<commit_message>
Adiciona coluna @legislacao (legislação vigente) a todos os outputs
Para cada artigo do @regulamento, identificado o diploma vigente mais
relevante e extraído o texto verbatim com referência no formato normalizado:
- ART-17 Identificação → n.ºs 1, 2 e 3 do art.º 5.º do DL n.º 82/2019
- ART-06 Bem-Estar     → n.ºs 1, 2 e 3 do art.º 7.º do DL n.º 276/2001
- ART-07 Criadores     → n.º 1 do art.º 3.º-A do DL n.º 276/2001

Alterações:
- gerar_comparativo_reuniao.py: campo legislacao em ARTIGOS, cor teal
  no COR, coluna @legislacao no Excel, 4.º card no HTML (grid 4 colunas)
- gerar_word.py: tabela passa de 3 para 4 colunas
- Ficheiros Excel, HTML e Word regenerados

https://claude.ai/code/session_018boKb8AzDijzFXMo6nY48F
</commit_message>
<xml_diff>
--- a/comparativo_reuniao_exemplo.docx
+++ b/comparativo_reuniao_exemplo.docx
@@ -258,6 +258,49 @@
         <w:tc>
           <w:tcPr>
             <w:tcW w:type="dxa" w:w="7569"/>
+            <w:shd w:val="clear" w:color="auto" w:fill="E0F7FA"/>
+            <w:tcBorders>
+              <w:top w:val="single" w:sz="4" w:space="0" w:color="CCCCCC"/>
+              <w:left w:val="single" w:sz="4" w:space="0" w:color="CCCCCC"/>
+              <w:bottom w:val="single" w:sz="4" w:space="0" w:color="CCCCCC"/>
+              <w:right w:val="single" w:sz="4" w:space="0" w:color="CCCCCC"/>
+            </w:tcBorders>
+          </w:tcPr>
+          <w:p>
+            <w:pPr>
+              <w:spacing w:before="60" w:after="60"/>
+              <w:ind w:left="120"/>
+            </w:pPr>
+            <w:r>
+              <w:rPr>
+                <w:rFonts w:ascii="Calibri" w:hAnsi="Calibri"/>
+                <w:b/>
+                <w:i w:val="0"/>
+                <w:color w:val="222222"/>
+                <w:sz w:val="18"/>
+              </w:rPr>
+              <w:t>@legislacao (legislação vigente)</w:t>
+            </w:r>
+          </w:p>
+        </w:tc>
+        <w:tc>
+          <w:tcPr>
+            <w:tcW w:type="dxa" w:w="7569"/>
+            <w:shd w:val="clear" w:color="auto" w:fill="E0F7FA"/>
+            <w:tcBorders>
+              <w:top w:val="single" w:sz="4" w:space="0" w:color="CCCCCC"/>
+              <w:left w:val="single" w:sz="4" w:space="0" w:color="CCCCCC"/>
+              <w:bottom w:val="single" w:sz="4" w:space="0" w:color="CCCCCC"/>
+              <w:right w:val="single" w:sz="4" w:space="0" w:color="CCCCCC"/>
+            </w:tcBorders>
+          </w:tcPr>
+          <w:p/>
+        </w:tc>
+      </w:tr>
+      <w:tr>
+        <w:tc>
+          <w:tcPr>
+            <w:tcW w:type="dxa" w:w="7569"/>
             <w:shd w:val="clear" w:color="auto" w:fill="EAD7F7"/>
             <w:tcBorders>
               <w:top w:val="single" w:sz="4" w:space="0" w:color="CCCCCC"/>
@@ -434,14 +477,15 @@
         <w:tblW w:w="5000" w:type="pct"/>
       </w:tblPr>
       <w:tblGrid>
-        <w:gridCol w:w="5046"/>
-        <w:gridCol w:w="5046"/>
-        <w:gridCol w:w="5046"/>
+        <w:gridCol w:w="3784"/>
+        <w:gridCol w:w="3784"/>
+        <w:gridCol w:w="3784"/>
+        <w:gridCol w:w="3784"/>
       </w:tblGrid>
       <w:tr>
         <w:tc>
           <w:tcPr>
-            <w:tcW w:type="dxa" w:w="5046"/>
+            <w:tcW w:type="dxa" w:w="3784"/>
             <w:shd w:val="clear" w:color="auto" w:fill="1A3A5C"/>
             <w:tcBorders>
               <w:top w:val="single" w:sz="4" w:space="0" w:color="CCCCCC"/>
@@ -469,7 +513,7 @@
         </w:tc>
         <w:tc>
           <w:tcPr>
-            <w:tcW w:type="dxa" w:w="5046"/>
+            <w:tcW w:type="dxa" w:w="3784"/>
             <w:shd w:val="clear" w:color="auto" w:fill="1E5631"/>
             <w:tcBorders>
               <w:top w:val="single" w:sz="4" w:space="0" w:color="CCCCCC"/>
@@ -497,7 +541,7 @@
         </w:tc>
         <w:tc>
           <w:tcPr>
-            <w:tcW w:type="dxa" w:w="5046"/>
+            <w:tcW w:type="dxa" w:w="3784"/>
             <w:shd w:val="clear" w:color="auto" w:fill="7E4C00"/>
             <w:tcBorders>
               <w:top w:val="single" w:sz="4" w:space="0" w:color="CCCCCC"/>
@@ -523,11 +567,39 @@
             </w:r>
           </w:p>
         </w:tc>
+        <w:tc>
+          <w:tcPr>
+            <w:tcW w:type="dxa" w:w="3784"/>
+            <w:shd w:val="clear" w:color="auto" w:fill="006064"/>
+            <w:tcBorders>
+              <w:top w:val="single" w:sz="4" w:space="0" w:color="CCCCCC"/>
+              <w:left w:val="single" w:sz="4" w:space="0" w:color="CCCCCC"/>
+              <w:bottom w:val="single" w:sz="4" w:space="0" w:color="CCCCCC"/>
+              <w:right w:val="single" w:sz="4" w:space="0" w:color="CCCCCC"/>
+            </w:tcBorders>
+          </w:tcPr>
+          <w:p>
+            <w:pPr>
+              <w:spacing w:before="80" w:after="80"/>
+              <w:jc w:val="center"/>
+            </w:pPr>
+            <w:r>
+              <w:rPr>
+                <w:rFonts w:ascii="Calibri" w:hAnsi="Calibri"/>
+                <w:b/>
+                <w:i w:val="0"/>
+                <w:color w:val="FFFFFF"/>
+                <w:sz w:val="18"/>
+              </w:rPr>
+              <w:t>@legislacao (legislação vigente)</w:t>
+            </w:r>
+          </w:p>
+        </w:tc>
       </w:tr>
       <w:tr>
         <w:tc>
           <w:tcPr>
-            <w:tcW w:type="dxa" w:w="5046"/>
+            <w:tcW w:type="dxa" w:w="3784"/>
             <w:shd w:val="clear" w:color="auto" w:fill="D6E4F0"/>
             <w:tcBorders>
               <w:top w:val="single" w:sz="4" w:space="0" w:color="CCCCCC"/>
@@ -615,7 +687,7 @@
         </w:tc>
         <w:tc>
           <w:tcPr>
-            <w:tcW w:type="dxa" w:w="5046"/>
+            <w:tcW w:type="dxa" w:w="3784"/>
             <w:shd w:val="clear" w:color="auto" w:fill="D5E8D4"/>
             <w:tcBorders>
               <w:top w:val="single" w:sz="4" w:space="0" w:color="CCCCCC"/>
@@ -703,7 +775,7 @@
         </w:tc>
         <w:tc>
           <w:tcPr>
-            <w:tcW w:type="dxa" w:w="5046"/>
+            <w:tcW w:type="dxa" w:w="3784"/>
             <w:shd w:val="clear" w:color="auto" w:fill="FFE6CC"/>
             <w:tcBorders>
               <w:top w:val="single" w:sz="4" w:space="0" w:color="CCCCCC"/>
@@ -786,6 +858,78 @@
                 <w:sz w:val="19"/>
               </w:rPr>
               <w:t>5 — A identificação electrónica é efetuada através da aplicação subcutânea de um microchip no centro da face lateral esquerda do pescoço.</w:t>
+            </w:r>
+          </w:p>
+        </w:tc>
+        <w:tc>
+          <w:tcPr>
+            <w:tcW w:type="dxa" w:w="3784"/>
+            <w:shd w:val="clear" w:color="auto" w:fill="E0F7FA"/>
+            <w:tcBorders>
+              <w:top w:val="single" w:sz="4" w:space="0" w:color="CCCCCC"/>
+              <w:left w:val="single" w:sz="4" w:space="0" w:color="CCCCCC"/>
+              <w:bottom w:val="single" w:sz="4" w:space="0" w:color="CCCCCC"/>
+              <w:right w:val="single" w:sz="4" w:space="0" w:color="CCCCCC"/>
+            </w:tcBorders>
+            <w:vAlign w:val="top"/>
+          </w:tcPr>
+          <w:p>
+            <w:pPr>
+              <w:spacing w:before="80" w:after="80"/>
+              <w:ind w:left="80" w:right="80"/>
+            </w:pPr>
+            <w:r>
+              <w:rPr>
+                <w:rFonts w:ascii="Calibri" w:hAnsi="Calibri"/>
+                <w:b/>
+                <w:i/>
+                <w:color w:val="555555"/>
+                <w:sz w:val="16"/>
+              </w:rPr>
+              <w:t>n.ºs 1, 2 e 3 do art.º 5.º do DL n.º 82/2019, de 27 de junho</w:t>
+              <w:br/>
+            </w:r>
+            <w:r>
+              <w:rPr>
+                <w:rFonts w:ascii="Calibri" w:hAnsi="Calibri"/>
+                <w:b w:val="0"/>
+                <w:i w:val="0"/>
+                <w:color w:val="222222"/>
+                <w:sz w:val="19"/>
+              </w:rPr>
+              <w:t>1 — A identificação dos animais de companhia, pela sua marcação e registo no SIAC, deve ser realizada até 120 dias após o seu nascimento.</w:t>
+            </w:r>
+          </w:p>
+          <w:p>
+            <w:pPr>
+              <w:spacing w:before="120" w:after="0"/>
+              <w:ind w:left="80"/>
+            </w:pPr>
+            <w:r>
+              <w:rPr>
+                <w:rFonts w:ascii="Calibri" w:hAnsi="Calibri"/>
+                <w:b w:val="0"/>
+                <w:i w:val="0"/>
+                <w:color w:val="222222"/>
+                <w:sz w:val="19"/>
+              </w:rPr>
+              <w:t>2 — Na impossibilidade de determinar a data de nascimento exata, para efeitos de contagem do prazo referido no número anterior, a identificação deve ser efetuada até à perda dos dentes incisivos de leite.</w:t>
+            </w:r>
+          </w:p>
+          <w:p>
+            <w:pPr>
+              <w:spacing w:before="120" w:after="0"/>
+              <w:ind w:left="80"/>
+            </w:pPr>
+            <w:r>
+              <w:rPr>
+                <w:rFonts w:ascii="Calibri" w:hAnsi="Calibri"/>
+                <w:b w:val="0"/>
+                <w:i w:val="0"/>
+                <w:color w:val="222222"/>
+                <w:sz w:val="19"/>
+              </w:rPr>
+              <w:t>3 — Sem prejuízo dos números anteriores, e relativamente aos cães, gatos e furões que sejam cedidos e ou comercializados a partir de um criador ou de um estabelecimento autorizado para a detenção de animais de companhia, nomeadamente os centros de hospedagem com ou sem fins lucrativos e os centros de recolha oficiais, deve ser assegurada a sua marcação e registo no SIAC antes de abandonarem a instalação de nascimento ou de alojamento, independentemente da sua idade.</w:t>
             </w:r>
           </w:p>
         </w:tc>
@@ -1168,14 +1312,15 @@
         <w:tblW w:w="5000" w:type="pct"/>
       </w:tblPr>
       <w:tblGrid>
-        <w:gridCol w:w="5046"/>
-        <w:gridCol w:w="5046"/>
-        <w:gridCol w:w="5046"/>
+        <w:gridCol w:w="3784"/>
+        <w:gridCol w:w="3784"/>
+        <w:gridCol w:w="3784"/>
+        <w:gridCol w:w="3784"/>
       </w:tblGrid>
       <w:tr>
         <w:tc>
           <w:tcPr>
-            <w:tcW w:type="dxa" w:w="5046"/>
+            <w:tcW w:type="dxa" w:w="3784"/>
             <w:shd w:val="clear" w:color="auto" w:fill="1A3A5C"/>
             <w:tcBorders>
               <w:top w:val="single" w:sz="4" w:space="0" w:color="CCCCCC"/>
@@ -1203,7 +1348,7 @@
         </w:tc>
         <w:tc>
           <w:tcPr>
-            <w:tcW w:type="dxa" w:w="5046"/>
+            <w:tcW w:type="dxa" w:w="3784"/>
             <w:shd w:val="clear" w:color="auto" w:fill="1E5631"/>
             <w:tcBorders>
               <w:top w:val="single" w:sz="4" w:space="0" w:color="CCCCCC"/>
@@ -1231,7 +1376,7 @@
         </w:tc>
         <w:tc>
           <w:tcPr>
-            <w:tcW w:type="dxa" w:w="5046"/>
+            <w:tcW w:type="dxa" w:w="3784"/>
             <w:shd w:val="clear" w:color="auto" w:fill="7E4C00"/>
             <w:tcBorders>
               <w:top w:val="single" w:sz="4" w:space="0" w:color="CCCCCC"/>
@@ -1257,11 +1402,39 @@
             </w:r>
           </w:p>
         </w:tc>
+        <w:tc>
+          <w:tcPr>
+            <w:tcW w:type="dxa" w:w="3784"/>
+            <w:shd w:val="clear" w:color="auto" w:fill="006064"/>
+            <w:tcBorders>
+              <w:top w:val="single" w:sz="4" w:space="0" w:color="CCCCCC"/>
+              <w:left w:val="single" w:sz="4" w:space="0" w:color="CCCCCC"/>
+              <w:bottom w:val="single" w:sz="4" w:space="0" w:color="CCCCCC"/>
+              <w:right w:val="single" w:sz="4" w:space="0" w:color="CCCCCC"/>
+            </w:tcBorders>
+          </w:tcPr>
+          <w:p>
+            <w:pPr>
+              <w:spacing w:before="80" w:after="80"/>
+              <w:jc w:val="center"/>
+            </w:pPr>
+            <w:r>
+              <w:rPr>
+                <w:rFonts w:ascii="Calibri" w:hAnsi="Calibri"/>
+                <w:b/>
+                <w:i w:val="0"/>
+                <w:color w:val="FFFFFF"/>
+                <w:sz w:val="18"/>
+              </w:rPr>
+              <w:t>@legislacao (legislação vigente)</w:t>
+            </w:r>
+          </w:p>
+        </w:tc>
       </w:tr>
       <w:tr>
         <w:tc>
           <w:tcPr>
-            <w:tcW w:type="dxa" w:w="5046"/>
+            <w:tcW w:type="dxa" w:w="3784"/>
             <w:shd w:val="clear" w:color="auto" w:fill="D6E4F0"/>
             <w:tcBorders>
               <w:top w:val="single" w:sz="4" w:space="0" w:color="CCCCCC"/>
@@ -1317,7 +1490,7 @@
         </w:tc>
         <w:tc>
           <w:tcPr>
-            <w:tcW w:type="dxa" w:w="5046"/>
+            <w:tcW w:type="dxa" w:w="3784"/>
             <w:shd w:val="clear" w:color="auto" w:fill="D5E8D4"/>
             <w:tcBorders>
               <w:top w:val="single" w:sz="4" w:space="0" w:color="CCCCCC"/>
@@ -1381,7 +1554,7 @@
         </w:tc>
         <w:tc>
           <w:tcPr>
-            <w:tcW w:type="dxa" w:w="5046"/>
+            <w:tcW w:type="dxa" w:w="3784"/>
             <w:shd w:val="clear" w:color="auto" w:fill="FFE6CC"/>
             <w:tcBorders>
               <w:top w:val="single" w:sz="4" w:space="0" w:color="CCCCCC"/>
@@ -1448,6 +1621,78 @@
                 <w:sz w:val="19"/>
               </w:rPr>
               <w:t>3 — É proibida a violência contra animais, considerando-se como tal todos os atos que, sem necessidade, infligem a morte, o sofrimento, a dor, a angústia ou ferimentos a um animal.</w:t>
+            </w:r>
+          </w:p>
+        </w:tc>
+        <w:tc>
+          <w:tcPr>
+            <w:tcW w:type="dxa" w:w="3784"/>
+            <w:shd w:val="clear" w:color="auto" w:fill="E0F7FA"/>
+            <w:tcBorders>
+              <w:top w:val="single" w:sz="4" w:space="0" w:color="CCCCCC"/>
+              <w:left w:val="single" w:sz="4" w:space="0" w:color="CCCCCC"/>
+              <w:bottom w:val="single" w:sz="4" w:space="0" w:color="CCCCCC"/>
+              <w:right w:val="single" w:sz="4" w:space="0" w:color="CCCCCC"/>
+            </w:tcBorders>
+            <w:vAlign w:val="top"/>
+          </w:tcPr>
+          <w:p>
+            <w:pPr>
+              <w:spacing w:before="80" w:after="80"/>
+              <w:ind w:left="80" w:right="80"/>
+            </w:pPr>
+            <w:r>
+              <w:rPr>
+                <w:rFonts w:ascii="Calibri" w:hAnsi="Calibri"/>
+                <w:b/>
+                <w:i/>
+                <w:color w:val="555555"/>
+                <w:sz w:val="16"/>
+              </w:rPr>
+              <w:t>n.ºs 1, 2 e 3 do art.º 7.º do DL n.º 276/2001, de 17 de outubro</w:t>
+              <w:br/>
+            </w:r>
+            <w:r>
+              <w:rPr>
+                <w:rFonts w:ascii="Calibri" w:hAnsi="Calibri"/>
+                <w:b w:val="0"/>
+                <w:i w:val="0"/>
+                <w:color w:val="222222"/>
+                <w:sz w:val="19"/>
+              </w:rPr>
+              <w:t>1 — As condições de detenção e de alojamento para reprodução, criação, manutenção e acomodação dos animais de companhia devem salvaguardar os seus parâmetros de bem-estar animal, nomeadamente nos termos dos artigos seguintes.</w:t>
+            </w:r>
+          </w:p>
+          <w:p>
+            <w:pPr>
+              <w:spacing w:before="120" w:after="0"/>
+              <w:ind w:left="80"/>
+            </w:pPr>
+            <w:r>
+              <w:rPr>
+                <w:rFonts w:ascii="Calibri" w:hAnsi="Calibri"/>
+                <w:b w:val="0"/>
+                <w:i w:val="0"/>
+                <w:color w:val="222222"/>
+                <w:sz w:val="19"/>
+              </w:rPr>
+              <w:t>2 — Nenhum animal deve ser detido como animal de companhia se não estiverem asseguradas as condições referidas no número anterior ou se não se adaptar ao cativeiro.</w:t>
+            </w:r>
+          </w:p>
+          <w:p>
+            <w:pPr>
+              <w:spacing w:before="120" w:after="0"/>
+              <w:ind w:left="80"/>
+            </w:pPr>
+            <w:r>
+              <w:rPr>
+                <w:rFonts w:ascii="Calibri" w:hAnsi="Calibri"/>
+                <w:b w:val="0"/>
+                <w:i w:val="0"/>
+                <w:color w:val="222222"/>
+                <w:sz w:val="19"/>
+              </w:rPr>
+              <w:t>3 — São proibidas todas as violências contra animais, considerando-se como tais os atos consistentes em, sem necessidade, se infligir a morte, o sofrimento ou lesões a um animal.</w:t>
             </w:r>
           </w:p>
         </w:tc>
@@ -1798,14 +2043,15 @@
         <w:tblW w:w="5000" w:type="pct"/>
       </w:tblPr>
       <w:tblGrid>
-        <w:gridCol w:w="5046"/>
-        <w:gridCol w:w="5046"/>
-        <w:gridCol w:w="5046"/>
+        <w:gridCol w:w="3784"/>
+        <w:gridCol w:w="3784"/>
+        <w:gridCol w:w="3784"/>
+        <w:gridCol w:w="3784"/>
       </w:tblGrid>
       <w:tr>
         <w:tc>
           <w:tcPr>
-            <w:tcW w:type="dxa" w:w="5046"/>
+            <w:tcW w:type="dxa" w:w="3784"/>
             <w:shd w:val="clear" w:color="auto" w:fill="1A3A5C"/>
             <w:tcBorders>
               <w:top w:val="single" w:sz="4" w:space="0" w:color="CCCCCC"/>
@@ -1833,7 +2079,7 @@
         </w:tc>
         <w:tc>
           <w:tcPr>
-            <w:tcW w:type="dxa" w:w="5046"/>
+            <w:tcW w:type="dxa" w:w="3784"/>
             <w:shd w:val="clear" w:color="auto" w:fill="1E5631"/>
             <w:tcBorders>
               <w:top w:val="single" w:sz="4" w:space="0" w:color="CCCCCC"/>
@@ -1861,7 +2107,7 @@
         </w:tc>
         <w:tc>
           <w:tcPr>
-            <w:tcW w:type="dxa" w:w="5046"/>
+            <w:tcW w:type="dxa" w:w="3784"/>
             <w:shd w:val="clear" w:color="auto" w:fill="7E4C00"/>
             <w:tcBorders>
               <w:top w:val="single" w:sz="4" w:space="0" w:color="CCCCCC"/>
@@ -1887,11 +2133,39 @@
             </w:r>
           </w:p>
         </w:tc>
+        <w:tc>
+          <w:tcPr>
+            <w:tcW w:type="dxa" w:w="3784"/>
+            <w:shd w:val="clear" w:color="auto" w:fill="006064"/>
+            <w:tcBorders>
+              <w:top w:val="single" w:sz="4" w:space="0" w:color="CCCCCC"/>
+              <w:left w:val="single" w:sz="4" w:space="0" w:color="CCCCCC"/>
+              <w:bottom w:val="single" w:sz="4" w:space="0" w:color="CCCCCC"/>
+              <w:right w:val="single" w:sz="4" w:space="0" w:color="CCCCCC"/>
+            </w:tcBorders>
+          </w:tcPr>
+          <w:p>
+            <w:pPr>
+              <w:spacing w:before="80" w:after="80"/>
+              <w:jc w:val="center"/>
+            </w:pPr>
+            <w:r>
+              <w:rPr>
+                <w:rFonts w:ascii="Calibri" w:hAnsi="Calibri"/>
+                <w:b/>
+                <w:i w:val="0"/>
+                <w:color w:val="FFFFFF"/>
+                <w:sz w:val="18"/>
+              </w:rPr>
+              <w:t>@legislacao (legislação vigente)</w:t>
+            </w:r>
+          </w:p>
+        </w:tc>
       </w:tr>
       <w:tr>
         <w:tc>
           <w:tcPr>
-            <w:tcW w:type="dxa" w:w="5046"/>
+            <w:tcW w:type="dxa" w:w="3784"/>
             <w:shd w:val="clear" w:color="auto" w:fill="D6E4F0"/>
             <w:tcBorders>
               <w:top w:val="single" w:sz="4" w:space="0" w:color="CCCCCC"/>
@@ -1957,7 +2231,7 @@
         </w:tc>
         <w:tc>
           <w:tcPr>
-            <w:tcW w:type="dxa" w:w="5046"/>
+            <w:tcW w:type="dxa" w:w="3784"/>
             <w:shd w:val="clear" w:color="auto" w:fill="D5E8D4"/>
             <w:tcBorders>
               <w:top w:val="single" w:sz="4" w:space="0" w:color="CCCCCC"/>
@@ -2029,7 +2303,7 @@
         </w:tc>
         <w:tc>
           <w:tcPr>
-            <w:tcW w:type="dxa" w:w="5046"/>
+            <w:tcW w:type="dxa" w:w="3784"/>
             <w:shd w:val="clear" w:color="auto" w:fill="FFE6CC"/>
             <w:tcBorders>
               <w:top w:val="single" w:sz="4" w:space="0" w:color="CCCCCC"/>
@@ -2128,6 +2402,80 @@
                 <w:sz w:val="19"/>
               </w:rPr>
               <w:t>c) Devem ser excluídos da reprodução os animais que revelem defeitos genéticos e malformações, designadamente monorquidia e displasia.</w:t>
+            </w:r>
+          </w:p>
+        </w:tc>
+        <w:tc>
+          <w:tcPr>
+            <w:tcW w:type="dxa" w:w="3784"/>
+            <w:shd w:val="clear" w:color="auto" w:fill="E0F7FA"/>
+            <w:tcBorders>
+              <w:top w:val="single" w:sz="4" w:space="0" w:color="CCCCCC"/>
+              <w:left w:val="single" w:sz="4" w:space="0" w:color="CCCCCC"/>
+              <w:bottom w:val="single" w:sz="4" w:space="0" w:color="CCCCCC"/>
+              <w:right w:val="single" w:sz="4" w:space="0" w:color="CCCCCC"/>
+            </w:tcBorders>
+            <w:vAlign w:val="top"/>
+          </w:tcPr>
+          <w:p>
+            <w:pPr>
+              <w:spacing w:before="80" w:after="80"/>
+              <w:ind w:left="80" w:right="80"/>
+            </w:pPr>
+            <w:r>
+              <w:rPr>
+                <w:rFonts w:ascii="Calibri" w:hAnsi="Calibri"/>
+                <w:b/>
+                <w:i/>
+                <w:color w:val="555555"/>
+                <w:sz w:val="16"/>
+              </w:rPr>
+              <w:t>n.º 1 do art.º 3.º-A do DL n.º 276/2001, de 17 de outubro</w:t>
+              <w:br/>
+            </w:r>
+            <w:r>
+              <w:rPr>
+                <w:rFonts w:ascii="Calibri" w:hAnsi="Calibri"/>
+                <w:b w:val="0"/>
+                <w:i w:val="0"/>
+                <w:color w:val="222222"/>
+                <w:sz w:val="19"/>
+              </w:rPr>
+              <w:t>1 — A mera comunicação prévia a que se refere a alínea a) do n.º 1 do artigo anterior é dirigida à DGAV e deve conter os seguintes elementos, quando aplicáveis:</w:t>
+            </w:r>
+          </w:p>
+          <w:p>
+            <w:pPr>
+              <w:spacing w:before="120" w:after="0"/>
+              <w:ind w:left="80"/>
+            </w:pPr>
+            <w:r>
+              <w:rPr>
+                <w:rFonts w:ascii="Calibri" w:hAnsi="Calibri"/>
+                <w:b w:val="0"/>
+                <w:i w:val="0"/>
+                <w:color w:val="222222"/>
+                <w:sz w:val="19"/>
+              </w:rPr>
+              <w:t>a) O nome ou a denominação social do interessado;</w:t>
+              <w:br/>
+              <w:t>b) A localização do alojamento e a sua designação comercial;</w:t>
+              <w:br/>
+              <w:t>c) O número de identificação fiscal ou de pessoa coletiva do interessado;</w:t>
+              <w:br/>
+              <w:t>d) Municípios integrantes, no caso dos centros de recolha intermunicipais;</w:t>
+              <w:br/>
+              <w:t>e) Caracterização das atividades a exercer;</w:t>
+              <w:br/>
+              <w:t>f) Indicação do médico veterinário responsável pelo alojamento;</w:t>
+              <w:br/>
+              <w:t>g) O número de celas de quarentena para isolamento de animais por suspeita de raiva, no caso dos centros de recolha;</w:t>
+              <w:br/>
+              <w:t>h) A capacidade máxima de animais e respetivas espécies a alojar;</w:t>
+              <w:br/>
+              <w:t>i) O número de animais detidos, espécies e raças;</w:t>
+              <w:br/>
+              <w:t>j) Declaração de responsabilidade, subscrita pelo interessado, relativa ao cumprimento da legislação aplicável aos animais de companhia, nomeadamente em matéria de instalações, equipamentos, higiene, saúde e bem-estar dos animais.</w:t>
             </w:r>
           </w:p>
         </w:tc>

</xml_diff>

<commit_message>
Reorganizar layout: tradução PT topo + 3 colunas nacionais
Nova ordem em ambos os formatos (HTML e Word):
  1. @regulamento — Tradução PT-PT (full-width, leitura primária)
     com referência do artigo integrada no cabeçalho
  2. @regulamento — Texto original EN (full-width, referência)
  3. Grid 3 colunas: @rgbeac | @codigo | @legislacao vigente

CSS: grid alterado de 4 para 3 colunas (breakpoints ajustados:
  2 colunas <1100px, 1 coluna <700px)
Novo estilo .card-header-ref para ref inline no cabeçalho.

https://claude.ai/code/session_018boKb8AzDijzFXMo6nY48F
</commit_message>
<xml_diff>
--- a/comparativo_reuniao_exemplo.docx
+++ b/comparativo_reuniao_exemplo.docx
@@ -477,15 +477,135 @@
         <w:tblW w:w="5000" w:type="pct"/>
       </w:tblPr>
       <w:tblGrid>
-        <w:gridCol w:w="3784"/>
-        <w:gridCol w:w="3784"/>
-        <w:gridCol w:w="3784"/>
-        <w:gridCol w:w="3784"/>
+        <w:gridCol w:w="15138"/>
       </w:tblGrid>
       <w:tr>
         <w:tc>
           <w:tcPr>
-            <w:tcW w:type="dxa" w:w="3784"/>
+            <w:tcW w:type="dxa" w:w="15138"/>
+            <w:shd w:val="clear" w:color="auto" w:fill="2471A3"/>
+            <w:tcBorders>
+              <w:top w:val="single" w:sz="4" w:space="0" w:color="CCCCCC"/>
+              <w:left w:val="single" w:sz="4" w:space="0" w:color="CCCCCC"/>
+              <w:bottom w:val="single" w:sz="4" w:space="0" w:color="CCCCCC"/>
+              <w:right w:val="single" w:sz="4" w:space="0" w:color="CCCCCC"/>
+            </w:tcBorders>
+          </w:tcPr>
+          <w:p>
+            <w:pPr>
+              <w:spacing w:before="80" w:after="80"/>
+              <w:jc w:val="center"/>
+            </w:pPr>
+            <w:r>
+              <w:rPr>
+                <w:rFonts w:ascii="Calibri" w:hAnsi="Calibri"/>
+                <w:b/>
+                <w:i w:val="0"/>
+                <w:color w:val="FFFFFF"/>
+                <w:sz w:val="18"/>
+              </w:rPr>
+              <w:t>@regulamento — Tradução PT-PT  ·  Art.º 17.º do Regulamento 2023/0447</w:t>
+            </w:r>
+          </w:p>
+        </w:tc>
+      </w:tr>
+      <w:tr>
+        <w:tc>
+          <w:tcPr>
+            <w:tcW w:type="dxa" w:w="15138"/>
+            <w:shd w:val="clear" w:color="auto" w:fill="EBF5FB"/>
+            <w:tcBorders>
+              <w:top w:val="single" w:sz="4" w:space="0" w:color="CCCCCC"/>
+              <w:left w:val="single" w:sz="4" w:space="0" w:color="CCCCCC"/>
+              <w:bottom w:val="single" w:sz="4" w:space="0" w:color="CCCCCC"/>
+              <w:right w:val="single" w:sz="4" w:space="0" w:color="CCCCCC"/>
+            </w:tcBorders>
+            <w:vAlign w:val="top"/>
+          </w:tcPr>
+          <w:p>
+            <w:pPr>
+              <w:spacing w:before="80" w:after="80"/>
+              <w:ind w:left="80" w:right="80"/>
+            </w:pPr>
+            <w:r>
+              <w:rPr>
+                <w:rFonts w:ascii="Calibri" w:hAnsi="Calibri"/>
+                <w:b w:val="0"/>
+                <w:i/>
+                <w:color w:val="222222"/>
+                <w:sz w:val="19"/>
+              </w:rPr>
+              <w:t>Todos os cães e gatos mantidos em estabelecimentos colocados no mercado ou detidos por donos de animais de companhia ou por qualquer outra pessoa singular ou coletiva devem ser identificados individualmente por meio de um único transponder injetável contendo um microchip legível em conformidade com o Anexo II.</w:t>
+            </w:r>
+          </w:p>
+          <w:p>
+            <w:pPr>
+              <w:spacing w:before="120" w:after="0"/>
+              <w:ind w:left="80"/>
+            </w:pPr>
+            <w:r>
+              <w:rPr>
+                <w:rFonts w:ascii="Calibri" w:hAnsi="Calibri"/>
+                <w:b w:val="0"/>
+                <w:i/>
+                <w:color w:val="222222"/>
+                <w:sz w:val="19"/>
+              </w:rPr>
+              <w:t>1a. Os operadores devem assegurar que os cães e gatos nascidos nos seus estabelecimentos sejam identificados individualmente no prazo de 3 meses após o nascimento e, em qualquer caso, antes da data da sua colocação no mercado.</w:t>
+            </w:r>
+          </w:p>
+          <w:p>
+            <w:pPr>
+              <w:spacing w:before="120" w:after="0"/>
+              <w:ind w:left="80"/>
+            </w:pPr>
+            <w:r>
+              <w:rPr>
+                <w:rFonts w:ascii="Calibri" w:hAnsi="Calibri"/>
+                <w:b w:val="0"/>
+                <w:i/>
+                <w:color w:val="222222"/>
+                <w:sz w:val="19"/>
+              </w:rPr>
+              <w:t>Os operadores de estabelecimentos de venda, abrigos e os que colocam e são responsáveis por cães e gatos em famílias de acolhimento devem assegurar que os cães e gatos que entrem nos seus estabelecimentos sejam identificados individualmente no prazo de 30 dias após a chegada.</w:t>
+            </w:r>
+          </w:p>
+          <w:p>
+            <w:pPr>
+              <w:spacing w:before="120" w:after="0"/>
+              <w:ind w:left="80"/>
+            </w:pPr>
+            <w:r>
+              <w:rPr>
+                <w:rFonts w:ascii="Calibri" w:hAnsi="Calibri"/>
+                <w:b w:val="0"/>
+                <w:i/>
+                <w:color w:val="222222"/>
+                <w:sz w:val="19"/>
+              </w:rPr>
+              <w:t>Os donos de animais de companhia e quaisquer outras pessoas singulares ou coletivas que detenham cães ou gatos devem assegurar que os animais sejam identificados individualmente o mais tardar quando o animal atingir os 3 meses de idade.</w:t>
+            </w:r>
+          </w:p>
+        </w:tc>
+      </w:tr>
+    </w:tbl>
+    <w:p>
+      <w:pPr>
+        <w:spacing w:after="80"/>
+      </w:pPr>
+    </w:p>
+    <w:tbl>
+      <w:tblPr>
+        <w:tblLook w:firstColumn="1" w:firstRow="1" w:lastColumn="0" w:lastRow="0" w:noHBand="0" w:noVBand="1" w:val="04A0"/>
+        <w:tblW w:w="5000" w:type="pct"/>
+      </w:tblPr>
+      <w:tblGrid>
+        <w:gridCol w:w="15138"/>
+      </w:tblGrid>
+      <w:tr>
+        <w:tc>
+          <w:tcPr>
+            <w:tcW w:type="dxa" w:w="15138"/>
             <w:shd w:val="clear" w:color="auto" w:fill="1A3A5C"/>
             <w:tcBorders>
               <w:top w:val="single" w:sz="4" w:space="0" w:color="CCCCCC"/>
@@ -507,91 +627,7 @@
                 <w:color w:val="FFFFFF"/>
                 <w:sz w:val="18"/>
               </w:rPr>
-              <w:t>@regulamento (texto original EN)</w:t>
-            </w:r>
-          </w:p>
-        </w:tc>
-        <w:tc>
-          <w:tcPr>
-            <w:tcW w:type="dxa" w:w="3784"/>
-            <w:shd w:val="clear" w:color="auto" w:fill="1E5631"/>
-            <w:tcBorders>
-              <w:top w:val="single" w:sz="4" w:space="0" w:color="CCCCCC"/>
-              <w:left w:val="single" w:sz="4" w:space="0" w:color="CCCCCC"/>
-              <w:bottom w:val="single" w:sz="4" w:space="0" w:color="CCCCCC"/>
-              <w:right w:val="single" w:sz="4" w:space="0" w:color="CCCCCC"/>
-            </w:tcBorders>
-          </w:tcPr>
-          <w:p>
-            <w:pPr>
-              <w:spacing w:before="80" w:after="80"/>
-              <w:jc w:val="center"/>
-            </w:pPr>
-            <w:r>
-              <w:rPr>
-                <w:rFonts w:ascii="Calibri" w:hAnsi="Calibri"/>
-                <w:b/>
-                <w:i w:val="0"/>
-                <w:color w:val="FFFFFF"/>
-                <w:sz w:val="18"/>
-              </w:rPr>
-              <w:t>@rgbeac (proposta jun. 2025)</w:t>
-            </w:r>
-          </w:p>
-        </w:tc>
-        <w:tc>
-          <w:tcPr>
-            <w:tcW w:type="dxa" w:w="3784"/>
-            <w:shd w:val="clear" w:color="auto" w:fill="7E4C00"/>
-            <w:tcBorders>
-              <w:top w:val="single" w:sz="4" w:space="0" w:color="CCCCCC"/>
-              <w:left w:val="single" w:sz="4" w:space="0" w:color="CCCCCC"/>
-              <w:bottom w:val="single" w:sz="4" w:space="0" w:color="CCCCCC"/>
-              <w:right w:val="single" w:sz="4" w:space="0" w:color="CCCCCC"/>
-            </w:tcBorders>
-          </w:tcPr>
-          <w:p>
-            <w:pPr>
-              <w:spacing w:before="80" w:after="80"/>
-              <w:jc w:val="center"/>
-            </w:pPr>
-            <w:r>
-              <w:rPr>
-                <w:rFonts w:ascii="Calibri" w:hAnsi="Calibri"/>
-                <w:b/>
-                <w:i w:val="0"/>
-                <w:color w:val="FFFFFF"/>
-                <w:sz w:val="18"/>
-              </w:rPr>
-              <w:t>@codigo (DL n.º 214/2013)</w:t>
-            </w:r>
-          </w:p>
-        </w:tc>
-        <w:tc>
-          <w:tcPr>
-            <w:tcW w:type="dxa" w:w="3784"/>
-            <w:shd w:val="clear" w:color="auto" w:fill="006064"/>
-            <w:tcBorders>
-              <w:top w:val="single" w:sz="4" w:space="0" w:color="CCCCCC"/>
-              <w:left w:val="single" w:sz="4" w:space="0" w:color="CCCCCC"/>
-              <w:bottom w:val="single" w:sz="4" w:space="0" w:color="CCCCCC"/>
-              <w:right w:val="single" w:sz="4" w:space="0" w:color="CCCCCC"/>
-            </w:tcBorders>
-          </w:tcPr>
-          <w:p>
-            <w:pPr>
-              <w:spacing w:before="80" w:after="80"/>
-              <w:jc w:val="center"/>
-            </w:pPr>
-            <w:r>
-              <w:rPr>
-                <w:rFonts w:ascii="Calibri" w:hAnsi="Calibri"/>
-                <w:b/>
-                <w:i w:val="0"/>
-                <w:color w:val="FFFFFF"/>
-                <w:sz w:val="18"/>
-              </w:rPr>
-              <w:t>@legislacao (legislação vigente)</w:t>
+              <w:t>@regulamento — Texto original EN</w:t>
             </w:r>
           </w:p>
         </w:tc>
@@ -599,7 +635,7 @@
       <w:tr>
         <w:tc>
           <w:tcPr>
-            <w:tcW w:type="dxa" w:w="3784"/>
+            <w:tcW w:type="dxa" w:w="15138"/>
             <w:shd w:val="clear" w:color="auto" w:fill="D6E4F0"/>
             <w:tcBorders>
               <w:top w:val="single" w:sz="4" w:space="0" w:color="CCCCCC"/>
@@ -614,17 +650,6 @@
               <w:spacing w:before="80" w:after="80"/>
               <w:ind w:left="80" w:right="80"/>
             </w:pPr>
-            <w:r>
-              <w:rPr>
-                <w:rFonts w:ascii="Calibri" w:hAnsi="Calibri"/>
-                <w:b/>
-                <w:i/>
-                <w:color w:val="555555"/>
-                <w:sz w:val="16"/>
-              </w:rPr>
-              <w:t>Art.º 17.º do Regulamento 2023/0447</w:t>
-              <w:br/>
-            </w:r>
             <w:r>
               <w:rPr>
                 <w:rFonts w:ascii="Calibri" w:hAnsi="Calibri"/>
@@ -685,9 +710,113 @@
             </w:r>
           </w:p>
         </w:tc>
+      </w:tr>
+    </w:tbl>
+    <w:p>
+      <w:pPr>
+        <w:spacing w:after="80"/>
+      </w:pPr>
+    </w:p>
+    <w:tbl>
+      <w:tblPr>
+        <w:tblLook w:firstColumn="1" w:firstRow="1" w:lastColumn="0" w:lastRow="0" w:noHBand="0" w:noVBand="1" w:val="04A0"/>
+        <w:tblW w:w="5000" w:type="pct"/>
+      </w:tblPr>
+      <w:tblGrid>
+        <w:gridCol w:w="5046"/>
+        <w:gridCol w:w="5046"/>
+        <w:gridCol w:w="5046"/>
+      </w:tblGrid>
+      <w:tr>
         <w:tc>
           <w:tcPr>
-            <w:tcW w:type="dxa" w:w="3784"/>
+            <w:tcW w:type="dxa" w:w="5046"/>
+            <w:shd w:val="clear" w:color="auto" w:fill="1E5631"/>
+            <w:tcBorders>
+              <w:top w:val="single" w:sz="4" w:space="0" w:color="CCCCCC"/>
+              <w:left w:val="single" w:sz="4" w:space="0" w:color="CCCCCC"/>
+              <w:bottom w:val="single" w:sz="4" w:space="0" w:color="CCCCCC"/>
+              <w:right w:val="single" w:sz="4" w:space="0" w:color="CCCCCC"/>
+            </w:tcBorders>
+          </w:tcPr>
+          <w:p>
+            <w:pPr>
+              <w:spacing w:before="80" w:after="80"/>
+              <w:jc w:val="center"/>
+            </w:pPr>
+            <w:r>
+              <w:rPr>
+                <w:rFonts w:ascii="Calibri" w:hAnsi="Calibri"/>
+                <w:b/>
+                <w:i w:val="0"/>
+                <w:color w:val="FFFFFF"/>
+                <w:sz w:val="18"/>
+              </w:rPr>
+              <w:t>@rgbeac (proposta jun. 2025)</w:t>
+            </w:r>
+          </w:p>
+        </w:tc>
+        <w:tc>
+          <w:tcPr>
+            <w:tcW w:type="dxa" w:w="5046"/>
+            <w:shd w:val="clear" w:color="auto" w:fill="7E4C00"/>
+            <w:tcBorders>
+              <w:top w:val="single" w:sz="4" w:space="0" w:color="CCCCCC"/>
+              <w:left w:val="single" w:sz="4" w:space="0" w:color="CCCCCC"/>
+              <w:bottom w:val="single" w:sz="4" w:space="0" w:color="CCCCCC"/>
+              <w:right w:val="single" w:sz="4" w:space="0" w:color="CCCCCC"/>
+            </w:tcBorders>
+          </w:tcPr>
+          <w:p>
+            <w:pPr>
+              <w:spacing w:before="80" w:after="80"/>
+              <w:jc w:val="center"/>
+            </w:pPr>
+            <w:r>
+              <w:rPr>
+                <w:rFonts w:ascii="Calibri" w:hAnsi="Calibri"/>
+                <w:b/>
+                <w:i w:val="0"/>
+                <w:color w:val="FFFFFF"/>
+                <w:sz w:val="18"/>
+              </w:rPr>
+              <w:t>@codigo (DL n.º 214/2013)</w:t>
+            </w:r>
+          </w:p>
+        </w:tc>
+        <w:tc>
+          <w:tcPr>
+            <w:tcW w:type="dxa" w:w="5046"/>
+            <w:shd w:val="clear" w:color="auto" w:fill="006064"/>
+            <w:tcBorders>
+              <w:top w:val="single" w:sz="4" w:space="0" w:color="CCCCCC"/>
+              <w:left w:val="single" w:sz="4" w:space="0" w:color="CCCCCC"/>
+              <w:bottom w:val="single" w:sz="4" w:space="0" w:color="CCCCCC"/>
+              <w:right w:val="single" w:sz="4" w:space="0" w:color="CCCCCC"/>
+            </w:tcBorders>
+          </w:tcPr>
+          <w:p>
+            <w:pPr>
+              <w:spacing w:before="80" w:after="80"/>
+              <w:jc w:val="center"/>
+            </w:pPr>
+            <w:r>
+              <w:rPr>
+                <w:rFonts w:ascii="Calibri" w:hAnsi="Calibri"/>
+                <w:b/>
+                <w:i w:val="0"/>
+                <w:color w:val="FFFFFF"/>
+                <w:sz w:val="18"/>
+              </w:rPr>
+              <w:t>@legislacao (legislação vigente)</w:t>
+            </w:r>
+          </w:p>
+        </w:tc>
+      </w:tr>
+      <w:tr>
+        <w:tc>
+          <w:tcPr>
+            <w:tcW w:type="dxa" w:w="5046"/>
             <w:shd w:val="clear" w:color="auto" w:fill="D5E8D4"/>
             <w:tcBorders>
               <w:top w:val="single" w:sz="4" w:space="0" w:color="CCCCCC"/>
@@ -775,7 +904,7 @@
         </w:tc>
         <w:tc>
           <w:tcPr>
-            <w:tcW w:type="dxa" w:w="3784"/>
+            <w:tcW w:type="dxa" w:w="5046"/>
             <w:shd w:val="clear" w:color="auto" w:fill="FFE6CC"/>
             <w:tcBorders>
               <w:top w:val="single" w:sz="4" w:space="0" w:color="CCCCCC"/>
@@ -863,7 +992,7 @@
         </w:tc>
         <w:tc>
           <w:tcPr>
-            <w:tcW w:type="dxa" w:w="3784"/>
+            <w:tcW w:type="dxa" w:w="5046"/>
             <w:shd w:val="clear" w:color="auto" w:fill="E0F7FA"/>
             <w:tcBorders>
               <w:top w:val="single" w:sz="4" w:space="0" w:color="CCCCCC"/>
@@ -930,129 +1059,6 @@
                 <w:sz w:val="19"/>
               </w:rPr>
               <w:t>3 — Sem prejuízo dos números anteriores, e relativamente aos cães, gatos e furões que sejam cedidos e ou comercializados a partir de um criador ou de um estabelecimento autorizado para a detenção de animais de companhia, nomeadamente os centros de hospedagem com ou sem fins lucrativos e os centros de recolha oficiais, deve ser assegurada a sua marcação e registo no SIAC antes de abandonarem a instalação de nascimento ou de alojamento, independentemente da sua idade.</w:t>
-            </w:r>
-          </w:p>
-        </w:tc>
-      </w:tr>
-    </w:tbl>
-    <w:p>
-      <w:pPr>
-        <w:spacing w:after="80"/>
-      </w:pPr>
-    </w:p>
-    <w:tbl>
-      <w:tblPr>
-        <w:tblLook w:firstColumn="1" w:firstRow="1" w:lastColumn="0" w:lastRow="0" w:noHBand="0" w:noVBand="1" w:val="04A0"/>
-        <w:tblW w:w="5000" w:type="pct"/>
-      </w:tblPr>
-      <w:tblGrid>
-        <w:gridCol w:w="15138"/>
-      </w:tblGrid>
-      <w:tr>
-        <w:tc>
-          <w:tcPr>
-            <w:tcW w:type="dxa" w:w="15138"/>
-            <w:shd w:val="clear" w:color="auto" w:fill="2471A3"/>
-            <w:tcBorders>
-              <w:top w:val="single" w:sz="4" w:space="0" w:color="CCCCCC"/>
-              <w:left w:val="single" w:sz="4" w:space="0" w:color="CCCCCC"/>
-              <w:bottom w:val="single" w:sz="4" w:space="0" w:color="CCCCCC"/>
-              <w:right w:val="single" w:sz="4" w:space="0" w:color="CCCCCC"/>
-            </w:tcBorders>
-          </w:tcPr>
-          <w:p>
-            <w:pPr>
-              <w:spacing w:before="80" w:after="80"/>
-              <w:jc w:val="center"/>
-            </w:pPr>
-            <w:r>
-              <w:rPr>
-                <w:rFonts w:ascii="Calibri" w:hAnsi="Calibri"/>
-                <w:b/>
-                <w:i w:val="0"/>
-                <w:color w:val="FFFFFF"/>
-                <w:sz w:val="18"/>
-              </w:rPr>
-              <w:t>Tradução do @regulamento (PT-PT)</w:t>
-            </w:r>
-          </w:p>
-        </w:tc>
-      </w:tr>
-      <w:tr>
-        <w:tc>
-          <w:tcPr>
-            <w:tcW w:type="dxa" w:w="15138"/>
-            <w:shd w:val="clear" w:color="auto" w:fill="EBF5FB"/>
-            <w:tcBorders>
-              <w:top w:val="single" w:sz="4" w:space="0" w:color="CCCCCC"/>
-              <w:left w:val="single" w:sz="4" w:space="0" w:color="CCCCCC"/>
-              <w:bottom w:val="single" w:sz="4" w:space="0" w:color="CCCCCC"/>
-              <w:right w:val="single" w:sz="4" w:space="0" w:color="CCCCCC"/>
-            </w:tcBorders>
-            <w:vAlign w:val="top"/>
-          </w:tcPr>
-          <w:p>
-            <w:pPr>
-              <w:spacing w:before="80" w:after="80"/>
-              <w:ind w:left="80" w:right="80"/>
-            </w:pPr>
-            <w:r>
-              <w:rPr>
-                <w:rFonts w:ascii="Calibri" w:hAnsi="Calibri"/>
-                <w:b w:val="0"/>
-                <w:i/>
-                <w:color w:val="222222"/>
-                <w:sz w:val="19"/>
-              </w:rPr>
-              <w:t>Todos os cães e gatos mantidos em estabelecimentos colocados no mercado ou detidos por donos de animais de companhia ou por qualquer outra pessoa singular ou coletiva devem ser identificados individualmente por meio de um único transponder injetável contendo um microchip legível em conformidade com o Anexo II.</w:t>
-            </w:r>
-          </w:p>
-          <w:p>
-            <w:pPr>
-              <w:spacing w:before="120" w:after="0"/>
-              <w:ind w:left="80"/>
-            </w:pPr>
-            <w:r>
-              <w:rPr>
-                <w:rFonts w:ascii="Calibri" w:hAnsi="Calibri"/>
-                <w:b w:val="0"/>
-                <w:i/>
-                <w:color w:val="222222"/>
-                <w:sz w:val="19"/>
-              </w:rPr>
-              <w:t>1a. Os operadores devem assegurar que os cães e gatos nascidos nos seus estabelecimentos sejam identificados individualmente no prazo de 3 meses após o nascimento e, em qualquer caso, antes da data da sua colocação no mercado.</w:t>
-            </w:r>
-          </w:p>
-          <w:p>
-            <w:pPr>
-              <w:spacing w:before="120" w:after="0"/>
-              <w:ind w:left="80"/>
-            </w:pPr>
-            <w:r>
-              <w:rPr>
-                <w:rFonts w:ascii="Calibri" w:hAnsi="Calibri"/>
-                <w:b w:val="0"/>
-                <w:i/>
-                <w:color w:val="222222"/>
-                <w:sz w:val="19"/>
-              </w:rPr>
-              <w:t>Os operadores de estabelecimentos de venda, abrigos e os que colocam e são responsáveis por cães e gatos em famílias de acolhimento devem assegurar que os cães e gatos que entrem nos seus estabelecimentos sejam identificados individualmente no prazo de 30 dias após a chegada.</w:t>
-            </w:r>
-          </w:p>
-          <w:p>
-            <w:pPr>
-              <w:spacing w:before="120" w:after="0"/>
-              <w:ind w:left="80"/>
-            </w:pPr>
-            <w:r>
-              <w:rPr>
-                <w:rFonts w:ascii="Calibri" w:hAnsi="Calibri"/>
-                <w:b w:val="0"/>
-                <w:i/>
-                <w:color w:val="222222"/>
-                <w:sz w:val="19"/>
-              </w:rPr>
-              <w:t>Os donos de animais de companhia e quaisquer outras pessoas singulares ou coletivas que detenham cães ou gatos devem assegurar que os animais sejam identificados individualmente o mais tardar quando o animal atingir os 3 meses de idade.</w:t>
             </w:r>
           </w:p>
         </w:tc>
@@ -1312,15 +1318,103 @@
         <w:tblW w:w="5000" w:type="pct"/>
       </w:tblPr>
       <w:tblGrid>
-        <w:gridCol w:w="3784"/>
-        <w:gridCol w:w="3784"/>
-        <w:gridCol w:w="3784"/>
-        <w:gridCol w:w="3784"/>
+        <w:gridCol w:w="15138"/>
       </w:tblGrid>
       <w:tr>
         <w:tc>
           <w:tcPr>
-            <w:tcW w:type="dxa" w:w="3784"/>
+            <w:tcW w:type="dxa" w:w="15138"/>
+            <w:shd w:val="clear" w:color="auto" w:fill="2471A3"/>
+            <w:tcBorders>
+              <w:top w:val="single" w:sz="4" w:space="0" w:color="CCCCCC"/>
+              <w:left w:val="single" w:sz="4" w:space="0" w:color="CCCCCC"/>
+              <w:bottom w:val="single" w:sz="4" w:space="0" w:color="CCCCCC"/>
+              <w:right w:val="single" w:sz="4" w:space="0" w:color="CCCCCC"/>
+            </w:tcBorders>
+          </w:tcPr>
+          <w:p>
+            <w:pPr>
+              <w:spacing w:before="80" w:after="80"/>
+              <w:jc w:val="center"/>
+            </w:pPr>
+            <w:r>
+              <w:rPr>
+                <w:rFonts w:ascii="Calibri" w:hAnsi="Calibri"/>
+                <w:b/>
+                <w:i w:val="0"/>
+                <w:color w:val="FFFFFF"/>
+                <w:sz w:val="18"/>
+              </w:rPr>
+              <w:t>@regulamento — Tradução PT-PT  ·  Art.º 6.º do Regulamento 2023/0447</w:t>
+            </w:r>
+          </w:p>
+        </w:tc>
+      </w:tr>
+      <w:tr>
+        <w:tc>
+          <w:tcPr>
+            <w:tcW w:type="dxa" w:w="15138"/>
+            <w:shd w:val="clear" w:color="auto" w:fill="EBF5FB"/>
+            <w:tcBorders>
+              <w:top w:val="single" w:sz="4" w:space="0" w:color="CCCCCC"/>
+              <w:left w:val="single" w:sz="4" w:space="0" w:color="CCCCCC"/>
+              <w:bottom w:val="single" w:sz="4" w:space="0" w:color="CCCCCC"/>
+              <w:right w:val="single" w:sz="4" w:space="0" w:color="CCCCCC"/>
+            </w:tcBorders>
+            <w:vAlign w:val="top"/>
+          </w:tcPr>
+          <w:p>
+            <w:pPr>
+              <w:spacing w:before="80" w:after="80"/>
+              <w:ind w:left="80" w:right="80"/>
+            </w:pPr>
+            <w:r>
+              <w:rPr>
+                <w:rFonts w:ascii="Calibri" w:hAnsi="Calibri"/>
+                <w:b w:val="0"/>
+                <w:i/>
+                <w:color w:val="222222"/>
+                <w:sz w:val="19"/>
+              </w:rPr>
+              <w:t>Os operadores são responsáveis pelo bem-estar dos cães ou gatos mantidos nos estabelecimentos sob a sua responsabilidade e controlo e devem minimizar quaisquer riscos para o seu bem-estar.</w:t>
+            </w:r>
+          </w:p>
+          <w:p>
+            <w:pPr>
+              <w:spacing w:before="120" w:after="0"/>
+              <w:ind w:left="80"/>
+            </w:pPr>
+            <w:r>
+              <w:rPr>
+                <w:rFonts w:ascii="Calibri" w:hAnsi="Calibri"/>
+                <w:b w:val="0"/>
+                <w:i/>
+                <w:color w:val="222222"/>
+                <w:sz w:val="19"/>
+              </w:rPr>
+              <w:t>1a. No caso de famílias de acolhimento, a responsabilidade recai sobre o operador em nome de quem os cães ou gatos são mantidos. Esses operadores não devem colocar mais do que um total de cinco cães ou gatos ou uma ninhada com ou sem mãe numa família de acolhimento em qualquer momento e devem fornecer à família de acolhimento informação adequada sobre as obrigações de bem-estar animal, bem como as necessidades individuais dos animais.</w:t>
+            </w:r>
+          </w:p>
+        </w:tc>
+      </w:tr>
+    </w:tbl>
+    <w:p>
+      <w:pPr>
+        <w:spacing w:after="80"/>
+      </w:pPr>
+    </w:p>
+    <w:tbl>
+      <w:tblPr>
+        <w:tblLook w:firstColumn="1" w:firstRow="1" w:lastColumn="0" w:lastRow="0" w:noHBand="0" w:noVBand="1" w:val="04A0"/>
+        <w:tblW w:w="5000" w:type="pct"/>
+      </w:tblPr>
+      <w:tblGrid>
+        <w:gridCol w:w="15138"/>
+      </w:tblGrid>
+      <w:tr>
+        <w:tc>
+          <w:tcPr>
+            <w:tcW w:type="dxa" w:w="15138"/>
             <w:shd w:val="clear" w:color="auto" w:fill="1A3A5C"/>
             <w:tcBorders>
               <w:top w:val="single" w:sz="4" w:space="0" w:color="CCCCCC"/>
@@ -1342,13 +1436,78 @@
                 <w:color w:val="FFFFFF"/>
                 <w:sz w:val="18"/>
               </w:rPr>
-              <w:t>@regulamento (texto original EN)</w:t>
+              <w:t>@regulamento — Texto original EN</w:t>
             </w:r>
           </w:p>
         </w:tc>
+      </w:tr>
+      <w:tr>
         <w:tc>
           <w:tcPr>
-            <w:tcW w:type="dxa" w:w="3784"/>
+            <w:tcW w:type="dxa" w:w="15138"/>
+            <w:shd w:val="clear" w:color="auto" w:fill="D6E4F0"/>
+            <w:tcBorders>
+              <w:top w:val="single" w:sz="4" w:space="0" w:color="CCCCCC"/>
+              <w:left w:val="single" w:sz="4" w:space="0" w:color="CCCCCC"/>
+              <w:bottom w:val="single" w:sz="4" w:space="0" w:color="CCCCCC"/>
+              <w:right w:val="single" w:sz="4" w:space="0" w:color="CCCCCC"/>
+            </w:tcBorders>
+            <w:vAlign w:val="top"/>
+          </w:tcPr>
+          <w:p>
+            <w:pPr>
+              <w:spacing w:before="80" w:after="80"/>
+              <w:ind w:left="80" w:right="80"/>
+            </w:pPr>
+            <w:r>
+              <w:rPr>
+                <w:rFonts w:ascii="Calibri" w:hAnsi="Calibri"/>
+                <w:b w:val="0"/>
+                <w:i w:val="0"/>
+                <w:color w:val="222222"/>
+                <w:sz w:val="19"/>
+              </w:rPr>
+              <w:t>Operators shall be responsible for the welfare of dogs or cats kept in the establishments under their responsibility and under their control and to minimise any risks to their welfare.</w:t>
+            </w:r>
+          </w:p>
+          <w:p>
+            <w:pPr>
+              <w:spacing w:before="120" w:after="0"/>
+              <w:ind w:left="80"/>
+            </w:pPr>
+            <w:r>
+              <w:rPr>
+                <w:rFonts w:ascii="Calibri" w:hAnsi="Calibri"/>
+                <w:b w:val="0"/>
+                <w:i w:val="0"/>
+                <w:color w:val="222222"/>
+                <w:sz w:val="19"/>
+              </w:rPr>
+              <w:t>1a. In the case of foster homes, the responsibility shall lie with the operator on whose behalf dogs or cats are kept. Such operators shall not place more than a total of five dogs or cats or one litter with or without mother in a foster home at any given time and shall provide the foster family with adequate information on the animal welfare obligations as well as the individual needs of the dogs or cats, and shall ensure that the relevant obligations set out by this Regulation are complied with in foster homes.</w:t>
+            </w:r>
+          </w:p>
+        </w:tc>
+      </w:tr>
+    </w:tbl>
+    <w:p>
+      <w:pPr>
+        <w:spacing w:after="80"/>
+      </w:pPr>
+    </w:p>
+    <w:tbl>
+      <w:tblPr>
+        <w:tblLook w:firstColumn="1" w:firstRow="1" w:lastColumn="0" w:lastRow="0" w:noHBand="0" w:noVBand="1" w:val="04A0"/>
+        <w:tblW w:w="5000" w:type="pct"/>
+      </w:tblPr>
+      <w:tblGrid>
+        <w:gridCol w:w="5046"/>
+        <w:gridCol w:w="5046"/>
+        <w:gridCol w:w="5046"/>
+      </w:tblGrid>
+      <w:tr>
+        <w:tc>
+          <w:tcPr>
+            <w:tcW w:type="dxa" w:w="5046"/>
             <w:shd w:val="clear" w:color="auto" w:fill="1E5631"/>
             <w:tcBorders>
               <w:top w:val="single" w:sz="4" w:space="0" w:color="CCCCCC"/>
@@ -1376,7 +1535,7 @@
         </w:tc>
         <w:tc>
           <w:tcPr>
-            <w:tcW w:type="dxa" w:w="3784"/>
+            <w:tcW w:type="dxa" w:w="5046"/>
             <w:shd w:val="clear" w:color="auto" w:fill="7E4C00"/>
             <w:tcBorders>
               <w:top w:val="single" w:sz="4" w:space="0" w:color="CCCCCC"/>
@@ -1404,7 +1563,7 @@
         </w:tc>
         <w:tc>
           <w:tcPr>
-            <w:tcW w:type="dxa" w:w="3784"/>
+            <w:tcW w:type="dxa" w:w="5046"/>
             <w:shd w:val="clear" w:color="auto" w:fill="006064"/>
             <w:tcBorders>
               <w:top w:val="single" w:sz="4" w:space="0" w:color="CCCCCC"/>
@@ -1434,63 +1593,7 @@
       <w:tr>
         <w:tc>
           <w:tcPr>
-            <w:tcW w:type="dxa" w:w="3784"/>
-            <w:shd w:val="clear" w:color="auto" w:fill="D6E4F0"/>
-            <w:tcBorders>
-              <w:top w:val="single" w:sz="4" w:space="0" w:color="CCCCCC"/>
-              <w:left w:val="single" w:sz="4" w:space="0" w:color="CCCCCC"/>
-              <w:bottom w:val="single" w:sz="4" w:space="0" w:color="CCCCCC"/>
-              <w:right w:val="single" w:sz="4" w:space="0" w:color="CCCCCC"/>
-            </w:tcBorders>
-            <w:vAlign w:val="top"/>
-          </w:tcPr>
-          <w:p>
-            <w:pPr>
-              <w:spacing w:before="80" w:after="80"/>
-              <w:ind w:left="80" w:right="80"/>
-            </w:pPr>
-            <w:r>
-              <w:rPr>
-                <w:rFonts w:ascii="Calibri" w:hAnsi="Calibri"/>
-                <w:b/>
-                <w:i/>
-                <w:color w:val="555555"/>
-                <w:sz w:val="16"/>
-              </w:rPr>
-              <w:t>Art.º 6.º do Regulamento 2023/0447</w:t>
-              <w:br/>
-            </w:r>
-            <w:r>
-              <w:rPr>
-                <w:rFonts w:ascii="Calibri" w:hAnsi="Calibri"/>
-                <w:b w:val="0"/>
-                <w:i w:val="0"/>
-                <w:color w:val="222222"/>
-                <w:sz w:val="19"/>
-              </w:rPr>
-              <w:t>Operators shall be responsible for the welfare of dogs or cats kept in the establishments under their responsibility and under their control and to minimise any risks to their welfare.</w:t>
-            </w:r>
-          </w:p>
-          <w:p>
-            <w:pPr>
-              <w:spacing w:before="120" w:after="0"/>
-              <w:ind w:left="80"/>
-            </w:pPr>
-            <w:r>
-              <w:rPr>
-                <w:rFonts w:ascii="Calibri" w:hAnsi="Calibri"/>
-                <w:b w:val="0"/>
-                <w:i w:val="0"/>
-                <w:color w:val="222222"/>
-                <w:sz w:val="19"/>
-              </w:rPr>
-              <w:t>1a. In the case of foster homes, the responsibility shall lie with the operator on whose behalf dogs or cats are kept. Such operators shall not place more than a total of five dogs or cats or one litter with or without mother in a foster home at any given time and shall provide the foster family with adequate information on the animal welfare obligations as well as the individual needs of the dogs or cats, and shall ensure that the relevant obligations set out by this Regulation are complied with in foster homes.</w:t>
-            </w:r>
-          </w:p>
-        </w:tc>
-        <w:tc>
-          <w:tcPr>
-            <w:tcW w:type="dxa" w:w="3784"/>
+            <w:tcW w:type="dxa" w:w="5046"/>
             <w:shd w:val="clear" w:color="auto" w:fill="D5E8D4"/>
             <w:tcBorders>
               <w:top w:val="single" w:sz="4" w:space="0" w:color="CCCCCC"/>
@@ -1554,7 +1657,7 @@
         </w:tc>
         <w:tc>
           <w:tcPr>
-            <w:tcW w:type="dxa" w:w="3784"/>
+            <w:tcW w:type="dxa" w:w="5046"/>
             <w:shd w:val="clear" w:color="auto" w:fill="FFE6CC"/>
             <w:tcBorders>
               <w:top w:val="single" w:sz="4" w:space="0" w:color="CCCCCC"/>
@@ -1626,7 +1729,7 @@
         </w:tc>
         <w:tc>
           <w:tcPr>
-            <w:tcW w:type="dxa" w:w="3784"/>
+            <w:tcW w:type="dxa" w:w="5046"/>
             <w:shd w:val="clear" w:color="auto" w:fill="E0F7FA"/>
             <w:tcBorders>
               <w:top w:val="single" w:sz="4" w:space="0" w:color="CCCCCC"/>
@@ -1693,97 +1796,6 @@
                 <w:sz w:val="19"/>
               </w:rPr>
               <w:t>3 — São proibidas todas as violências contra animais, considerando-se como tais os atos consistentes em, sem necessidade, se infligir a morte, o sofrimento ou lesões a um animal.</w:t>
-            </w:r>
-          </w:p>
-        </w:tc>
-      </w:tr>
-    </w:tbl>
-    <w:p>
-      <w:pPr>
-        <w:spacing w:after="80"/>
-      </w:pPr>
-    </w:p>
-    <w:tbl>
-      <w:tblPr>
-        <w:tblLook w:firstColumn="1" w:firstRow="1" w:lastColumn="0" w:lastRow="0" w:noHBand="0" w:noVBand="1" w:val="04A0"/>
-        <w:tblW w:w="5000" w:type="pct"/>
-      </w:tblPr>
-      <w:tblGrid>
-        <w:gridCol w:w="15138"/>
-      </w:tblGrid>
-      <w:tr>
-        <w:tc>
-          <w:tcPr>
-            <w:tcW w:type="dxa" w:w="15138"/>
-            <w:shd w:val="clear" w:color="auto" w:fill="2471A3"/>
-            <w:tcBorders>
-              <w:top w:val="single" w:sz="4" w:space="0" w:color="CCCCCC"/>
-              <w:left w:val="single" w:sz="4" w:space="0" w:color="CCCCCC"/>
-              <w:bottom w:val="single" w:sz="4" w:space="0" w:color="CCCCCC"/>
-              <w:right w:val="single" w:sz="4" w:space="0" w:color="CCCCCC"/>
-            </w:tcBorders>
-          </w:tcPr>
-          <w:p>
-            <w:pPr>
-              <w:spacing w:before="80" w:after="80"/>
-              <w:jc w:val="center"/>
-            </w:pPr>
-            <w:r>
-              <w:rPr>
-                <w:rFonts w:ascii="Calibri" w:hAnsi="Calibri"/>
-                <w:b/>
-                <w:i w:val="0"/>
-                <w:color w:val="FFFFFF"/>
-                <w:sz w:val="18"/>
-              </w:rPr>
-              <w:t>Tradução do @regulamento (PT-PT)</w:t>
-            </w:r>
-          </w:p>
-        </w:tc>
-      </w:tr>
-      <w:tr>
-        <w:tc>
-          <w:tcPr>
-            <w:tcW w:type="dxa" w:w="15138"/>
-            <w:shd w:val="clear" w:color="auto" w:fill="EBF5FB"/>
-            <w:tcBorders>
-              <w:top w:val="single" w:sz="4" w:space="0" w:color="CCCCCC"/>
-              <w:left w:val="single" w:sz="4" w:space="0" w:color="CCCCCC"/>
-              <w:bottom w:val="single" w:sz="4" w:space="0" w:color="CCCCCC"/>
-              <w:right w:val="single" w:sz="4" w:space="0" w:color="CCCCCC"/>
-            </w:tcBorders>
-            <w:vAlign w:val="top"/>
-          </w:tcPr>
-          <w:p>
-            <w:pPr>
-              <w:spacing w:before="80" w:after="80"/>
-              <w:ind w:left="80" w:right="80"/>
-            </w:pPr>
-            <w:r>
-              <w:rPr>
-                <w:rFonts w:ascii="Calibri" w:hAnsi="Calibri"/>
-                <w:b w:val="0"/>
-                <w:i/>
-                <w:color w:val="222222"/>
-                <w:sz w:val="19"/>
-              </w:rPr>
-              <w:t>Os operadores são responsáveis pelo bem-estar dos cães ou gatos mantidos nos estabelecimentos sob a sua responsabilidade e controlo e devem minimizar quaisquer riscos para o seu bem-estar.</w:t>
-            </w:r>
-          </w:p>
-          <w:p>
-            <w:pPr>
-              <w:spacing w:before="120" w:after="0"/>
-              <w:ind w:left="80"/>
-            </w:pPr>
-            <w:r>
-              <w:rPr>
-                <w:rFonts w:ascii="Calibri" w:hAnsi="Calibri"/>
-                <w:b w:val="0"/>
-                <w:i/>
-                <w:color w:val="222222"/>
-                <w:sz w:val="19"/>
-              </w:rPr>
-              <w:t>1a. No caso de famílias de acolhimento, a responsabilidade recai sobre o operador em nome de quem os cães ou gatos são mantidos. Esses operadores não devem colocar mais do que um total de cinco cães ou gatos ou uma ninhada com ou sem mãe numa família de acolhimento em qualquer momento e devem fornecer à família de acolhimento informação adequada sobre as obrigações de bem-estar animal, bem como as necessidades individuais dos animais.</w:t>
             </w:r>
           </w:p>
         </w:tc>
@@ -2043,15 +2055,113 @@
         <w:tblW w:w="5000" w:type="pct"/>
       </w:tblPr>
       <w:tblGrid>
-        <w:gridCol w:w="3784"/>
-        <w:gridCol w:w="3784"/>
-        <w:gridCol w:w="3784"/>
-        <w:gridCol w:w="3784"/>
+        <w:gridCol w:w="15138"/>
       </w:tblGrid>
       <w:tr>
         <w:tc>
           <w:tcPr>
-            <w:tcW w:type="dxa" w:w="3784"/>
+            <w:tcW w:type="dxa" w:w="15138"/>
+            <w:shd w:val="clear" w:color="auto" w:fill="2471A3"/>
+            <w:tcBorders>
+              <w:top w:val="single" w:sz="4" w:space="0" w:color="CCCCCC"/>
+              <w:left w:val="single" w:sz="4" w:space="0" w:color="CCCCCC"/>
+              <w:bottom w:val="single" w:sz="4" w:space="0" w:color="CCCCCC"/>
+              <w:right w:val="single" w:sz="4" w:space="0" w:color="CCCCCC"/>
+            </w:tcBorders>
+          </w:tcPr>
+          <w:p>
+            <w:pPr>
+              <w:spacing w:before="80" w:after="80"/>
+              <w:jc w:val="center"/>
+            </w:pPr>
+            <w:r>
+              <w:rPr>
+                <w:rFonts w:ascii="Calibri" w:hAnsi="Calibri"/>
+                <w:b/>
+                <w:i w:val="0"/>
+                <w:color w:val="FFFFFF"/>
+                <w:sz w:val="18"/>
+              </w:rPr>
+              <w:t>@regulamento — Tradução PT-PT  ·  Art.º 7.º do Regulamento 2023/0447</w:t>
+            </w:r>
+          </w:p>
+        </w:tc>
+      </w:tr>
+      <w:tr>
+        <w:tc>
+          <w:tcPr>
+            <w:tcW w:type="dxa" w:w="15138"/>
+            <w:shd w:val="clear" w:color="auto" w:fill="EBF5FB"/>
+            <w:tcBorders>
+              <w:top w:val="single" w:sz="4" w:space="0" w:color="CCCCCC"/>
+              <w:left w:val="single" w:sz="4" w:space="0" w:color="CCCCCC"/>
+              <w:bottom w:val="single" w:sz="4" w:space="0" w:color="CCCCCC"/>
+              <w:right w:val="single" w:sz="4" w:space="0" w:color="CCCCCC"/>
+            </w:tcBorders>
+            <w:vAlign w:val="top"/>
+          </w:tcPr>
+          <w:p>
+            <w:pPr>
+              <w:spacing w:before="80" w:after="80"/>
+              <w:ind w:left="80" w:right="80"/>
+            </w:pPr>
+            <w:r>
+              <w:rPr>
+                <w:rFonts w:ascii="Calibri" w:hAnsi="Calibri"/>
+                <w:b w:val="0"/>
+                <w:i/>
+                <w:color w:val="222222"/>
+                <w:sz w:val="19"/>
+              </w:rPr>
+              <w:t>Os operadores devem notificar as autoridades competentes da sua atividade, fornecendo pelo menos as seguintes informações:</w:t>
+            </w:r>
+          </w:p>
+          <w:p>
+            <w:pPr>
+              <w:spacing w:before="120" w:after="0"/>
+              <w:ind w:left="80"/>
+            </w:pPr>
+            <w:r>
+              <w:rPr>
+                <w:rFonts w:ascii="Calibri" w:hAnsi="Calibri"/>
+                <w:b w:val="0"/>
+                <w:i/>
+                <w:color w:val="222222"/>
+                <w:sz w:val="19"/>
+              </w:rPr>
+              <w:t>(a) nome, morada e contactos do operador;</w:t>
+              <w:br/>
+              <w:t>(b) a(s) localização(ões) do(s) estabelecimento(s);</w:t>
+              <w:br/>
+              <w:t>(c) o tipo de estabelecimento: criação, venda, abrigo ou família de acolhimento;</w:t>
+              <w:br/>
+              <w:t>(d) as espécies e, para os estabelecimentos de criação, as raças dos cães ou gatos mantidos;</w:t>
+              <w:br/>
+              <w:t>(e) a capacidade do estabelecimento, expressa no número máximo de cães e gatos que podem ser alojados;</w:t>
+              <w:br/>
+              <w:t>(ea) para os estabelecimentos de criação, o número estimado de ninhadas a colocar no mercado por ano.</w:t>
+            </w:r>
+          </w:p>
+        </w:tc>
+      </w:tr>
+    </w:tbl>
+    <w:p>
+      <w:pPr>
+        <w:spacing w:after="80"/>
+      </w:pPr>
+    </w:p>
+    <w:tbl>
+      <w:tblPr>
+        <w:tblLook w:firstColumn="1" w:firstRow="1" w:lastColumn="0" w:lastRow="0" w:noHBand="0" w:noVBand="1" w:val="04A0"/>
+        <w:tblW w:w="5000" w:type="pct"/>
+      </w:tblPr>
+      <w:tblGrid>
+        <w:gridCol w:w="15138"/>
+      </w:tblGrid>
+      <w:tr>
+        <w:tc>
+          <w:tcPr>
+            <w:tcW w:type="dxa" w:w="15138"/>
             <w:shd w:val="clear" w:color="auto" w:fill="1A3A5C"/>
             <w:tcBorders>
               <w:top w:val="single" w:sz="4" w:space="0" w:color="CCCCCC"/>
@@ -2073,91 +2183,7 @@
                 <w:color w:val="FFFFFF"/>
                 <w:sz w:val="18"/>
               </w:rPr>
-              <w:t>@regulamento (texto original EN)</w:t>
-            </w:r>
-          </w:p>
-        </w:tc>
-        <w:tc>
-          <w:tcPr>
-            <w:tcW w:type="dxa" w:w="3784"/>
-            <w:shd w:val="clear" w:color="auto" w:fill="1E5631"/>
-            <w:tcBorders>
-              <w:top w:val="single" w:sz="4" w:space="0" w:color="CCCCCC"/>
-              <w:left w:val="single" w:sz="4" w:space="0" w:color="CCCCCC"/>
-              <w:bottom w:val="single" w:sz="4" w:space="0" w:color="CCCCCC"/>
-              <w:right w:val="single" w:sz="4" w:space="0" w:color="CCCCCC"/>
-            </w:tcBorders>
-          </w:tcPr>
-          <w:p>
-            <w:pPr>
-              <w:spacing w:before="80" w:after="80"/>
-              <w:jc w:val="center"/>
-            </w:pPr>
-            <w:r>
-              <w:rPr>
-                <w:rFonts w:ascii="Calibri" w:hAnsi="Calibri"/>
-                <w:b/>
-                <w:i w:val="0"/>
-                <w:color w:val="FFFFFF"/>
-                <w:sz w:val="18"/>
-              </w:rPr>
-              <w:t>@rgbeac (proposta jun. 2025)</w:t>
-            </w:r>
-          </w:p>
-        </w:tc>
-        <w:tc>
-          <w:tcPr>
-            <w:tcW w:type="dxa" w:w="3784"/>
-            <w:shd w:val="clear" w:color="auto" w:fill="7E4C00"/>
-            <w:tcBorders>
-              <w:top w:val="single" w:sz="4" w:space="0" w:color="CCCCCC"/>
-              <w:left w:val="single" w:sz="4" w:space="0" w:color="CCCCCC"/>
-              <w:bottom w:val="single" w:sz="4" w:space="0" w:color="CCCCCC"/>
-              <w:right w:val="single" w:sz="4" w:space="0" w:color="CCCCCC"/>
-            </w:tcBorders>
-          </w:tcPr>
-          <w:p>
-            <w:pPr>
-              <w:spacing w:before="80" w:after="80"/>
-              <w:jc w:val="center"/>
-            </w:pPr>
-            <w:r>
-              <w:rPr>
-                <w:rFonts w:ascii="Calibri" w:hAnsi="Calibri"/>
-                <w:b/>
-                <w:i w:val="0"/>
-                <w:color w:val="FFFFFF"/>
-                <w:sz w:val="18"/>
-              </w:rPr>
-              <w:t>@codigo (DL n.º 214/2013)</w:t>
-            </w:r>
-          </w:p>
-        </w:tc>
-        <w:tc>
-          <w:tcPr>
-            <w:tcW w:type="dxa" w:w="3784"/>
-            <w:shd w:val="clear" w:color="auto" w:fill="006064"/>
-            <w:tcBorders>
-              <w:top w:val="single" w:sz="4" w:space="0" w:color="CCCCCC"/>
-              <w:left w:val="single" w:sz="4" w:space="0" w:color="CCCCCC"/>
-              <w:bottom w:val="single" w:sz="4" w:space="0" w:color="CCCCCC"/>
-              <w:right w:val="single" w:sz="4" w:space="0" w:color="CCCCCC"/>
-            </w:tcBorders>
-          </w:tcPr>
-          <w:p>
-            <w:pPr>
-              <w:spacing w:before="80" w:after="80"/>
-              <w:jc w:val="center"/>
-            </w:pPr>
-            <w:r>
-              <w:rPr>
-                <w:rFonts w:ascii="Calibri" w:hAnsi="Calibri"/>
-                <w:b/>
-                <w:i w:val="0"/>
-                <w:color w:val="FFFFFF"/>
-                <w:sz w:val="18"/>
-              </w:rPr>
-              <w:t>@legislacao (legislação vigente)</w:t>
+              <w:t>@regulamento — Texto original EN</w:t>
             </w:r>
           </w:p>
         </w:tc>
@@ -2165,7 +2191,7 @@
       <w:tr>
         <w:tc>
           <w:tcPr>
-            <w:tcW w:type="dxa" w:w="3784"/>
+            <w:tcW w:type="dxa" w:w="15138"/>
             <w:shd w:val="clear" w:color="auto" w:fill="D6E4F0"/>
             <w:tcBorders>
               <w:top w:val="single" w:sz="4" w:space="0" w:color="CCCCCC"/>
@@ -2180,17 +2206,6 @@
               <w:spacing w:before="80" w:after="80"/>
               <w:ind w:left="80" w:right="80"/>
             </w:pPr>
-            <w:r>
-              <w:rPr>
-                <w:rFonts w:ascii="Calibri" w:hAnsi="Calibri"/>
-                <w:b/>
-                <w:i/>
-                <w:color w:val="555555"/>
-                <w:sz w:val="16"/>
-              </w:rPr>
-              <w:t>Art.º 7.º do Regulamento 2023/0447</w:t>
-              <w:br/>
-            </w:r>
             <w:r>
               <w:rPr>
                 <w:rFonts w:ascii="Calibri" w:hAnsi="Calibri"/>
@@ -2229,9 +2244,113 @@
             </w:r>
           </w:p>
         </w:tc>
+      </w:tr>
+    </w:tbl>
+    <w:p>
+      <w:pPr>
+        <w:spacing w:after="80"/>
+      </w:pPr>
+    </w:p>
+    <w:tbl>
+      <w:tblPr>
+        <w:tblLook w:firstColumn="1" w:firstRow="1" w:lastColumn="0" w:lastRow="0" w:noHBand="0" w:noVBand="1" w:val="04A0"/>
+        <w:tblW w:w="5000" w:type="pct"/>
+      </w:tblPr>
+      <w:tblGrid>
+        <w:gridCol w:w="5046"/>
+        <w:gridCol w:w="5046"/>
+        <w:gridCol w:w="5046"/>
+      </w:tblGrid>
+      <w:tr>
         <w:tc>
           <w:tcPr>
-            <w:tcW w:type="dxa" w:w="3784"/>
+            <w:tcW w:type="dxa" w:w="5046"/>
+            <w:shd w:val="clear" w:color="auto" w:fill="1E5631"/>
+            <w:tcBorders>
+              <w:top w:val="single" w:sz="4" w:space="0" w:color="CCCCCC"/>
+              <w:left w:val="single" w:sz="4" w:space="0" w:color="CCCCCC"/>
+              <w:bottom w:val="single" w:sz="4" w:space="0" w:color="CCCCCC"/>
+              <w:right w:val="single" w:sz="4" w:space="0" w:color="CCCCCC"/>
+            </w:tcBorders>
+          </w:tcPr>
+          <w:p>
+            <w:pPr>
+              <w:spacing w:before="80" w:after="80"/>
+              <w:jc w:val="center"/>
+            </w:pPr>
+            <w:r>
+              <w:rPr>
+                <w:rFonts w:ascii="Calibri" w:hAnsi="Calibri"/>
+                <w:b/>
+                <w:i w:val="0"/>
+                <w:color w:val="FFFFFF"/>
+                <w:sz w:val="18"/>
+              </w:rPr>
+              <w:t>@rgbeac (proposta jun. 2025)</w:t>
+            </w:r>
+          </w:p>
+        </w:tc>
+        <w:tc>
+          <w:tcPr>
+            <w:tcW w:type="dxa" w:w="5046"/>
+            <w:shd w:val="clear" w:color="auto" w:fill="7E4C00"/>
+            <w:tcBorders>
+              <w:top w:val="single" w:sz="4" w:space="0" w:color="CCCCCC"/>
+              <w:left w:val="single" w:sz="4" w:space="0" w:color="CCCCCC"/>
+              <w:bottom w:val="single" w:sz="4" w:space="0" w:color="CCCCCC"/>
+              <w:right w:val="single" w:sz="4" w:space="0" w:color="CCCCCC"/>
+            </w:tcBorders>
+          </w:tcPr>
+          <w:p>
+            <w:pPr>
+              <w:spacing w:before="80" w:after="80"/>
+              <w:jc w:val="center"/>
+            </w:pPr>
+            <w:r>
+              <w:rPr>
+                <w:rFonts w:ascii="Calibri" w:hAnsi="Calibri"/>
+                <w:b/>
+                <w:i w:val="0"/>
+                <w:color w:val="FFFFFF"/>
+                <w:sz w:val="18"/>
+              </w:rPr>
+              <w:t>@codigo (DL n.º 214/2013)</w:t>
+            </w:r>
+          </w:p>
+        </w:tc>
+        <w:tc>
+          <w:tcPr>
+            <w:tcW w:type="dxa" w:w="5046"/>
+            <w:shd w:val="clear" w:color="auto" w:fill="006064"/>
+            <w:tcBorders>
+              <w:top w:val="single" w:sz="4" w:space="0" w:color="CCCCCC"/>
+              <w:left w:val="single" w:sz="4" w:space="0" w:color="CCCCCC"/>
+              <w:bottom w:val="single" w:sz="4" w:space="0" w:color="CCCCCC"/>
+              <w:right w:val="single" w:sz="4" w:space="0" w:color="CCCCCC"/>
+            </w:tcBorders>
+          </w:tcPr>
+          <w:p>
+            <w:pPr>
+              <w:spacing w:before="80" w:after="80"/>
+              <w:jc w:val="center"/>
+            </w:pPr>
+            <w:r>
+              <w:rPr>
+                <w:rFonts w:ascii="Calibri" w:hAnsi="Calibri"/>
+                <w:b/>
+                <w:i w:val="0"/>
+                <w:color w:val="FFFFFF"/>
+                <w:sz w:val="18"/>
+              </w:rPr>
+              <w:t>@legislacao (legislação vigente)</w:t>
+            </w:r>
+          </w:p>
+        </w:tc>
+      </w:tr>
+      <w:tr>
+        <w:tc>
+          <w:tcPr>
+            <w:tcW w:type="dxa" w:w="5046"/>
             <w:shd w:val="clear" w:color="auto" w:fill="D5E8D4"/>
             <w:tcBorders>
               <w:top w:val="single" w:sz="4" w:space="0" w:color="CCCCCC"/>
@@ -2303,7 +2422,7 @@
         </w:tc>
         <w:tc>
           <w:tcPr>
-            <w:tcW w:type="dxa" w:w="3784"/>
+            <w:tcW w:type="dxa" w:w="5046"/>
             <w:shd w:val="clear" w:color="auto" w:fill="FFE6CC"/>
             <w:tcBorders>
               <w:top w:val="single" w:sz="4" w:space="0" w:color="CCCCCC"/>
@@ -2407,7 +2526,7 @@
         </w:tc>
         <w:tc>
           <w:tcPr>
-            <w:tcW w:type="dxa" w:w="3784"/>
+            <w:tcW w:type="dxa" w:w="5046"/>
             <w:shd w:val="clear" w:color="auto" w:fill="E0F7FA"/>
             <w:tcBorders>
               <w:top w:val="single" w:sz="4" w:space="0" w:color="CCCCCC"/>
@@ -2476,107 +2595,6 @@
               <w:t>i) O número de animais detidos, espécies e raças;</w:t>
               <w:br/>
               <w:t>j) Declaração de responsabilidade, subscrita pelo interessado, relativa ao cumprimento da legislação aplicável aos animais de companhia, nomeadamente em matéria de instalações, equipamentos, higiene, saúde e bem-estar dos animais.</w:t>
-            </w:r>
-          </w:p>
-        </w:tc>
-      </w:tr>
-    </w:tbl>
-    <w:p>
-      <w:pPr>
-        <w:spacing w:after="80"/>
-      </w:pPr>
-    </w:p>
-    <w:tbl>
-      <w:tblPr>
-        <w:tblLook w:firstColumn="1" w:firstRow="1" w:lastColumn="0" w:lastRow="0" w:noHBand="0" w:noVBand="1" w:val="04A0"/>
-        <w:tblW w:w="5000" w:type="pct"/>
-      </w:tblPr>
-      <w:tblGrid>
-        <w:gridCol w:w="15138"/>
-      </w:tblGrid>
-      <w:tr>
-        <w:tc>
-          <w:tcPr>
-            <w:tcW w:type="dxa" w:w="15138"/>
-            <w:shd w:val="clear" w:color="auto" w:fill="2471A3"/>
-            <w:tcBorders>
-              <w:top w:val="single" w:sz="4" w:space="0" w:color="CCCCCC"/>
-              <w:left w:val="single" w:sz="4" w:space="0" w:color="CCCCCC"/>
-              <w:bottom w:val="single" w:sz="4" w:space="0" w:color="CCCCCC"/>
-              <w:right w:val="single" w:sz="4" w:space="0" w:color="CCCCCC"/>
-            </w:tcBorders>
-          </w:tcPr>
-          <w:p>
-            <w:pPr>
-              <w:spacing w:before="80" w:after="80"/>
-              <w:jc w:val="center"/>
-            </w:pPr>
-            <w:r>
-              <w:rPr>
-                <w:rFonts w:ascii="Calibri" w:hAnsi="Calibri"/>
-                <w:b/>
-                <w:i w:val="0"/>
-                <w:color w:val="FFFFFF"/>
-                <w:sz w:val="18"/>
-              </w:rPr>
-              <w:t>Tradução do @regulamento (PT-PT)</w:t>
-            </w:r>
-          </w:p>
-        </w:tc>
-      </w:tr>
-      <w:tr>
-        <w:tc>
-          <w:tcPr>
-            <w:tcW w:type="dxa" w:w="15138"/>
-            <w:shd w:val="clear" w:color="auto" w:fill="EBF5FB"/>
-            <w:tcBorders>
-              <w:top w:val="single" w:sz="4" w:space="0" w:color="CCCCCC"/>
-              <w:left w:val="single" w:sz="4" w:space="0" w:color="CCCCCC"/>
-              <w:bottom w:val="single" w:sz="4" w:space="0" w:color="CCCCCC"/>
-              <w:right w:val="single" w:sz="4" w:space="0" w:color="CCCCCC"/>
-            </w:tcBorders>
-            <w:vAlign w:val="top"/>
-          </w:tcPr>
-          <w:p>
-            <w:pPr>
-              <w:spacing w:before="80" w:after="80"/>
-              <w:ind w:left="80" w:right="80"/>
-            </w:pPr>
-            <w:r>
-              <w:rPr>
-                <w:rFonts w:ascii="Calibri" w:hAnsi="Calibri"/>
-                <w:b w:val="0"/>
-                <w:i/>
-                <w:color w:val="222222"/>
-                <w:sz w:val="19"/>
-              </w:rPr>
-              <w:t>Os operadores devem notificar as autoridades competentes da sua atividade, fornecendo pelo menos as seguintes informações:</w:t>
-            </w:r>
-          </w:p>
-          <w:p>
-            <w:pPr>
-              <w:spacing w:before="120" w:after="0"/>
-              <w:ind w:left="80"/>
-            </w:pPr>
-            <w:r>
-              <w:rPr>
-                <w:rFonts w:ascii="Calibri" w:hAnsi="Calibri"/>
-                <w:b w:val="0"/>
-                <w:i/>
-                <w:color w:val="222222"/>
-                <w:sz w:val="19"/>
-              </w:rPr>
-              <w:t>(a) nome, morada e contactos do operador;</w:t>
-              <w:br/>
-              <w:t>(b) a(s) localização(ões) do(s) estabelecimento(s);</w:t>
-              <w:br/>
-              <w:t>(c) o tipo de estabelecimento: criação, venda, abrigo ou família de acolhimento;</w:t>
-              <w:br/>
-              <w:t>(d) as espécies e, para os estabelecimentos de criação, as raças dos cães ou gatos mantidos;</w:t>
-              <w:br/>
-              <w:t>(e) a capacidade do estabelecimento, expressa no número máximo de cães e gatos que podem ser alojados;</w:t>
-              <w:br/>
-              <w:t>(ea) para os estabelecimentos de criação, o número estimado de ninhadas a colocar no mercado por ano.</w:t>
             </w:r>
           </w:p>
         </w:tc>
@@ -2836,455 +2854,6 @@
         <w:tblW w:w="5000" w:type="pct"/>
       </w:tblPr>
       <w:tblGrid>
-        <w:gridCol w:w="3784"/>
-        <w:gridCol w:w="3784"/>
-        <w:gridCol w:w="3784"/>
-        <w:gridCol w:w="3784"/>
-      </w:tblGrid>
-      <w:tr>
-        <w:tc>
-          <w:tcPr>
-            <w:tcW w:type="dxa" w:w="3784"/>
-            <w:shd w:val="clear" w:color="auto" w:fill="1A3A5C"/>
-            <w:tcBorders>
-              <w:top w:val="single" w:sz="4" w:space="0" w:color="CCCCCC"/>
-              <w:left w:val="single" w:sz="4" w:space="0" w:color="CCCCCC"/>
-              <w:bottom w:val="single" w:sz="4" w:space="0" w:color="CCCCCC"/>
-              <w:right w:val="single" w:sz="4" w:space="0" w:color="CCCCCC"/>
-            </w:tcBorders>
-          </w:tcPr>
-          <w:p>
-            <w:pPr>
-              <w:spacing w:before="80" w:after="80"/>
-              <w:jc w:val="center"/>
-            </w:pPr>
-            <w:r>
-              <w:rPr>
-                <w:rFonts w:ascii="Calibri" w:hAnsi="Calibri"/>
-                <w:b/>
-                <w:i w:val="0"/>
-                <w:color w:val="FFFFFF"/>
-                <w:sz w:val="18"/>
-              </w:rPr>
-              <w:t>@regulamento (texto original EN)</w:t>
-            </w:r>
-          </w:p>
-        </w:tc>
-        <w:tc>
-          <w:tcPr>
-            <w:tcW w:type="dxa" w:w="3784"/>
-            <w:shd w:val="clear" w:color="auto" w:fill="1E5631"/>
-            <w:tcBorders>
-              <w:top w:val="single" w:sz="4" w:space="0" w:color="CCCCCC"/>
-              <w:left w:val="single" w:sz="4" w:space="0" w:color="CCCCCC"/>
-              <w:bottom w:val="single" w:sz="4" w:space="0" w:color="CCCCCC"/>
-              <w:right w:val="single" w:sz="4" w:space="0" w:color="CCCCCC"/>
-            </w:tcBorders>
-          </w:tcPr>
-          <w:p>
-            <w:pPr>
-              <w:spacing w:before="80" w:after="80"/>
-              <w:jc w:val="center"/>
-            </w:pPr>
-            <w:r>
-              <w:rPr>
-                <w:rFonts w:ascii="Calibri" w:hAnsi="Calibri"/>
-                <w:b/>
-                <w:i w:val="0"/>
-                <w:color w:val="FFFFFF"/>
-                <w:sz w:val="18"/>
-              </w:rPr>
-              <w:t>@rgbeac (proposta jun. 2025)</w:t>
-            </w:r>
-          </w:p>
-        </w:tc>
-        <w:tc>
-          <w:tcPr>
-            <w:tcW w:type="dxa" w:w="3784"/>
-            <w:shd w:val="clear" w:color="auto" w:fill="7E4C00"/>
-            <w:tcBorders>
-              <w:top w:val="single" w:sz="4" w:space="0" w:color="CCCCCC"/>
-              <w:left w:val="single" w:sz="4" w:space="0" w:color="CCCCCC"/>
-              <w:bottom w:val="single" w:sz="4" w:space="0" w:color="CCCCCC"/>
-              <w:right w:val="single" w:sz="4" w:space="0" w:color="CCCCCC"/>
-            </w:tcBorders>
-          </w:tcPr>
-          <w:p>
-            <w:pPr>
-              <w:spacing w:before="80" w:after="80"/>
-              <w:jc w:val="center"/>
-            </w:pPr>
-            <w:r>
-              <w:rPr>
-                <w:rFonts w:ascii="Calibri" w:hAnsi="Calibri"/>
-                <w:b/>
-                <w:i w:val="0"/>
-                <w:color w:val="FFFFFF"/>
-                <w:sz w:val="18"/>
-              </w:rPr>
-              <w:t>@codigo (DL n.º 214/2013)</w:t>
-            </w:r>
-          </w:p>
-        </w:tc>
-        <w:tc>
-          <w:tcPr>
-            <w:tcW w:type="dxa" w:w="3784"/>
-            <w:shd w:val="clear" w:color="auto" w:fill="006064"/>
-            <w:tcBorders>
-              <w:top w:val="single" w:sz="4" w:space="0" w:color="CCCCCC"/>
-              <w:left w:val="single" w:sz="4" w:space="0" w:color="CCCCCC"/>
-              <w:bottom w:val="single" w:sz="4" w:space="0" w:color="CCCCCC"/>
-              <w:right w:val="single" w:sz="4" w:space="0" w:color="CCCCCC"/>
-            </w:tcBorders>
-          </w:tcPr>
-          <w:p>
-            <w:pPr>
-              <w:spacing w:before="80" w:after="80"/>
-              <w:jc w:val="center"/>
-            </w:pPr>
-            <w:r>
-              <w:rPr>
-                <w:rFonts w:ascii="Calibri" w:hAnsi="Calibri"/>
-                <w:b/>
-                <w:i w:val="0"/>
-                <w:color w:val="FFFFFF"/>
-                <w:sz w:val="18"/>
-              </w:rPr>
-              <w:t>@legislacao (legislação vigente)</w:t>
-            </w:r>
-          </w:p>
-        </w:tc>
-      </w:tr>
-      <w:tr>
-        <w:tc>
-          <w:tcPr>
-            <w:tcW w:type="dxa" w:w="3784"/>
-            <w:shd w:val="clear" w:color="auto" w:fill="D6E4F0"/>
-            <w:tcBorders>
-              <w:top w:val="single" w:sz="4" w:space="0" w:color="CCCCCC"/>
-              <w:left w:val="single" w:sz="4" w:space="0" w:color="CCCCCC"/>
-              <w:bottom w:val="single" w:sz="4" w:space="0" w:color="CCCCCC"/>
-              <w:right w:val="single" w:sz="4" w:space="0" w:color="CCCCCC"/>
-            </w:tcBorders>
-            <w:vAlign w:val="top"/>
-          </w:tcPr>
-          <w:p>
-            <w:pPr>
-              <w:spacing w:before="80" w:after="80"/>
-              <w:ind w:left="80" w:right="80"/>
-            </w:pPr>
-            <w:r>
-              <w:rPr>
-                <w:rFonts w:ascii="Calibri" w:hAnsi="Calibri"/>
-                <w:b/>
-                <w:i/>
-                <w:color w:val="555555"/>
-                <w:sz w:val="16"/>
-              </w:rPr>
-              <w:t>Art.º 5.º do Regulamento 2023/0447</w:t>
-              <w:br/>
-            </w:r>
-            <w:r>
-              <w:rPr>
-                <w:rFonts w:ascii="Calibri" w:hAnsi="Calibri"/>
-                <w:b w:val="0"/>
-                <w:i w:val="0"/>
-                <w:color w:val="222222"/>
-                <w:sz w:val="19"/>
-              </w:rPr>
-              <w:t>Operators shall apply the following general welfare principles with respect to dogs or cats bred or kept in their establishment:</w:t>
-            </w:r>
-          </w:p>
-          <w:p>
-            <w:pPr>
-              <w:spacing w:before="120" w:after="0"/>
-              <w:ind w:left="80"/>
-            </w:pPr>
-            <w:r>
-              <w:rPr>
-                <w:rFonts w:ascii="Calibri" w:hAnsi="Calibri"/>
-                <w:b w:val="0"/>
-                <w:i w:val="0"/>
-                <w:color w:val="222222"/>
-                <w:sz w:val="19"/>
-              </w:rPr>
-              <w:t>(a) dogs and cats are provided with water and feed of a quality and of a quantity that enables them to have appropriate nutrition and hydration;</w:t>
-            </w:r>
-          </w:p>
-          <w:p>
-            <w:pPr>
-              <w:spacing w:before="120" w:after="0"/>
-              <w:ind w:left="80"/>
-            </w:pPr>
-            <w:r>
-              <w:rPr>
-                <w:rFonts w:ascii="Calibri" w:hAnsi="Calibri"/>
-                <w:b w:val="0"/>
-                <w:i w:val="0"/>
-                <w:color w:val="222222"/>
-                <w:sz w:val="19"/>
-              </w:rPr>
-              <w:t>(b) dogs and cats are kept in an appropriate and regularly cleaned physical environment which is secure and comfortable, especially in terms of space, air quality, temperature, light, protection against adverse climatic conditions and ease of movement, preventing overcrowding;</w:t>
-            </w:r>
-          </w:p>
-          <w:p>
-            <w:pPr>
-              <w:spacing w:before="120" w:after="0"/>
-              <w:ind w:left="80"/>
-            </w:pPr>
-            <w:r>
-              <w:rPr>
-                <w:rFonts w:ascii="Calibri" w:hAnsi="Calibri"/>
-                <w:b w:val="0"/>
-                <w:i w:val="0"/>
-                <w:color w:val="222222"/>
-                <w:sz w:val="19"/>
-              </w:rPr>
-              <w:t>(c) dogs and cats are kept safe, clean and in good health by preventing diseases, injuries, and pain, due in particular to management, handling practices and breeding practices;</w:t>
-            </w:r>
-          </w:p>
-          <w:p>
-            <w:pPr>
-              <w:spacing w:before="120" w:after="0"/>
-              <w:ind w:left="80"/>
-            </w:pPr>
-            <w:r>
-              <w:rPr>
-                <w:rFonts w:ascii="Calibri" w:hAnsi="Calibri"/>
-                <w:b w:val="0"/>
-                <w:i w:val="0"/>
-                <w:color w:val="222222"/>
-                <w:sz w:val="19"/>
-              </w:rPr>
-              <w:t>(d) dogs and cats are kept in an environment that enables them to exhibit species-specific and social non-harmful behaviour, and to establish a positive relationship with human beings;</w:t>
-            </w:r>
-          </w:p>
-          <w:p>
-            <w:pPr>
-              <w:spacing w:before="120" w:after="0"/>
-              <w:ind w:left="80"/>
-            </w:pPr>
-            <w:r>
-              <w:rPr>
-                <w:rFonts w:ascii="Calibri" w:hAnsi="Calibri"/>
-                <w:b w:val="0"/>
-                <w:i w:val="0"/>
-                <w:color w:val="222222"/>
-                <w:sz w:val="19"/>
-              </w:rPr>
-              <w:t>(e) dogs and cats are kept in such a way as to optimise their mental state by preventing or reducing negative stimuli in duration and intensity, as well as by maximising opportunities for positive stimuli in duration and intensity, preventing the development of abnormal repetitive and other behaviours indicative of negative animal welfare, and taking into consideration the individual dog's or cat's needs in the different domains referred to in points (a) to (d).</w:t>
-            </w:r>
-          </w:p>
-        </w:tc>
-        <w:tc>
-          <w:tcPr>
-            <w:tcW w:type="dxa" w:w="3784"/>
-            <w:shd w:val="clear" w:color="auto" w:fill="D5E8D4"/>
-            <w:tcBorders>
-              <w:top w:val="single" w:sz="4" w:space="0" w:color="CCCCCC"/>
-              <w:left w:val="single" w:sz="4" w:space="0" w:color="CCCCCC"/>
-              <w:bottom w:val="single" w:sz="4" w:space="0" w:color="CCCCCC"/>
-              <w:right w:val="single" w:sz="4" w:space="0" w:color="CCCCCC"/>
-            </w:tcBorders>
-            <w:vAlign w:val="top"/>
-          </w:tcPr>
-          <w:p>
-            <w:pPr>
-              <w:spacing w:before="80" w:after="80"/>
-              <w:ind w:left="80" w:right="80"/>
-            </w:pPr>
-            <w:r>
-              <w:rPr>
-                <w:rFonts w:ascii="Calibri" w:hAnsi="Calibri"/>
-                <w:b/>
-                <w:i/>
-                <w:color w:val="555555"/>
-                <w:sz w:val="16"/>
-              </w:rPr>
-              <w:t>al. a) do n.º 1 do art.º 10.º do RGBEAC (proposta, jun. 2025)</w:t>
-              <w:br/>
-            </w:r>
-            <w:r>
-              <w:rPr>
-                <w:rFonts w:ascii="Calibri" w:hAnsi="Calibri"/>
-                <w:b w:val="0"/>
-                <w:i w:val="0"/>
-                <w:color w:val="222222"/>
-                <w:sz w:val="19"/>
-              </w:rPr>
-              <w:t>1 — O detentor do animal de companhia deve:</w:t>
-            </w:r>
-          </w:p>
-          <w:p>
-            <w:pPr>
-              <w:spacing w:before="120" w:after="0"/>
-              <w:ind w:left="80"/>
-            </w:pPr>
-            <w:r>
-              <w:rPr>
-                <w:rFonts w:ascii="Calibri" w:hAnsi="Calibri"/>
-                <w:b w:val="0"/>
-                <w:i w:val="0"/>
-                <w:color w:val="222222"/>
-                <w:sz w:val="19"/>
-              </w:rPr>
-              <w:t>a) Assegurar o bem-estar do animal, de acordo com sua espécie, raça, idade e necessidades físicas e etológicas, proporcionando-lhe:</w:t>
-              <w:br/>
-              <w:t>— Atenção, supervisão, controlo, exercício físico e estímulo mental;</w:t>
-              <w:br/>
-              <w:t>— Alimentos saudáveis, adequados e convenientes ao seu normal desenvolvimento e acesso permanente a água potável;</w:t>
-              <w:br/>
-              <w:t>— Condições higiossanitárias que atendam, no mínimo, ao estabelecido no presente decreto-lei e na demais legislação aplicável;</w:t>
-              <w:br/>
-              <w:t>— Liberdade de movimento, sendo proibidos todos os sistemas de contenção permanentes;</w:t>
-              <w:br/>
-              <w:t>— Abrigo adequado, em termos de tamanho e qualidade, com vista a proteger de condições atmosféricas adversas, incluindo frio, chuva, sol ou calor excessivos, com cama seca, limpa e confortável;</w:t>
-              <w:br/>
-              <w:t>— Contato social adequado a cada espécie, de acordo com a sua idade e atividade.</w:t>
-            </w:r>
-          </w:p>
-        </w:tc>
-        <w:tc>
-          <w:tcPr>
-            <w:tcW w:type="dxa" w:w="3784"/>
-            <w:shd w:val="clear" w:color="auto" w:fill="FFE6CC"/>
-            <w:tcBorders>
-              <w:top w:val="single" w:sz="4" w:space="0" w:color="CCCCCC"/>
-              <w:left w:val="single" w:sz="4" w:space="0" w:color="CCCCCC"/>
-              <w:bottom w:val="single" w:sz="4" w:space="0" w:color="CCCCCC"/>
-              <w:right w:val="single" w:sz="4" w:space="0" w:color="CCCCCC"/>
-            </w:tcBorders>
-            <w:vAlign w:val="top"/>
-          </w:tcPr>
-          <w:p>
-            <w:pPr>
-              <w:spacing w:before="80" w:after="80"/>
-              <w:ind w:left="80" w:right="80"/>
-            </w:pPr>
-            <w:r>
-              <w:rPr>
-                <w:rFonts w:ascii="Calibri" w:hAnsi="Calibri"/>
-                <w:b/>
-                <w:i/>
-                <w:color w:val="555555"/>
-                <w:sz w:val="16"/>
-              </w:rPr>
-              <w:t>n.ºs 1, 2 e 3 do art.º 5.º do Código do Animal (DL n.º 214/2013)</w:t>
-              <w:br/>
-            </w:r>
-            <w:r>
-              <w:rPr>
-                <w:rFonts w:ascii="Calibri" w:hAnsi="Calibri"/>
-                <w:b w:val="0"/>
-                <w:i w:val="0"/>
-                <w:color w:val="222222"/>
-                <w:sz w:val="19"/>
-              </w:rPr>
-              <w:t>1 — As condições de detenção e de alojamento para reprodução, criação, manutenção e acomodação dos animais de companhia devem salvaguardar os seus parâmetros de bem-estar animal.</w:t>
-            </w:r>
-          </w:p>
-          <w:p>
-            <w:pPr>
-              <w:spacing w:before="120" w:after="0"/>
-              <w:ind w:left="80"/>
-            </w:pPr>
-            <w:r>
-              <w:rPr>
-                <w:rFonts w:ascii="Calibri" w:hAnsi="Calibri"/>
-                <w:b w:val="0"/>
-                <w:i w:val="0"/>
-                <w:color w:val="222222"/>
-                <w:sz w:val="19"/>
-              </w:rPr>
-              <w:t>2 — Nenhum animal deve ser detido como animal de companhia se não estiverem asseguradas as condições referidas no número anterior ou se não se adaptar ao cativeiro.</w:t>
-            </w:r>
-          </w:p>
-          <w:p>
-            <w:pPr>
-              <w:spacing w:before="120" w:after="0"/>
-              <w:ind w:left="80"/>
-            </w:pPr>
-            <w:r>
-              <w:rPr>
-                <w:rFonts w:ascii="Calibri" w:hAnsi="Calibri"/>
-                <w:b w:val="0"/>
-                <w:i w:val="0"/>
-                <w:color w:val="222222"/>
-                <w:sz w:val="19"/>
-              </w:rPr>
-              <w:t>3 — É proibida a violência contra animais, considerando-se como tal todos os atos que, sem necessidade, infligem a morte, o sofrimento, abuso ou lesões a um animal.</w:t>
-            </w:r>
-          </w:p>
-        </w:tc>
-        <w:tc>
-          <w:tcPr>
-            <w:tcW w:type="dxa" w:w="3784"/>
-            <w:shd w:val="clear" w:color="auto" w:fill="E0F7FA"/>
-            <w:tcBorders>
-              <w:top w:val="single" w:sz="4" w:space="0" w:color="CCCCCC"/>
-              <w:left w:val="single" w:sz="4" w:space="0" w:color="CCCCCC"/>
-              <w:bottom w:val="single" w:sz="4" w:space="0" w:color="CCCCCC"/>
-              <w:right w:val="single" w:sz="4" w:space="0" w:color="CCCCCC"/>
-            </w:tcBorders>
-            <w:vAlign w:val="top"/>
-          </w:tcPr>
-          <w:p>
-            <w:pPr>
-              <w:spacing w:before="80" w:after="80"/>
-              <w:ind w:left="80" w:right="80"/>
-            </w:pPr>
-            <w:r>
-              <w:rPr>
-                <w:rFonts w:ascii="Calibri" w:hAnsi="Calibri"/>
-                <w:b/>
-                <w:i/>
-                <w:color w:val="555555"/>
-                <w:sz w:val="16"/>
-              </w:rPr>
-              <w:t>n.º 1 do art.º 7.º e n.º 1 do art.º 9.º do DL n.º 276/2001, de 17 de outubro</w:t>
-              <w:br/>
-            </w:r>
-            <w:r>
-              <w:rPr>
-                <w:rFonts w:ascii="Calibri" w:hAnsi="Calibri"/>
-                <w:b w:val="0"/>
-                <w:i w:val="0"/>
-                <w:color w:val="222222"/>
-                <w:sz w:val="19"/>
-              </w:rPr>
-              <w:t>Artigo 7.º, n.º 1 — As condições de detenção e de alojamento para reprodução, criação, manutenção e acomodação dos animais de companhia devem salvaguardar os seus parâmetros de bem-estar animal, nomeadamente nos termos dos artigos seguintes.</w:t>
-            </w:r>
-          </w:p>
-          <w:p>
-            <w:pPr>
-              <w:spacing w:before="120" w:after="0"/>
-              <w:ind w:left="80"/>
-            </w:pPr>
-            <w:r>
-              <w:rPr>
-                <w:rFonts w:ascii="Calibri" w:hAnsi="Calibri"/>
-                <w:b w:val="0"/>
-                <w:i w:val="0"/>
-                <w:color w:val="222222"/>
-                <w:sz w:val="19"/>
-              </w:rPr>
-              <w:t>Artigo 9.º, n.º 1 — A temperatura, a ventilação e a luminosidade e obscuridade das instalações devem ser as adequadas à manutenção do conforto e bem-estar das espécies que albergam.</w:t>
-            </w:r>
-          </w:p>
-        </w:tc>
-      </w:tr>
-    </w:tbl>
-    <w:p>
-      <w:pPr>
-        <w:spacing w:after="80"/>
-      </w:pPr>
-    </w:p>
-    <w:tbl>
-      <w:tblPr>
-        <w:tblLook w:firstColumn="1" w:firstRow="1" w:lastColumn="0" w:lastRow="0" w:noHBand="0" w:noVBand="1" w:val="04A0"/>
-        <w:tblW w:w="5000" w:type="pct"/>
-      </w:tblPr>
-      <w:tblGrid>
         <w:gridCol w:w="15138"/>
       </w:tblGrid>
       <w:tr>
@@ -3312,7 +2881,7 @@
                 <w:color w:val="FFFFFF"/>
                 <w:sz w:val="18"/>
               </w:rPr>
-              <w:t>Tradução do @regulamento (PT-PT)</w:t>
+              <w:t>@regulamento — Tradução PT-PT  ·  Art.º 5.º do Regulamento 2023/0447</w:t>
             </w:r>
           </w:p>
         </w:tc>
@@ -3424,6 +2993,461 @@
                 <w:sz w:val="19"/>
               </w:rPr>
               <w:t>(e) os cães e gatos são mantidos de forma a otimizar o seu estado mental, prevenindo ou reduzindo estímulos negativos em duração e intensidade, maximizando oportunidades de estímulos positivos, prevenindo o desenvolvimento de comportamentos repetitivos anormais, tendo em conta as necessidades individuais do animal nos domínios referidos nas alíneas (a) a (d).</w:t>
+            </w:r>
+          </w:p>
+        </w:tc>
+      </w:tr>
+    </w:tbl>
+    <w:p>
+      <w:pPr>
+        <w:spacing w:after="80"/>
+      </w:pPr>
+    </w:p>
+    <w:tbl>
+      <w:tblPr>
+        <w:tblLook w:firstColumn="1" w:firstRow="1" w:lastColumn="0" w:lastRow="0" w:noHBand="0" w:noVBand="1" w:val="04A0"/>
+        <w:tblW w:w="5000" w:type="pct"/>
+      </w:tblPr>
+      <w:tblGrid>
+        <w:gridCol w:w="15138"/>
+      </w:tblGrid>
+      <w:tr>
+        <w:tc>
+          <w:tcPr>
+            <w:tcW w:type="dxa" w:w="15138"/>
+            <w:shd w:val="clear" w:color="auto" w:fill="1A3A5C"/>
+            <w:tcBorders>
+              <w:top w:val="single" w:sz="4" w:space="0" w:color="CCCCCC"/>
+              <w:left w:val="single" w:sz="4" w:space="0" w:color="CCCCCC"/>
+              <w:bottom w:val="single" w:sz="4" w:space="0" w:color="CCCCCC"/>
+              <w:right w:val="single" w:sz="4" w:space="0" w:color="CCCCCC"/>
+            </w:tcBorders>
+          </w:tcPr>
+          <w:p>
+            <w:pPr>
+              <w:spacing w:before="80" w:after="80"/>
+              <w:jc w:val="center"/>
+            </w:pPr>
+            <w:r>
+              <w:rPr>
+                <w:rFonts w:ascii="Calibri" w:hAnsi="Calibri"/>
+                <w:b/>
+                <w:i w:val="0"/>
+                <w:color w:val="FFFFFF"/>
+                <w:sz w:val="18"/>
+              </w:rPr>
+              <w:t>@regulamento — Texto original EN</w:t>
+            </w:r>
+          </w:p>
+        </w:tc>
+      </w:tr>
+      <w:tr>
+        <w:tc>
+          <w:tcPr>
+            <w:tcW w:type="dxa" w:w="15138"/>
+            <w:shd w:val="clear" w:color="auto" w:fill="D6E4F0"/>
+            <w:tcBorders>
+              <w:top w:val="single" w:sz="4" w:space="0" w:color="CCCCCC"/>
+              <w:left w:val="single" w:sz="4" w:space="0" w:color="CCCCCC"/>
+              <w:bottom w:val="single" w:sz="4" w:space="0" w:color="CCCCCC"/>
+              <w:right w:val="single" w:sz="4" w:space="0" w:color="CCCCCC"/>
+            </w:tcBorders>
+            <w:vAlign w:val="top"/>
+          </w:tcPr>
+          <w:p>
+            <w:pPr>
+              <w:spacing w:before="80" w:after="80"/>
+              <w:ind w:left="80" w:right="80"/>
+            </w:pPr>
+            <w:r>
+              <w:rPr>
+                <w:rFonts w:ascii="Calibri" w:hAnsi="Calibri"/>
+                <w:b w:val="0"/>
+                <w:i w:val="0"/>
+                <w:color w:val="222222"/>
+                <w:sz w:val="19"/>
+              </w:rPr>
+              <w:t>Operators shall apply the following general welfare principles with respect to dogs or cats bred or kept in their establishment:</w:t>
+            </w:r>
+          </w:p>
+          <w:p>
+            <w:pPr>
+              <w:spacing w:before="120" w:after="0"/>
+              <w:ind w:left="80"/>
+            </w:pPr>
+            <w:r>
+              <w:rPr>
+                <w:rFonts w:ascii="Calibri" w:hAnsi="Calibri"/>
+                <w:b w:val="0"/>
+                <w:i w:val="0"/>
+                <w:color w:val="222222"/>
+                <w:sz w:val="19"/>
+              </w:rPr>
+              <w:t>(a) dogs and cats are provided with water and feed of a quality and of a quantity that enables them to have appropriate nutrition and hydration;</w:t>
+            </w:r>
+          </w:p>
+          <w:p>
+            <w:pPr>
+              <w:spacing w:before="120" w:after="0"/>
+              <w:ind w:left="80"/>
+            </w:pPr>
+            <w:r>
+              <w:rPr>
+                <w:rFonts w:ascii="Calibri" w:hAnsi="Calibri"/>
+                <w:b w:val="0"/>
+                <w:i w:val="0"/>
+                <w:color w:val="222222"/>
+                <w:sz w:val="19"/>
+              </w:rPr>
+              <w:t>(b) dogs and cats are kept in an appropriate and regularly cleaned physical environment which is secure and comfortable, especially in terms of space, air quality, temperature, light, protection against adverse climatic conditions and ease of movement, preventing overcrowding;</w:t>
+            </w:r>
+          </w:p>
+          <w:p>
+            <w:pPr>
+              <w:spacing w:before="120" w:after="0"/>
+              <w:ind w:left="80"/>
+            </w:pPr>
+            <w:r>
+              <w:rPr>
+                <w:rFonts w:ascii="Calibri" w:hAnsi="Calibri"/>
+                <w:b w:val="0"/>
+                <w:i w:val="0"/>
+                <w:color w:val="222222"/>
+                <w:sz w:val="19"/>
+              </w:rPr>
+              <w:t>(c) dogs and cats are kept safe, clean and in good health by preventing diseases, injuries, and pain, due in particular to management, handling practices and breeding practices;</w:t>
+            </w:r>
+          </w:p>
+          <w:p>
+            <w:pPr>
+              <w:spacing w:before="120" w:after="0"/>
+              <w:ind w:left="80"/>
+            </w:pPr>
+            <w:r>
+              <w:rPr>
+                <w:rFonts w:ascii="Calibri" w:hAnsi="Calibri"/>
+                <w:b w:val="0"/>
+                <w:i w:val="0"/>
+                <w:color w:val="222222"/>
+                <w:sz w:val="19"/>
+              </w:rPr>
+              <w:t>(d) dogs and cats are kept in an environment that enables them to exhibit species-specific and social non-harmful behaviour, and to establish a positive relationship with human beings;</w:t>
+            </w:r>
+          </w:p>
+          <w:p>
+            <w:pPr>
+              <w:spacing w:before="120" w:after="0"/>
+              <w:ind w:left="80"/>
+            </w:pPr>
+            <w:r>
+              <w:rPr>
+                <w:rFonts w:ascii="Calibri" w:hAnsi="Calibri"/>
+                <w:b w:val="0"/>
+                <w:i w:val="0"/>
+                <w:color w:val="222222"/>
+                <w:sz w:val="19"/>
+              </w:rPr>
+              <w:t>(e) dogs and cats are kept in such a way as to optimise their mental state by preventing or reducing negative stimuli in duration and intensity, as well as by maximising opportunities for positive stimuli in duration and intensity, preventing the development of abnormal repetitive and other behaviours indicative of negative animal welfare, and taking into consideration the individual dog's or cat's needs in the different domains referred to in points (a) to (d).</w:t>
+            </w:r>
+          </w:p>
+        </w:tc>
+      </w:tr>
+    </w:tbl>
+    <w:p>
+      <w:pPr>
+        <w:spacing w:after="80"/>
+      </w:pPr>
+    </w:p>
+    <w:tbl>
+      <w:tblPr>
+        <w:tblLook w:firstColumn="1" w:firstRow="1" w:lastColumn="0" w:lastRow="0" w:noHBand="0" w:noVBand="1" w:val="04A0"/>
+        <w:tblW w:w="5000" w:type="pct"/>
+      </w:tblPr>
+      <w:tblGrid>
+        <w:gridCol w:w="5046"/>
+        <w:gridCol w:w="5046"/>
+        <w:gridCol w:w="5046"/>
+      </w:tblGrid>
+      <w:tr>
+        <w:tc>
+          <w:tcPr>
+            <w:tcW w:type="dxa" w:w="5046"/>
+            <w:shd w:val="clear" w:color="auto" w:fill="1E5631"/>
+            <w:tcBorders>
+              <w:top w:val="single" w:sz="4" w:space="0" w:color="CCCCCC"/>
+              <w:left w:val="single" w:sz="4" w:space="0" w:color="CCCCCC"/>
+              <w:bottom w:val="single" w:sz="4" w:space="0" w:color="CCCCCC"/>
+              <w:right w:val="single" w:sz="4" w:space="0" w:color="CCCCCC"/>
+            </w:tcBorders>
+          </w:tcPr>
+          <w:p>
+            <w:pPr>
+              <w:spacing w:before="80" w:after="80"/>
+              <w:jc w:val="center"/>
+            </w:pPr>
+            <w:r>
+              <w:rPr>
+                <w:rFonts w:ascii="Calibri" w:hAnsi="Calibri"/>
+                <w:b/>
+                <w:i w:val="0"/>
+                <w:color w:val="FFFFFF"/>
+                <w:sz w:val="18"/>
+              </w:rPr>
+              <w:t>@rgbeac (proposta jun. 2025)</w:t>
+            </w:r>
+          </w:p>
+        </w:tc>
+        <w:tc>
+          <w:tcPr>
+            <w:tcW w:type="dxa" w:w="5046"/>
+            <w:shd w:val="clear" w:color="auto" w:fill="7E4C00"/>
+            <w:tcBorders>
+              <w:top w:val="single" w:sz="4" w:space="0" w:color="CCCCCC"/>
+              <w:left w:val="single" w:sz="4" w:space="0" w:color="CCCCCC"/>
+              <w:bottom w:val="single" w:sz="4" w:space="0" w:color="CCCCCC"/>
+              <w:right w:val="single" w:sz="4" w:space="0" w:color="CCCCCC"/>
+            </w:tcBorders>
+          </w:tcPr>
+          <w:p>
+            <w:pPr>
+              <w:spacing w:before="80" w:after="80"/>
+              <w:jc w:val="center"/>
+            </w:pPr>
+            <w:r>
+              <w:rPr>
+                <w:rFonts w:ascii="Calibri" w:hAnsi="Calibri"/>
+                <w:b/>
+                <w:i w:val="0"/>
+                <w:color w:val="FFFFFF"/>
+                <w:sz w:val="18"/>
+              </w:rPr>
+              <w:t>@codigo (DL n.º 214/2013)</w:t>
+            </w:r>
+          </w:p>
+        </w:tc>
+        <w:tc>
+          <w:tcPr>
+            <w:tcW w:type="dxa" w:w="5046"/>
+            <w:shd w:val="clear" w:color="auto" w:fill="006064"/>
+            <w:tcBorders>
+              <w:top w:val="single" w:sz="4" w:space="0" w:color="CCCCCC"/>
+              <w:left w:val="single" w:sz="4" w:space="0" w:color="CCCCCC"/>
+              <w:bottom w:val="single" w:sz="4" w:space="0" w:color="CCCCCC"/>
+              <w:right w:val="single" w:sz="4" w:space="0" w:color="CCCCCC"/>
+            </w:tcBorders>
+          </w:tcPr>
+          <w:p>
+            <w:pPr>
+              <w:spacing w:before="80" w:after="80"/>
+              <w:jc w:val="center"/>
+            </w:pPr>
+            <w:r>
+              <w:rPr>
+                <w:rFonts w:ascii="Calibri" w:hAnsi="Calibri"/>
+                <w:b/>
+                <w:i w:val="0"/>
+                <w:color w:val="FFFFFF"/>
+                <w:sz w:val="18"/>
+              </w:rPr>
+              <w:t>@legislacao (legislação vigente)</w:t>
+            </w:r>
+          </w:p>
+        </w:tc>
+      </w:tr>
+      <w:tr>
+        <w:tc>
+          <w:tcPr>
+            <w:tcW w:type="dxa" w:w="5046"/>
+            <w:shd w:val="clear" w:color="auto" w:fill="D5E8D4"/>
+            <w:tcBorders>
+              <w:top w:val="single" w:sz="4" w:space="0" w:color="CCCCCC"/>
+              <w:left w:val="single" w:sz="4" w:space="0" w:color="CCCCCC"/>
+              <w:bottom w:val="single" w:sz="4" w:space="0" w:color="CCCCCC"/>
+              <w:right w:val="single" w:sz="4" w:space="0" w:color="CCCCCC"/>
+            </w:tcBorders>
+            <w:vAlign w:val="top"/>
+          </w:tcPr>
+          <w:p>
+            <w:pPr>
+              <w:spacing w:before="80" w:after="80"/>
+              <w:ind w:left="80" w:right="80"/>
+            </w:pPr>
+            <w:r>
+              <w:rPr>
+                <w:rFonts w:ascii="Calibri" w:hAnsi="Calibri"/>
+                <w:b/>
+                <w:i/>
+                <w:color w:val="555555"/>
+                <w:sz w:val="16"/>
+              </w:rPr>
+              <w:t>al. a) do n.º 1 do art.º 10.º do RGBEAC (proposta, jun. 2025)</w:t>
+              <w:br/>
+            </w:r>
+            <w:r>
+              <w:rPr>
+                <w:rFonts w:ascii="Calibri" w:hAnsi="Calibri"/>
+                <w:b w:val="0"/>
+                <w:i w:val="0"/>
+                <w:color w:val="222222"/>
+                <w:sz w:val="19"/>
+              </w:rPr>
+              <w:t>1 — O detentor do animal de companhia deve:</w:t>
+            </w:r>
+          </w:p>
+          <w:p>
+            <w:pPr>
+              <w:spacing w:before="120" w:after="0"/>
+              <w:ind w:left="80"/>
+            </w:pPr>
+            <w:r>
+              <w:rPr>
+                <w:rFonts w:ascii="Calibri" w:hAnsi="Calibri"/>
+                <w:b w:val="0"/>
+                <w:i w:val="0"/>
+                <w:color w:val="222222"/>
+                <w:sz w:val="19"/>
+              </w:rPr>
+              <w:t>a) Assegurar o bem-estar do animal, de acordo com sua espécie, raça, idade e necessidades físicas e etológicas, proporcionando-lhe:</w:t>
+              <w:br/>
+              <w:t>— Atenção, supervisão, controlo, exercício físico e estímulo mental;</w:t>
+              <w:br/>
+              <w:t>— Alimentos saudáveis, adequados e convenientes ao seu normal desenvolvimento e acesso permanente a água potável;</w:t>
+              <w:br/>
+              <w:t>— Condições higiossanitárias que atendam, no mínimo, ao estabelecido no presente decreto-lei e na demais legislação aplicável;</w:t>
+              <w:br/>
+              <w:t>— Liberdade de movimento, sendo proibidos todos os sistemas de contenção permanentes;</w:t>
+              <w:br/>
+              <w:t>— Abrigo adequado, em termos de tamanho e qualidade, com vista a proteger de condições atmosféricas adversas, incluindo frio, chuva, sol ou calor excessivos, com cama seca, limpa e confortável;</w:t>
+              <w:br/>
+              <w:t>— Contato social adequado a cada espécie, de acordo com a sua idade e atividade.</w:t>
+            </w:r>
+          </w:p>
+        </w:tc>
+        <w:tc>
+          <w:tcPr>
+            <w:tcW w:type="dxa" w:w="5046"/>
+            <w:shd w:val="clear" w:color="auto" w:fill="FFE6CC"/>
+            <w:tcBorders>
+              <w:top w:val="single" w:sz="4" w:space="0" w:color="CCCCCC"/>
+              <w:left w:val="single" w:sz="4" w:space="0" w:color="CCCCCC"/>
+              <w:bottom w:val="single" w:sz="4" w:space="0" w:color="CCCCCC"/>
+              <w:right w:val="single" w:sz="4" w:space="0" w:color="CCCCCC"/>
+            </w:tcBorders>
+            <w:vAlign w:val="top"/>
+          </w:tcPr>
+          <w:p>
+            <w:pPr>
+              <w:spacing w:before="80" w:after="80"/>
+              <w:ind w:left="80" w:right="80"/>
+            </w:pPr>
+            <w:r>
+              <w:rPr>
+                <w:rFonts w:ascii="Calibri" w:hAnsi="Calibri"/>
+                <w:b/>
+                <w:i/>
+                <w:color w:val="555555"/>
+                <w:sz w:val="16"/>
+              </w:rPr>
+              <w:t>n.ºs 1, 2 e 3 do art.º 5.º do Código do Animal (DL n.º 214/2013)</w:t>
+              <w:br/>
+            </w:r>
+            <w:r>
+              <w:rPr>
+                <w:rFonts w:ascii="Calibri" w:hAnsi="Calibri"/>
+                <w:b w:val="0"/>
+                <w:i w:val="0"/>
+                <w:color w:val="222222"/>
+                <w:sz w:val="19"/>
+              </w:rPr>
+              <w:t>1 — As condições de detenção e de alojamento para reprodução, criação, manutenção e acomodação dos animais de companhia devem salvaguardar os seus parâmetros de bem-estar animal.</w:t>
+            </w:r>
+          </w:p>
+          <w:p>
+            <w:pPr>
+              <w:spacing w:before="120" w:after="0"/>
+              <w:ind w:left="80"/>
+            </w:pPr>
+            <w:r>
+              <w:rPr>
+                <w:rFonts w:ascii="Calibri" w:hAnsi="Calibri"/>
+                <w:b w:val="0"/>
+                <w:i w:val="0"/>
+                <w:color w:val="222222"/>
+                <w:sz w:val="19"/>
+              </w:rPr>
+              <w:t>2 — Nenhum animal deve ser detido como animal de companhia se não estiverem asseguradas as condições referidas no número anterior ou se não se adaptar ao cativeiro.</w:t>
+            </w:r>
+          </w:p>
+          <w:p>
+            <w:pPr>
+              <w:spacing w:before="120" w:after="0"/>
+              <w:ind w:left="80"/>
+            </w:pPr>
+            <w:r>
+              <w:rPr>
+                <w:rFonts w:ascii="Calibri" w:hAnsi="Calibri"/>
+                <w:b w:val="0"/>
+                <w:i w:val="0"/>
+                <w:color w:val="222222"/>
+                <w:sz w:val="19"/>
+              </w:rPr>
+              <w:t>3 — É proibida a violência contra animais, considerando-se como tal todos os atos que, sem necessidade, infligem a morte, o sofrimento, abuso ou lesões a um animal.</w:t>
+            </w:r>
+          </w:p>
+        </w:tc>
+        <w:tc>
+          <w:tcPr>
+            <w:tcW w:type="dxa" w:w="5046"/>
+            <w:shd w:val="clear" w:color="auto" w:fill="E0F7FA"/>
+            <w:tcBorders>
+              <w:top w:val="single" w:sz="4" w:space="0" w:color="CCCCCC"/>
+              <w:left w:val="single" w:sz="4" w:space="0" w:color="CCCCCC"/>
+              <w:bottom w:val="single" w:sz="4" w:space="0" w:color="CCCCCC"/>
+              <w:right w:val="single" w:sz="4" w:space="0" w:color="CCCCCC"/>
+            </w:tcBorders>
+            <w:vAlign w:val="top"/>
+          </w:tcPr>
+          <w:p>
+            <w:pPr>
+              <w:spacing w:before="80" w:after="80"/>
+              <w:ind w:left="80" w:right="80"/>
+            </w:pPr>
+            <w:r>
+              <w:rPr>
+                <w:rFonts w:ascii="Calibri" w:hAnsi="Calibri"/>
+                <w:b/>
+                <w:i/>
+                <w:color w:val="555555"/>
+                <w:sz w:val="16"/>
+              </w:rPr>
+              <w:t>n.º 1 do art.º 7.º e n.º 1 do art.º 9.º do DL n.º 276/2001, de 17 de outubro</w:t>
+              <w:br/>
+            </w:r>
+            <w:r>
+              <w:rPr>
+                <w:rFonts w:ascii="Calibri" w:hAnsi="Calibri"/>
+                <w:b w:val="0"/>
+                <w:i w:val="0"/>
+                <w:color w:val="222222"/>
+                <w:sz w:val="19"/>
+              </w:rPr>
+              <w:t>Artigo 7.º, n.º 1 — As condições de detenção e de alojamento para reprodução, criação, manutenção e acomodação dos animais de companhia devem salvaguardar os seus parâmetros de bem-estar animal, nomeadamente nos termos dos artigos seguintes.</w:t>
+            </w:r>
+          </w:p>
+          <w:p>
+            <w:pPr>
+              <w:spacing w:before="120" w:after="0"/>
+              <w:ind w:left="80"/>
+            </w:pPr>
+            <w:r>
+              <w:rPr>
+                <w:rFonts w:ascii="Calibri" w:hAnsi="Calibri"/>
+                <w:b w:val="0"/>
+                <w:i w:val="0"/>
+                <w:color w:val="222222"/>
+                <w:sz w:val="19"/>
+              </w:rPr>
+              <w:t>Artigo 9.º, n.º 1 — A temperatura, a ventilação e a luminosidade e obscuridade das instalações devem ser as adequadas à manutenção do conforto e bem-estar das espécies que albergam.</w:t>
             </w:r>
           </w:p>
         </w:tc>
@@ -3683,15 +3707,123 @@
         <w:tblW w:w="5000" w:type="pct"/>
       </w:tblPr>
       <w:tblGrid>
-        <w:gridCol w:w="3784"/>
-        <w:gridCol w:w="3784"/>
-        <w:gridCol w:w="3784"/>
-        <w:gridCol w:w="3784"/>
+        <w:gridCol w:w="15138"/>
       </w:tblGrid>
       <w:tr>
         <w:tc>
           <w:tcPr>
-            <w:tcW w:type="dxa" w:w="3784"/>
+            <w:tcW w:type="dxa" w:w="15138"/>
+            <w:shd w:val="clear" w:color="auto" w:fill="2471A3"/>
+            <w:tcBorders>
+              <w:top w:val="single" w:sz="4" w:space="0" w:color="CCCCCC"/>
+              <w:left w:val="single" w:sz="4" w:space="0" w:color="CCCCCC"/>
+              <w:bottom w:val="single" w:sz="4" w:space="0" w:color="CCCCCC"/>
+              <w:right w:val="single" w:sz="4" w:space="0" w:color="CCCCCC"/>
+            </w:tcBorders>
+          </w:tcPr>
+          <w:p>
+            <w:pPr>
+              <w:spacing w:before="80" w:after="80"/>
+              <w:jc w:val="center"/>
+            </w:pPr>
+            <w:r>
+              <w:rPr>
+                <w:rFonts w:ascii="Calibri" w:hAnsi="Calibri"/>
+                <w:b/>
+                <w:i w:val="0"/>
+                <w:color w:val="FFFFFF"/>
+                <w:sz w:val="18"/>
+              </w:rPr>
+              <w:t>@regulamento — Tradução PT-PT  ·  Art.º 6.a do Regulamento 2023/0447</w:t>
+            </w:r>
+          </w:p>
+        </w:tc>
+      </w:tr>
+      <w:tr>
+        <w:tc>
+          <w:tcPr>
+            <w:tcW w:type="dxa" w:w="15138"/>
+            <w:shd w:val="clear" w:color="auto" w:fill="EBF5FB"/>
+            <w:tcBorders>
+              <w:top w:val="single" w:sz="4" w:space="0" w:color="CCCCCC"/>
+              <w:left w:val="single" w:sz="4" w:space="0" w:color="CCCCCC"/>
+              <w:bottom w:val="single" w:sz="4" w:space="0" w:color="CCCCCC"/>
+              <w:right w:val="single" w:sz="4" w:space="0" w:color="CCCCCC"/>
+            </w:tcBorders>
+            <w:vAlign w:val="top"/>
+          </w:tcPr>
+          <w:p>
+            <w:pPr>
+              <w:spacing w:before="80" w:after="80"/>
+              <w:ind w:left="80" w:right="80"/>
+            </w:pPr>
+            <w:r>
+              <w:rPr>
+                <w:rFonts w:ascii="Calibri" w:hAnsi="Calibri"/>
+                <w:b w:val="0"/>
+                <w:i/>
+                <w:color w:val="222222"/>
+                <w:sz w:val="19"/>
+              </w:rPr>
+              <w:t>Os operadores de estabelecimentos de criação devem assegurar que as suas estratégias de criação minimizam o risco de produzir cães ou gatos com genótipos associados a efeitos prejudiciais para a sua saúde e bem-estar.</w:t>
+            </w:r>
+          </w:p>
+          <w:p>
+            <w:pPr>
+              <w:spacing w:before="120" w:after="0"/>
+              <w:ind w:left="80"/>
+            </w:pPr>
+            <w:r>
+              <w:rPr>
+                <w:rFonts w:ascii="Calibri" w:hAnsi="Calibri"/>
+                <w:b w:val="0"/>
+                <w:i/>
+                <w:color w:val="222222"/>
+                <w:sz w:val="19"/>
+              </w:rPr>
+              <w:t>Os operadores de estabelecimentos de criação não devem utilizar para reprodução cães ou gatos que apresentem traços conformacionais excessivos que conduzam a um risco elevado de efeitos prejudiciais para o bem-estar desses animais ou das suas crias. Antes da seleção para reprodução de um animal potencialmente afetado por traço conformacional excessivo, o operador deve consultar um médico veterinário ou uma pessoa qualificada independente sob responsabilidade veterinária.</w:t>
+            </w:r>
+          </w:p>
+          <w:p>
+            <w:pPr>
+              <w:spacing w:before="120" w:after="0"/>
+              <w:ind w:left="80"/>
+            </w:pPr>
+            <w:r>
+              <w:rPr>
+                <w:rFonts w:ascii="Calibri" w:hAnsi="Calibri"/>
+                <w:b w:val="0"/>
+                <w:i/>
+                <w:color w:val="222222"/>
+                <w:sz w:val="19"/>
+              </w:rPr>
+              <w:t>São proibidos na gestão da reprodução de cães e gatos:</w:t>
+              <w:br/>
+              <w:t>(a) o cruzamento entre progenitores e descendentes, entre irmãos, entre meios-irmãos ou entre avós e netos, exceto com aprovação da autoridade competente por razão de necessidade específica de preservação de raças locais com reserva genética limitada;</w:t>
+              <w:br/>
+              <w:t>(b) o cruzamento para produção de híbridos.</w:t>
+            </w:r>
+          </w:p>
+        </w:tc>
+      </w:tr>
+    </w:tbl>
+    <w:p>
+      <w:pPr>
+        <w:spacing w:after="80"/>
+      </w:pPr>
+    </w:p>
+    <w:tbl>
+      <w:tblPr>
+        <w:tblLook w:firstColumn="1" w:firstRow="1" w:lastColumn="0" w:lastRow="0" w:noHBand="0" w:noVBand="1" w:val="04A0"/>
+        <w:tblW w:w="5000" w:type="pct"/>
+      </w:tblPr>
+      <w:tblGrid>
+        <w:gridCol w:w="15138"/>
+      </w:tblGrid>
+      <w:tr>
+        <w:tc>
+          <w:tcPr>
+            <w:tcW w:type="dxa" w:w="15138"/>
             <w:shd w:val="clear" w:color="auto" w:fill="1A3A5C"/>
             <w:tcBorders>
               <w:top w:val="single" w:sz="4" w:space="0" w:color="CCCCCC"/>
@@ -3713,91 +3845,7 @@
                 <w:color w:val="FFFFFF"/>
                 <w:sz w:val="18"/>
               </w:rPr>
-              <w:t>@regulamento (texto original EN)</w:t>
-            </w:r>
-          </w:p>
-        </w:tc>
-        <w:tc>
-          <w:tcPr>
-            <w:tcW w:type="dxa" w:w="3784"/>
-            <w:shd w:val="clear" w:color="auto" w:fill="1E5631"/>
-            <w:tcBorders>
-              <w:top w:val="single" w:sz="4" w:space="0" w:color="CCCCCC"/>
-              <w:left w:val="single" w:sz="4" w:space="0" w:color="CCCCCC"/>
-              <w:bottom w:val="single" w:sz="4" w:space="0" w:color="CCCCCC"/>
-              <w:right w:val="single" w:sz="4" w:space="0" w:color="CCCCCC"/>
-            </w:tcBorders>
-          </w:tcPr>
-          <w:p>
-            <w:pPr>
-              <w:spacing w:before="80" w:after="80"/>
-              <w:jc w:val="center"/>
-            </w:pPr>
-            <w:r>
-              <w:rPr>
-                <w:rFonts w:ascii="Calibri" w:hAnsi="Calibri"/>
-                <w:b/>
-                <w:i w:val="0"/>
-                <w:color w:val="FFFFFF"/>
-                <w:sz w:val="18"/>
-              </w:rPr>
-              <w:t>@rgbeac (proposta jun. 2025)</w:t>
-            </w:r>
-          </w:p>
-        </w:tc>
-        <w:tc>
-          <w:tcPr>
-            <w:tcW w:type="dxa" w:w="3784"/>
-            <w:shd w:val="clear" w:color="auto" w:fill="7E4C00"/>
-            <w:tcBorders>
-              <w:top w:val="single" w:sz="4" w:space="0" w:color="CCCCCC"/>
-              <w:left w:val="single" w:sz="4" w:space="0" w:color="CCCCCC"/>
-              <w:bottom w:val="single" w:sz="4" w:space="0" w:color="CCCCCC"/>
-              <w:right w:val="single" w:sz="4" w:space="0" w:color="CCCCCC"/>
-            </w:tcBorders>
-          </w:tcPr>
-          <w:p>
-            <w:pPr>
-              <w:spacing w:before="80" w:after="80"/>
-              <w:jc w:val="center"/>
-            </w:pPr>
-            <w:r>
-              <w:rPr>
-                <w:rFonts w:ascii="Calibri" w:hAnsi="Calibri"/>
-                <w:b/>
-                <w:i w:val="0"/>
-                <w:color w:val="FFFFFF"/>
-                <w:sz w:val="18"/>
-              </w:rPr>
-              <w:t>@codigo (DL n.º 214/2013)</w:t>
-            </w:r>
-          </w:p>
-        </w:tc>
-        <w:tc>
-          <w:tcPr>
-            <w:tcW w:type="dxa" w:w="3784"/>
-            <w:shd w:val="clear" w:color="auto" w:fill="006064"/>
-            <w:tcBorders>
-              <w:top w:val="single" w:sz="4" w:space="0" w:color="CCCCCC"/>
-              <w:left w:val="single" w:sz="4" w:space="0" w:color="CCCCCC"/>
-              <w:bottom w:val="single" w:sz="4" w:space="0" w:color="CCCCCC"/>
-              <w:right w:val="single" w:sz="4" w:space="0" w:color="CCCCCC"/>
-            </w:tcBorders>
-          </w:tcPr>
-          <w:p>
-            <w:pPr>
-              <w:spacing w:before="80" w:after="80"/>
-              <w:jc w:val="center"/>
-            </w:pPr>
-            <w:r>
-              <w:rPr>
-                <w:rFonts w:ascii="Calibri" w:hAnsi="Calibri"/>
-                <w:b/>
-                <w:i w:val="0"/>
-                <w:color w:val="FFFFFF"/>
-                <w:sz w:val="18"/>
-              </w:rPr>
-              <w:t>@legislacao (legislação vigente)</w:t>
+              <w:t>@regulamento — Texto original EN</w:t>
             </w:r>
           </w:p>
         </w:tc>
@@ -3805,7 +3853,7 @@
       <w:tr>
         <w:tc>
           <w:tcPr>
-            <w:tcW w:type="dxa" w:w="3784"/>
+            <w:tcW w:type="dxa" w:w="15138"/>
             <w:shd w:val="clear" w:color="auto" w:fill="D6E4F0"/>
             <w:tcBorders>
               <w:top w:val="single" w:sz="4" w:space="0" w:color="CCCCCC"/>
@@ -3820,17 +3868,6 @@
               <w:spacing w:before="80" w:after="80"/>
               <w:ind w:left="80" w:right="80"/>
             </w:pPr>
-            <w:r>
-              <w:rPr>
-                <w:rFonts w:ascii="Calibri" w:hAnsi="Calibri"/>
-                <w:b/>
-                <w:i/>
-                <w:color w:val="555555"/>
-                <w:sz w:val="16"/>
-              </w:rPr>
-              <w:t>Art.º 6.a do Regulamento 2023/0447</w:t>
-              <w:br/>
-            </w:r>
             <w:r>
               <w:rPr>
                 <w:rFonts w:ascii="Calibri" w:hAnsi="Calibri"/>
@@ -3879,9 +3916,113 @@
             </w:r>
           </w:p>
         </w:tc>
+      </w:tr>
+    </w:tbl>
+    <w:p>
+      <w:pPr>
+        <w:spacing w:after="80"/>
+      </w:pPr>
+    </w:p>
+    <w:tbl>
+      <w:tblPr>
+        <w:tblLook w:firstColumn="1" w:firstRow="1" w:lastColumn="0" w:lastRow="0" w:noHBand="0" w:noVBand="1" w:val="04A0"/>
+        <w:tblW w:w="5000" w:type="pct"/>
+      </w:tblPr>
+      <w:tblGrid>
+        <w:gridCol w:w="5046"/>
+        <w:gridCol w:w="5046"/>
+        <w:gridCol w:w="5046"/>
+      </w:tblGrid>
+      <w:tr>
         <w:tc>
           <w:tcPr>
-            <w:tcW w:type="dxa" w:w="3784"/>
+            <w:tcW w:type="dxa" w:w="5046"/>
+            <w:shd w:val="clear" w:color="auto" w:fill="1E5631"/>
+            <w:tcBorders>
+              <w:top w:val="single" w:sz="4" w:space="0" w:color="CCCCCC"/>
+              <w:left w:val="single" w:sz="4" w:space="0" w:color="CCCCCC"/>
+              <w:bottom w:val="single" w:sz="4" w:space="0" w:color="CCCCCC"/>
+              <w:right w:val="single" w:sz="4" w:space="0" w:color="CCCCCC"/>
+            </w:tcBorders>
+          </w:tcPr>
+          <w:p>
+            <w:pPr>
+              <w:spacing w:before="80" w:after="80"/>
+              <w:jc w:val="center"/>
+            </w:pPr>
+            <w:r>
+              <w:rPr>
+                <w:rFonts w:ascii="Calibri" w:hAnsi="Calibri"/>
+                <w:b/>
+                <w:i w:val="0"/>
+                <w:color w:val="FFFFFF"/>
+                <w:sz w:val="18"/>
+              </w:rPr>
+              <w:t>@rgbeac (proposta jun. 2025)</w:t>
+            </w:r>
+          </w:p>
+        </w:tc>
+        <w:tc>
+          <w:tcPr>
+            <w:tcW w:type="dxa" w:w="5046"/>
+            <w:shd w:val="clear" w:color="auto" w:fill="7E4C00"/>
+            <w:tcBorders>
+              <w:top w:val="single" w:sz="4" w:space="0" w:color="CCCCCC"/>
+              <w:left w:val="single" w:sz="4" w:space="0" w:color="CCCCCC"/>
+              <w:bottom w:val="single" w:sz="4" w:space="0" w:color="CCCCCC"/>
+              <w:right w:val="single" w:sz="4" w:space="0" w:color="CCCCCC"/>
+            </w:tcBorders>
+          </w:tcPr>
+          <w:p>
+            <w:pPr>
+              <w:spacing w:before="80" w:after="80"/>
+              <w:jc w:val="center"/>
+            </w:pPr>
+            <w:r>
+              <w:rPr>
+                <w:rFonts w:ascii="Calibri" w:hAnsi="Calibri"/>
+                <w:b/>
+                <w:i w:val="0"/>
+                <w:color w:val="FFFFFF"/>
+                <w:sz w:val="18"/>
+              </w:rPr>
+              <w:t>@codigo (DL n.º 214/2013)</w:t>
+            </w:r>
+          </w:p>
+        </w:tc>
+        <w:tc>
+          <w:tcPr>
+            <w:tcW w:type="dxa" w:w="5046"/>
+            <w:shd w:val="clear" w:color="auto" w:fill="006064"/>
+            <w:tcBorders>
+              <w:top w:val="single" w:sz="4" w:space="0" w:color="CCCCCC"/>
+              <w:left w:val="single" w:sz="4" w:space="0" w:color="CCCCCC"/>
+              <w:bottom w:val="single" w:sz="4" w:space="0" w:color="CCCCCC"/>
+              <w:right w:val="single" w:sz="4" w:space="0" w:color="CCCCCC"/>
+            </w:tcBorders>
+          </w:tcPr>
+          <w:p>
+            <w:pPr>
+              <w:spacing w:before="80" w:after="80"/>
+              <w:jc w:val="center"/>
+            </w:pPr>
+            <w:r>
+              <w:rPr>
+                <w:rFonts w:ascii="Calibri" w:hAnsi="Calibri"/>
+                <w:b/>
+                <w:i w:val="0"/>
+                <w:color w:val="FFFFFF"/>
+                <w:sz w:val="18"/>
+              </w:rPr>
+              <w:t>@legislacao (legislação vigente)</w:t>
+            </w:r>
+          </w:p>
+        </w:tc>
+      </w:tr>
+      <w:tr>
+        <w:tc>
+          <w:tcPr>
+            <w:tcW w:type="dxa" w:w="5046"/>
             <w:shd w:val="clear" w:color="auto" w:fill="D5E8D4"/>
             <w:tcBorders>
               <w:top w:val="single" w:sz="4" w:space="0" w:color="CCCCCC"/>
@@ -3937,7 +4078,7 @@
         </w:tc>
         <w:tc>
           <w:tcPr>
-            <w:tcW w:type="dxa" w:w="3784"/>
+            <w:tcW w:type="dxa" w:w="5046"/>
             <w:shd w:val="clear" w:color="auto" w:fill="FFE6CC"/>
             <w:tcBorders>
               <w:top w:val="single" w:sz="4" w:space="0" w:color="CCCCCC"/>
@@ -4025,7 +4166,7 @@
         </w:tc>
         <w:tc>
           <w:tcPr>
-            <w:tcW w:type="dxa" w:w="3784"/>
+            <w:tcW w:type="dxa" w:w="5046"/>
             <w:shd w:val="clear" w:color="auto" w:fill="E0F7FA"/>
             <w:tcBorders>
               <w:top w:val="single" w:sz="4" w:space="0" w:color="CCCCCC"/>
@@ -4076,117 +4217,6 @@
                 <w:sz w:val="19"/>
               </w:rPr>
               <w:t>Artigo 18.º, n.º 1 — Os detentores de animais de companhia que os apresentem com quaisquer amputações que modifiquem a aparência dos animais ou com fins não curativos devem possuir documento comprovativo, passado pelo médico veterinário que a elas procedeu, da necessidade dessa amputação, nomeadamente discriminando que as mesmas foram feitas por razões médico-veterinárias ou no interesse particular do animal ou para impedir a reprodução.</w:t>
-            </w:r>
-          </w:p>
-        </w:tc>
-      </w:tr>
-    </w:tbl>
-    <w:p>
-      <w:pPr>
-        <w:spacing w:after="80"/>
-      </w:pPr>
-    </w:p>
-    <w:tbl>
-      <w:tblPr>
-        <w:tblLook w:firstColumn="1" w:firstRow="1" w:lastColumn="0" w:lastRow="0" w:noHBand="0" w:noVBand="1" w:val="04A0"/>
-        <w:tblW w:w="5000" w:type="pct"/>
-      </w:tblPr>
-      <w:tblGrid>
-        <w:gridCol w:w="15138"/>
-      </w:tblGrid>
-      <w:tr>
-        <w:tc>
-          <w:tcPr>
-            <w:tcW w:type="dxa" w:w="15138"/>
-            <w:shd w:val="clear" w:color="auto" w:fill="2471A3"/>
-            <w:tcBorders>
-              <w:top w:val="single" w:sz="4" w:space="0" w:color="CCCCCC"/>
-              <w:left w:val="single" w:sz="4" w:space="0" w:color="CCCCCC"/>
-              <w:bottom w:val="single" w:sz="4" w:space="0" w:color="CCCCCC"/>
-              <w:right w:val="single" w:sz="4" w:space="0" w:color="CCCCCC"/>
-            </w:tcBorders>
-          </w:tcPr>
-          <w:p>
-            <w:pPr>
-              <w:spacing w:before="80" w:after="80"/>
-              <w:jc w:val="center"/>
-            </w:pPr>
-            <w:r>
-              <w:rPr>
-                <w:rFonts w:ascii="Calibri" w:hAnsi="Calibri"/>
-                <w:b/>
-                <w:i w:val="0"/>
-                <w:color w:val="FFFFFF"/>
-                <w:sz w:val="18"/>
-              </w:rPr>
-              <w:t>Tradução do @regulamento (PT-PT)</w:t>
-            </w:r>
-          </w:p>
-        </w:tc>
-      </w:tr>
-      <w:tr>
-        <w:tc>
-          <w:tcPr>
-            <w:tcW w:type="dxa" w:w="15138"/>
-            <w:shd w:val="clear" w:color="auto" w:fill="EBF5FB"/>
-            <w:tcBorders>
-              <w:top w:val="single" w:sz="4" w:space="0" w:color="CCCCCC"/>
-              <w:left w:val="single" w:sz="4" w:space="0" w:color="CCCCCC"/>
-              <w:bottom w:val="single" w:sz="4" w:space="0" w:color="CCCCCC"/>
-              <w:right w:val="single" w:sz="4" w:space="0" w:color="CCCCCC"/>
-            </w:tcBorders>
-            <w:vAlign w:val="top"/>
-          </w:tcPr>
-          <w:p>
-            <w:pPr>
-              <w:spacing w:before="80" w:after="80"/>
-              <w:ind w:left="80" w:right="80"/>
-            </w:pPr>
-            <w:r>
-              <w:rPr>
-                <w:rFonts w:ascii="Calibri" w:hAnsi="Calibri"/>
-                <w:b w:val="0"/>
-                <w:i/>
-                <w:color w:val="222222"/>
-                <w:sz w:val="19"/>
-              </w:rPr>
-              <w:t>Os operadores de estabelecimentos de criação devem assegurar que as suas estratégias de criação minimizam o risco de produzir cães ou gatos com genótipos associados a efeitos prejudiciais para a sua saúde e bem-estar.</w:t>
-            </w:r>
-          </w:p>
-          <w:p>
-            <w:pPr>
-              <w:spacing w:before="120" w:after="0"/>
-              <w:ind w:left="80"/>
-            </w:pPr>
-            <w:r>
-              <w:rPr>
-                <w:rFonts w:ascii="Calibri" w:hAnsi="Calibri"/>
-                <w:b w:val="0"/>
-                <w:i/>
-                <w:color w:val="222222"/>
-                <w:sz w:val="19"/>
-              </w:rPr>
-              <w:t>Os operadores de estabelecimentos de criação não devem utilizar para reprodução cães ou gatos que apresentem traços conformacionais excessivos que conduzam a um risco elevado de efeitos prejudiciais para o bem-estar desses animais ou das suas crias. Antes da seleção para reprodução de um animal potencialmente afetado por traço conformacional excessivo, o operador deve consultar um médico veterinário ou uma pessoa qualificada independente sob responsabilidade veterinária.</w:t>
-            </w:r>
-          </w:p>
-          <w:p>
-            <w:pPr>
-              <w:spacing w:before="120" w:after="0"/>
-              <w:ind w:left="80"/>
-            </w:pPr>
-            <w:r>
-              <w:rPr>
-                <w:rFonts w:ascii="Calibri" w:hAnsi="Calibri"/>
-                <w:b w:val="0"/>
-                <w:i/>
-                <w:color w:val="222222"/>
-                <w:sz w:val="19"/>
-              </w:rPr>
-              <w:t>São proibidos na gestão da reprodução de cães e gatos:</w:t>
-              <w:br/>
-              <w:t>(a) o cruzamento entre progenitores e descendentes, entre irmãos, entre meios-irmãos ou entre avós e netos, exceto com aprovação da autoridade competente por razão de necessidade específica de preservação de raças locais com reserva genética limitada;</w:t>
-              <w:br/>
-              <w:t>(b) o cruzamento para produção de híbridos.</w:t>
             </w:r>
           </w:p>
         </w:tc>
@@ -4446,465 +4476,6 @@
         <w:tblW w:w="5000" w:type="pct"/>
       </w:tblPr>
       <w:tblGrid>
-        <w:gridCol w:w="3784"/>
-        <w:gridCol w:w="3784"/>
-        <w:gridCol w:w="3784"/>
-        <w:gridCol w:w="3784"/>
-      </w:tblGrid>
-      <w:tr>
-        <w:tc>
-          <w:tcPr>
-            <w:tcW w:type="dxa" w:w="3784"/>
-            <w:shd w:val="clear" w:color="auto" w:fill="1A3A5C"/>
-            <w:tcBorders>
-              <w:top w:val="single" w:sz="4" w:space="0" w:color="CCCCCC"/>
-              <w:left w:val="single" w:sz="4" w:space="0" w:color="CCCCCC"/>
-              <w:bottom w:val="single" w:sz="4" w:space="0" w:color="CCCCCC"/>
-              <w:right w:val="single" w:sz="4" w:space="0" w:color="CCCCCC"/>
-            </w:tcBorders>
-          </w:tcPr>
-          <w:p>
-            <w:pPr>
-              <w:spacing w:before="80" w:after="80"/>
-              <w:jc w:val="center"/>
-            </w:pPr>
-            <w:r>
-              <w:rPr>
-                <w:rFonts w:ascii="Calibri" w:hAnsi="Calibri"/>
-                <w:b/>
-                <w:i w:val="0"/>
-                <w:color w:val="FFFFFF"/>
-                <w:sz w:val="18"/>
-              </w:rPr>
-              <w:t>@regulamento (texto original EN)</w:t>
-            </w:r>
-          </w:p>
-        </w:tc>
-        <w:tc>
-          <w:tcPr>
-            <w:tcW w:type="dxa" w:w="3784"/>
-            <w:shd w:val="clear" w:color="auto" w:fill="1E5631"/>
-            <w:tcBorders>
-              <w:top w:val="single" w:sz="4" w:space="0" w:color="CCCCCC"/>
-              <w:left w:val="single" w:sz="4" w:space="0" w:color="CCCCCC"/>
-              <w:bottom w:val="single" w:sz="4" w:space="0" w:color="CCCCCC"/>
-              <w:right w:val="single" w:sz="4" w:space="0" w:color="CCCCCC"/>
-            </w:tcBorders>
-          </w:tcPr>
-          <w:p>
-            <w:pPr>
-              <w:spacing w:before="80" w:after="80"/>
-              <w:jc w:val="center"/>
-            </w:pPr>
-            <w:r>
-              <w:rPr>
-                <w:rFonts w:ascii="Calibri" w:hAnsi="Calibri"/>
-                <w:b/>
-                <w:i w:val="0"/>
-                <w:color w:val="FFFFFF"/>
-                <w:sz w:val="18"/>
-              </w:rPr>
-              <w:t>@rgbeac (proposta jun. 2025)</w:t>
-            </w:r>
-          </w:p>
-        </w:tc>
-        <w:tc>
-          <w:tcPr>
-            <w:tcW w:type="dxa" w:w="3784"/>
-            <w:shd w:val="clear" w:color="auto" w:fill="7E4C00"/>
-            <w:tcBorders>
-              <w:top w:val="single" w:sz="4" w:space="0" w:color="CCCCCC"/>
-              <w:left w:val="single" w:sz="4" w:space="0" w:color="CCCCCC"/>
-              <w:bottom w:val="single" w:sz="4" w:space="0" w:color="CCCCCC"/>
-              <w:right w:val="single" w:sz="4" w:space="0" w:color="CCCCCC"/>
-            </w:tcBorders>
-          </w:tcPr>
-          <w:p>
-            <w:pPr>
-              <w:spacing w:before="80" w:after="80"/>
-              <w:jc w:val="center"/>
-            </w:pPr>
-            <w:r>
-              <w:rPr>
-                <w:rFonts w:ascii="Calibri" w:hAnsi="Calibri"/>
-                <w:b/>
-                <w:i w:val="0"/>
-                <w:color w:val="FFFFFF"/>
-                <w:sz w:val="18"/>
-              </w:rPr>
-              <w:t>@codigo (DL n.º 214/2013)</w:t>
-            </w:r>
-          </w:p>
-        </w:tc>
-        <w:tc>
-          <w:tcPr>
-            <w:tcW w:type="dxa" w:w="3784"/>
-            <w:shd w:val="clear" w:color="auto" w:fill="006064"/>
-            <w:tcBorders>
-              <w:top w:val="single" w:sz="4" w:space="0" w:color="CCCCCC"/>
-              <w:left w:val="single" w:sz="4" w:space="0" w:color="CCCCCC"/>
-              <w:bottom w:val="single" w:sz="4" w:space="0" w:color="CCCCCC"/>
-              <w:right w:val="single" w:sz="4" w:space="0" w:color="CCCCCC"/>
-            </w:tcBorders>
-          </w:tcPr>
-          <w:p>
-            <w:pPr>
-              <w:spacing w:before="80" w:after="80"/>
-              <w:jc w:val="center"/>
-            </w:pPr>
-            <w:r>
-              <w:rPr>
-                <w:rFonts w:ascii="Calibri" w:hAnsi="Calibri"/>
-                <w:b/>
-                <w:i w:val="0"/>
-                <w:color w:val="FFFFFF"/>
-                <w:sz w:val="18"/>
-              </w:rPr>
-              <w:t>@legislacao (legislação vigente)</w:t>
-            </w:r>
-          </w:p>
-        </w:tc>
-      </w:tr>
-      <w:tr>
-        <w:tc>
-          <w:tcPr>
-            <w:tcW w:type="dxa" w:w="3784"/>
-            <w:shd w:val="clear" w:color="auto" w:fill="D6E4F0"/>
-            <w:tcBorders>
-              <w:top w:val="single" w:sz="4" w:space="0" w:color="CCCCCC"/>
-              <w:left w:val="single" w:sz="4" w:space="0" w:color="CCCCCC"/>
-              <w:bottom w:val="single" w:sz="4" w:space="0" w:color="CCCCCC"/>
-              <w:right w:val="single" w:sz="4" w:space="0" w:color="CCCCCC"/>
-            </w:tcBorders>
-            <w:vAlign w:val="top"/>
-          </w:tcPr>
-          <w:p>
-            <w:pPr>
-              <w:spacing w:before="80" w:after="80"/>
-              <w:ind w:left="80" w:right="80"/>
-            </w:pPr>
-            <w:r>
-              <w:rPr>
-                <w:rFonts w:ascii="Calibri" w:hAnsi="Calibri"/>
-                <w:b/>
-                <w:i/>
-                <w:color w:val="555555"/>
-                <w:sz w:val="16"/>
-              </w:rPr>
-              <w:t>Art.º 13.º do Regulamento 2023/0447</w:t>
-              <w:br/>
-            </w:r>
-            <w:r>
-              <w:rPr>
-                <w:rFonts w:ascii="Calibri" w:hAnsi="Calibri"/>
-                <w:b w:val="0"/>
-                <w:i w:val="0"/>
-                <w:color w:val="222222"/>
-                <w:sz w:val="19"/>
-              </w:rPr>
-              <w:t>Operators shall ensure that:</w:t>
-            </w:r>
-          </w:p>
-          <w:p>
-            <w:pPr>
-              <w:spacing w:before="120" w:after="0"/>
-              <w:ind w:left="80"/>
-            </w:pPr>
-            <w:r>
-              <w:rPr>
-                <w:rFonts w:ascii="Calibri" w:hAnsi="Calibri"/>
-                <w:b w:val="0"/>
-                <w:i w:val="0"/>
-                <w:color w:val="222222"/>
-                <w:sz w:val="19"/>
-              </w:rPr>
-              <w:t>(a) dogs or cats under their responsibility are inspected by animal caretakers at least once a day and vulnerable dogs and cats, such as newborns, ill or injured dogs and cats, and peri-partum bitches and queens, are inspected more frequently;</w:t>
-            </w:r>
-          </w:p>
-          <w:p>
-            <w:pPr>
-              <w:spacing w:before="120" w:after="0"/>
-              <w:ind w:left="80"/>
-            </w:pPr>
-            <w:r>
-              <w:rPr>
-                <w:rFonts w:ascii="Calibri" w:hAnsi="Calibri"/>
-                <w:b w:val="0"/>
-                <w:i w:val="0"/>
-                <w:color w:val="222222"/>
-                <w:sz w:val="19"/>
-              </w:rPr>
-              <w:t>(b) dogs or cats with compromised welfare are, where necessary, transferred without undue delay to a separate area and, where needed, receive appropriate treatment;</w:t>
-            </w:r>
-          </w:p>
-          <w:p>
-            <w:pPr>
-              <w:spacing w:before="120" w:after="0"/>
-              <w:ind w:left="80"/>
-            </w:pPr>
-            <w:r>
-              <w:rPr>
-                <w:rFonts w:ascii="Calibri" w:hAnsi="Calibri"/>
-                <w:b w:val="0"/>
-                <w:i w:val="0"/>
-                <w:color w:val="222222"/>
-                <w:sz w:val="19"/>
-              </w:rPr>
-              <w:t>(c) where the recovery of a dog or a cat with compromised welfare is not achievable and the dog or cat experiences severe pain or suffering, a veterinarian is consulted without undue delay, to decide whether the dog or cat shall be euthanised to end its suffering, and, if that is the case, to perform the euthanasia using anesthesia and analgesia;</w:t>
-            </w:r>
-          </w:p>
-          <w:p>
-            <w:pPr>
-              <w:spacing w:before="120" w:after="0"/>
-              <w:ind w:left="80"/>
-            </w:pPr>
-            <w:r>
-              <w:rPr>
-                <w:rFonts w:ascii="Calibri" w:hAnsi="Calibri"/>
-                <w:b w:val="0"/>
-                <w:i w:val="0"/>
-                <w:color w:val="222222"/>
-                <w:sz w:val="19"/>
-              </w:rPr>
-              <w:t>(d) measures to prevent and control external and internal parasites, and vaccinations to prevent common diseases to which dogs or cats are likely to be exposed are implemented.</w:t>
-            </w:r>
-          </w:p>
-          <w:p>
-            <w:pPr>
-              <w:spacing w:before="120" w:after="0"/>
-              <w:ind w:left="80"/>
-            </w:pPr>
-            <w:r>
-              <w:rPr>
-                <w:rFonts w:ascii="Calibri" w:hAnsi="Calibri"/>
-                <w:b w:val="0"/>
-                <w:i w:val="0"/>
-                <w:color w:val="222222"/>
-                <w:sz w:val="19"/>
-              </w:rPr>
-              <w:t>Operators of breeding establishments shall additionally ensure that:</w:t>
-              <w:br/>
-              <w:t>(-a) bitches or queens are only bred if they have reached a minimum age and skeletal maturity in accordance with point 3 of Annex I, and they have no diagnosed disease, clinical sign of diseases or physical conditions which could negatively impact their pregnancy and welfare;</w:t>
-              <w:br/>
-              <w:t>(-b) litter-giving pregnancies of bitches or queens follows a maximum frequency in accordance with point 3 of Annex I;</w:t>
-              <w:br/>
-              <w:t>(-c) lactating queens are not mated or inseminated.</w:t>
-            </w:r>
-          </w:p>
-        </w:tc>
-        <w:tc>
-          <w:tcPr>
-            <w:tcW w:type="dxa" w:w="3784"/>
-            <w:shd w:val="clear" w:color="auto" w:fill="D5E8D4"/>
-            <w:tcBorders>
-              <w:top w:val="single" w:sz="4" w:space="0" w:color="CCCCCC"/>
-              <w:left w:val="single" w:sz="4" w:space="0" w:color="CCCCCC"/>
-              <w:bottom w:val="single" w:sz="4" w:space="0" w:color="CCCCCC"/>
-              <w:right w:val="single" w:sz="4" w:space="0" w:color="CCCCCC"/>
-            </w:tcBorders>
-            <w:vAlign w:val="top"/>
-          </w:tcPr>
-          <w:p>
-            <w:pPr>
-              <w:spacing w:before="80" w:after="80"/>
-              <w:ind w:left="80" w:right="80"/>
-            </w:pPr>
-            <w:r>
-              <w:rPr>
-                <w:rFonts w:ascii="Calibri" w:hAnsi="Calibri"/>
-                <w:b/>
-                <w:i/>
-                <w:color w:val="555555"/>
-                <w:sz w:val="16"/>
-              </w:rPr>
-              <w:t>n.ºs 1, 2 e 3 do art.º 33.º do RGBEAC (proposta, jun. 2025)</w:t>
-              <w:br/>
-            </w:r>
-            <w:r>
-              <w:rPr>
-                <w:rFonts w:ascii="Calibri" w:hAnsi="Calibri"/>
-                <w:b w:val="0"/>
-                <w:i w:val="0"/>
-                <w:color w:val="222222"/>
-                <w:sz w:val="19"/>
-              </w:rPr>
-              <w:t>1 — Os detentores dos animais de companhia devem assegurar-lhes os cuidados de saúde adequados, nomeadamente seguindo as orientações da DGAV em matéria de vacinação e tratamentos obrigatórios, bem como consultas regulares junto de médico veterinário.</w:t>
-            </w:r>
-          </w:p>
-          <w:p>
-            <w:pPr>
-              <w:spacing w:before="120" w:after="0"/>
-              <w:ind w:left="80"/>
-            </w:pPr>
-            <w:r>
-              <w:rPr>
-                <w:rFonts w:ascii="Calibri" w:hAnsi="Calibri"/>
-                <w:b w:val="0"/>
-                <w:i w:val="0"/>
-                <w:color w:val="222222"/>
-                <w:sz w:val="19"/>
-              </w:rPr>
-              <w:t>2 — Os animais que apresentem sinais que levem a suspeitar de poderem estar doentes ou lesionados devem receber os primeiros cuidados pelo detentor e, se não houver indícios de recuperação, devem ser tratados por médico veterinário.</w:t>
-            </w:r>
-          </w:p>
-          <w:p>
-            <w:pPr>
-              <w:spacing w:before="120" w:after="0"/>
-              <w:ind w:left="80"/>
-            </w:pPr>
-            <w:r>
-              <w:rPr>
-                <w:rFonts w:ascii="Calibri" w:hAnsi="Calibri"/>
-                <w:b w:val="0"/>
-                <w:i w:val="0"/>
-                <w:color w:val="222222"/>
-                <w:sz w:val="19"/>
-              </w:rPr>
-              <w:t>3 — Os médicos veterinários e os centros de atendimento médico-veterinário (CAMV) devem manter um arquivo com os dados clínicos de cada animal, pelo período mínimo de cinco anos, que ficará à disposição das autoridades competentes.</w:t>
-            </w:r>
-          </w:p>
-        </w:tc>
-        <w:tc>
-          <w:tcPr>
-            <w:tcW w:type="dxa" w:w="3784"/>
-            <w:shd w:val="clear" w:color="auto" w:fill="FFE6CC"/>
-            <w:tcBorders>
-              <w:top w:val="single" w:sz="4" w:space="0" w:color="CCCCCC"/>
-              <w:left w:val="single" w:sz="4" w:space="0" w:color="CCCCCC"/>
-              <w:bottom w:val="single" w:sz="4" w:space="0" w:color="CCCCCC"/>
-              <w:right w:val="single" w:sz="4" w:space="0" w:color="CCCCCC"/>
-            </w:tcBorders>
-            <w:vAlign w:val="top"/>
-          </w:tcPr>
-          <w:p>
-            <w:pPr>
-              <w:spacing w:before="80" w:after="80"/>
-              <w:ind w:left="80" w:right="80"/>
-            </w:pPr>
-            <w:r>
-              <w:rPr>
-                <w:rFonts w:ascii="Calibri" w:hAnsi="Calibri"/>
-                <w:b/>
-                <w:i/>
-                <w:color w:val="555555"/>
-                <w:sz w:val="16"/>
-              </w:rPr>
-              <w:t>art.º 6.º do Código do Animal (DL n.º 214/2013)</w:t>
-              <w:br/>
-            </w:r>
-            <w:r>
-              <w:rPr>
-                <w:rFonts w:ascii="Calibri" w:hAnsi="Calibri"/>
-                <w:b w:val="0"/>
-                <w:i w:val="0"/>
-                <w:color w:val="222222"/>
-                <w:sz w:val="19"/>
-              </w:rPr>
-              <w:t>O detentor do animal deve assegurar ao animal ferido ou doente os cuidados médico-veterinários adequados, designadamente retirando o mesmo do alojamento sempre que este seja um local de venda.</w:t>
-            </w:r>
-          </w:p>
-        </w:tc>
-        <w:tc>
-          <w:tcPr>
-            <w:tcW w:type="dxa" w:w="3784"/>
-            <w:shd w:val="clear" w:color="auto" w:fill="E0F7FA"/>
-            <w:tcBorders>
-              <w:top w:val="single" w:sz="4" w:space="0" w:color="CCCCCC"/>
-              <w:left w:val="single" w:sz="4" w:space="0" w:color="CCCCCC"/>
-              <w:bottom w:val="single" w:sz="4" w:space="0" w:color="CCCCCC"/>
-              <w:right w:val="single" w:sz="4" w:space="0" w:color="CCCCCC"/>
-            </w:tcBorders>
-            <w:vAlign w:val="top"/>
-          </w:tcPr>
-          <w:p>
-            <w:pPr>
-              <w:spacing w:before="80" w:after="80"/>
-              <w:ind w:left="80" w:right="80"/>
-            </w:pPr>
-            <w:r>
-              <w:rPr>
-                <w:rFonts w:ascii="Calibri" w:hAnsi="Calibri"/>
-                <w:b/>
-                <w:i/>
-                <w:color w:val="555555"/>
-                <w:sz w:val="16"/>
-              </w:rPr>
-              <w:t>n.ºs 1 e 3 do art.º 13.º e n.ºs 1 e 2 do art.º 16.º do DL n.º 276/2001, de 17 de outubro</w:t>
-              <w:br/>
-            </w:r>
-            <w:r>
-              <w:rPr>
-                <w:rFonts w:ascii="Calibri" w:hAnsi="Calibri"/>
-                <w:b w:val="0"/>
-                <w:i w:val="0"/>
-                <w:color w:val="222222"/>
-                <w:sz w:val="19"/>
-              </w:rPr>
-              <w:t>Artigo 13.º, n.º 1 — A observação diária dos animais e o seu maneio, a organização da dieta e o tratamento médico-veterinário devem ser assegurados por pessoal técnico competente e em número adequado à quantidade e espécies animais que alojam.</w:t>
-            </w:r>
-          </w:p>
-          <w:p>
-            <w:pPr>
-              <w:spacing w:before="120" w:after="0"/>
-              <w:ind w:left="80"/>
-            </w:pPr>
-            <w:r>
-              <w:rPr>
-                <w:rFonts w:ascii="Calibri" w:hAnsi="Calibri"/>
-                <w:b w:val="0"/>
-                <w:i w:val="0"/>
-                <w:color w:val="222222"/>
-                <w:sz w:val="19"/>
-              </w:rPr>
-              <w:t>Artigo 13.º, n.º 3 — Todos os animais devem ser alvo de inspeção diária, sendo de imediato prestados os primeiros cuidados aos que tiverem sinais que levem a suspeitar estarem doentes, lesionados ou com alterações comportamentais.</w:t>
-            </w:r>
-          </w:p>
-          <w:p>
-            <w:pPr>
-              <w:spacing w:before="120" w:after="0"/>
-              <w:ind w:left="80"/>
-            </w:pPr>
-            <w:r>
-              <w:rPr>
-                <w:rFonts w:ascii="Calibri" w:hAnsi="Calibri"/>
-                <w:b w:val="0"/>
-                <w:i w:val="0"/>
-                <w:color w:val="222222"/>
-                <w:sz w:val="19"/>
-              </w:rPr>
-              <w:t>Artigo 16.º, n.º 1 — Sem prejuízo de quaisquer medidas determinadas pela DGAV, deve existir um programa de profilaxia médica e sanitária devidamente elaborado e supervisionado pelo médico veterinário responsável e executado por profissionais competentes.</w:t>
-            </w:r>
-          </w:p>
-          <w:p>
-            <w:pPr>
-              <w:spacing w:before="120" w:after="0"/>
-              <w:ind w:left="80"/>
-            </w:pPr>
-            <w:r>
-              <w:rPr>
-                <w:rFonts w:ascii="Calibri" w:hAnsi="Calibri"/>
-                <w:b w:val="0"/>
-                <w:i w:val="0"/>
-                <w:color w:val="222222"/>
-                <w:sz w:val="19"/>
-              </w:rPr>
-              <w:t>Artigo 16.º, n.º 2 — No âmbito do número anterior, os animais devem ser sujeitos a exames médico-veterinários de rotina, vacinações e desparasitações sempre que aconselhável.</w:t>
-            </w:r>
-          </w:p>
-        </w:tc>
-      </w:tr>
-    </w:tbl>
-    <w:p>
-      <w:pPr>
-        <w:spacing w:after="80"/>
-      </w:pPr>
-    </w:p>
-    <w:tbl>
-      <w:tblPr>
-        <w:tblLook w:firstColumn="1" w:firstRow="1" w:lastColumn="0" w:lastRow="0" w:noHBand="0" w:noVBand="1" w:val="04A0"/>
-        <w:tblW w:w="5000" w:type="pct"/>
-      </w:tblPr>
-      <w:tblGrid>
         <w:gridCol w:w="15138"/>
       </w:tblGrid>
       <w:tr>
@@ -4932,7 +4503,7 @@
                 <w:color w:val="FFFFFF"/>
                 <w:sz w:val="18"/>
               </w:rPr>
-              <w:t>Tradução do @regulamento (PT-PT)</w:t>
+              <w:t>@regulamento — Tradução PT-PT  ·  Art.º 13.º do Regulamento 2023/0447</w:t>
             </w:r>
           </w:p>
         </w:tc>
@@ -5050,6 +4621,471 @@
               <w:t>(-b) a frequência de gestações com ninhadas respeita o máximo fixado no Anexo I;</w:t>
               <w:br/>
               <w:t>(-c) as gatas a lactar não são acasaladas nem inseminadas.</w:t>
+            </w:r>
+          </w:p>
+        </w:tc>
+      </w:tr>
+    </w:tbl>
+    <w:p>
+      <w:pPr>
+        <w:spacing w:after="80"/>
+      </w:pPr>
+    </w:p>
+    <w:tbl>
+      <w:tblPr>
+        <w:tblLook w:firstColumn="1" w:firstRow="1" w:lastColumn="0" w:lastRow="0" w:noHBand="0" w:noVBand="1" w:val="04A0"/>
+        <w:tblW w:w="5000" w:type="pct"/>
+      </w:tblPr>
+      <w:tblGrid>
+        <w:gridCol w:w="15138"/>
+      </w:tblGrid>
+      <w:tr>
+        <w:tc>
+          <w:tcPr>
+            <w:tcW w:type="dxa" w:w="15138"/>
+            <w:shd w:val="clear" w:color="auto" w:fill="1A3A5C"/>
+            <w:tcBorders>
+              <w:top w:val="single" w:sz="4" w:space="0" w:color="CCCCCC"/>
+              <w:left w:val="single" w:sz="4" w:space="0" w:color="CCCCCC"/>
+              <w:bottom w:val="single" w:sz="4" w:space="0" w:color="CCCCCC"/>
+              <w:right w:val="single" w:sz="4" w:space="0" w:color="CCCCCC"/>
+            </w:tcBorders>
+          </w:tcPr>
+          <w:p>
+            <w:pPr>
+              <w:spacing w:before="80" w:after="80"/>
+              <w:jc w:val="center"/>
+            </w:pPr>
+            <w:r>
+              <w:rPr>
+                <w:rFonts w:ascii="Calibri" w:hAnsi="Calibri"/>
+                <w:b/>
+                <w:i w:val="0"/>
+                <w:color w:val="FFFFFF"/>
+                <w:sz w:val="18"/>
+              </w:rPr>
+              <w:t>@regulamento — Texto original EN</w:t>
+            </w:r>
+          </w:p>
+        </w:tc>
+      </w:tr>
+      <w:tr>
+        <w:tc>
+          <w:tcPr>
+            <w:tcW w:type="dxa" w:w="15138"/>
+            <w:shd w:val="clear" w:color="auto" w:fill="D6E4F0"/>
+            <w:tcBorders>
+              <w:top w:val="single" w:sz="4" w:space="0" w:color="CCCCCC"/>
+              <w:left w:val="single" w:sz="4" w:space="0" w:color="CCCCCC"/>
+              <w:bottom w:val="single" w:sz="4" w:space="0" w:color="CCCCCC"/>
+              <w:right w:val="single" w:sz="4" w:space="0" w:color="CCCCCC"/>
+            </w:tcBorders>
+            <w:vAlign w:val="top"/>
+          </w:tcPr>
+          <w:p>
+            <w:pPr>
+              <w:spacing w:before="80" w:after="80"/>
+              <w:ind w:left="80" w:right="80"/>
+            </w:pPr>
+            <w:r>
+              <w:rPr>
+                <w:rFonts w:ascii="Calibri" w:hAnsi="Calibri"/>
+                <w:b w:val="0"/>
+                <w:i w:val="0"/>
+                <w:color w:val="222222"/>
+                <w:sz w:val="19"/>
+              </w:rPr>
+              <w:t>Operators shall ensure that:</w:t>
+            </w:r>
+          </w:p>
+          <w:p>
+            <w:pPr>
+              <w:spacing w:before="120" w:after="0"/>
+              <w:ind w:left="80"/>
+            </w:pPr>
+            <w:r>
+              <w:rPr>
+                <w:rFonts w:ascii="Calibri" w:hAnsi="Calibri"/>
+                <w:b w:val="0"/>
+                <w:i w:val="0"/>
+                <w:color w:val="222222"/>
+                <w:sz w:val="19"/>
+              </w:rPr>
+              <w:t>(a) dogs or cats under their responsibility are inspected by animal caretakers at least once a day and vulnerable dogs and cats, such as newborns, ill or injured dogs and cats, and peri-partum bitches and queens, are inspected more frequently;</w:t>
+            </w:r>
+          </w:p>
+          <w:p>
+            <w:pPr>
+              <w:spacing w:before="120" w:after="0"/>
+              <w:ind w:left="80"/>
+            </w:pPr>
+            <w:r>
+              <w:rPr>
+                <w:rFonts w:ascii="Calibri" w:hAnsi="Calibri"/>
+                <w:b w:val="0"/>
+                <w:i w:val="0"/>
+                <w:color w:val="222222"/>
+                <w:sz w:val="19"/>
+              </w:rPr>
+              <w:t>(b) dogs or cats with compromised welfare are, where necessary, transferred without undue delay to a separate area and, where needed, receive appropriate treatment;</w:t>
+            </w:r>
+          </w:p>
+          <w:p>
+            <w:pPr>
+              <w:spacing w:before="120" w:after="0"/>
+              <w:ind w:left="80"/>
+            </w:pPr>
+            <w:r>
+              <w:rPr>
+                <w:rFonts w:ascii="Calibri" w:hAnsi="Calibri"/>
+                <w:b w:val="0"/>
+                <w:i w:val="0"/>
+                <w:color w:val="222222"/>
+                <w:sz w:val="19"/>
+              </w:rPr>
+              <w:t>(c) where the recovery of a dog or a cat with compromised welfare is not achievable and the dog or cat experiences severe pain or suffering, a veterinarian is consulted without undue delay, to decide whether the dog or cat shall be euthanised to end its suffering, and, if that is the case, to perform the euthanasia using anesthesia and analgesia;</w:t>
+            </w:r>
+          </w:p>
+          <w:p>
+            <w:pPr>
+              <w:spacing w:before="120" w:after="0"/>
+              <w:ind w:left="80"/>
+            </w:pPr>
+            <w:r>
+              <w:rPr>
+                <w:rFonts w:ascii="Calibri" w:hAnsi="Calibri"/>
+                <w:b w:val="0"/>
+                <w:i w:val="0"/>
+                <w:color w:val="222222"/>
+                <w:sz w:val="19"/>
+              </w:rPr>
+              <w:t>(d) measures to prevent and control external and internal parasites, and vaccinations to prevent common diseases to which dogs or cats are likely to be exposed are implemented.</w:t>
+            </w:r>
+          </w:p>
+          <w:p>
+            <w:pPr>
+              <w:spacing w:before="120" w:after="0"/>
+              <w:ind w:left="80"/>
+            </w:pPr>
+            <w:r>
+              <w:rPr>
+                <w:rFonts w:ascii="Calibri" w:hAnsi="Calibri"/>
+                <w:b w:val="0"/>
+                <w:i w:val="0"/>
+                <w:color w:val="222222"/>
+                <w:sz w:val="19"/>
+              </w:rPr>
+              <w:t>Operators of breeding establishments shall additionally ensure that:</w:t>
+              <w:br/>
+              <w:t>(-a) bitches or queens are only bred if they have reached a minimum age and skeletal maturity in accordance with point 3 of Annex I, and they have no diagnosed disease, clinical sign of diseases or physical conditions which could negatively impact their pregnancy and welfare;</w:t>
+              <w:br/>
+              <w:t>(-b) litter-giving pregnancies of bitches or queens follows a maximum frequency in accordance with point 3 of Annex I;</w:t>
+              <w:br/>
+              <w:t>(-c) lactating queens are not mated or inseminated.</w:t>
+            </w:r>
+          </w:p>
+        </w:tc>
+      </w:tr>
+    </w:tbl>
+    <w:p>
+      <w:pPr>
+        <w:spacing w:after="80"/>
+      </w:pPr>
+    </w:p>
+    <w:tbl>
+      <w:tblPr>
+        <w:tblLook w:firstColumn="1" w:firstRow="1" w:lastColumn="0" w:lastRow="0" w:noHBand="0" w:noVBand="1" w:val="04A0"/>
+        <w:tblW w:w="5000" w:type="pct"/>
+      </w:tblPr>
+      <w:tblGrid>
+        <w:gridCol w:w="5046"/>
+        <w:gridCol w:w="5046"/>
+        <w:gridCol w:w="5046"/>
+      </w:tblGrid>
+      <w:tr>
+        <w:tc>
+          <w:tcPr>
+            <w:tcW w:type="dxa" w:w="5046"/>
+            <w:shd w:val="clear" w:color="auto" w:fill="1E5631"/>
+            <w:tcBorders>
+              <w:top w:val="single" w:sz="4" w:space="0" w:color="CCCCCC"/>
+              <w:left w:val="single" w:sz="4" w:space="0" w:color="CCCCCC"/>
+              <w:bottom w:val="single" w:sz="4" w:space="0" w:color="CCCCCC"/>
+              <w:right w:val="single" w:sz="4" w:space="0" w:color="CCCCCC"/>
+            </w:tcBorders>
+          </w:tcPr>
+          <w:p>
+            <w:pPr>
+              <w:spacing w:before="80" w:after="80"/>
+              <w:jc w:val="center"/>
+            </w:pPr>
+            <w:r>
+              <w:rPr>
+                <w:rFonts w:ascii="Calibri" w:hAnsi="Calibri"/>
+                <w:b/>
+                <w:i w:val="0"/>
+                <w:color w:val="FFFFFF"/>
+                <w:sz w:val="18"/>
+              </w:rPr>
+              <w:t>@rgbeac (proposta jun. 2025)</w:t>
+            </w:r>
+          </w:p>
+        </w:tc>
+        <w:tc>
+          <w:tcPr>
+            <w:tcW w:type="dxa" w:w="5046"/>
+            <w:shd w:val="clear" w:color="auto" w:fill="7E4C00"/>
+            <w:tcBorders>
+              <w:top w:val="single" w:sz="4" w:space="0" w:color="CCCCCC"/>
+              <w:left w:val="single" w:sz="4" w:space="0" w:color="CCCCCC"/>
+              <w:bottom w:val="single" w:sz="4" w:space="0" w:color="CCCCCC"/>
+              <w:right w:val="single" w:sz="4" w:space="0" w:color="CCCCCC"/>
+            </w:tcBorders>
+          </w:tcPr>
+          <w:p>
+            <w:pPr>
+              <w:spacing w:before="80" w:after="80"/>
+              <w:jc w:val="center"/>
+            </w:pPr>
+            <w:r>
+              <w:rPr>
+                <w:rFonts w:ascii="Calibri" w:hAnsi="Calibri"/>
+                <w:b/>
+                <w:i w:val="0"/>
+                <w:color w:val="FFFFFF"/>
+                <w:sz w:val="18"/>
+              </w:rPr>
+              <w:t>@codigo (DL n.º 214/2013)</w:t>
+            </w:r>
+          </w:p>
+        </w:tc>
+        <w:tc>
+          <w:tcPr>
+            <w:tcW w:type="dxa" w:w="5046"/>
+            <w:shd w:val="clear" w:color="auto" w:fill="006064"/>
+            <w:tcBorders>
+              <w:top w:val="single" w:sz="4" w:space="0" w:color="CCCCCC"/>
+              <w:left w:val="single" w:sz="4" w:space="0" w:color="CCCCCC"/>
+              <w:bottom w:val="single" w:sz="4" w:space="0" w:color="CCCCCC"/>
+              <w:right w:val="single" w:sz="4" w:space="0" w:color="CCCCCC"/>
+            </w:tcBorders>
+          </w:tcPr>
+          <w:p>
+            <w:pPr>
+              <w:spacing w:before="80" w:after="80"/>
+              <w:jc w:val="center"/>
+            </w:pPr>
+            <w:r>
+              <w:rPr>
+                <w:rFonts w:ascii="Calibri" w:hAnsi="Calibri"/>
+                <w:b/>
+                <w:i w:val="0"/>
+                <w:color w:val="FFFFFF"/>
+                <w:sz w:val="18"/>
+              </w:rPr>
+              <w:t>@legislacao (legislação vigente)</w:t>
+            </w:r>
+          </w:p>
+        </w:tc>
+      </w:tr>
+      <w:tr>
+        <w:tc>
+          <w:tcPr>
+            <w:tcW w:type="dxa" w:w="5046"/>
+            <w:shd w:val="clear" w:color="auto" w:fill="D5E8D4"/>
+            <w:tcBorders>
+              <w:top w:val="single" w:sz="4" w:space="0" w:color="CCCCCC"/>
+              <w:left w:val="single" w:sz="4" w:space="0" w:color="CCCCCC"/>
+              <w:bottom w:val="single" w:sz="4" w:space="0" w:color="CCCCCC"/>
+              <w:right w:val="single" w:sz="4" w:space="0" w:color="CCCCCC"/>
+            </w:tcBorders>
+            <w:vAlign w:val="top"/>
+          </w:tcPr>
+          <w:p>
+            <w:pPr>
+              <w:spacing w:before="80" w:after="80"/>
+              <w:ind w:left="80" w:right="80"/>
+            </w:pPr>
+            <w:r>
+              <w:rPr>
+                <w:rFonts w:ascii="Calibri" w:hAnsi="Calibri"/>
+                <w:b/>
+                <w:i/>
+                <w:color w:val="555555"/>
+                <w:sz w:val="16"/>
+              </w:rPr>
+              <w:t>n.ºs 1, 2 e 3 do art.º 33.º do RGBEAC (proposta, jun. 2025)</w:t>
+              <w:br/>
+            </w:r>
+            <w:r>
+              <w:rPr>
+                <w:rFonts w:ascii="Calibri" w:hAnsi="Calibri"/>
+                <w:b w:val="0"/>
+                <w:i w:val="0"/>
+                <w:color w:val="222222"/>
+                <w:sz w:val="19"/>
+              </w:rPr>
+              <w:t>1 — Os detentores dos animais de companhia devem assegurar-lhes os cuidados de saúde adequados, nomeadamente seguindo as orientações da DGAV em matéria de vacinação e tratamentos obrigatórios, bem como consultas regulares junto de médico veterinário.</w:t>
+            </w:r>
+          </w:p>
+          <w:p>
+            <w:pPr>
+              <w:spacing w:before="120" w:after="0"/>
+              <w:ind w:left="80"/>
+            </w:pPr>
+            <w:r>
+              <w:rPr>
+                <w:rFonts w:ascii="Calibri" w:hAnsi="Calibri"/>
+                <w:b w:val="0"/>
+                <w:i w:val="0"/>
+                <w:color w:val="222222"/>
+                <w:sz w:val="19"/>
+              </w:rPr>
+              <w:t>2 — Os animais que apresentem sinais que levem a suspeitar de poderem estar doentes ou lesionados devem receber os primeiros cuidados pelo detentor e, se não houver indícios de recuperação, devem ser tratados por médico veterinário.</w:t>
+            </w:r>
+          </w:p>
+          <w:p>
+            <w:pPr>
+              <w:spacing w:before="120" w:after="0"/>
+              <w:ind w:left="80"/>
+            </w:pPr>
+            <w:r>
+              <w:rPr>
+                <w:rFonts w:ascii="Calibri" w:hAnsi="Calibri"/>
+                <w:b w:val="0"/>
+                <w:i w:val="0"/>
+                <w:color w:val="222222"/>
+                <w:sz w:val="19"/>
+              </w:rPr>
+              <w:t>3 — Os médicos veterinários e os centros de atendimento médico-veterinário (CAMV) devem manter um arquivo com os dados clínicos de cada animal, pelo período mínimo de cinco anos, que ficará à disposição das autoridades competentes.</w:t>
+            </w:r>
+          </w:p>
+        </w:tc>
+        <w:tc>
+          <w:tcPr>
+            <w:tcW w:type="dxa" w:w="5046"/>
+            <w:shd w:val="clear" w:color="auto" w:fill="FFE6CC"/>
+            <w:tcBorders>
+              <w:top w:val="single" w:sz="4" w:space="0" w:color="CCCCCC"/>
+              <w:left w:val="single" w:sz="4" w:space="0" w:color="CCCCCC"/>
+              <w:bottom w:val="single" w:sz="4" w:space="0" w:color="CCCCCC"/>
+              <w:right w:val="single" w:sz="4" w:space="0" w:color="CCCCCC"/>
+            </w:tcBorders>
+            <w:vAlign w:val="top"/>
+          </w:tcPr>
+          <w:p>
+            <w:pPr>
+              <w:spacing w:before="80" w:after="80"/>
+              <w:ind w:left="80" w:right="80"/>
+            </w:pPr>
+            <w:r>
+              <w:rPr>
+                <w:rFonts w:ascii="Calibri" w:hAnsi="Calibri"/>
+                <w:b/>
+                <w:i/>
+                <w:color w:val="555555"/>
+                <w:sz w:val="16"/>
+              </w:rPr>
+              <w:t>art.º 6.º do Código do Animal (DL n.º 214/2013)</w:t>
+              <w:br/>
+            </w:r>
+            <w:r>
+              <w:rPr>
+                <w:rFonts w:ascii="Calibri" w:hAnsi="Calibri"/>
+                <w:b w:val="0"/>
+                <w:i w:val="0"/>
+                <w:color w:val="222222"/>
+                <w:sz w:val="19"/>
+              </w:rPr>
+              <w:t>O detentor do animal deve assegurar ao animal ferido ou doente os cuidados médico-veterinários adequados, designadamente retirando o mesmo do alojamento sempre que este seja um local de venda.</w:t>
+            </w:r>
+          </w:p>
+        </w:tc>
+        <w:tc>
+          <w:tcPr>
+            <w:tcW w:type="dxa" w:w="5046"/>
+            <w:shd w:val="clear" w:color="auto" w:fill="E0F7FA"/>
+            <w:tcBorders>
+              <w:top w:val="single" w:sz="4" w:space="0" w:color="CCCCCC"/>
+              <w:left w:val="single" w:sz="4" w:space="0" w:color="CCCCCC"/>
+              <w:bottom w:val="single" w:sz="4" w:space="0" w:color="CCCCCC"/>
+              <w:right w:val="single" w:sz="4" w:space="0" w:color="CCCCCC"/>
+            </w:tcBorders>
+            <w:vAlign w:val="top"/>
+          </w:tcPr>
+          <w:p>
+            <w:pPr>
+              <w:spacing w:before="80" w:after="80"/>
+              <w:ind w:left="80" w:right="80"/>
+            </w:pPr>
+            <w:r>
+              <w:rPr>
+                <w:rFonts w:ascii="Calibri" w:hAnsi="Calibri"/>
+                <w:b/>
+                <w:i/>
+                <w:color w:val="555555"/>
+                <w:sz w:val="16"/>
+              </w:rPr>
+              <w:t>n.ºs 1 e 3 do art.º 13.º e n.ºs 1 e 2 do art.º 16.º do DL n.º 276/2001, de 17 de outubro</w:t>
+              <w:br/>
+            </w:r>
+            <w:r>
+              <w:rPr>
+                <w:rFonts w:ascii="Calibri" w:hAnsi="Calibri"/>
+                <w:b w:val="0"/>
+                <w:i w:val="0"/>
+                <w:color w:val="222222"/>
+                <w:sz w:val="19"/>
+              </w:rPr>
+              <w:t>Artigo 13.º, n.º 1 — A observação diária dos animais e o seu maneio, a organização da dieta e o tratamento médico-veterinário devem ser assegurados por pessoal técnico competente e em número adequado à quantidade e espécies animais que alojam.</w:t>
+            </w:r>
+          </w:p>
+          <w:p>
+            <w:pPr>
+              <w:spacing w:before="120" w:after="0"/>
+              <w:ind w:left="80"/>
+            </w:pPr>
+            <w:r>
+              <w:rPr>
+                <w:rFonts w:ascii="Calibri" w:hAnsi="Calibri"/>
+                <w:b w:val="0"/>
+                <w:i w:val="0"/>
+                <w:color w:val="222222"/>
+                <w:sz w:val="19"/>
+              </w:rPr>
+              <w:t>Artigo 13.º, n.º 3 — Todos os animais devem ser alvo de inspeção diária, sendo de imediato prestados os primeiros cuidados aos que tiverem sinais que levem a suspeitar estarem doentes, lesionados ou com alterações comportamentais.</w:t>
+            </w:r>
+          </w:p>
+          <w:p>
+            <w:pPr>
+              <w:spacing w:before="120" w:after="0"/>
+              <w:ind w:left="80"/>
+            </w:pPr>
+            <w:r>
+              <w:rPr>
+                <w:rFonts w:ascii="Calibri" w:hAnsi="Calibri"/>
+                <w:b w:val="0"/>
+                <w:i w:val="0"/>
+                <w:color w:val="222222"/>
+                <w:sz w:val="19"/>
+              </w:rPr>
+              <w:t>Artigo 16.º, n.º 1 — Sem prejuízo de quaisquer medidas determinadas pela DGAV, deve existir um programa de profilaxia médica e sanitária devidamente elaborado e supervisionado pelo médico veterinário responsável e executado por profissionais competentes.</w:t>
+            </w:r>
+          </w:p>
+          <w:p>
+            <w:pPr>
+              <w:spacing w:before="120" w:after="0"/>
+              <w:ind w:left="80"/>
+            </w:pPr>
+            <w:r>
+              <w:rPr>
+                <w:rFonts w:ascii="Calibri" w:hAnsi="Calibri"/>
+                <w:b w:val="0"/>
+                <w:i w:val="0"/>
+                <w:color w:val="222222"/>
+                <w:sz w:val="19"/>
+              </w:rPr>
+              <w:t>Artigo 16.º, n.º 2 — No âmbito do número anterior, os animais devem ser sujeitos a exames médico-veterinários de rotina, vacinações e desparasitações sempre que aconselhável.</w:t>
             </w:r>
           </w:p>
         </w:tc>

</xml_diff>

<commit_message>
Formatar texto legal (alíneas/subalíneas) + divergência estruturada em 4 secções
- HTML: CSS classes .leg-p/.leg-alinea/.leg-sub/.leg-block com avanço em
  cabide (hanging indent) para formatação fluída de alíneas e subalíneas;
  JS formatarTexto() deteta padrões via regex e aplica classes
- HTML: Divergência substituída por 4 secções individuais (@legislacao,
  @codigo, @rgbeac, Sumário) renderizadas via renderDiv() com badges coloridos
- Word: cell_body() reescrito com _classify_line()/_add_para(); alíneas em
  Pt(18)/Pt(-14) e subalíneas em Pt(34)/Pt(-14); espaçamento \n\n → Pt(7)
- Word: Secção de divergência em 4 sub-tabelas com cores por diploma
- Excel: 4 colunas de divergência em vez de 1
- Dados: campo divergencia de string para dict com chaves legislacao/codigo/
  rgbeac/sumario em todos os 6 artigos
- Corrigido erro de sintaxe (linha duplicada no ART-13 divergencia)

https://claude.ai/code/session_018boKb8AzDijzFXMo6nY48F
</commit_message>
<xml_diff>
--- a/comparativo_reuniao_exemplo.docx
+++ b/comparativo_reuniao_exemplo.docx
@@ -524,8 +524,8 @@
           </w:tcPr>
           <w:p>
             <w:pPr>
-              <w:spacing w:before="80" w:after="80"/>
-              <w:ind w:left="80" w:right="80"/>
+              <w:spacing w:after="0" w:before="80"/>
+              <w:ind w:right="80" w:left="80" w:firstLine="0"/>
             </w:pPr>
             <w:r>
               <w:rPr>
@@ -540,8 +540,8 @@
           </w:p>
           <w:p>
             <w:pPr>
-              <w:spacing w:before="120" w:after="0"/>
-              <w:ind w:left="80"/>
+              <w:spacing w:after="0" w:before="140"/>
+              <w:ind w:right="80" w:left="80" w:firstLine="0"/>
             </w:pPr>
             <w:r>
               <w:rPr>
@@ -556,8 +556,8 @@
           </w:p>
           <w:p>
             <w:pPr>
-              <w:spacing w:before="120" w:after="0"/>
-              <w:ind w:left="80"/>
+              <w:spacing w:after="0" w:before="140"/>
+              <w:ind w:right="80" w:left="80" w:firstLine="0"/>
             </w:pPr>
             <w:r>
               <w:rPr>
@@ -572,8 +572,8 @@
           </w:p>
           <w:p>
             <w:pPr>
-              <w:spacing w:before="120" w:after="0"/>
-              <w:ind w:left="80"/>
+              <w:spacing w:after="0" w:before="140"/>
+              <w:ind w:right="80" w:left="80" w:firstLine="0"/>
             </w:pPr>
             <w:r>
               <w:rPr>
@@ -647,8 +647,8 @@
           </w:tcPr>
           <w:p>
             <w:pPr>
-              <w:spacing w:before="80" w:after="80"/>
-              <w:ind w:left="80" w:right="80"/>
+              <w:spacing w:after="0" w:before="80"/>
+              <w:ind w:right="80" w:left="80" w:firstLine="0"/>
             </w:pPr>
             <w:r>
               <w:rPr>
@@ -663,8 +663,8 @@
           </w:p>
           <w:p>
             <w:pPr>
-              <w:spacing w:before="120" w:after="0"/>
-              <w:ind w:left="80"/>
+              <w:spacing w:after="0" w:before="140"/>
+              <w:ind w:right="80" w:left="80" w:firstLine="0"/>
             </w:pPr>
             <w:r>
               <w:rPr>
@@ -679,8 +679,8 @@
           </w:p>
           <w:p>
             <w:pPr>
-              <w:spacing w:before="120" w:after="0"/>
-              <w:ind w:left="80"/>
+              <w:spacing w:after="0" w:before="140"/>
+              <w:ind w:right="80" w:left="80" w:firstLine="0"/>
             </w:pPr>
             <w:r>
               <w:rPr>
@@ -695,8 +695,8 @@
           </w:p>
           <w:p>
             <w:pPr>
-              <w:spacing w:before="120" w:after="0"/>
-              <w:ind w:left="80"/>
+              <w:spacing w:after="0" w:before="140"/>
+              <w:ind w:right="80" w:left="80" w:firstLine="0"/>
             </w:pPr>
             <w:r>
               <w:rPr>
@@ -828,7 +828,7 @@
           </w:tcPr>
           <w:p>
             <w:pPr>
-              <w:spacing w:before="80" w:after="80"/>
+              <w:spacing w:before="80" w:after="40"/>
               <w:ind w:left="80" w:right="80"/>
             </w:pPr>
             <w:r>
@@ -840,8 +840,13 @@
                 <w:sz w:val="16"/>
               </w:rPr>
               <w:t>Art.º 17.º do RGBEAC (proposta, jun. 2025)</w:t>
-              <w:br/>
             </w:r>
+          </w:p>
+          <w:p>
+            <w:pPr>
+              <w:spacing w:after="0" w:before="140"/>
+              <w:ind w:right="80" w:left="80" w:firstLine="0"/>
+            </w:pPr>
             <w:r>
               <w:rPr>
                 <w:rFonts w:ascii="Calibri" w:hAnsi="Calibri"/>
@@ -855,8 +860,8 @@
           </w:p>
           <w:p>
             <w:pPr>
-              <w:spacing w:before="120" w:after="0"/>
-              <w:ind w:left="80"/>
+              <w:spacing w:after="0" w:before="140"/>
+              <w:ind w:right="80" w:left="360" w:hanging="280"/>
             </w:pPr>
             <w:r>
               <w:rPr>
@@ -871,8 +876,8 @@
           </w:p>
           <w:p>
             <w:pPr>
-              <w:spacing w:before="120" w:after="0"/>
-              <w:ind w:left="80"/>
+              <w:spacing w:after="0" w:before="140"/>
+              <w:ind w:right="80" w:left="360" w:hanging="280"/>
             </w:pPr>
             <w:r>
               <w:rPr>
@@ -887,8 +892,8 @@
           </w:p>
           <w:p>
             <w:pPr>
-              <w:spacing w:before="120" w:after="0"/>
-              <w:ind w:left="80"/>
+              <w:spacing w:after="0" w:before="140"/>
+              <w:ind w:right="80" w:left="360" w:hanging="280"/>
             </w:pPr>
             <w:r>
               <w:rPr>
@@ -916,7 +921,7 @@
           </w:tcPr>
           <w:p>
             <w:pPr>
-              <w:spacing w:before="80" w:after="80"/>
+              <w:spacing w:before="80" w:after="40"/>
               <w:ind w:left="80" w:right="80"/>
             </w:pPr>
             <w:r>
@@ -928,8 +933,13 @@
                 <w:sz w:val="16"/>
               </w:rPr>
               <w:t>Art.º 53.º do Código do Animal (DL n.º 214/2013)</w:t>
-              <w:br/>
             </w:r>
+          </w:p>
+          <w:p>
+            <w:pPr>
+              <w:spacing w:after="0" w:before="140"/>
+              <w:ind w:right="80" w:left="80" w:firstLine="0"/>
+            </w:pPr>
             <w:r>
               <w:rPr>
                 <w:rFonts w:ascii="Calibri" w:hAnsi="Calibri"/>
@@ -943,8 +953,8 @@
           </w:p>
           <w:p>
             <w:pPr>
-              <w:spacing w:before="120" w:after="0"/>
-              <w:ind w:left="80"/>
+              <w:spacing w:after="0" w:before="140"/>
+              <w:ind w:right="80" w:left="80" w:firstLine="0"/>
             </w:pPr>
             <w:r>
               <w:rPr>
@@ -959,8 +969,8 @@
           </w:p>
           <w:p>
             <w:pPr>
-              <w:spacing w:before="120" w:after="0"/>
-              <w:ind w:left="80"/>
+              <w:spacing w:after="0" w:before="140"/>
+              <w:ind w:right="80" w:left="80" w:firstLine="0"/>
             </w:pPr>
             <w:r>
               <w:rPr>
@@ -975,8 +985,8 @@
           </w:p>
           <w:p>
             <w:pPr>
-              <w:spacing w:before="120" w:after="0"/>
-              <w:ind w:left="80"/>
+              <w:spacing w:after="0" w:before="140"/>
+              <w:ind w:right="80" w:left="80" w:firstLine="0"/>
             </w:pPr>
             <w:r>
               <w:rPr>
@@ -1004,7 +1014,7 @@
           </w:tcPr>
           <w:p>
             <w:pPr>
-              <w:spacing w:before="80" w:after="80"/>
+              <w:spacing w:before="80" w:after="40"/>
               <w:ind w:left="80" w:right="80"/>
             </w:pPr>
             <w:r>
@@ -1016,8 +1026,13 @@
                 <w:sz w:val="16"/>
               </w:rPr>
               <w:t>n.ºs 1, 2 e 3 do art.º 5.º do DL n.º 82/2019, de 27 de junho</w:t>
-              <w:br/>
             </w:r>
+          </w:p>
+          <w:p>
+            <w:pPr>
+              <w:spacing w:after="0" w:before="140"/>
+              <w:ind w:right="80" w:left="80" w:firstLine="0"/>
+            </w:pPr>
             <w:r>
               <w:rPr>
                 <w:rFonts w:ascii="Calibri" w:hAnsi="Calibri"/>
@@ -1031,8 +1046,8 @@
           </w:p>
           <w:p>
             <w:pPr>
-              <w:spacing w:before="120" w:after="0"/>
-              <w:ind w:left="80"/>
+              <w:spacing w:after="0" w:before="140"/>
+              <w:ind w:right="80" w:left="80" w:firstLine="0"/>
             </w:pPr>
             <w:r>
               <w:rPr>
@@ -1047,8 +1062,8 @@
           </w:p>
           <w:p>
             <w:pPr>
-              <w:spacing w:before="120" w:after="0"/>
-              <w:ind w:left="80"/>
+              <w:spacing w:after="0" w:before="140"/>
+              <w:ind w:right="80" w:left="80" w:firstLine="0"/>
             </w:pPr>
             <w:r>
               <w:rPr>
@@ -1111,6 +1126,219 @@
         <w:tc>
           <w:tcPr>
             <w:tcW w:type="dxa" w:w="15138"/>
+            <w:shd w:val="clear" w:color="auto" w:fill="006064"/>
+            <w:tcBorders>
+              <w:top w:val="single" w:sz="4" w:space="0" w:color="006064"/>
+              <w:left w:val="single" w:sz="4" w:space="0" w:color="006064"/>
+              <w:bottom w:val="single" w:sz="4" w:space="0" w:color="006064"/>
+              <w:right w:val="single" w:sz="4" w:space="0" w:color="006064"/>
+            </w:tcBorders>
+          </w:tcPr>
+          <w:p>
+            <w:pPr>
+              <w:spacing w:before="80" w:after="0"/>
+              <w:ind w:left="120"/>
+            </w:pPr>
+            <w:r>
+              <w:rPr>
+                <w:rFonts w:ascii="Calibri" w:hAnsi="Calibri"/>
+                <w:b/>
+                <w:i w:val="0"/>
+                <w:color w:val="FFFFFF"/>
+                <w:sz w:val="17"/>
+              </w:rPr>
+              <w:t>@legislacao</w:t>
+            </w:r>
+          </w:p>
+        </w:tc>
+      </w:tr>
+      <w:tr>
+        <w:tc>
+          <w:tcPr>
+            <w:tcW w:type="dxa" w:w="15138"/>
+            <w:shd w:val="clear" w:color="auto" w:fill="E0F7FA"/>
+            <w:tcBorders>
+              <w:top w:val="single" w:sz="4" w:space="0" w:color="CCCCCC"/>
+              <w:left w:val="single" w:sz="4" w:space="0" w:color="CCCCCC"/>
+              <w:bottom w:val="single" w:sz="4" w:space="0" w:color="CCCCCC"/>
+              <w:right w:val="single" w:sz="4" w:space="0" w:color="CCCCCC"/>
+            </w:tcBorders>
+            <w:vAlign w:val="top"/>
+          </w:tcPr>
+          <w:p>
+            <w:pPr>
+              <w:spacing w:before="80" w:after="80"/>
+              <w:ind w:left="120" w:right="120"/>
+            </w:pPr>
+            <w:r>
+              <w:rPr>
+                <w:rFonts w:ascii="Calibri" w:hAnsi="Calibri"/>
+                <w:b w:val="0"/>
+                <w:i w:val="0"/>
+                <w:color w:val="222222"/>
+                <w:sz w:val="18"/>
+              </w:rPr>
+              <w:t>O DL n.º 82/2019 (art.º 5.º) prevê prazo geral de 120 dias após o nascimento, sem distinguir o contexto de estabelecimento — prazo superior ao máximo de 3 meses do @regulamento, que exigirá redução. Não prevê o prazo específico de 30 dias para animais que entram em estabelecimentos.</w:t>
+            </w:r>
+          </w:p>
+        </w:tc>
+      </w:tr>
+      <w:tr>
+        <w:tc>
+          <w:tcPr>
+            <w:tcW w:type="dxa" w:w="15138"/>
+            <w:shd w:val="clear" w:color="auto" w:fill="7E4C00"/>
+            <w:tcBorders>
+              <w:top w:val="single" w:sz="4" w:space="0" w:color="7E4C00"/>
+              <w:left w:val="single" w:sz="4" w:space="0" w:color="7E4C00"/>
+              <w:bottom w:val="single" w:sz="4" w:space="0" w:color="7E4C00"/>
+              <w:right w:val="single" w:sz="4" w:space="0" w:color="7E4C00"/>
+            </w:tcBorders>
+          </w:tcPr>
+          <w:p>
+            <w:pPr>
+              <w:spacing w:before="80" w:after="0"/>
+              <w:ind w:left="120"/>
+            </w:pPr>
+            <w:r>
+              <w:rPr>
+                <w:rFonts w:ascii="Calibri" w:hAnsi="Calibri"/>
+                <w:b/>
+                <w:i w:val="0"/>
+                <w:color w:val="FFFFFF"/>
+                <w:sz w:val="17"/>
+              </w:rPr>
+              <w:t>@codigo</w:t>
+            </w:r>
+          </w:p>
+        </w:tc>
+      </w:tr>
+      <w:tr>
+        <w:tc>
+          <w:tcPr>
+            <w:tcW w:type="dxa" w:w="15138"/>
+            <w:shd w:val="clear" w:color="auto" w:fill="FFE6CC"/>
+            <w:tcBorders>
+              <w:top w:val="single" w:sz="4" w:space="0" w:color="CCCCCC"/>
+              <w:left w:val="single" w:sz="4" w:space="0" w:color="CCCCCC"/>
+              <w:bottom w:val="single" w:sz="4" w:space="0" w:color="CCCCCC"/>
+              <w:right w:val="single" w:sz="4" w:space="0" w:color="CCCCCC"/>
+            </w:tcBorders>
+            <w:vAlign w:val="top"/>
+          </w:tcPr>
+          <w:p>
+            <w:pPr>
+              <w:spacing w:before="80" w:after="80"/>
+              <w:ind w:left="120" w:right="120"/>
+            </w:pPr>
+            <w:r>
+              <w:rPr>
+                <w:rFonts w:ascii="Calibri" w:hAnsi="Calibri"/>
+                <w:b w:val="0"/>
+                <w:i w:val="0"/>
+                <w:color w:val="222222"/>
+                <w:sz w:val="18"/>
+              </w:rPr>
+              <w:t>O @codigo fixa prazo de identificação entre 3 e 6 meses, igualmente sem distinção entre nascimentos e entrada em estabelecimentos, ficando aquém da precisão exigida pelo @regulamento.</w:t>
+            </w:r>
+          </w:p>
+        </w:tc>
+      </w:tr>
+      <w:tr>
+        <w:tc>
+          <w:tcPr>
+            <w:tcW w:type="dxa" w:w="15138"/>
+            <w:shd w:val="clear" w:color="auto" w:fill="1E5631"/>
+            <w:tcBorders>
+              <w:top w:val="single" w:sz="4" w:space="0" w:color="1E5631"/>
+              <w:left w:val="single" w:sz="4" w:space="0" w:color="1E5631"/>
+              <w:bottom w:val="single" w:sz="4" w:space="0" w:color="1E5631"/>
+              <w:right w:val="single" w:sz="4" w:space="0" w:color="1E5631"/>
+            </w:tcBorders>
+          </w:tcPr>
+          <w:p>
+            <w:pPr>
+              <w:spacing w:before="80" w:after="0"/>
+              <w:ind w:left="120"/>
+            </w:pPr>
+            <w:r>
+              <w:rPr>
+                <w:rFonts w:ascii="Calibri" w:hAnsi="Calibri"/>
+                <w:b/>
+                <w:i w:val="0"/>
+                <w:color w:val="FFFFFF"/>
+                <w:sz w:val="17"/>
+              </w:rPr>
+              <w:t>@rgbeac</w:t>
+            </w:r>
+          </w:p>
+        </w:tc>
+      </w:tr>
+      <w:tr>
+        <w:tc>
+          <w:tcPr>
+            <w:tcW w:type="dxa" w:w="15138"/>
+            <w:shd w:val="clear" w:color="auto" w:fill="D5E8D4"/>
+            <w:tcBorders>
+              <w:top w:val="single" w:sz="4" w:space="0" w:color="CCCCCC"/>
+              <w:left w:val="single" w:sz="4" w:space="0" w:color="CCCCCC"/>
+              <w:bottom w:val="single" w:sz="4" w:space="0" w:color="CCCCCC"/>
+              <w:right w:val="single" w:sz="4" w:space="0" w:color="CCCCCC"/>
+            </w:tcBorders>
+            <w:vAlign w:val="top"/>
+          </w:tcPr>
+          <w:p>
+            <w:pPr>
+              <w:spacing w:before="80" w:after="80"/>
+              <w:ind w:left="120" w:right="120"/>
+            </w:pPr>
+            <w:r>
+              <w:rPr>
+                <w:rFonts w:ascii="Calibri" w:hAnsi="Calibri"/>
+                <w:b w:val="0"/>
+                <w:i w:val="0"/>
+                <w:color w:val="222222"/>
+                <w:sz w:val="18"/>
+              </w:rPr>
+              <w:t>O @rgbeac aproxima-se dos prazos do @regulamento mas aplica-se apenas a cães, gatos e furões. Não prevê o prazo específico de 30 dias para animais que entram em estabelecimentos.</w:t>
+            </w:r>
+          </w:p>
+        </w:tc>
+      </w:tr>
+      <w:tr>
+        <w:tc>
+          <w:tcPr>
+            <w:tcW w:type="dxa" w:w="15138"/>
+            <w:shd w:val="clear" w:color="auto" w:fill="5D2A8A"/>
+            <w:tcBorders>
+              <w:top w:val="single" w:sz="4" w:space="0" w:color="5D2A8A"/>
+              <w:left w:val="single" w:sz="4" w:space="0" w:color="5D2A8A"/>
+              <w:bottom w:val="single" w:sz="4" w:space="0" w:color="5D2A8A"/>
+              <w:right w:val="single" w:sz="4" w:space="0" w:color="5D2A8A"/>
+            </w:tcBorders>
+          </w:tcPr>
+          <w:p>
+            <w:pPr>
+              <w:spacing w:before="80" w:after="0"/>
+              <w:ind w:left="120"/>
+            </w:pPr>
+            <w:r>
+              <w:rPr>
+                <w:rFonts w:ascii="Calibri" w:hAnsi="Calibri"/>
+                <w:b/>
+                <w:i w:val="0"/>
+                <w:color w:val="FFFFFF"/>
+                <w:sz w:val="17"/>
+              </w:rPr>
+              <w:t>Sumário / Proposta</w:t>
+            </w:r>
+          </w:p>
+        </w:tc>
+      </w:tr>
+      <w:tr>
+        <w:tc>
+          <w:tcPr>
+            <w:tcW w:type="dxa" w:w="15138"/>
             <w:shd w:val="clear" w:color="auto" w:fill="EAD7F7"/>
             <w:tcBorders>
               <w:top w:val="single" w:sz="4" w:space="0" w:color="CCCCCC"/>
@@ -1123,17 +1351,17 @@
           <w:p>
             <w:pPr>
               <w:spacing w:before="80" w:after="80"/>
-              <w:ind w:left="80" w:right="80"/>
+              <w:ind w:left="120" w:right="120"/>
             </w:pPr>
             <w:r>
               <w:rPr>
                 <w:rFonts w:ascii="Calibri" w:hAnsi="Calibri"/>
-                <w:b/>
+                <w:b w:val="0"/>
                 <w:i w:val="0"/>
-                <w:color w:val="3D1A6E"/>
-                <w:sz w:val="19"/>
+                <w:color w:val="222222"/>
+                <w:sz w:val="18"/>
               </w:rPr>
-              <w:t>O @regulamento fixa o prazo de identificação em 3 meses para nascimentos e 30 dias para entrada em estabelecimentos. A @legislacao (DL n.º 82/2019, art.º 5.º) prevê um prazo geral de 120 dias após o nascimento, sem distinguir o contexto de estabelecimento — prazo superior ao fixado pelo @regulamento e que exigirá redução. O @codigo fixa entre 3 e 6 meses, igualmente sem distinção de contexto. O @rgbeac alinha com o @regulamento nos prazos, mas aplica-se apenas a cães, gatos e furões. Nenhum dos diplomas nacionais vigentes distingue o prazo de 30 dias aplicável a animais que entram em estabelecimentos, previsto no @regulamento.</w:t>
+              <w:t>Necessidade de alteração: (1) reduzir prazo máximo de identificação de nascimentos para 3 meses; (2) criar prazo diferenciado de 30 dias para animais admitidos em estabelecimentos; (3) harmonizar prazos entre todos os diplomas nacionais.</w:t>
             </w:r>
           </w:p>
         </w:tc>
@@ -1365,8 +1593,8 @@
           </w:tcPr>
           <w:p>
             <w:pPr>
-              <w:spacing w:before="80" w:after="80"/>
-              <w:ind w:left="80" w:right="80"/>
+              <w:spacing w:after="0" w:before="80"/>
+              <w:ind w:right="80" w:left="80" w:firstLine="0"/>
             </w:pPr>
             <w:r>
               <w:rPr>
@@ -1381,8 +1609,8 @@
           </w:p>
           <w:p>
             <w:pPr>
-              <w:spacing w:before="120" w:after="0"/>
-              <w:ind w:left="80"/>
+              <w:spacing w:after="0" w:before="140"/>
+              <w:ind w:right="80" w:left="80" w:firstLine="0"/>
             </w:pPr>
             <w:r>
               <w:rPr>
@@ -1456,8 +1684,8 @@
           </w:tcPr>
           <w:p>
             <w:pPr>
-              <w:spacing w:before="80" w:after="80"/>
-              <w:ind w:left="80" w:right="80"/>
+              <w:spacing w:after="0" w:before="80"/>
+              <w:ind w:right="80" w:left="80" w:firstLine="0"/>
             </w:pPr>
             <w:r>
               <w:rPr>
@@ -1472,8 +1700,8 @@
           </w:p>
           <w:p>
             <w:pPr>
-              <w:spacing w:before="120" w:after="0"/>
-              <w:ind w:left="80"/>
+              <w:spacing w:after="0" w:before="140"/>
+              <w:ind w:right="80" w:left="80" w:firstLine="0"/>
             </w:pPr>
             <w:r>
               <w:rPr>
@@ -1605,7 +1833,7 @@
           </w:tcPr>
           <w:p>
             <w:pPr>
-              <w:spacing w:before="80" w:after="80"/>
+              <w:spacing w:before="80" w:after="40"/>
               <w:ind w:left="80" w:right="80"/>
             </w:pPr>
             <w:r>
@@ -1617,8 +1845,13 @@
                 <w:sz w:val="16"/>
               </w:rPr>
               <w:t>Art.º 10.º do RGBEAC (proposta, jun. 2025)</w:t>
-              <w:br/>
             </w:r>
+          </w:p>
+          <w:p>
+            <w:pPr>
+              <w:spacing w:after="0" w:before="140"/>
+              <w:ind w:right="80" w:left="80" w:firstLine="0"/>
+            </w:pPr>
             <w:r>
               <w:rPr>
                 <w:rFonts w:ascii="Calibri" w:hAnsi="Calibri"/>
@@ -1632,8 +1865,8 @@
           </w:p>
           <w:p>
             <w:pPr>
-              <w:spacing w:before="120" w:after="0"/>
-              <w:ind w:left="80"/>
+              <w:spacing w:after="0" w:before="140"/>
+              <w:ind w:right="80" w:left="360" w:hanging="280"/>
             </w:pPr>
             <w:r>
               <w:rPr>
@@ -1644,13 +1877,69 @@
                 <w:sz w:val="19"/>
               </w:rPr>
               <w:t>a) Assegurar o bem-estar do animal, de acordo com a sua espécie, raça, idade e necessidades físicas e etológicas, proporcionando-lhe:</w:t>
-              <w:br/>
+            </w:r>
+          </w:p>
+          <w:p>
+            <w:pPr>
+              <w:spacing w:after="0" w:before="20"/>
+              <w:ind w:right="80" w:left="680" w:hanging="280"/>
+            </w:pPr>
+            <w:r>
+              <w:rPr>
+                <w:rFonts w:ascii="Calibri" w:hAnsi="Calibri"/>
+                <w:b w:val="0"/>
+                <w:i w:val="0"/>
+                <w:color w:val="222222"/>
+                <w:sz w:val="19"/>
+              </w:rPr>
               <w:t>— Atenção, supervisão, controlo, exercício físico e estímulo mental;</w:t>
-              <w:br/>
+            </w:r>
+          </w:p>
+          <w:p>
+            <w:pPr>
+              <w:spacing w:after="0" w:before="20"/>
+              <w:ind w:right="80" w:left="680" w:hanging="280"/>
+            </w:pPr>
+            <w:r>
+              <w:rPr>
+                <w:rFonts w:ascii="Calibri" w:hAnsi="Calibri"/>
+                <w:b w:val="0"/>
+                <w:i w:val="0"/>
+                <w:color w:val="222222"/>
+                <w:sz w:val="19"/>
+              </w:rPr>
               <w:t>— Alimentos saudáveis, adequados e convenientes ao seu normal desenvolvimento e acesso permanente a água potável;</w:t>
-              <w:br/>
+            </w:r>
+          </w:p>
+          <w:p>
+            <w:pPr>
+              <w:spacing w:after="0" w:before="20"/>
+              <w:ind w:right="80" w:left="680" w:hanging="280"/>
+            </w:pPr>
+            <w:r>
+              <w:rPr>
+                <w:rFonts w:ascii="Calibri" w:hAnsi="Calibri"/>
+                <w:b w:val="0"/>
+                <w:i w:val="0"/>
+                <w:color w:val="222222"/>
+                <w:sz w:val="19"/>
+              </w:rPr>
               <w:t>— Condições higiossanitárias que atendam, no mínimo, ao estabelecido no presente decreto-lei e na demais legislação aplicável;</w:t>
-              <w:br/>
+            </w:r>
+          </w:p>
+          <w:p>
+            <w:pPr>
+              <w:spacing w:after="0" w:before="20"/>
+              <w:ind w:right="80" w:left="680" w:hanging="280"/>
+            </w:pPr>
+            <w:r>
+              <w:rPr>
+                <w:rFonts w:ascii="Calibri" w:hAnsi="Calibri"/>
+                <w:b w:val="0"/>
+                <w:i w:val="0"/>
+                <w:color w:val="222222"/>
+                <w:sz w:val="19"/>
+              </w:rPr>
               <w:t>— Liberdade de movimento, sendo proibidos todos os sistemas de contenção permanentes.</w:t>
             </w:r>
           </w:p>
@@ -1669,7 +1958,7 @@
           </w:tcPr>
           <w:p>
             <w:pPr>
-              <w:spacing w:before="80" w:after="80"/>
+              <w:spacing w:before="80" w:after="40"/>
               <w:ind w:left="80" w:right="80"/>
             </w:pPr>
             <w:r>
@@ -1681,8 +1970,13 @@
                 <w:sz w:val="16"/>
               </w:rPr>
               <w:t>Art.º 5.º do Código do Animal (DL n.º 214/2013)</w:t>
-              <w:br/>
             </w:r>
+          </w:p>
+          <w:p>
+            <w:pPr>
+              <w:spacing w:after="0" w:before="140"/>
+              <w:ind w:right="80" w:left="80" w:firstLine="0"/>
+            </w:pPr>
             <w:r>
               <w:rPr>
                 <w:rFonts w:ascii="Calibri" w:hAnsi="Calibri"/>
@@ -1696,8 +1990,8 @@
           </w:p>
           <w:p>
             <w:pPr>
-              <w:spacing w:before="120" w:after="0"/>
-              <w:ind w:left="80"/>
+              <w:spacing w:after="0" w:before="140"/>
+              <w:ind w:right="80" w:left="80" w:firstLine="0"/>
             </w:pPr>
             <w:r>
               <w:rPr>
@@ -1712,8 +2006,8 @@
           </w:p>
           <w:p>
             <w:pPr>
-              <w:spacing w:before="120" w:after="0"/>
-              <w:ind w:left="80"/>
+              <w:spacing w:after="0" w:before="140"/>
+              <w:ind w:right="80" w:left="80" w:firstLine="0"/>
             </w:pPr>
             <w:r>
               <w:rPr>
@@ -1741,7 +2035,7 @@
           </w:tcPr>
           <w:p>
             <w:pPr>
-              <w:spacing w:before="80" w:after="80"/>
+              <w:spacing w:before="80" w:after="40"/>
               <w:ind w:left="80" w:right="80"/>
             </w:pPr>
             <w:r>
@@ -1753,8 +2047,13 @@
                 <w:sz w:val="16"/>
               </w:rPr>
               <w:t>n.ºs 1, 2 e 3 do art.º 7.º do DL n.º 276/2001, de 17 de outubro</w:t>
-              <w:br/>
             </w:r>
+          </w:p>
+          <w:p>
+            <w:pPr>
+              <w:spacing w:after="0" w:before="140"/>
+              <w:ind w:right="80" w:left="80" w:firstLine="0"/>
+            </w:pPr>
             <w:r>
               <w:rPr>
                 <w:rFonts w:ascii="Calibri" w:hAnsi="Calibri"/>
@@ -1768,8 +2067,8 @@
           </w:p>
           <w:p>
             <w:pPr>
-              <w:spacing w:before="120" w:after="0"/>
-              <w:ind w:left="80"/>
+              <w:spacing w:after="0" w:before="140"/>
+              <w:ind w:right="80" w:left="80" w:firstLine="0"/>
             </w:pPr>
             <w:r>
               <w:rPr>
@@ -1784,8 +2083,8 @@
           </w:p>
           <w:p>
             <w:pPr>
-              <w:spacing w:before="120" w:after="0"/>
-              <w:ind w:left="80"/>
+              <w:spacing w:after="0" w:before="140"/>
+              <w:ind w:right="80" w:left="80" w:firstLine="0"/>
             </w:pPr>
             <w:r>
               <w:rPr>
@@ -1848,6 +2147,219 @@
         <w:tc>
           <w:tcPr>
             <w:tcW w:type="dxa" w:w="15138"/>
+            <w:shd w:val="clear" w:color="auto" w:fill="006064"/>
+            <w:tcBorders>
+              <w:top w:val="single" w:sz="4" w:space="0" w:color="006064"/>
+              <w:left w:val="single" w:sz="4" w:space="0" w:color="006064"/>
+              <w:bottom w:val="single" w:sz="4" w:space="0" w:color="006064"/>
+              <w:right w:val="single" w:sz="4" w:space="0" w:color="006064"/>
+            </w:tcBorders>
+          </w:tcPr>
+          <w:p>
+            <w:pPr>
+              <w:spacing w:before="80" w:after="0"/>
+              <w:ind w:left="120"/>
+            </w:pPr>
+            <w:r>
+              <w:rPr>
+                <w:rFonts w:ascii="Calibri" w:hAnsi="Calibri"/>
+                <w:b/>
+                <w:i w:val="0"/>
+                <w:color w:val="FFFFFF"/>
+                <w:sz w:val="17"/>
+              </w:rPr>
+              <w:t>@legislacao</w:t>
+            </w:r>
+          </w:p>
+        </w:tc>
+      </w:tr>
+      <w:tr>
+        <w:tc>
+          <w:tcPr>
+            <w:tcW w:type="dxa" w:w="15138"/>
+            <w:shd w:val="clear" w:color="auto" w:fill="E0F7FA"/>
+            <w:tcBorders>
+              <w:top w:val="single" w:sz="4" w:space="0" w:color="CCCCCC"/>
+              <w:left w:val="single" w:sz="4" w:space="0" w:color="CCCCCC"/>
+              <w:bottom w:val="single" w:sz="4" w:space="0" w:color="CCCCCC"/>
+              <w:right w:val="single" w:sz="4" w:space="0" w:color="CCCCCC"/>
+            </w:tcBorders>
+            <w:vAlign w:val="top"/>
+          </w:tcPr>
+          <w:p>
+            <w:pPr>
+              <w:spacing w:before="80" w:after="80"/>
+              <w:ind w:left="120" w:right="120"/>
+            </w:pPr>
+            <w:r>
+              <w:rPr>
+                <w:rFonts w:ascii="Calibri" w:hAnsi="Calibri"/>
+                <w:b w:val="0"/>
+                <w:i w:val="0"/>
+                <w:color w:val="222222"/>
+                <w:sz w:val="18"/>
+              </w:rPr>
+              <w:t>O DL n.º 276/2001 (art.º 7.º) centra a responsabilidade no detentor em geral, sem distinguir o contexto de acolhimento temporário nem fixar limites numéricos de animais por família. O conceito de família de acolhimento é inexistente na legislação vigente.</w:t>
+            </w:r>
+          </w:p>
+        </w:tc>
+      </w:tr>
+      <w:tr>
+        <w:tc>
+          <w:tcPr>
+            <w:tcW w:type="dxa" w:w="15138"/>
+            <w:shd w:val="clear" w:color="auto" w:fill="7E4C00"/>
+            <w:tcBorders>
+              <w:top w:val="single" w:sz="4" w:space="0" w:color="7E4C00"/>
+              <w:left w:val="single" w:sz="4" w:space="0" w:color="7E4C00"/>
+              <w:bottom w:val="single" w:sz="4" w:space="0" w:color="7E4C00"/>
+              <w:right w:val="single" w:sz="4" w:space="0" w:color="7E4C00"/>
+            </w:tcBorders>
+          </w:tcPr>
+          <w:p>
+            <w:pPr>
+              <w:spacing w:before="80" w:after="0"/>
+              <w:ind w:left="120"/>
+            </w:pPr>
+            <w:r>
+              <w:rPr>
+                <w:rFonts w:ascii="Calibri" w:hAnsi="Calibri"/>
+                <w:b/>
+                <w:i w:val="0"/>
+                <w:color w:val="FFFFFF"/>
+                <w:sz w:val="17"/>
+              </w:rPr>
+              <w:t>@codigo</w:t>
+            </w:r>
+          </w:p>
+        </w:tc>
+      </w:tr>
+      <w:tr>
+        <w:tc>
+          <w:tcPr>
+            <w:tcW w:type="dxa" w:w="15138"/>
+            <w:shd w:val="clear" w:color="auto" w:fill="FFE6CC"/>
+            <w:tcBorders>
+              <w:top w:val="single" w:sz="4" w:space="0" w:color="CCCCCC"/>
+              <w:left w:val="single" w:sz="4" w:space="0" w:color="CCCCCC"/>
+              <w:bottom w:val="single" w:sz="4" w:space="0" w:color="CCCCCC"/>
+              <w:right w:val="single" w:sz="4" w:space="0" w:color="CCCCCC"/>
+            </w:tcBorders>
+            <w:vAlign w:val="top"/>
+          </w:tcPr>
+          <w:p>
+            <w:pPr>
+              <w:spacing w:before="80" w:after="80"/>
+              <w:ind w:left="120" w:right="120"/>
+            </w:pPr>
+            <w:r>
+              <w:rPr>
+                <w:rFonts w:ascii="Calibri" w:hAnsi="Calibri"/>
+                <w:b w:val="0"/>
+                <w:i w:val="0"/>
+                <w:color w:val="222222"/>
+                <w:sz w:val="18"/>
+              </w:rPr>
+              <w:t>O @codigo não prevê o conceito de família de acolhimento nem qualquer limite numérico de animais por unidade. A responsabilidade do operador como figura distinta do detentor particular também não é contemplada.</w:t>
+            </w:r>
+          </w:p>
+        </w:tc>
+      </w:tr>
+      <w:tr>
+        <w:tc>
+          <w:tcPr>
+            <w:tcW w:type="dxa" w:w="15138"/>
+            <w:shd w:val="clear" w:color="auto" w:fill="1E5631"/>
+            <w:tcBorders>
+              <w:top w:val="single" w:sz="4" w:space="0" w:color="1E5631"/>
+              <w:left w:val="single" w:sz="4" w:space="0" w:color="1E5631"/>
+              <w:bottom w:val="single" w:sz="4" w:space="0" w:color="1E5631"/>
+              <w:right w:val="single" w:sz="4" w:space="0" w:color="1E5631"/>
+            </w:tcBorders>
+          </w:tcPr>
+          <w:p>
+            <w:pPr>
+              <w:spacing w:before="80" w:after="0"/>
+              <w:ind w:left="120"/>
+            </w:pPr>
+            <w:r>
+              <w:rPr>
+                <w:rFonts w:ascii="Calibri" w:hAnsi="Calibri"/>
+                <w:b/>
+                <w:i w:val="0"/>
+                <w:color w:val="FFFFFF"/>
+                <w:sz w:val="17"/>
+              </w:rPr>
+              <w:t>@rgbeac</w:t>
+            </w:r>
+          </w:p>
+        </w:tc>
+      </w:tr>
+      <w:tr>
+        <w:tc>
+          <w:tcPr>
+            <w:tcW w:type="dxa" w:w="15138"/>
+            <w:shd w:val="clear" w:color="auto" w:fill="D5E8D4"/>
+            <w:tcBorders>
+              <w:top w:val="single" w:sz="4" w:space="0" w:color="CCCCCC"/>
+              <w:left w:val="single" w:sz="4" w:space="0" w:color="CCCCCC"/>
+              <w:bottom w:val="single" w:sz="4" w:space="0" w:color="CCCCCC"/>
+              <w:right w:val="single" w:sz="4" w:space="0" w:color="CCCCCC"/>
+            </w:tcBorders>
+            <w:vAlign w:val="top"/>
+          </w:tcPr>
+          <w:p>
+            <w:pPr>
+              <w:spacing w:before="80" w:after="80"/>
+              <w:ind w:left="120" w:right="120"/>
+            </w:pPr>
+            <w:r>
+              <w:rPr>
+                <w:rFonts w:ascii="Calibri" w:hAnsi="Calibri"/>
+                <w:b w:val="0"/>
+                <w:i w:val="0"/>
+                <w:color w:val="222222"/>
+                <w:sz w:val="18"/>
+              </w:rPr>
+              <w:t>O @rgbeac menciona famílias de acolhimento temporário mas não fixa o limite de 5 animais por família de acolhimento nem especifica que a responsabilidade jurídica recai sobre o operador e não sobre a família.</w:t>
+            </w:r>
+          </w:p>
+        </w:tc>
+      </w:tr>
+      <w:tr>
+        <w:tc>
+          <w:tcPr>
+            <w:tcW w:type="dxa" w:w="15138"/>
+            <w:shd w:val="clear" w:color="auto" w:fill="5D2A8A"/>
+            <w:tcBorders>
+              <w:top w:val="single" w:sz="4" w:space="0" w:color="5D2A8A"/>
+              <w:left w:val="single" w:sz="4" w:space="0" w:color="5D2A8A"/>
+              <w:bottom w:val="single" w:sz="4" w:space="0" w:color="5D2A8A"/>
+              <w:right w:val="single" w:sz="4" w:space="0" w:color="5D2A8A"/>
+            </w:tcBorders>
+          </w:tcPr>
+          <w:p>
+            <w:pPr>
+              <w:spacing w:before="80" w:after="0"/>
+              <w:ind w:left="120"/>
+            </w:pPr>
+            <w:r>
+              <w:rPr>
+                <w:rFonts w:ascii="Calibri" w:hAnsi="Calibri"/>
+                <w:b/>
+                <w:i w:val="0"/>
+                <w:color w:val="FFFFFF"/>
+                <w:sz w:val="17"/>
+              </w:rPr>
+              <w:t>Sumário / Proposta</w:t>
+            </w:r>
+          </w:p>
+        </w:tc>
+      </w:tr>
+      <w:tr>
+        <w:tc>
+          <w:tcPr>
+            <w:tcW w:type="dxa" w:w="15138"/>
             <w:shd w:val="clear" w:color="auto" w:fill="EAD7F7"/>
             <w:tcBorders>
               <w:top w:val="single" w:sz="4" w:space="0" w:color="CCCCCC"/>
@@ -1860,17 +2372,17 @@
           <w:p>
             <w:pPr>
               <w:spacing w:before="80" w:after="80"/>
-              <w:ind w:left="80" w:right="80"/>
+              <w:ind w:left="120" w:right="120"/>
             </w:pPr>
             <w:r>
               <w:rPr>
                 <w:rFonts w:ascii="Calibri" w:hAnsi="Calibri"/>
-                <w:b/>
+                <w:b w:val="0"/>
                 <w:i w:val="0"/>
-                <w:color w:val="3D1A6E"/>
-                <w:sz w:val="19"/>
+                <w:color w:val="222222"/>
+                <w:sz w:val="18"/>
               </w:rPr>
-              <w:t>O @regulamento especifica o limite de 5 animais por família de acolhimento e atribui responsabilidade ao operador (não à família). A @legislacao (DL n.º 276/2001, art.º 7.º) centra a responsabilidade no detentor, sem distinguir o contexto de acolhimento temporário nem fixar limites numéricos — posição idêntica à do @rgbeac e do @codigo. Nenhum dos diplomas nacionais, incluindo a legislação vigente, prevê o conceito de família de acolhimento nem o limite numérico de 5 animais estabelecido pelo @regulamento. A lacuna é transversal a toda a legislação nacional.</w:t>
+              <w:t>Lacuna transversal a toda a legislação nacional. Necessidade de: (1) criar o conceito de 'família de acolhimento' como extensão da atividade do operador; (2) fixar limite numérico de animais por família (máximo 5, ou 1 ninhada com mãe); (3) atribuir responsabilidade jurídica ao operador, não à família de acolhimento.</w:t>
             </w:r>
           </w:p>
         </w:tc>
@@ -2102,8 +2614,8 @@
           </w:tcPr>
           <w:p>
             <w:pPr>
-              <w:spacing w:before="80" w:after="80"/>
-              <w:ind w:left="80" w:right="80"/>
+              <w:spacing w:after="0" w:before="80"/>
+              <w:ind w:right="80" w:left="80" w:firstLine="0"/>
             </w:pPr>
             <w:r>
               <w:rPr>
@@ -2118,8 +2630,8 @@
           </w:p>
           <w:p>
             <w:pPr>
-              <w:spacing w:before="120" w:after="0"/>
-              <w:ind w:left="80"/>
+              <w:spacing w:after="0" w:before="140"/>
+              <w:ind w:right="80" w:left="360" w:hanging="280"/>
             </w:pPr>
             <w:r>
               <w:rPr>
@@ -2130,15 +2642,85 @@
                 <w:sz w:val="19"/>
               </w:rPr>
               <w:t>(a) nome, morada e contactos do operador;</w:t>
-              <w:br/>
+            </w:r>
+          </w:p>
+          <w:p>
+            <w:pPr>
+              <w:spacing w:after="0" w:before="20"/>
+              <w:ind w:right="80" w:left="360" w:hanging="280"/>
+            </w:pPr>
+            <w:r>
+              <w:rPr>
+                <w:rFonts w:ascii="Calibri" w:hAnsi="Calibri"/>
+                <w:b w:val="0"/>
+                <w:i/>
+                <w:color w:val="222222"/>
+                <w:sz w:val="19"/>
+              </w:rPr>
               <w:t>(b) a(s) localização(ões) do(s) estabelecimento(s);</w:t>
-              <w:br/>
+            </w:r>
+          </w:p>
+          <w:p>
+            <w:pPr>
+              <w:spacing w:after="0" w:before="20"/>
+              <w:ind w:right="80" w:left="360" w:hanging="280"/>
+            </w:pPr>
+            <w:r>
+              <w:rPr>
+                <w:rFonts w:ascii="Calibri" w:hAnsi="Calibri"/>
+                <w:b w:val="0"/>
+                <w:i/>
+                <w:color w:val="222222"/>
+                <w:sz w:val="19"/>
+              </w:rPr>
               <w:t>(c) o tipo de estabelecimento: criação, venda, abrigo ou família de acolhimento;</w:t>
-              <w:br/>
+            </w:r>
+          </w:p>
+          <w:p>
+            <w:pPr>
+              <w:spacing w:after="0" w:before="20"/>
+              <w:ind w:right="80" w:left="360" w:hanging="280"/>
+            </w:pPr>
+            <w:r>
+              <w:rPr>
+                <w:rFonts w:ascii="Calibri" w:hAnsi="Calibri"/>
+                <w:b w:val="0"/>
+                <w:i/>
+                <w:color w:val="222222"/>
+                <w:sz w:val="19"/>
+              </w:rPr>
               <w:t>(d) as espécies e, para os estabelecimentos de criação, as raças dos cães ou gatos mantidos;</w:t>
-              <w:br/>
+            </w:r>
+          </w:p>
+          <w:p>
+            <w:pPr>
+              <w:spacing w:after="0" w:before="20"/>
+              <w:ind w:right="80" w:left="360" w:hanging="280"/>
+            </w:pPr>
+            <w:r>
+              <w:rPr>
+                <w:rFonts w:ascii="Calibri" w:hAnsi="Calibri"/>
+                <w:b w:val="0"/>
+                <w:i/>
+                <w:color w:val="222222"/>
+                <w:sz w:val="19"/>
+              </w:rPr>
               <w:t>(e) a capacidade do estabelecimento, expressa no número máximo de cães e gatos que podem ser alojados;</w:t>
-              <w:br/>
+            </w:r>
+          </w:p>
+          <w:p>
+            <w:pPr>
+              <w:spacing w:after="0" w:before="20"/>
+              <w:ind w:right="80" w:left="360" w:hanging="280"/>
+            </w:pPr>
+            <w:r>
+              <w:rPr>
+                <w:rFonts w:ascii="Calibri" w:hAnsi="Calibri"/>
+                <w:b w:val="0"/>
+                <w:i/>
+                <w:color w:val="222222"/>
+                <w:sz w:val="19"/>
+              </w:rPr>
               <w:t>(ea) para os estabelecimentos de criação, o número estimado de ninhadas a colocar no mercado por ano.</w:t>
             </w:r>
           </w:p>
@@ -2203,8 +2785,8 @@
           </w:tcPr>
           <w:p>
             <w:pPr>
-              <w:spacing w:before="80" w:after="80"/>
-              <w:ind w:left="80" w:right="80"/>
+              <w:spacing w:after="0" w:before="80"/>
+              <w:ind w:right="80" w:left="80" w:firstLine="0"/>
             </w:pPr>
             <w:r>
               <w:rPr>
@@ -2219,8 +2801,8 @@
           </w:p>
           <w:p>
             <w:pPr>
-              <w:spacing w:before="120" w:after="0"/>
-              <w:ind w:left="80"/>
+              <w:spacing w:after="0" w:before="140"/>
+              <w:ind w:right="80" w:left="360" w:hanging="280"/>
             </w:pPr>
             <w:r>
               <w:rPr>
@@ -2231,15 +2813,85 @@
                 <w:sz w:val="19"/>
               </w:rPr>
               <w:t>(a) name, address and contact details of the operator;</w:t>
-              <w:br/>
+            </w:r>
+          </w:p>
+          <w:p>
+            <w:pPr>
+              <w:spacing w:after="0" w:before="20"/>
+              <w:ind w:right="80" w:left="360" w:hanging="280"/>
+            </w:pPr>
+            <w:r>
+              <w:rPr>
+                <w:rFonts w:ascii="Calibri" w:hAnsi="Calibri"/>
+                <w:b w:val="0"/>
+                <w:i w:val="0"/>
+                <w:color w:val="222222"/>
+                <w:sz w:val="19"/>
+              </w:rPr>
               <w:t>(b) the location(s) of the establishment(s);</w:t>
-              <w:br/>
+            </w:r>
+          </w:p>
+          <w:p>
+            <w:pPr>
+              <w:spacing w:after="0" w:before="20"/>
+              <w:ind w:right="80" w:left="360" w:hanging="280"/>
+            </w:pPr>
+            <w:r>
+              <w:rPr>
+                <w:rFonts w:ascii="Calibri" w:hAnsi="Calibri"/>
+                <w:b w:val="0"/>
+                <w:i w:val="0"/>
+                <w:color w:val="222222"/>
+                <w:sz w:val="19"/>
+              </w:rPr>
               <w:t>(c) the type(s) of establishment: breeding establishment, selling establishment, shelter or foster home;</w:t>
-              <w:br/>
+            </w:r>
+          </w:p>
+          <w:p>
+            <w:pPr>
+              <w:spacing w:after="0" w:before="20"/>
+              <w:ind w:right="80" w:left="360" w:hanging="280"/>
+            </w:pPr>
+            <w:r>
+              <w:rPr>
+                <w:rFonts w:ascii="Calibri" w:hAnsi="Calibri"/>
+                <w:b w:val="0"/>
+                <w:i w:val="0"/>
+                <w:color w:val="222222"/>
+                <w:sz w:val="19"/>
+              </w:rPr>
               <w:t>(d) the species and, for breeding establishments, the breeds of the dogs or cats kept in the establishment(s);</w:t>
-              <w:br/>
+            </w:r>
+          </w:p>
+          <w:p>
+            <w:pPr>
+              <w:spacing w:after="0" w:before="20"/>
+              <w:ind w:right="80" w:left="360" w:hanging="280"/>
+            </w:pPr>
+            <w:r>
+              <w:rPr>
+                <w:rFonts w:ascii="Calibri" w:hAnsi="Calibri"/>
+                <w:b w:val="0"/>
+                <w:i w:val="0"/>
+                <w:color w:val="222222"/>
+                <w:sz w:val="19"/>
+              </w:rPr>
               <w:t>(e) the capacity of the establishment expressed as the maximum number of dogs and cats which can be kept in the establishment(s);</w:t>
-              <w:br/>
+            </w:r>
+          </w:p>
+          <w:p>
+            <w:pPr>
+              <w:spacing w:after="0" w:before="20"/>
+              <w:ind w:right="80" w:left="360" w:hanging="280"/>
+            </w:pPr>
+            <w:r>
+              <w:rPr>
+                <w:rFonts w:ascii="Calibri" w:hAnsi="Calibri"/>
+                <w:b w:val="0"/>
+                <w:i w:val="0"/>
+                <w:color w:val="222222"/>
+                <w:sz w:val="19"/>
+              </w:rPr>
               <w:t>(ea) for breeding establishments, the estimated number of litters to be placed on the market per year.</w:t>
             </w:r>
           </w:p>
@@ -2362,7 +3014,7 @@
           </w:tcPr>
           <w:p>
             <w:pPr>
-              <w:spacing w:before="80" w:after="80"/>
+              <w:spacing w:before="80" w:after="40"/>
               <w:ind w:left="80" w:right="80"/>
             </w:pPr>
             <w:r>
@@ -2374,8 +3026,13 @@
                 <w:sz w:val="16"/>
               </w:rPr>
               <w:t>Art.º 43.º do RGBEAC (proposta, jun. 2025)</w:t>
-              <w:br/>
             </w:r>
+          </w:p>
+          <w:p>
+            <w:pPr>
+              <w:spacing w:after="0" w:before="140"/>
+              <w:ind w:right="80" w:left="80" w:firstLine="0"/>
+            </w:pPr>
             <w:r>
               <w:rPr>
                 <w:rFonts w:ascii="Calibri" w:hAnsi="Calibri"/>
@@ -2389,8 +3046,8 @@
           </w:p>
           <w:p>
             <w:pPr>
-              <w:spacing w:before="120" w:after="0"/>
-              <w:ind w:left="80"/>
+              <w:spacing w:after="0" w:before="140"/>
+              <w:ind w:right="80" w:left="80" w:firstLine="0"/>
             </w:pPr>
             <w:r>
               <w:rPr>
@@ -2405,8 +3062,8 @@
           </w:p>
           <w:p>
             <w:pPr>
-              <w:spacing w:before="120" w:after="0"/>
-              <w:ind w:left="80"/>
+              <w:spacing w:after="0" w:before="140"/>
+              <w:ind w:right="80" w:left="80" w:firstLine="0"/>
             </w:pPr>
             <w:r>
               <w:rPr>
@@ -2434,7 +3091,7 @@
           </w:tcPr>
           <w:p>
             <w:pPr>
-              <w:spacing w:before="80" w:after="80"/>
+              <w:spacing w:before="80" w:after="40"/>
               <w:ind w:left="80" w:right="80"/>
             </w:pPr>
             <w:r>
@@ -2446,8 +3103,13 @@
                 <w:sz w:val="16"/>
               </w:rPr>
               <w:t>Art.º 8.º do Código do Animal (DL n.º 214/2013)</w:t>
-              <w:br/>
             </w:r>
+          </w:p>
+          <w:p>
+            <w:pPr>
+              <w:spacing w:after="0" w:before="140"/>
+              <w:ind w:right="80" w:left="80" w:firstLine="0"/>
+            </w:pPr>
             <w:r>
               <w:rPr>
                 <w:rFonts w:ascii="Calibri" w:hAnsi="Calibri"/>
@@ -2461,8 +3123,8 @@
           </w:p>
           <w:p>
             <w:pPr>
-              <w:spacing w:before="120" w:after="0"/>
-              <w:ind w:left="80"/>
+              <w:spacing w:after="0" w:before="140"/>
+              <w:ind w:right="80" w:left="80" w:firstLine="0"/>
             </w:pPr>
             <w:r>
               <w:rPr>
@@ -2477,8 +3139,8 @@
           </w:p>
           <w:p>
             <w:pPr>
-              <w:spacing w:before="120" w:after="0"/>
-              <w:ind w:left="80"/>
+              <w:spacing w:after="0" w:before="140"/>
+              <w:ind w:right="80" w:left="360" w:hanging="280"/>
             </w:pPr>
             <w:r>
               <w:rPr>
@@ -2493,8 +3155,8 @@
           </w:p>
           <w:p>
             <w:pPr>
-              <w:spacing w:before="120" w:after="0"/>
-              <w:ind w:left="80"/>
+              <w:spacing w:after="0" w:before="140"/>
+              <w:ind w:right="80" w:left="360" w:hanging="280"/>
             </w:pPr>
             <w:r>
               <w:rPr>
@@ -2509,8 +3171,8 @@
           </w:p>
           <w:p>
             <w:pPr>
-              <w:spacing w:before="120" w:after="0"/>
-              <w:ind w:left="80"/>
+              <w:spacing w:after="0" w:before="140"/>
+              <w:ind w:right="80" w:left="360" w:hanging="280"/>
             </w:pPr>
             <w:r>
               <w:rPr>
@@ -2538,7 +3200,7 @@
           </w:tcPr>
           <w:p>
             <w:pPr>
-              <w:spacing w:before="80" w:after="80"/>
+              <w:spacing w:before="80" w:after="40"/>
               <w:ind w:left="80" w:right="80"/>
             </w:pPr>
             <w:r>
@@ -2550,8 +3212,13 @@
                 <w:sz w:val="16"/>
               </w:rPr>
               <w:t>n.º 1 do art.º 3.º-A do DL n.º 276/2001, de 17 de outubro</w:t>
-              <w:br/>
             </w:r>
+          </w:p>
+          <w:p>
+            <w:pPr>
+              <w:spacing w:after="0" w:before="140"/>
+              <w:ind w:right="80" w:left="80" w:firstLine="0"/>
+            </w:pPr>
             <w:r>
               <w:rPr>
                 <w:rFonts w:ascii="Calibri" w:hAnsi="Calibri"/>
@@ -2565,8 +3232,8 @@
           </w:p>
           <w:p>
             <w:pPr>
-              <w:spacing w:before="120" w:after="0"/>
-              <w:ind w:left="80"/>
+              <w:spacing w:after="0" w:before="140"/>
+              <w:ind w:right="80" w:left="360" w:hanging="280"/>
             </w:pPr>
             <w:r>
               <w:rPr>
@@ -2577,23 +3244,149 @@
                 <w:sz w:val="19"/>
               </w:rPr>
               <w:t>a) O nome ou a denominação social do interessado;</w:t>
-              <w:br/>
+            </w:r>
+          </w:p>
+          <w:p>
+            <w:pPr>
+              <w:spacing w:after="0" w:before="20"/>
+              <w:ind w:right="80" w:left="360" w:hanging="280"/>
+            </w:pPr>
+            <w:r>
+              <w:rPr>
+                <w:rFonts w:ascii="Calibri" w:hAnsi="Calibri"/>
+                <w:b w:val="0"/>
+                <w:i w:val="0"/>
+                <w:color w:val="222222"/>
+                <w:sz w:val="19"/>
+              </w:rPr>
               <w:t>b) A localização do alojamento e a sua designação comercial;</w:t>
-              <w:br/>
+            </w:r>
+          </w:p>
+          <w:p>
+            <w:pPr>
+              <w:spacing w:after="0" w:before="20"/>
+              <w:ind w:right="80" w:left="360" w:hanging="280"/>
+            </w:pPr>
+            <w:r>
+              <w:rPr>
+                <w:rFonts w:ascii="Calibri" w:hAnsi="Calibri"/>
+                <w:b w:val="0"/>
+                <w:i w:val="0"/>
+                <w:color w:val="222222"/>
+                <w:sz w:val="19"/>
+              </w:rPr>
               <w:t>c) O número de identificação fiscal ou de pessoa coletiva do interessado;</w:t>
-              <w:br/>
+            </w:r>
+          </w:p>
+          <w:p>
+            <w:pPr>
+              <w:spacing w:after="0" w:before="20"/>
+              <w:ind w:right="80" w:left="360" w:hanging="280"/>
+            </w:pPr>
+            <w:r>
+              <w:rPr>
+                <w:rFonts w:ascii="Calibri" w:hAnsi="Calibri"/>
+                <w:b w:val="0"/>
+                <w:i w:val="0"/>
+                <w:color w:val="222222"/>
+                <w:sz w:val="19"/>
+              </w:rPr>
               <w:t>d) Municípios integrantes, no caso dos centros de recolha intermunicipais;</w:t>
-              <w:br/>
+            </w:r>
+          </w:p>
+          <w:p>
+            <w:pPr>
+              <w:spacing w:after="0" w:before="20"/>
+              <w:ind w:right="80" w:left="360" w:hanging="280"/>
+            </w:pPr>
+            <w:r>
+              <w:rPr>
+                <w:rFonts w:ascii="Calibri" w:hAnsi="Calibri"/>
+                <w:b w:val="0"/>
+                <w:i w:val="0"/>
+                <w:color w:val="222222"/>
+                <w:sz w:val="19"/>
+              </w:rPr>
               <w:t>e) Caracterização das atividades a exercer;</w:t>
-              <w:br/>
+            </w:r>
+          </w:p>
+          <w:p>
+            <w:pPr>
+              <w:spacing w:after="0" w:before="20"/>
+              <w:ind w:right="80" w:left="360" w:hanging="280"/>
+            </w:pPr>
+            <w:r>
+              <w:rPr>
+                <w:rFonts w:ascii="Calibri" w:hAnsi="Calibri"/>
+                <w:b w:val="0"/>
+                <w:i w:val="0"/>
+                <w:color w:val="222222"/>
+                <w:sz w:val="19"/>
+              </w:rPr>
               <w:t>f) Indicação do médico veterinário responsável pelo alojamento;</w:t>
-              <w:br/>
+            </w:r>
+          </w:p>
+          <w:p>
+            <w:pPr>
+              <w:spacing w:after="0" w:before="20"/>
+              <w:ind w:right="80" w:left="360" w:hanging="280"/>
+            </w:pPr>
+            <w:r>
+              <w:rPr>
+                <w:rFonts w:ascii="Calibri" w:hAnsi="Calibri"/>
+                <w:b w:val="0"/>
+                <w:i w:val="0"/>
+                <w:color w:val="222222"/>
+                <w:sz w:val="19"/>
+              </w:rPr>
               <w:t>g) O número de celas de quarentena para isolamento de animais por suspeita de raiva, no caso dos centros de recolha;</w:t>
-              <w:br/>
+            </w:r>
+          </w:p>
+          <w:p>
+            <w:pPr>
+              <w:spacing w:after="0" w:before="20"/>
+              <w:ind w:right="80" w:left="360" w:hanging="280"/>
+            </w:pPr>
+            <w:r>
+              <w:rPr>
+                <w:rFonts w:ascii="Calibri" w:hAnsi="Calibri"/>
+                <w:b w:val="0"/>
+                <w:i w:val="0"/>
+                <w:color w:val="222222"/>
+                <w:sz w:val="19"/>
+              </w:rPr>
               <w:t>h) A capacidade máxima de animais e respetivas espécies a alojar;</w:t>
-              <w:br/>
+            </w:r>
+          </w:p>
+          <w:p>
+            <w:pPr>
+              <w:spacing w:after="0" w:before="20"/>
+              <w:ind w:right="80" w:left="360" w:hanging="280"/>
+            </w:pPr>
+            <w:r>
+              <w:rPr>
+                <w:rFonts w:ascii="Calibri" w:hAnsi="Calibri"/>
+                <w:b w:val="0"/>
+                <w:i w:val="0"/>
+                <w:color w:val="222222"/>
+                <w:sz w:val="19"/>
+              </w:rPr>
               <w:t>i) O número de animais detidos, espécies e raças;</w:t>
-              <w:br/>
+            </w:r>
+          </w:p>
+          <w:p>
+            <w:pPr>
+              <w:spacing w:after="0" w:before="20"/>
+              <w:ind w:right="80" w:left="360" w:hanging="280"/>
+            </w:pPr>
+            <w:r>
+              <w:rPr>
+                <w:rFonts w:ascii="Calibri" w:hAnsi="Calibri"/>
+                <w:b w:val="0"/>
+                <w:i w:val="0"/>
+                <w:color w:val="222222"/>
+                <w:sz w:val="19"/>
+              </w:rPr>
               <w:t>j) Declaração de responsabilidade, subscrita pelo interessado, relativa ao cumprimento da legislação aplicável aos animais de companhia, nomeadamente em matéria de instalações, equipamentos, higiene, saúde e bem-estar dos animais.</w:t>
             </w:r>
           </w:p>
@@ -2647,6 +3440,219 @@
         <w:tc>
           <w:tcPr>
             <w:tcW w:type="dxa" w:w="15138"/>
+            <w:shd w:val="clear" w:color="auto" w:fill="006064"/>
+            <w:tcBorders>
+              <w:top w:val="single" w:sz="4" w:space="0" w:color="006064"/>
+              <w:left w:val="single" w:sz="4" w:space="0" w:color="006064"/>
+              <w:bottom w:val="single" w:sz="4" w:space="0" w:color="006064"/>
+              <w:right w:val="single" w:sz="4" w:space="0" w:color="006064"/>
+            </w:tcBorders>
+          </w:tcPr>
+          <w:p>
+            <w:pPr>
+              <w:spacing w:before="80" w:after="0"/>
+              <w:ind w:left="120"/>
+            </w:pPr>
+            <w:r>
+              <w:rPr>
+                <w:rFonts w:ascii="Calibri" w:hAnsi="Calibri"/>
+                <w:b/>
+                <w:i w:val="0"/>
+                <w:color w:val="FFFFFF"/>
+                <w:sz w:val="17"/>
+              </w:rPr>
+              <w:t>@legislacao</w:t>
+            </w:r>
+          </w:p>
+        </w:tc>
+      </w:tr>
+      <w:tr>
+        <w:tc>
+          <w:tcPr>
+            <w:tcW w:type="dxa" w:w="15138"/>
+            <w:shd w:val="clear" w:color="auto" w:fill="E0F7FA"/>
+            <w:tcBorders>
+              <w:top w:val="single" w:sz="4" w:space="0" w:color="CCCCCC"/>
+              <w:left w:val="single" w:sz="4" w:space="0" w:color="CCCCCC"/>
+              <w:bottom w:val="single" w:sz="4" w:space="0" w:color="CCCCCC"/>
+              <w:right w:val="single" w:sz="4" w:space="0" w:color="CCCCCC"/>
+            </w:tcBorders>
+            <w:vAlign w:val="top"/>
+          </w:tcPr>
+          <w:p>
+            <w:pPr>
+              <w:spacing w:before="80" w:after="80"/>
+              <w:ind w:left="120" w:right="120"/>
+            </w:pPr>
+            <w:r>
+              <w:rPr>
+                <w:rFonts w:ascii="Calibri" w:hAnsi="Calibri"/>
+                <w:b w:val="0"/>
+                <w:i w:val="0"/>
+                <w:color w:val="222222"/>
+                <w:sz w:val="18"/>
+              </w:rPr>
+              <w:t>O DL n.º 276/2001 (art.º 3.º-A) prevê comunicação prévia à DGAV com elementos parcialmente equivalentes (capacidade máxima, espécies, raças). Não exige a estimativa anual de ninhadas a colocar no mercado (al. ea) do @regulamento), constituindo lacuna parcial. É o diploma mais próximo do @regulamento neste eixo.</w:t>
+            </w:r>
+          </w:p>
+        </w:tc>
+      </w:tr>
+      <w:tr>
+        <w:tc>
+          <w:tcPr>
+            <w:tcW w:type="dxa" w:w="15138"/>
+            <w:shd w:val="clear" w:color="auto" w:fill="7E4C00"/>
+            <w:tcBorders>
+              <w:top w:val="single" w:sz="4" w:space="0" w:color="7E4C00"/>
+              <w:left w:val="single" w:sz="4" w:space="0" w:color="7E4C00"/>
+              <w:bottom w:val="single" w:sz="4" w:space="0" w:color="7E4C00"/>
+              <w:right w:val="single" w:sz="4" w:space="0" w:color="7E4C00"/>
+            </w:tcBorders>
+          </w:tcPr>
+          <w:p>
+            <w:pPr>
+              <w:spacing w:before="80" w:after="0"/>
+              <w:ind w:left="120"/>
+            </w:pPr>
+            <w:r>
+              <w:rPr>
+                <w:rFonts w:ascii="Calibri" w:hAnsi="Calibri"/>
+                <w:b/>
+                <w:i w:val="0"/>
+                <w:color w:val="FFFFFF"/>
+                <w:sz w:val="17"/>
+              </w:rPr>
+              <w:t>@codigo</w:t>
+            </w:r>
+          </w:p>
+        </w:tc>
+      </w:tr>
+      <w:tr>
+        <w:tc>
+          <w:tcPr>
+            <w:tcW w:type="dxa" w:w="15138"/>
+            <w:shd w:val="clear" w:color="auto" w:fill="FFE6CC"/>
+            <w:tcBorders>
+              <w:top w:val="single" w:sz="4" w:space="0" w:color="CCCCCC"/>
+              <w:left w:val="single" w:sz="4" w:space="0" w:color="CCCCCC"/>
+              <w:bottom w:val="single" w:sz="4" w:space="0" w:color="CCCCCC"/>
+              <w:right w:val="single" w:sz="4" w:space="0" w:color="CCCCCC"/>
+            </w:tcBorders>
+            <w:vAlign w:val="top"/>
+          </w:tcPr>
+          <w:p>
+            <w:pPr>
+              <w:spacing w:before="80" w:after="80"/>
+              <w:ind w:left="120" w:right="120"/>
+            </w:pPr>
+            <w:r>
+              <w:rPr>
+                <w:rFonts w:ascii="Calibri" w:hAnsi="Calibri"/>
+                <w:b w:val="0"/>
+                <w:i w:val="0"/>
+                <w:color w:val="222222"/>
+                <w:sz w:val="18"/>
+              </w:rPr>
+              <w:t>O @codigo regula condições de reprodução (art.º 8.º) mas não prevê qualquer sistema de notificação ou registo de estabelecimentos criadores junto da autoridade competente.</w:t>
+            </w:r>
+          </w:p>
+        </w:tc>
+      </w:tr>
+      <w:tr>
+        <w:tc>
+          <w:tcPr>
+            <w:tcW w:type="dxa" w:w="15138"/>
+            <w:shd w:val="clear" w:color="auto" w:fill="1E5631"/>
+            <w:tcBorders>
+              <w:top w:val="single" w:sz="4" w:space="0" w:color="1E5631"/>
+              <w:left w:val="single" w:sz="4" w:space="0" w:color="1E5631"/>
+              <w:bottom w:val="single" w:sz="4" w:space="0" w:color="1E5631"/>
+              <w:right w:val="single" w:sz="4" w:space="0" w:color="1E5631"/>
+            </w:tcBorders>
+          </w:tcPr>
+          <w:p>
+            <w:pPr>
+              <w:spacing w:before="80" w:after="0"/>
+              <w:ind w:left="120"/>
+            </w:pPr>
+            <w:r>
+              <w:rPr>
+                <w:rFonts w:ascii="Calibri" w:hAnsi="Calibri"/>
+                <w:b/>
+                <w:i w:val="0"/>
+                <w:color w:val="FFFFFF"/>
+                <w:sz w:val="17"/>
+              </w:rPr>
+              <w:t>@rgbeac</w:t>
+            </w:r>
+          </w:p>
+        </w:tc>
+      </w:tr>
+      <w:tr>
+        <w:tc>
+          <w:tcPr>
+            <w:tcW w:type="dxa" w:w="15138"/>
+            <w:shd w:val="clear" w:color="auto" w:fill="D5E8D4"/>
+            <w:tcBorders>
+              <w:top w:val="single" w:sz="4" w:space="0" w:color="CCCCCC"/>
+              <w:left w:val="single" w:sz="4" w:space="0" w:color="CCCCCC"/>
+              <w:bottom w:val="single" w:sz="4" w:space="0" w:color="CCCCCC"/>
+              <w:right w:val="single" w:sz="4" w:space="0" w:color="CCCCCC"/>
+            </w:tcBorders>
+            <w:vAlign w:val="top"/>
+          </w:tcPr>
+          <w:p>
+            <w:pPr>
+              <w:spacing w:before="80" w:after="80"/>
+              <w:ind w:left="120" w:right="120"/>
+            </w:pPr>
+            <w:r>
+              <w:rPr>
+                <w:rFonts w:ascii="Calibri" w:hAnsi="Calibri"/>
+                <w:b w:val="0"/>
+                <w:i w:val="0"/>
+                <w:color w:val="222222"/>
+                <w:sz w:val="18"/>
+              </w:rPr>
+              <w:t>O @rgbeac trata da esterilização de errantes e CED, mas não contém norma sobre notificação de criadores ou registo de estabelecimentos com fins de reprodução comercial.</w:t>
+            </w:r>
+          </w:p>
+        </w:tc>
+      </w:tr>
+      <w:tr>
+        <w:tc>
+          <w:tcPr>
+            <w:tcW w:type="dxa" w:w="15138"/>
+            <w:shd w:val="clear" w:color="auto" w:fill="5D2A8A"/>
+            <w:tcBorders>
+              <w:top w:val="single" w:sz="4" w:space="0" w:color="5D2A8A"/>
+              <w:left w:val="single" w:sz="4" w:space="0" w:color="5D2A8A"/>
+              <w:bottom w:val="single" w:sz="4" w:space="0" w:color="5D2A8A"/>
+              <w:right w:val="single" w:sz="4" w:space="0" w:color="5D2A8A"/>
+            </w:tcBorders>
+          </w:tcPr>
+          <w:p>
+            <w:pPr>
+              <w:spacing w:before="80" w:after="0"/>
+              <w:ind w:left="120"/>
+            </w:pPr>
+            <w:r>
+              <w:rPr>
+                <w:rFonts w:ascii="Calibri" w:hAnsi="Calibri"/>
+                <w:b/>
+                <w:i w:val="0"/>
+                <w:color w:val="FFFFFF"/>
+                <w:sz w:val="17"/>
+              </w:rPr>
+              <w:t>Sumário / Proposta</w:t>
+            </w:r>
+          </w:p>
+        </w:tc>
+      </w:tr>
+      <w:tr>
+        <w:tc>
+          <w:tcPr>
+            <w:tcW w:type="dxa" w:w="15138"/>
             <w:shd w:val="clear" w:color="auto" w:fill="EAD7F7"/>
             <w:tcBorders>
               <w:top w:val="single" w:sz="4" w:space="0" w:color="CCCCCC"/>
@@ -2659,17 +3665,17 @@
           <w:p>
             <w:pPr>
               <w:spacing w:before="80" w:after="80"/>
-              <w:ind w:left="80" w:right="80"/>
+              <w:ind w:left="120" w:right="120"/>
             </w:pPr>
             <w:r>
               <w:rPr>
                 <w:rFonts w:ascii="Calibri" w:hAnsi="Calibri"/>
-                <w:b/>
+                <w:b w:val="0"/>
                 <w:i w:val="0"/>
-                <w:color w:val="3D1A6E"/>
-                <w:sz w:val="19"/>
+                <w:color w:val="222222"/>
+                <w:sz w:val="18"/>
               </w:rPr>
-              <w:t>O @regulamento exige notificação prévia com dados detalhados, incluindo o número estimado de ninhadas a colocar no mercado por ano (al. ea)). A @legislacao (DL n.º 276/2001, art.º 3.º-A) já prevê comunicação prévia à DGAV com elementos parcialmente equivalentes (capacidade máxima, espécies, raças — als. h) e i)), mas não exige a estimativa de ninhadas, constituindo lacuna parcial face ao @regulamento. O @codigo regula condições de reprodução mas não prevê notificação ou registo de estabelecimentos criadores. O @rgbeac trata exclusivamente da esterilização de errantes, sem qualquer norma sobre notificação de criadores. A @legislacao vigente é, dos diplomas nacionais, o mais próximo do @regulamento neste eixo, ainda que com lacuna relevante.</w:t>
+              <w:t>A @legislacao vigente é o diploma base adequado para a transposição. Necessidade de ajuste: acrescentar a obrigação de estimativa anual de ninhadas a colocar no mercado e alinhar os restantes elementos informativos com a lista exaustiva do art.º 7.º do @regulamento.</w:t>
             </w:r>
           </w:p>
         </w:tc>
@@ -2901,8 +3907,8 @@
           </w:tcPr>
           <w:p>
             <w:pPr>
-              <w:spacing w:before="80" w:after="80"/>
-              <w:ind w:left="80" w:right="80"/>
+              <w:spacing w:after="0" w:before="80"/>
+              <w:ind w:right="80" w:left="80" w:firstLine="0"/>
             </w:pPr>
             <w:r>
               <w:rPr>
@@ -2917,8 +3923,8 @@
           </w:p>
           <w:p>
             <w:pPr>
-              <w:spacing w:before="120" w:after="0"/>
-              <w:ind w:left="80"/>
+              <w:spacing w:after="0" w:before="140"/>
+              <w:ind w:right="80" w:left="360" w:hanging="280"/>
             </w:pPr>
             <w:r>
               <w:rPr>
@@ -2933,8 +3939,8 @@
           </w:p>
           <w:p>
             <w:pPr>
-              <w:spacing w:before="120" w:after="0"/>
-              <w:ind w:left="80"/>
+              <w:spacing w:after="0" w:before="140"/>
+              <w:ind w:right="80" w:left="360" w:hanging="280"/>
             </w:pPr>
             <w:r>
               <w:rPr>
@@ -2949,8 +3955,8 @@
           </w:p>
           <w:p>
             <w:pPr>
-              <w:spacing w:before="120" w:after="0"/>
-              <w:ind w:left="80"/>
+              <w:spacing w:after="0" w:before="140"/>
+              <w:ind w:right="80" w:left="360" w:hanging="280"/>
             </w:pPr>
             <w:r>
               <w:rPr>
@@ -2965,8 +3971,8 @@
           </w:p>
           <w:p>
             <w:pPr>
-              <w:spacing w:before="120" w:after="0"/>
-              <w:ind w:left="80"/>
+              <w:spacing w:after="0" w:before="140"/>
+              <w:ind w:right="80" w:left="360" w:hanging="280"/>
             </w:pPr>
             <w:r>
               <w:rPr>
@@ -2981,8 +3987,8 @@
           </w:p>
           <w:p>
             <w:pPr>
-              <w:spacing w:before="120" w:after="0"/>
-              <w:ind w:left="80"/>
+              <w:spacing w:after="0" w:before="140"/>
+              <w:ind w:right="80" w:left="360" w:hanging="280"/>
             </w:pPr>
             <w:r>
               <w:rPr>
@@ -3056,8 +4062,8 @@
           </w:tcPr>
           <w:p>
             <w:pPr>
-              <w:spacing w:before="80" w:after="80"/>
-              <w:ind w:left="80" w:right="80"/>
+              <w:spacing w:after="0" w:before="80"/>
+              <w:ind w:right="80" w:left="80" w:firstLine="0"/>
             </w:pPr>
             <w:r>
               <w:rPr>
@@ -3072,8 +4078,8 @@
           </w:p>
           <w:p>
             <w:pPr>
-              <w:spacing w:before="120" w:after="0"/>
-              <w:ind w:left="80"/>
+              <w:spacing w:after="0" w:before="140"/>
+              <w:ind w:right="80" w:left="360" w:hanging="280"/>
             </w:pPr>
             <w:r>
               <w:rPr>
@@ -3088,8 +4094,8 @@
           </w:p>
           <w:p>
             <w:pPr>
-              <w:spacing w:before="120" w:after="0"/>
-              <w:ind w:left="80"/>
+              <w:spacing w:after="0" w:before="140"/>
+              <w:ind w:right="80" w:left="360" w:hanging="280"/>
             </w:pPr>
             <w:r>
               <w:rPr>
@@ -3104,8 +4110,8 @@
           </w:p>
           <w:p>
             <w:pPr>
-              <w:spacing w:before="120" w:after="0"/>
-              <w:ind w:left="80"/>
+              <w:spacing w:after="0" w:before="140"/>
+              <w:ind w:right="80" w:left="360" w:hanging="280"/>
             </w:pPr>
             <w:r>
               <w:rPr>
@@ -3120,8 +4126,8 @@
           </w:p>
           <w:p>
             <w:pPr>
-              <w:spacing w:before="120" w:after="0"/>
-              <w:ind w:left="80"/>
+              <w:spacing w:after="0" w:before="140"/>
+              <w:ind w:right="80" w:left="360" w:hanging="280"/>
             </w:pPr>
             <w:r>
               <w:rPr>
@@ -3136,8 +4142,8 @@
           </w:p>
           <w:p>
             <w:pPr>
-              <w:spacing w:before="120" w:after="0"/>
-              <w:ind w:left="80"/>
+              <w:spacing w:after="0" w:before="140"/>
+              <w:ind w:right="80" w:left="360" w:hanging="280"/>
             </w:pPr>
             <w:r>
               <w:rPr>
@@ -3269,7 +4275,7 @@
           </w:tcPr>
           <w:p>
             <w:pPr>
-              <w:spacing w:before="80" w:after="80"/>
+              <w:spacing w:before="80" w:after="40"/>
               <w:ind w:left="80" w:right="80"/>
             </w:pPr>
             <w:r>
@@ -3281,8 +4287,13 @@
                 <w:sz w:val="16"/>
               </w:rPr>
               <w:t>al. a) do n.º 1 do art.º 10.º do RGBEAC (proposta, jun. 2025)</w:t>
-              <w:br/>
             </w:r>
+          </w:p>
+          <w:p>
+            <w:pPr>
+              <w:spacing w:after="0" w:before="140"/>
+              <w:ind w:right="80" w:left="80" w:firstLine="0"/>
+            </w:pPr>
             <w:r>
               <w:rPr>
                 <w:rFonts w:ascii="Calibri" w:hAnsi="Calibri"/>
@@ -3296,8 +4307,8 @@
           </w:p>
           <w:p>
             <w:pPr>
-              <w:spacing w:before="120" w:after="0"/>
-              <w:ind w:left="80"/>
+              <w:spacing w:after="0" w:before="140"/>
+              <w:ind w:right="80" w:left="360" w:hanging="280"/>
             </w:pPr>
             <w:r>
               <w:rPr>
@@ -3308,17 +4319,101 @@
                 <w:sz w:val="19"/>
               </w:rPr>
               <w:t>a) Assegurar o bem-estar do animal, de acordo com sua espécie, raça, idade e necessidades físicas e etológicas, proporcionando-lhe:</w:t>
-              <w:br/>
+            </w:r>
+          </w:p>
+          <w:p>
+            <w:pPr>
+              <w:spacing w:after="0" w:before="20"/>
+              <w:ind w:right="80" w:left="680" w:hanging="280"/>
+            </w:pPr>
+            <w:r>
+              <w:rPr>
+                <w:rFonts w:ascii="Calibri" w:hAnsi="Calibri"/>
+                <w:b w:val="0"/>
+                <w:i w:val="0"/>
+                <w:color w:val="222222"/>
+                <w:sz w:val="19"/>
+              </w:rPr>
               <w:t>— Atenção, supervisão, controlo, exercício físico e estímulo mental;</w:t>
-              <w:br/>
+            </w:r>
+          </w:p>
+          <w:p>
+            <w:pPr>
+              <w:spacing w:after="0" w:before="20"/>
+              <w:ind w:right="80" w:left="680" w:hanging="280"/>
+            </w:pPr>
+            <w:r>
+              <w:rPr>
+                <w:rFonts w:ascii="Calibri" w:hAnsi="Calibri"/>
+                <w:b w:val="0"/>
+                <w:i w:val="0"/>
+                <w:color w:val="222222"/>
+                <w:sz w:val="19"/>
+              </w:rPr>
               <w:t>— Alimentos saudáveis, adequados e convenientes ao seu normal desenvolvimento e acesso permanente a água potável;</w:t>
-              <w:br/>
+            </w:r>
+          </w:p>
+          <w:p>
+            <w:pPr>
+              <w:spacing w:after="0" w:before="20"/>
+              <w:ind w:right="80" w:left="680" w:hanging="280"/>
+            </w:pPr>
+            <w:r>
+              <w:rPr>
+                <w:rFonts w:ascii="Calibri" w:hAnsi="Calibri"/>
+                <w:b w:val="0"/>
+                <w:i w:val="0"/>
+                <w:color w:val="222222"/>
+                <w:sz w:val="19"/>
+              </w:rPr>
               <w:t>— Condições higiossanitárias que atendam, no mínimo, ao estabelecido no presente decreto-lei e na demais legislação aplicável;</w:t>
-              <w:br/>
+            </w:r>
+          </w:p>
+          <w:p>
+            <w:pPr>
+              <w:spacing w:after="0" w:before="20"/>
+              <w:ind w:right="80" w:left="680" w:hanging="280"/>
+            </w:pPr>
+            <w:r>
+              <w:rPr>
+                <w:rFonts w:ascii="Calibri" w:hAnsi="Calibri"/>
+                <w:b w:val="0"/>
+                <w:i w:val="0"/>
+                <w:color w:val="222222"/>
+                <w:sz w:val="19"/>
+              </w:rPr>
               <w:t>— Liberdade de movimento, sendo proibidos todos os sistemas de contenção permanentes;</w:t>
-              <w:br/>
+            </w:r>
+          </w:p>
+          <w:p>
+            <w:pPr>
+              <w:spacing w:after="0" w:before="20"/>
+              <w:ind w:right="80" w:left="680" w:hanging="280"/>
+            </w:pPr>
+            <w:r>
+              <w:rPr>
+                <w:rFonts w:ascii="Calibri" w:hAnsi="Calibri"/>
+                <w:b w:val="0"/>
+                <w:i w:val="0"/>
+                <w:color w:val="222222"/>
+                <w:sz w:val="19"/>
+              </w:rPr>
               <w:t>— Abrigo adequado, em termos de tamanho e qualidade, com vista a proteger de condições atmosféricas adversas, incluindo frio, chuva, sol ou calor excessivos, com cama seca, limpa e confortável;</w:t>
-              <w:br/>
+            </w:r>
+          </w:p>
+          <w:p>
+            <w:pPr>
+              <w:spacing w:after="0" w:before="20"/>
+              <w:ind w:right="80" w:left="680" w:hanging="280"/>
+            </w:pPr>
+            <w:r>
+              <w:rPr>
+                <w:rFonts w:ascii="Calibri" w:hAnsi="Calibri"/>
+                <w:b w:val="0"/>
+                <w:i w:val="0"/>
+                <w:color w:val="222222"/>
+                <w:sz w:val="19"/>
+              </w:rPr>
               <w:t>— Contato social adequado a cada espécie, de acordo com a sua idade e atividade.</w:t>
             </w:r>
           </w:p>
@@ -3337,7 +4432,7 @@
           </w:tcPr>
           <w:p>
             <w:pPr>
-              <w:spacing w:before="80" w:after="80"/>
+              <w:spacing w:before="80" w:after="40"/>
               <w:ind w:left="80" w:right="80"/>
             </w:pPr>
             <w:r>
@@ -3349,8 +4444,13 @@
                 <w:sz w:val="16"/>
               </w:rPr>
               <w:t>n.ºs 1, 2 e 3 do art.º 5.º do Código do Animal (DL n.º 214/2013)</w:t>
-              <w:br/>
             </w:r>
+          </w:p>
+          <w:p>
+            <w:pPr>
+              <w:spacing w:after="0" w:before="140"/>
+              <w:ind w:right="80" w:left="80" w:firstLine="0"/>
+            </w:pPr>
             <w:r>
               <w:rPr>
                 <w:rFonts w:ascii="Calibri" w:hAnsi="Calibri"/>
@@ -3364,8 +4464,8 @@
           </w:p>
           <w:p>
             <w:pPr>
-              <w:spacing w:before="120" w:after="0"/>
-              <w:ind w:left="80"/>
+              <w:spacing w:after="0" w:before="140"/>
+              <w:ind w:right="80" w:left="80" w:firstLine="0"/>
             </w:pPr>
             <w:r>
               <w:rPr>
@@ -3380,8 +4480,8 @@
           </w:p>
           <w:p>
             <w:pPr>
-              <w:spacing w:before="120" w:after="0"/>
-              <w:ind w:left="80"/>
+              <w:spacing w:after="0" w:before="140"/>
+              <w:ind w:right="80" w:left="80" w:firstLine="0"/>
             </w:pPr>
             <w:r>
               <w:rPr>
@@ -3409,7 +4509,7 @@
           </w:tcPr>
           <w:p>
             <w:pPr>
-              <w:spacing w:before="80" w:after="80"/>
+              <w:spacing w:before="80" w:after="40"/>
               <w:ind w:left="80" w:right="80"/>
             </w:pPr>
             <w:r>
@@ -3421,8 +4521,13 @@
                 <w:sz w:val="16"/>
               </w:rPr>
               <w:t>n.º 1 do art.º 7.º e n.º 1 do art.º 9.º do DL n.º 276/2001, de 17 de outubro</w:t>
-              <w:br/>
             </w:r>
+          </w:p>
+          <w:p>
+            <w:pPr>
+              <w:spacing w:after="0" w:before="140"/>
+              <w:ind w:right="80" w:left="80" w:firstLine="0"/>
+            </w:pPr>
             <w:r>
               <w:rPr>
                 <w:rFonts w:ascii="Calibri" w:hAnsi="Calibri"/>
@@ -3436,8 +4541,8 @@
           </w:p>
           <w:p>
             <w:pPr>
-              <w:spacing w:before="120" w:after="0"/>
-              <w:ind w:left="80"/>
+              <w:spacing w:after="0" w:before="140"/>
+              <w:ind w:right="80" w:left="80" w:firstLine="0"/>
             </w:pPr>
             <w:r>
               <w:rPr>
@@ -3500,6 +4605,219 @@
         <w:tc>
           <w:tcPr>
             <w:tcW w:type="dxa" w:w="15138"/>
+            <w:shd w:val="clear" w:color="auto" w:fill="006064"/>
+            <w:tcBorders>
+              <w:top w:val="single" w:sz="4" w:space="0" w:color="006064"/>
+              <w:left w:val="single" w:sz="4" w:space="0" w:color="006064"/>
+              <w:bottom w:val="single" w:sz="4" w:space="0" w:color="006064"/>
+              <w:right w:val="single" w:sz="4" w:space="0" w:color="006064"/>
+            </w:tcBorders>
+          </w:tcPr>
+          <w:p>
+            <w:pPr>
+              <w:spacing w:before="80" w:after="0"/>
+              <w:ind w:left="120"/>
+            </w:pPr>
+            <w:r>
+              <w:rPr>
+                <w:rFonts w:ascii="Calibri" w:hAnsi="Calibri"/>
+                <w:b/>
+                <w:i w:val="0"/>
+                <w:color w:val="FFFFFF"/>
+                <w:sz w:val="17"/>
+              </w:rPr>
+              <w:t>@legislacao</w:t>
+            </w:r>
+          </w:p>
+        </w:tc>
+      </w:tr>
+      <w:tr>
+        <w:tc>
+          <w:tcPr>
+            <w:tcW w:type="dxa" w:w="15138"/>
+            <w:shd w:val="clear" w:color="auto" w:fill="E0F7FA"/>
+            <w:tcBorders>
+              <w:top w:val="single" w:sz="4" w:space="0" w:color="CCCCCC"/>
+              <w:left w:val="single" w:sz="4" w:space="0" w:color="CCCCCC"/>
+              <w:bottom w:val="single" w:sz="4" w:space="0" w:color="CCCCCC"/>
+              <w:right w:val="single" w:sz="4" w:space="0" w:color="CCCCCC"/>
+            </w:tcBorders>
+            <w:vAlign w:val="top"/>
+          </w:tcPr>
+          <w:p>
+            <w:pPr>
+              <w:spacing w:before="80" w:after="80"/>
+              <w:ind w:left="120" w:right="120"/>
+            </w:pPr>
+            <w:r>
+              <w:rPr>
+                <w:rFonts w:ascii="Calibri" w:hAnsi="Calibri"/>
+                <w:b w:val="0"/>
+                <w:i w:val="0"/>
+                <w:color w:val="222222"/>
+                <w:sz w:val="18"/>
+              </w:rPr>
+              <w:t>O DL n.º 276/2001 (art.ºs 7.º e 9.º) consagra os mesmos parâmetros mas desenvolve-os em artigos separados (alojamento, alimentação, ambiente) sem os denominar como domínios nem os sistematizar de forma unificada segundo o referencial OMSA.</w:t>
+            </w:r>
+          </w:p>
+        </w:tc>
+      </w:tr>
+      <w:tr>
+        <w:tc>
+          <w:tcPr>
+            <w:tcW w:type="dxa" w:w="15138"/>
+            <w:shd w:val="clear" w:color="auto" w:fill="7E4C00"/>
+            <w:tcBorders>
+              <w:top w:val="single" w:sz="4" w:space="0" w:color="7E4C00"/>
+              <w:left w:val="single" w:sz="4" w:space="0" w:color="7E4C00"/>
+              <w:bottom w:val="single" w:sz="4" w:space="0" w:color="7E4C00"/>
+              <w:right w:val="single" w:sz="4" w:space="0" w:color="7E4C00"/>
+            </w:tcBorders>
+          </w:tcPr>
+          <w:p>
+            <w:pPr>
+              <w:spacing w:before="80" w:after="0"/>
+              <w:ind w:left="120"/>
+            </w:pPr>
+            <w:r>
+              <w:rPr>
+                <w:rFonts w:ascii="Calibri" w:hAnsi="Calibri"/>
+                <w:b/>
+                <w:i w:val="0"/>
+                <w:color w:val="FFFFFF"/>
+                <w:sz w:val="17"/>
+              </w:rPr>
+              <w:t>@codigo</w:t>
+            </w:r>
+          </w:p>
+        </w:tc>
+      </w:tr>
+      <w:tr>
+        <w:tc>
+          <w:tcPr>
+            <w:tcW w:type="dxa" w:w="15138"/>
+            <w:shd w:val="clear" w:color="auto" w:fill="FFE6CC"/>
+            <w:tcBorders>
+              <w:top w:val="single" w:sz="4" w:space="0" w:color="CCCCCC"/>
+              <w:left w:val="single" w:sz="4" w:space="0" w:color="CCCCCC"/>
+              <w:bottom w:val="single" w:sz="4" w:space="0" w:color="CCCCCC"/>
+              <w:right w:val="single" w:sz="4" w:space="0" w:color="CCCCCC"/>
+            </w:tcBorders>
+            <w:vAlign w:val="top"/>
+          </w:tcPr>
+          <w:p>
+            <w:pPr>
+              <w:spacing w:before="80" w:after="80"/>
+              <w:ind w:left="120" w:right="120"/>
+            </w:pPr>
+            <w:r>
+              <w:rPr>
+                <w:rFonts w:ascii="Calibri" w:hAnsi="Calibri"/>
+                <w:b w:val="0"/>
+                <w:i w:val="0"/>
+                <w:color w:val="222222"/>
+                <w:sz w:val="18"/>
+              </w:rPr>
+              <w:t>O @codigo (art.º 5.º) refere 'parâmetros de bem-estar animal' genericamente, sem adotar formalmente a nomenclatura dos 5 domínios OMSA nem a sua sistematização explícita.</w:t>
+            </w:r>
+          </w:p>
+        </w:tc>
+      </w:tr>
+      <w:tr>
+        <w:tc>
+          <w:tcPr>
+            <w:tcW w:type="dxa" w:w="15138"/>
+            <w:shd w:val="clear" w:color="auto" w:fill="1E5631"/>
+            <w:tcBorders>
+              <w:top w:val="single" w:sz="4" w:space="0" w:color="1E5631"/>
+              <w:left w:val="single" w:sz="4" w:space="0" w:color="1E5631"/>
+              <w:bottom w:val="single" w:sz="4" w:space="0" w:color="1E5631"/>
+              <w:right w:val="single" w:sz="4" w:space="0" w:color="1E5631"/>
+            </w:tcBorders>
+          </w:tcPr>
+          <w:p>
+            <w:pPr>
+              <w:spacing w:before="80" w:after="0"/>
+              <w:ind w:left="120"/>
+            </w:pPr>
+            <w:r>
+              <w:rPr>
+                <w:rFonts w:ascii="Calibri" w:hAnsi="Calibri"/>
+                <w:b/>
+                <w:i w:val="0"/>
+                <w:color w:val="FFFFFF"/>
+                <w:sz w:val="17"/>
+              </w:rPr>
+              <w:t>@rgbeac</w:t>
+            </w:r>
+          </w:p>
+        </w:tc>
+      </w:tr>
+      <w:tr>
+        <w:tc>
+          <w:tcPr>
+            <w:tcW w:type="dxa" w:w="15138"/>
+            <w:shd w:val="clear" w:color="auto" w:fill="D5E8D4"/>
+            <w:tcBorders>
+              <w:top w:val="single" w:sz="4" w:space="0" w:color="CCCCCC"/>
+              <w:left w:val="single" w:sz="4" w:space="0" w:color="CCCCCC"/>
+              <w:bottom w:val="single" w:sz="4" w:space="0" w:color="CCCCCC"/>
+              <w:right w:val="single" w:sz="4" w:space="0" w:color="CCCCCC"/>
+            </w:tcBorders>
+            <w:vAlign w:val="top"/>
+          </w:tcPr>
+          <w:p>
+            <w:pPr>
+              <w:spacing w:before="80" w:after="80"/>
+              <w:ind w:left="120" w:right="120"/>
+            </w:pPr>
+            <w:r>
+              <w:rPr>
+                <w:rFonts w:ascii="Calibri" w:hAnsi="Calibri"/>
+                <w:b w:val="0"/>
+                <w:i w:val="0"/>
+                <w:color w:val="222222"/>
+                <w:sz w:val="18"/>
+              </w:rPr>
+              <w:t>O @rgbeac (art.º 10.º, n.º 1, al. a)) articula obrigações equivalentes ao nível do detentor de forma descritiva, sem sistematização nos 5 domínios nem referência ao quadro OMSA.</w:t>
+            </w:r>
+          </w:p>
+        </w:tc>
+      </w:tr>
+      <w:tr>
+        <w:tc>
+          <w:tcPr>
+            <w:tcW w:type="dxa" w:w="15138"/>
+            <w:shd w:val="clear" w:color="auto" w:fill="5D2A8A"/>
+            <w:tcBorders>
+              <w:top w:val="single" w:sz="4" w:space="0" w:color="5D2A8A"/>
+              <w:left w:val="single" w:sz="4" w:space="0" w:color="5D2A8A"/>
+              <w:bottom w:val="single" w:sz="4" w:space="0" w:color="5D2A8A"/>
+              <w:right w:val="single" w:sz="4" w:space="0" w:color="5D2A8A"/>
+            </w:tcBorders>
+          </w:tcPr>
+          <w:p>
+            <w:pPr>
+              <w:spacing w:before="80" w:after="0"/>
+              <w:ind w:left="120"/>
+            </w:pPr>
+            <w:r>
+              <w:rPr>
+                <w:rFonts w:ascii="Calibri" w:hAnsi="Calibri"/>
+                <w:b/>
+                <w:i w:val="0"/>
+                <w:color w:val="FFFFFF"/>
+                <w:sz w:val="17"/>
+              </w:rPr>
+              <w:t>Sumário / Proposta</w:t>
+            </w:r>
+          </w:p>
+        </w:tc>
+      </w:tr>
+      <w:tr>
+        <w:tc>
+          <w:tcPr>
+            <w:tcW w:type="dxa" w:w="15138"/>
             <w:shd w:val="clear" w:color="auto" w:fill="EAD7F7"/>
             <w:tcBorders>
               <w:top w:val="single" w:sz="4" w:space="0" w:color="CCCCCC"/>
@@ -3512,17 +4830,17 @@
           <w:p>
             <w:pPr>
               <w:spacing w:before="80" w:after="80"/>
-              <w:ind w:left="80" w:right="80"/>
+              <w:ind w:left="120" w:right="120"/>
             </w:pPr>
             <w:r>
               <w:rPr>
                 <w:rFonts w:ascii="Calibri" w:hAnsi="Calibri"/>
-                <w:b/>
+                <w:b w:val="0"/>
                 <w:i w:val="0"/>
-                <w:color w:val="3D1A6E"/>
-                <w:sz w:val="19"/>
+                <w:color w:val="222222"/>
+                <w:sz w:val="18"/>
               </w:rPr>
-              <w:t>O @regulamento enuncia explicitamente 5 domínios de bem-estar — nutrição, ambiente, saúde, comportamento e estado mental — como obrigação vinculativa dos operadores de estabelecimentos. A @legislacao (DL n.º 276/2001, art.ºs 7.º e 9.º) e o @codigo (art.º 5.º) consagram os mesmos parâmetros de bem-estar, mas sem formulação sistemática nos 5 domínios: o @codigo refere 'parâmetros de bem-estar animal' genericamente; o DL n.º 276/2001 desenvolve cada parâmetro em artigos separados (alojamento, alimentação, ambiente) mas sem os denominar domínios. O @rgbeac (art.º 10.º, n.º 1, al. a)) articula obrigações equivalentes ao nível do detentor mas de forma descritiva, não sistematizada nos 5 domínios. Nenhum diploma nacional adota formalmente a nomenclatura dos 5 domínios OMSA como o @regulamento.</w:t>
+              <w:t>Alinhamento substancial de conteúdo; sem necessidade de alteração imediata. Recomenda-se a adoção formal dos 5 domínios OMSA como referencial estruturante em futura revisão legislativa ou em normas de orientação técnica da DGAV.</w:t>
             </w:r>
           </w:p>
         </w:tc>
@@ -3754,8 +5072,8 @@
           </w:tcPr>
           <w:p>
             <w:pPr>
-              <w:spacing w:before="80" w:after="80"/>
-              <w:ind w:left="80" w:right="80"/>
+              <w:spacing w:after="0" w:before="80"/>
+              <w:ind w:right="80" w:left="80" w:firstLine="0"/>
             </w:pPr>
             <w:r>
               <w:rPr>
@@ -3770,8 +5088,8 @@
           </w:p>
           <w:p>
             <w:pPr>
-              <w:spacing w:before="120" w:after="0"/>
-              <w:ind w:left="80"/>
+              <w:spacing w:after="0" w:before="140"/>
+              <w:ind w:right="80" w:left="80" w:firstLine="0"/>
             </w:pPr>
             <w:r>
               <w:rPr>
@@ -3786,8 +5104,8 @@
           </w:p>
           <w:p>
             <w:pPr>
-              <w:spacing w:before="120" w:after="0"/>
-              <w:ind w:left="80"/>
+              <w:spacing w:after="0" w:before="140"/>
+              <w:ind w:right="80" w:left="80" w:firstLine="0"/>
             </w:pPr>
             <w:r>
               <w:rPr>
@@ -3798,9 +5116,37 @@
                 <w:sz w:val="19"/>
               </w:rPr>
               <w:t>São proibidos na gestão da reprodução de cães e gatos:</w:t>
-              <w:br/>
+            </w:r>
+          </w:p>
+          <w:p>
+            <w:pPr>
+              <w:spacing w:after="0" w:before="20"/>
+              <w:ind w:right="80" w:left="360" w:hanging="280"/>
+            </w:pPr>
+            <w:r>
+              <w:rPr>
+                <w:rFonts w:ascii="Calibri" w:hAnsi="Calibri"/>
+                <w:b w:val="0"/>
+                <w:i/>
+                <w:color w:val="222222"/>
+                <w:sz w:val="19"/>
+              </w:rPr>
               <w:t>(a) o cruzamento entre progenitores e descendentes, entre irmãos, entre meios-irmãos ou entre avós e netos, exceto com aprovação da autoridade competente por razão de necessidade específica de preservação de raças locais com reserva genética limitada;</w:t>
-              <w:br/>
+            </w:r>
+          </w:p>
+          <w:p>
+            <w:pPr>
+              <w:spacing w:after="0" w:before="20"/>
+              <w:ind w:right="80" w:left="360" w:hanging="280"/>
+            </w:pPr>
+            <w:r>
+              <w:rPr>
+                <w:rFonts w:ascii="Calibri" w:hAnsi="Calibri"/>
+                <w:b w:val="0"/>
+                <w:i/>
+                <w:color w:val="222222"/>
+                <w:sz w:val="19"/>
+              </w:rPr>
               <w:t>(b) o cruzamento para produção de híbridos.</w:t>
             </w:r>
           </w:p>
@@ -3865,8 +5211,8 @@
           </w:tcPr>
           <w:p>
             <w:pPr>
-              <w:spacing w:before="80" w:after="80"/>
-              <w:ind w:left="80" w:right="80"/>
+              <w:spacing w:after="0" w:before="80"/>
+              <w:ind w:right="80" w:left="80" w:firstLine="0"/>
             </w:pPr>
             <w:r>
               <w:rPr>
@@ -3881,8 +5227,8 @@
           </w:p>
           <w:p>
             <w:pPr>
-              <w:spacing w:before="120" w:after="0"/>
-              <w:ind w:left="80"/>
+              <w:spacing w:after="0" w:before="140"/>
+              <w:ind w:right="80" w:left="80" w:firstLine="0"/>
             </w:pPr>
             <w:r>
               <w:rPr>
@@ -3897,8 +5243,8 @@
           </w:p>
           <w:p>
             <w:pPr>
-              <w:spacing w:before="120" w:after="0"/>
-              <w:ind w:left="80"/>
+              <w:spacing w:after="0" w:before="140"/>
+              <w:ind w:right="80" w:left="80" w:firstLine="0"/>
             </w:pPr>
             <w:r>
               <w:rPr>
@@ -3909,9 +5255,37 @@
                 <w:sz w:val="19"/>
               </w:rPr>
               <w:t>The following shall be prohibited in the management of the reproduction of dogs and cats:</w:t>
-              <w:br/>
+            </w:r>
+          </w:p>
+          <w:p>
+            <w:pPr>
+              <w:spacing w:after="0" w:before="20"/>
+              <w:ind w:right="80" w:left="360" w:hanging="280"/>
+            </w:pPr>
+            <w:r>
+              <w:rPr>
+                <w:rFonts w:ascii="Calibri" w:hAnsi="Calibri"/>
+                <w:b w:val="0"/>
+                <w:i w:val="0"/>
+                <w:color w:val="222222"/>
+                <w:sz w:val="19"/>
+              </w:rPr>
               <w:t>(a) the breeding between parents and offspring, between siblings, between half-siblings or between grandparents and grandchildren, unless approved by the competent authority based on a specific need to preserve local breeds with a limited genetic pool;</w:t>
-              <w:br/>
+            </w:r>
+          </w:p>
+          <w:p>
+            <w:pPr>
+              <w:spacing w:after="0" w:before="20"/>
+              <w:ind w:right="80" w:left="360" w:hanging="280"/>
+            </w:pPr>
+            <w:r>
+              <w:rPr>
+                <w:rFonts w:ascii="Calibri" w:hAnsi="Calibri"/>
+                <w:b w:val="0"/>
+                <w:i w:val="0"/>
+                <w:color w:val="222222"/>
+                <w:sz w:val="19"/>
+              </w:rPr>
               <w:t>(b) the breeding to produce hybrids.</w:t>
             </w:r>
           </w:p>
@@ -4034,7 +5408,7 @@
           </w:tcPr>
           <w:p>
             <w:pPr>
-              <w:spacing w:before="80" w:after="80"/>
+              <w:spacing w:before="80" w:after="40"/>
               <w:ind w:left="80" w:right="80"/>
             </w:pPr>
             <w:r>
@@ -4046,8 +5420,13 @@
                 <w:sz w:val="16"/>
               </w:rPr>
               <w:t>n.ºs 1 e 2 do art.º 34.º do RGBEAC (proposta, jun. 2025)</w:t>
-              <w:br/>
             </w:r>
+          </w:p>
+          <w:p>
+            <w:pPr>
+              <w:spacing w:after="0" w:before="140"/>
+              <w:ind w:right="80" w:left="80" w:firstLine="0"/>
+            </w:pPr>
             <w:r>
               <w:rPr>
                 <w:rFonts w:ascii="Calibri" w:hAnsi="Calibri"/>
@@ -4061,8 +5440,8 @@
           </w:p>
           <w:p>
             <w:pPr>
-              <w:spacing w:before="120" w:after="0"/>
-              <w:ind w:left="80"/>
+              <w:spacing w:after="0" w:before="140"/>
+              <w:ind w:right="80" w:left="80" w:firstLine="0"/>
             </w:pPr>
             <w:r>
               <w:rPr>
@@ -4090,7 +5469,7 @@
           </w:tcPr>
           <w:p>
             <w:pPr>
-              <w:spacing w:before="80" w:after="80"/>
+              <w:spacing w:before="80" w:after="40"/>
               <w:ind w:left="80" w:right="80"/>
             </w:pPr>
             <w:r>
@@ -4102,8 +5481,13 @@
                 <w:sz w:val="16"/>
               </w:rPr>
               <w:t>n.º 2, als. a), b) e c) do art.º 8.º do Código do Animal (DL n.º 214/2013)</w:t>
-              <w:br/>
             </w:r>
+          </w:p>
+          <w:p>
+            <w:pPr>
+              <w:spacing w:after="0" w:before="140"/>
+              <w:ind w:right="80" w:left="80" w:firstLine="0"/>
+            </w:pPr>
             <w:r>
               <w:rPr>
                 <w:rFonts w:ascii="Calibri" w:hAnsi="Calibri"/>
@@ -4117,8 +5501,8 @@
           </w:p>
           <w:p>
             <w:pPr>
-              <w:spacing w:before="120" w:after="0"/>
-              <w:ind w:left="80"/>
+              <w:spacing w:after="0" w:before="140"/>
+              <w:ind w:right="80" w:left="360" w:hanging="280"/>
             </w:pPr>
             <w:r>
               <w:rPr>
@@ -4133,8 +5517,8 @@
           </w:p>
           <w:p>
             <w:pPr>
-              <w:spacing w:before="120" w:after="0"/>
-              <w:ind w:left="80"/>
+              <w:spacing w:after="0" w:before="140"/>
+              <w:ind w:right="80" w:left="360" w:hanging="280"/>
             </w:pPr>
             <w:r>
               <w:rPr>
@@ -4149,8 +5533,8 @@
           </w:p>
           <w:p>
             <w:pPr>
-              <w:spacing w:before="120" w:after="0"/>
-              <w:ind w:left="80"/>
+              <w:spacing w:after="0" w:before="140"/>
+              <w:ind w:right="80" w:left="360" w:hanging="280"/>
             </w:pPr>
             <w:r>
               <w:rPr>
@@ -4178,7 +5562,7 @@
           </w:tcPr>
           <w:p>
             <w:pPr>
-              <w:spacing w:before="80" w:after="80"/>
+              <w:spacing w:before="80" w:after="40"/>
               <w:ind w:left="80" w:right="80"/>
             </w:pPr>
             <w:r>
@@ -4190,8 +5574,13 @@
                 <w:sz w:val="16"/>
               </w:rPr>
               <w:t>art.º 17.º e n.º 1 do art.º 18.º do DL n.º 276/2001, de 17 de outubro</w:t>
-              <w:br/>
             </w:r>
+          </w:p>
+          <w:p>
+            <w:pPr>
+              <w:spacing w:after="0" w:before="140"/>
+              <w:ind w:right="80" w:left="80" w:firstLine="0"/>
+            </w:pPr>
             <w:r>
               <w:rPr>
                 <w:rFonts w:ascii="Calibri" w:hAnsi="Calibri"/>
@@ -4205,8 +5594,8 @@
           </w:p>
           <w:p>
             <w:pPr>
-              <w:spacing w:before="120" w:after="0"/>
-              <w:ind w:left="80"/>
+              <w:spacing w:after="0" w:before="140"/>
+              <w:ind w:right="80" w:left="80" w:firstLine="0"/>
             </w:pPr>
             <w:r>
               <w:rPr>
@@ -4269,6 +5658,219 @@
         <w:tc>
           <w:tcPr>
             <w:tcW w:type="dxa" w:w="15138"/>
+            <w:shd w:val="clear" w:color="auto" w:fill="006064"/>
+            <w:tcBorders>
+              <w:top w:val="single" w:sz="4" w:space="0" w:color="006064"/>
+              <w:left w:val="single" w:sz="4" w:space="0" w:color="006064"/>
+              <w:bottom w:val="single" w:sz="4" w:space="0" w:color="006064"/>
+              <w:right w:val="single" w:sz="4" w:space="0" w:color="006064"/>
+            </w:tcBorders>
+          </w:tcPr>
+          <w:p>
+            <w:pPr>
+              <w:spacing w:before="80" w:after="0"/>
+              <w:ind w:left="120"/>
+            </w:pPr>
+            <w:r>
+              <w:rPr>
+                <w:rFonts w:ascii="Calibri" w:hAnsi="Calibri"/>
+                <w:b/>
+                <w:i w:val="0"/>
+                <w:color w:val="FFFFFF"/>
+                <w:sz w:val="17"/>
+              </w:rPr>
+              <w:t>@legislacao</w:t>
+            </w:r>
+          </w:p>
+        </w:tc>
+      </w:tr>
+      <w:tr>
+        <w:tc>
+          <w:tcPr>
+            <w:tcW w:type="dxa" w:w="15138"/>
+            <w:shd w:val="clear" w:color="auto" w:fill="E0F7FA"/>
+            <w:tcBorders>
+              <w:top w:val="single" w:sz="4" w:space="0" w:color="CCCCCC"/>
+              <w:left w:val="single" w:sz="4" w:space="0" w:color="CCCCCC"/>
+              <w:bottom w:val="single" w:sz="4" w:space="0" w:color="CCCCCC"/>
+              <w:right w:val="single" w:sz="4" w:space="0" w:color="CCCCCC"/>
+            </w:tcBorders>
+            <w:vAlign w:val="top"/>
+          </w:tcPr>
+          <w:p>
+            <w:pPr>
+              <w:spacing w:before="80" w:after="80"/>
+              <w:ind w:left="120" w:right="120"/>
+            </w:pPr>
+            <w:r>
+              <w:rPr>
+                <w:rFonts w:ascii="Calibri" w:hAnsi="Calibri"/>
+                <w:b w:val="0"/>
+                <w:i w:val="0"/>
+                <w:color w:val="222222"/>
+                <w:sz w:val="18"/>
+              </w:rPr>
+              <w:t>O DL n.º 276/2001 (art.ºs 17.º e 18.º) exige intervenção veterinária em cirurgias e documentação para amputações, mas não prevê qualquer restrição à reprodução por traços conformacionais excessivos nem proibição de consanguinidade próxima ou hibridação.</w:t>
+            </w:r>
+          </w:p>
+        </w:tc>
+      </w:tr>
+      <w:tr>
+        <w:tc>
+          <w:tcPr>
+            <w:tcW w:type="dxa" w:w="15138"/>
+            <w:shd w:val="clear" w:color="auto" w:fill="7E4C00"/>
+            <w:tcBorders>
+              <w:top w:val="single" w:sz="4" w:space="0" w:color="7E4C00"/>
+              <w:left w:val="single" w:sz="4" w:space="0" w:color="7E4C00"/>
+              <w:bottom w:val="single" w:sz="4" w:space="0" w:color="7E4C00"/>
+              <w:right w:val="single" w:sz="4" w:space="0" w:color="7E4C00"/>
+            </w:tcBorders>
+          </w:tcPr>
+          <w:p>
+            <w:pPr>
+              <w:spacing w:before="80" w:after="0"/>
+              <w:ind w:left="120"/>
+            </w:pPr>
+            <w:r>
+              <w:rPr>
+                <w:rFonts w:ascii="Calibri" w:hAnsi="Calibri"/>
+                <w:b/>
+                <w:i w:val="0"/>
+                <w:color w:val="FFFFFF"/>
+                <w:sz w:val="17"/>
+              </w:rPr>
+              <w:t>@codigo</w:t>
+            </w:r>
+          </w:p>
+        </w:tc>
+      </w:tr>
+      <w:tr>
+        <w:tc>
+          <w:tcPr>
+            <w:tcW w:type="dxa" w:w="15138"/>
+            <w:shd w:val="clear" w:color="auto" w:fill="FFE6CC"/>
+            <w:tcBorders>
+              <w:top w:val="single" w:sz="4" w:space="0" w:color="CCCCCC"/>
+              <w:left w:val="single" w:sz="4" w:space="0" w:color="CCCCCC"/>
+              <w:bottom w:val="single" w:sz="4" w:space="0" w:color="CCCCCC"/>
+              <w:right w:val="single" w:sz="4" w:space="0" w:color="CCCCCC"/>
+            </w:tcBorders>
+            <w:vAlign w:val="top"/>
+          </w:tcPr>
+          <w:p>
+            <w:pPr>
+              <w:spacing w:before="80" w:after="80"/>
+              <w:ind w:left="120" w:right="120"/>
+            </w:pPr>
+            <w:r>
+              <w:rPr>
+                <w:rFonts w:ascii="Calibri" w:hAnsi="Calibri"/>
+                <w:b w:val="0"/>
+                <w:i w:val="0"/>
+                <w:color w:val="222222"/>
+                <w:sz w:val="18"/>
+              </w:rPr>
+              <w:t>O @codigo (art.º 8.º, n.º 2) exclui da reprodução animais com defeitos genéticos e malformações (displasia, rim poliquístico) e proíbe cios sucessivos, mas não prevê o conceito de traços conformacionais excessivos nem a proibição de consanguinidade.</w:t>
+            </w:r>
+          </w:p>
+        </w:tc>
+      </w:tr>
+      <w:tr>
+        <w:tc>
+          <w:tcPr>
+            <w:tcW w:type="dxa" w:w="15138"/>
+            <w:shd w:val="clear" w:color="auto" w:fill="1E5631"/>
+            <w:tcBorders>
+              <w:top w:val="single" w:sz="4" w:space="0" w:color="1E5631"/>
+              <w:left w:val="single" w:sz="4" w:space="0" w:color="1E5631"/>
+              <w:bottom w:val="single" w:sz="4" w:space="0" w:color="1E5631"/>
+              <w:right w:val="single" w:sz="4" w:space="0" w:color="1E5631"/>
+            </w:tcBorders>
+          </w:tcPr>
+          <w:p>
+            <w:pPr>
+              <w:spacing w:before="80" w:after="0"/>
+              <w:ind w:left="120"/>
+            </w:pPr>
+            <w:r>
+              <w:rPr>
+                <w:rFonts w:ascii="Calibri" w:hAnsi="Calibri"/>
+                <w:b/>
+                <w:i w:val="0"/>
+                <w:color w:val="FFFFFF"/>
+                <w:sz w:val="17"/>
+              </w:rPr>
+              <w:t>@rgbeac</w:t>
+            </w:r>
+          </w:p>
+        </w:tc>
+      </w:tr>
+      <w:tr>
+        <w:tc>
+          <w:tcPr>
+            <w:tcW w:type="dxa" w:w="15138"/>
+            <w:shd w:val="clear" w:color="auto" w:fill="D5E8D4"/>
+            <w:tcBorders>
+              <w:top w:val="single" w:sz="4" w:space="0" w:color="CCCCCC"/>
+              <w:left w:val="single" w:sz="4" w:space="0" w:color="CCCCCC"/>
+              <w:bottom w:val="single" w:sz="4" w:space="0" w:color="CCCCCC"/>
+              <w:right w:val="single" w:sz="4" w:space="0" w:color="CCCCCC"/>
+            </w:tcBorders>
+            <w:vAlign w:val="top"/>
+          </w:tcPr>
+          <w:p>
+            <w:pPr>
+              <w:spacing w:before="80" w:after="80"/>
+              <w:ind w:left="120" w:right="120"/>
+            </w:pPr>
+            <w:r>
+              <w:rPr>
+                <w:rFonts w:ascii="Calibri" w:hAnsi="Calibri"/>
+                <w:b w:val="0"/>
+                <w:i w:val="0"/>
+                <w:color w:val="222222"/>
+                <w:sz w:val="18"/>
+              </w:rPr>
+              <w:t>O @rgbeac (art.º 34.º) proíbe intervenções cirúrgicas de modificação da aparência, mas não contém qualquer norma sobre estratégia genética de criação, conformação excessiva ou consanguinidade.</w:t>
+            </w:r>
+          </w:p>
+        </w:tc>
+      </w:tr>
+      <w:tr>
+        <w:tc>
+          <w:tcPr>
+            <w:tcW w:type="dxa" w:w="15138"/>
+            <w:shd w:val="clear" w:color="auto" w:fill="5D2A8A"/>
+            <w:tcBorders>
+              <w:top w:val="single" w:sz="4" w:space="0" w:color="5D2A8A"/>
+              <w:left w:val="single" w:sz="4" w:space="0" w:color="5D2A8A"/>
+              <w:bottom w:val="single" w:sz="4" w:space="0" w:color="5D2A8A"/>
+              <w:right w:val="single" w:sz="4" w:space="0" w:color="5D2A8A"/>
+            </w:tcBorders>
+          </w:tcPr>
+          <w:p>
+            <w:pPr>
+              <w:spacing w:before="80" w:after="0"/>
+              <w:ind w:left="120"/>
+            </w:pPr>
+            <w:r>
+              <w:rPr>
+                <w:rFonts w:ascii="Calibri" w:hAnsi="Calibri"/>
+                <w:b/>
+                <w:i w:val="0"/>
+                <w:color w:val="FFFFFF"/>
+                <w:sz w:val="17"/>
+              </w:rPr>
+              <w:t>Sumário / Proposta</w:t>
+            </w:r>
+          </w:p>
+        </w:tc>
+      </w:tr>
+      <w:tr>
+        <w:tc>
+          <w:tcPr>
+            <w:tcW w:type="dxa" w:w="15138"/>
             <w:shd w:val="clear" w:color="auto" w:fill="EAD7F7"/>
             <w:tcBorders>
               <w:top w:val="single" w:sz="4" w:space="0" w:color="CCCCCC"/>
@@ -4281,17 +5883,17 @@
           <w:p>
             <w:pPr>
               <w:spacing w:before="80" w:after="80"/>
-              <w:ind w:left="80" w:right="80"/>
+              <w:ind w:left="120" w:right="120"/>
             </w:pPr>
             <w:r>
               <w:rPr>
                 <w:rFonts w:ascii="Calibri" w:hAnsi="Calibri"/>
-                <w:b/>
+                <w:b w:val="0"/>
                 <w:i w:val="0"/>
-                <w:color w:val="3D1A6E"/>
-                <w:sz w:val="19"/>
+                <w:color w:val="222222"/>
+                <w:sz w:val="18"/>
               </w:rPr>
-              <w:t>O @regulamento proíbe traços conformacionais excessivos e impõe consulta veterinária prévia ao acasalamento de animais potencialmente afetados, além de proibir consanguinidade próxima (pais/filhos, irmãos, avós/netos) e produção de híbridos. Estas exigências são inteiramente novas no direito nacional: a @legislacao (DL n.º 276/2001, art.ºs 17.º e 18.º) limita-se a exigir intervenção veterinária em cirurgias e documentação para amputações, sem abordar conformação ou consanguinidade. O @codigo (art.º 8.º, n.º 2) exclui da reprodução animais com defeitos genéticos e malformações, e proíbe acasalamento em cios sucessivos, mas não prevê o conceito de traços conformacionais excessivos nem proíbe consanguinidade. O @rgbeac (art.º 34.º) proíbe apenas intervenções cirúrgicas de modificação da aparência, sem norma sobre estratégia genética. Lacuna normativa transversal a toda a legislação nacional quanto ao núcleo central do art.º 6.a do @regulamento.</w:t>
+              <w:t>Lacuna normativa transversal. Necessidade de criar norma específica que: (1) defina traços conformacionais excessivos (a regular por ato delegado europeu até 2030); (2) proíba consanguinidade próxima (pais/filhos, irmãos, avós/netos); (3) proíba a produção de híbridos; (4) imponha consulta veterinária prévia ao acasalamento de animais potencialmente afetados.</w:t>
             </w:r>
           </w:p>
         </w:tc>
@@ -4523,8 +6125,8 @@
           </w:tcPr>
           <w:p>
             <w:pPr>
-              <w:spacing w:before="80" w:after="80"/>
-              <w:ind w:left="80" w:right="80"/>
+              <w:spacing w:after="0" w:before="80"/>
+              <w:ind w:right="80" w:left="80" w:firstLine="0"/>
             </w:pPr>
             <w:r>
               <w:rPr>
@@ -4539,8 +6141,8 @@
           </w:p>
           <w:p>
             <w:pPr>
-              <w:spacing w:before="120" w:after="0"/>
-              <w:ind w:left="80"/>
+              <w:spacing w:after="0" w:before="140"/>
+              <w:ind w:right="80" w:left="360" w:hanging="280"/>
             </w:pPr>
             <w:r>
               <w:rPr>
@@ -4555,8 +6157,8 @@
           </w:p>
           <w:p>
             <w:pPr>
-              <w:spacing w:before="120" w:after="0"/>
-              <w:ind w:left="80"/>
+              <w:spacing w:after="0" w:before="140"/>
+              <w:ind w:right="80" w:left="360" w:hanging="280"/>
             </w:pPr>
             <w:r>
               <w:rPr>
@@ -4571,8 +6173,8 @@
           </w:p>
           <w:p>
             <w:pPr>
-              <w:spacing w:before="120" w:after="0"/>
-              <w:ind w:left="80"/>
+              <w:spacing w:after="0" w:before="140"/>
+              <w:ind w:right="80" w:left="360" w:hanging="280"/>
             </w:pPr>
             <w:r>
               <w:rPr>
@@ -4587,8 +6189,8 @@
           </w:p>
           <w:p>
             <w:pPr>
-              <w:spacing w:before="120" w:after="0"/>
-              <w:ind w:left="80"/>
+              <w:spacing w:after="0" w:before="140"/>
+              <w:ind w:right="80" w:left="360" w:hanging="280"/>
             </w:pPr>
             <w:r>
               <w:rPr>
@@ -4603,8 +6205,8 @@
           </w:p>
           <w:p>
             <w:pPr>
-              <w:spacing w:before="120" w:after="0"/>
-              <w:ind w:left="80"/>
+              <w:spacing w:after="0" w:before="140"/>
+              <w:ind w:right="80" w:left="80" w:firstLine="0"/>
             </w:pPr>
             <w:r>
               <w:rPr>
@@ -4615,11 +6217,53 @@
                 <w:sz w:val="19"/>
               </w:rPr>
               <w:t>Os operadores de estabelecimentos de criação devem adicionalmente assegurar que:</w:t>
-              <w:br/>
+            </w:r>
+          </w:p>
+          <w:p>
+            <w:pPr>
+              <w:spacing w:after="0" w:before="20"/>
+              <w:ind w:right="80" w:left="360" w:hanging="280"/>
+            </w:pPr>
+            <w:r>
+              <w:rPr>
+                <w:rFonts w:ascii="Calibri" w:hAnsi="Calibri"/>
+                <w:b w:val="0"/>
+                <w:i/>
+                <w:color w:val="222222"/>
+                <w:sz w:val="19"/>
+              </w:rPr>
               <w:t>(-a) as cadelas ou gatas só são reproduzidas se tiverem atingido a idade mínima e maturidade esquelética nos termos do Anexo I, e não apresentem doença diagnosticada, sinais clínicos ou condições físicas que possam impactar negativamente a gestação e o bem-estar;</w:t>
-              <w:br/>
+            </w:r>
+          </w:p>
+          <w:p>
+            <w:pPr>
+              <w:spacing w:after="0" w:before="20"/>
+              <w:ind w:right="80" w:left="360" w:hanging="280"/>
+            </w:pPr>
+            <w:r>
+              <w:rPr>
+                <w:rFonts w:ascii="Calibri" w:hAnsi="Calibri"/>
+                <w:b w:val="0"/>
+                <w:i/>
+                <w:color w:val="222222"/>
+                <w:sz w:val="19"/>
+              </w:rPr>
               <w:t>(-b) a frequência de gestações com ninhadas respeita o máximo fixado no Anexo I;</w:t>
-              <w:br/>
+            </w:r>
+          </w:p>
+          <w:p>
+            <w:pPr>
+              <w:spacing w:after="0" w:before="20"/>
+              <w:ind w:right="80" w:left="360" w:hanging="280"/>
+            </w:pPr>
+            <w:r>
+              <w:rPr>
+                <w:rFonts w:ascii="Calibri" w:hAnsi="Calibri"/>
+                <w:b w:val="0"/>
+                <w:i/>
+                <w:color w:val="222222"/>
+                <w:sz w:val="19"/>
+              </w:rPr>
               <w:t>(-c) as gatas a lactar não são acasaladas nem inseminadas.</w:t>
             </w:r>
           </w:p>
@@ -4684,8 +6328,8 @@
           </w:tcPr>
           <w:p>
             <w:pPr>
-              <w:spacing w:before="80" w:after="80"/>
-              <w:ind w:left="80" w:right="80"/>
+              <w:spacing w:after="0" w:before="80"/>
+              <w:ind w:right="80" w:left="80" w:firstLine="0"/>
             </w:pPr>
             <w:r>
               <w:rPr>
@@ -4700,8 +6344,8 @@
           </w:p>
           <w:p>
             <w:pPr>
-              <w:spacing w:before="120" w:after="0"/>
-              <w:ind w:left="80"/>
+              <w:spacing w:after="0" w:before="140"/>
+              <w:ind w:right="80" w:left="360" w:hanging="280"/>
             </w:pPr>
             <w:r>
               <w:rPr>
@@ -4716,8 +6360,8 @@
           </w:p>
           <w:p>
             <w:pPr>
-              <w:spacing w:before="120" w:after="0"/>
-              <w:ind w:left="80"/>
+              <w:spacing w:after="0" w:before="140"/>
+              <w:ind w:right="80" w:left="360" w:hanging="280"/>
             </w:pPr>
             <w:r>
               <w:rPr>
@@ -4732,8 +6376,8 @@
           </w:p>
           <w:p>
             <w:pPr>
-              <w:spacing w:before="120" w:after="0"/>
-              <w:ind w:left="80"/>
+              <w:spacing w:after="0" w:before="140"/>
+              <w:ind w:right="80" w:left="360" w:hanging="280"/>
             </w:pPr>
             <w:r>
               <w:rPr>
@@ -4748,8 +6392,8 @@
           </w:p>
           <w:p>
             <w:pPr>
-              <w:spacing w:before="120" w:after="0"/>
-              <w:ind w:left="80"/>
+              <w:spacing w:after="0" w:before="140"/>
+              <w:ind w:right="80" w:left="360" w:hanging="280"/>
             </w:pPr>
             <w:r>
               <w:rPr>
@@ -4764,8 +6408,8 @@
           </w:p>
           <w:p>
             <w:pPr>
-              <w:spacing w:before="120" w:after="0"/>
-              <w:ind w:left="80"/>
+              <w:spacing w:after="0" w:before="140"/>
+              <w:ind w:right="80" w:left="80" w:firstLine="0"/>
             </w:pPr>
             <w:r>
               <w:rPr>
@@ -4776,11 +6420,53 @@
                 <w:sz w:val="19"/>
               </w:rPr>
               <w:t>Operators of breeding establishments shall additionally ensure that:</w:t>
-              <w:br/>
+            </w:r>
+          </w:p>
+          <w:p>
+            <w:pPr>
+              <w:spacing w:after="0" w:before="20"/>
+              <w:ind w:right="80" w:left="360" w:hanging="280"/>
+            </w:pPr>
+            <w:r>
+              <w:rPr>
+                <w:rFonts w:ascii="Calibri" w:hAnsi="Calibri"/>
+                <w:b w:val="0"/>
+                <w:i w:val="0"/>
+                <w:color w:val="222222"/>
+                <w:sz w:val="19"/>
+              </w:rPr>
               <w:t>(-a) bitches or queens are only bred if they have reached a minimum age and skeletal maturity in accordance with point 3 of Annex I, and they have no diagnosed disease, clinical sign of diseases or physical conditions which could negatively impact their pregnancy and welfare;</w:t>
-              <w:br/>
+            </w:r>
+          </w:p>
+          <w:p>
+            <w:pPr>
+              <w:spacing w:after="0" w:before="20"/>
+              <w:ind w:right="80" w:left="360" w:hanging="280"/>
+            </w:pPr>
+            <w:r>
+              <w:rPr>
+                <w:rFonts w:ascii="Calibri" w:hAnsi="Calibri"/>
+                <w:b w:val="0"/>
+                <w:i w:val="0"/>
+                <w:color w:val="222222"/>
+                <w:sz w:val="19"/>
+              </w:rPr>
               <w:t>(-b) litter-giving pregnancies of bitches or queens follows a maximum frequency in accordance with point 3 of Annex I;</w:t>
-              <w:br/>
+            </w:r>
+          </w:p>
+          <w:p>
+            <w:pPr>
+              <w:spacing w:after="0" w:before="20"/>
+              <w:ind w:right="80" w:left="360" w:hanging="280"/>
+            </w:pPr>
+            <w:r>
+              <w:rPr>
+                <w:rFonts w:ascii="Calibri" w:hAnsi="Calibri"/>
+                <w:b w:val="0"/>
+                <w:i w:val="0"/>
+                <w:color w:val="222222"/>
+                <w:sz w:val="19"/>
+              </w:rPr>
               <w:t>(-c) lactating queens are not mated or inseminated.</w:t>
             </w:r>
           </w:p>
@@ -4903,7 +6589,7 @@
           </w:tcPr>
           <w:p>
             <w:pPr>
-              <w:spacing w:before="80" w:after="80"/>
+              <w:spacing w:before="80" w:after="40"/>
               <w:ind w:left="80" w:right="80"/>
             </w:pPr>
             <w:r>
@@ -4915,8 +6601,13 @@
                 <w:sz w:val="16"/>
               </w:rPr>
               <w:t>n.ºs 1, 2 e 3 do art.º 33.º do RGBEAC (proposta, jun. 2025)</w:t>
-              <w:br/>
             </w:r>
+          </w:p>
+          <w:p>
+            <w:pPr>
+              <w:spacing w:after="0" w:before="140"/>
+              <w:ind w:right="80" w:left="80" w:firstLine="0"/>
+            </w:pPr>
             <w:r>
               <w:rPr>
                 <w:rFonts w:ascii="Calibri" w:hAnsi="Calibri"/>
@@ -4930,8 +6621,8 @@
           </w:p>
           <w:p>
             <w:pPr>
-              <w:spacing w:before="120" w:after="0"/>
-              <w:ind w:left="80"/>
+              <w:spacing w:after="0" w:before="140"/>
+              <w:ind w:right="80" w:left="80" w:firstLine="0"/>
             </w:pPr>
             <w:r>
               <w:rPr>
@@ -4946,8 +6637,8 @@
           </w:p>
           <w:p>
             <w:pPr>
-              <w:spacing w:before="120" w:after="0"/>
-              <w:ind w:left="80"/>
+              <w:spacing w:after="0" w:before="140"/>
+              <w:ind w:right="80" w:left="80" w:firstLine="0"/>
             </w:pPr>
             <w:r>
               <w:rPr>
@@ -4975,7 +6666,7 @@
           </w:tcPr>
           <w:p>
             <w:pPr>
-              <w:spacing w:before="80" w:after="80"/>
+              <w:spacing w:before="80" w:after="40"/>
               <w:ind w:left="80" w:right="80"/>
             </w:pPr>
             <w:r>
@@ -4987,8 +6678,13 @@
                 <w:sz w:val="16"/>
               </w:rPr>
               <w:t>art.º 6.º do Código do Animal (DL n.º 214/2013)</w:t>
-              <w:br/>
             </w:r>
+          </w:p>
+          <w:p>
+            <w:pPr>
+              <w:spacing w:after="0" w:before="140"/>
+              <w:ind w:right="80" w:left="80" w:firstLine="0"/>
+            </w:pPr>
             <w:r>
               <w:rPr>
                 <w:rFonts w:ascii="Calibri" w:hAnsi="Calibri"/>
@@ -5015,7 +6711,7 @@
           </w:tcPr>
           <w:p>
             <w:pPr>
-              <w:spacing w:before="80" w:after="80"/>
+              <w:spacing w:before="80" w:after="40"/>
               <w:ind w:left="80" w:right="80"/>
             </w:pPr>
             <w:r>
@@ -5027,8 +6723,13 @@
                 <w:sz w:val="16"/>
               </w:rPr>
               <w:t>n.ºs 1 e 3 do art.º 13.º e n.ºs 1 e 2 do art.º 16.º do DL n.º 276/2001, de 17 de outubro</w:t>
-              <w:br/>
             </w:r>
+          </w:p>
+          <w:p>
+            <w:pPr>
+              <w:spacing w:after="0" w:before="140"/>
+              <w:ind w:right="80" w:left="80" w:firstLine="0"/>
+            </w:pPr>
             <w:r>
               <w:rPr>
                 <w:rFonts w:ascii="Calibri" w:hAnsi="Calibri"/>
@@ -5042,8 +6743,8 @@
           </w:p>
           <w:p>
             <w:pPr>
-              <w:spacing w:before="120" w:after="0"/>
-              <w:ind w:left="80"/>
+              <w:spacing w:after="0" w:before="140"/>
+              <w:ind w:right="80" w:left="80" w:firstLine="0"/>
             </w:pPr>
             <w:r>
               <w:rPr>
@@ -5058,8 +6759,8 @@
           </w:p>
           <w:p>
             <w:pPr>
-              <w:spacing w:before="120" w:after="0"/>
-              <w:ind w:left="80"/>
+              <w:spacing w:after="0" w:before="140"/>
+              <w:ind w:right="80" w:left="80" w:firstLine="0"/>
             </w:pPr>
             <w:r>
               <w:rPr>
@@ -5074,8 +6775,8 @@
           </w:p>
           <w:p>
             <w:pPr>
-              <w:spacing w:before="120" w:after="0"/>
-              <w:ind w:left="80"/>
+              <w:spacing w:after="0" w:before="140"/>
+              <w:ind w:right="80" w:left="80" w:firstLine="0"/>
             </w:pPr>
             <w:r>
               <w:rPr>
@@ -5138,6 +6839,219 @@
         <w:tc>
           <w:tcPr>
             <w:tcW w:type="dxa" w:w="15138"/>
+            <w:shd w:val="clear" w:color="auto" w:fill="006064"/>
+            <w:tcBorders>
+              <w:top w:val="single" w:sz="4" w:space="0" w:color="006064"/>
+              <w:left w:val="single" w:sz="4" w:space="0" w:color="006064"/>
+              <w:bottom w:val="single" w:sz="4" w:space="0" w:color="006064"/>
+              <w:right w:val="single" w:sz="4" w:space="0" w:color="006064"/>
+            </w:tcBorders>
+          </w:tcPr>
+          <w:p>
+            <w:pPr>
+              <w:spacing w:before="80" w:after="0"/>
+              <w:ind w:left="120"/>
+            </w:pPr>
+            <w:r>
+              <w:rPr>
+                <w:rFonts w:ascii="Calibri" w:hAnsi="Calibri"/>
+                <w:b/>
+                <w:i w:val="0"/>
+                <w:color w:val="FFFFFF"/>
+                <w:sz w:val="17"/>
+              </w:rPr>
+              <w:t>@legislacao</w:t>
+            </w:r>
+          </w:p>
+        </w:tc>
+      </w:tr>
+      <w:tr>
+        <w:tc>
+          <w:tcPr>
+            <w:tcW w:type="dxa" w:w="15138"/>
+            <w:shd w:val="clear" w:color="auto" w:fill="E0F7FA"/>
+            <w:tcBorders>
+              <w:top w:val="single" w:sz="4" w:space="0" w:color="CCCCCC"/>
+              <w:left w:val="single" w:sz="4" w:space="0" w:color="CCCCCC"/>
+              <w:bottom w:val="single" w:sz="4" w:space="0" w:color="CCCCCC"/>
+              <w:right w:val="single" w:sz="4" w:space="0" w:color="CCCCCC"/>
+            </w:tcBorders>
+            <w:vAlign w:val="top"/>
+          </w:tcPr>
+          <w:p>
+            <w:pPr>
+              <w:spacing w:before="80" w:after="80"/>
+              <w:ind w:left="120" w:right="120"/>
+            </w:pPr>
+            <w:r>
+              <w:rPr>
+                <w:rFonts w:ascii="Calibri" w:hAnsi="Calibri"/>
+                <w:b w:val="0"/>
+                <w:i w:val="0"/>
+                <w:color w:val="222222"/>
+                <w:sz w:val="18"/>
+              </w:rPr>
+              <w:t>O DL n.º 276/2001 (art.ºs 13.º e 16.º) prevê inspeção diária e programa de profilaxia supervisionado por veterinário — alinhamento parcial. Não fixa condições sanitárias específicas para reprodução em criadores: sem idade mínima da fêmea, sem frequência máxima de partos, sem proibição de cobrição de fêmeas a lactar.</w:t>
+            </w:r>
+          </w:p>
+        </w:tc>
+      </w:tr>
+      <w:tr>
+        <w:tc>
+          <w:tcPr>
+            <w:tcW w:type="dxa" w:w="15138"/>
+            <w:shd w:val="clear" w:color="auto" w:fill="7E4C00"/>
+            <w:tcBorders>
+              <w:top w:val="single" w:sz="4" w:space="0" w:color="7E4C00"/>
+              <w:left w:val="single" w:sz="4" w:space="0" w:color="7E4C00"/>
+              <w:bottom w:val="single" w:sz="4" w:space="0" w:color="7E4C00"/>
+              <w:right w:val="single" w:sz="4" w:space="0" w:color="7E4C00"/>
+            </w:tcBorders>
+          </w:tcPr>
+          <w:p>
+            <w:pPr>
+              <w:spacing w:before="80" w:after="0"/>
+              <w:ind w:left="120"/>
+            </w:pPr>
+            <w:r>
+              <w:rPr>
+                <w:rFonts w:ascii="Calibri" w:hAnsi="Calibri"/>
+                <w:b/>
+                <w:i w:val="0"/>
+                <w:color w:val="FFFFFF"/>
+                <w:sz w:val="17"/>
+              </w:rPr>
+              <w:t>@codigo</w:t>
+            </w:r>
+          </w:p>
+        </w:tc>
+      </w:tr>
+      <w:tr>
+        <w:tc>
+          <w:tcPr>
+            <w:tcW w:type="dxa" w:w="15138"/>
+            <w:shd w:val="clear" w:color="auto" w:fill="FFE6CC"/>
+            <w:tcBorders>
+              <w:top w:val="single" w:sz="4" w:space="0" w:color="CCCCCC"/>
+              <w:left w:val="single" w:sz="4" w:space="0" w:color="CCCCCC"/>
+              <w:bottom w:val="single" w:sz="4" w:space="0" w:color="CCCCCC"/>
+              <w:right w:val="single" w:sz="4" w:space="0" w:color="CCCCCC"/>
+            </w:tcBorders>
+            <w:vAlign w:val="top"/>
+          </w:tcPr>
+          <w:p>
+            <w:pPr>
+              <w:spacing w:before="80" w:after="80"/>
+              <w:ind w:left="120" w:right="120"/>
+            </w:pPr>
+            <w:r>
+              <w:rPr>
+                <w:rFonts w:ascii="Calibri" w:hAnsi="Calibri"/>
+                <w:b w:val="0"/>
+                <w:i w:val="0"/>
+                <w:color w:val="222222"/>
+                <w:sz w:val="18"/>
+              </w:rPr>
+              <w:t>O @codigo (art.º 6.º) limita o dever de cuidados médico-veterinários ao animal ferido ou doente, sem obrigação de inspeção diária sistemática nem quaisquer regras sanitárias específicas para a reprodução em criadores.</w:t>
+            </w:r>
+          </w:p>
+        </w:tc>
+      </w:tr>
+      <w:tr>
+        <w:tc>
+          <w:tcPr>
+            <w:tcW w:type="dxa" w:w="15138"/>
+            <w:shd w:val="clear" w:color="auto" w:fill="1E5631"/>
+            <w:tcBorders>
+              <w:top w:val="single" w:sz="4" w:space="0" w:color="1E5631"/>
+              <w:left w:val="single" w:sz="4" w:space="0" w:color="1E5631"/>
+              <w:bottom w:val="single" w:sz="4" w:space="0" w:color="1E5631"/>
+              <w:right w:val="single" w:sz="4" w:space="0" w:color="1E5631"/>
+            </w:tcBorders>
+          </w:tcPr>
+          <w:p>
+            <w:pPr>
+              <w:spacing w:before="80" w:after="0"/>
+              <w:ind w:left="120"/>
+            </w:pPr>
+            <w:r>
+              <w:rPr>
+                <w:rFonts w:ascii="Calibri" w:hAnsi="Calibri"/>
+                <w:b/>
+                <w:i w:val="0"/>
+                <w:color w:val="FFFFFF"/>
+                <w:sz w:val="17"/>
+              </w:rPr>
+              <w:t>@rgbeac</w:t>
+            </w:r>
+          </w:p>
+        </w:tc>
+      </w:tr>
+      <w:tr>
+        <w:tc>
+          <w:tcPr>
+            <w:tcW w:type="dxa" w:w="15138"/>
+            <w:shd w:val="clear" w:color="auto" w:fill="D5E8D4"/>
+            <w:tcBorders>
+              <w:top w:val="single" w:sz="4" w:space="0" w:color="CCCCCC"/>
+              <w:left w:val="single" w:sz="4" w:space="0" w:color="CCCCCC"/>
+              <w:bottom w:val="single" w:sz="4" w:space="0" w:color="CCCCCC"/>
+              <w:right w:val="single" w:sz="4" w:space="0" w:color="CCCCCC"/>
+            </w:tcBorders>
+            <w:vAlign w:val="top"/>
+          </w:tcPr>
+          <w:p>
+            <w:pPr>
+              <w:spacing w:before="80" w:after="80"/>
+              <w:ind w:left="120" w:right="120"/>
+            </w:pPr>
+            <w:r>
+              <w:rPr>
+                <w:rFonts w:ascii="Calibri" w:hAnsi="Calibri"/>
+                <w:b w:val="0"/>
+                <w:i w:val="0"/>
+                <w:color w:val="222222"/>
+                <w:sz w:val="18"/>
+              </w:rPr>
+              <w:t>O @rgbeac (art.º 33.º) centra os cuidados de saúde no detentor em geral, sem distinguir obrigações reforçadas para operadores de criação nem fixar condições específicas para a reprodução (idade mínima, frequência de partos, lactação).</w:t>
+            </w:r>
+          </w:p>
+        </w:tc>
+      </w:tr>
+      <w:tr>
+        <w:tc>
+          <w:tcPr>
+            <w:tcW w:type="dxa" w:w="15138"/>
+            <w:shd w:val="clear" w:color="auto" w:fill="5D2A8A"/>
+            <w:tcBorders>
+              <w:top w:val="single" w:sz="4" w:space="0" w:color="5D2A8A"/>
+              <w:left w:val="single" w:sz="4" w:space="0" w:color="5D2A8A"/>
+              <w:bottom w:val="single" w:sz="4" w:space="0" w:color="5D2A8A"/>
+              <w:right w:val="single" w:sz="4" w:space="0" w:color="5D2A8A"/>
+            </w:tcBorders>
+          </w:tcPr>
+          <w:p>
+            <w:pPr>
+              <w:spacing w:before="80" w:after="0"/>
+              <w:ind w:left="120"/>
+            </w:pPr>
+            <w:r>
+              <w:rPr>
+                <w:rFonts w:ascii="Calibri" w:hAnsi="Calibri"/>
+                <w:b/>
+                <w:i w:val="0"/>
+                <w:color w:val="FFFFFF"/>
+                <w:sz w:val="17"/>
+              </w:rPr>
+              <w:t>Sumário / Proposta</w:t>
+            </w:r>
+          </w:p>
+        </w:tc>
+      </w:tr>
+      <w:tr>
+        <w:tc>
+          <w:tcPr>
+            <w:tcW w:type="dxa" w:w="15138"/>
             <w:shd w:val="clear" w:color="auto" w:fill="EAD7F7"/>
             <w:tcBorders>
               <w:top w:val="single" w:sz="4" w:space="0" w:color="CCCCCC"/>
@@ -5150,17 +7064,17 @@
           <w:p>
             <w:pPr>
               <w:spacing w:before="80" w:after="80"/>
-              <w:ind w:left="80" w:right="80"/>
+              <w:ind w:left="120" w:right="120"/>
             </w:pPr>
             <w:r>
               <w:rPr>
                 <w:rFonts w:ascii="Calibri" w:hAnsi="Calibri"/>
-                <w:b/>
+                <w:b w:val="0"/>
                 <w:i w:val="0"/>
-                <w:color w:val="3D1A6E"/>
-                <w:sz w:val="19"/>
+                <w:color w:val="222222"/>
+                <w:sz w:val="18"/>
               </w:rPr>
-              <w:t>O @regulamento impõe inspeção diária por cuidadores, isolamento imediato de animais com bem-estar comprometido e condições específicas para reprodução em criadores (idade mínima da fêmea, frequência máxima de partos por ninhada, proibição de cobrição de gatas a lactar). A @legislacao (DL n.º 276/2001, art.ºs 13.º e 16.º) prevê inspeção diária e programa de profilaxia supervisionado por veterinário — alinhamento parcial com o @regulamento — mas não fixa condições sanitárias específicas para a reprodução em criadores. O @rgbeac (art.º 33.º) centra os cuidados de saúde no detentor em geral, sem distinguir obrigações reforçadas para operadores de criação. O @codigo (art.º 6.º) limita o dever de cuidados médico-veterinários ao animal ferido ou doente, sem obrigação de inspeção sistemática nem regras sanitárias de criação. A @legislacao vigente é a mais próxima do @regulamento neste eixo, mas apresenta lacuna relevante nas condições sanitárias específicas da reprodução.</w:t>
+              <w:t>A @legislacao vigente é o diploma mais próximo do @regulamento. Necessidade de alteração dirigida a criadores: introduzir (1) requisitos mínimos de idade e maturidade das fêmeas; (2) frequência máxima de partos conforme Anexo I do @regulamento; (3) proibição de cobrição de fêmeas a lactar; alinhando com o regime sanitário do art.º 13.º.</w:t>
             </w:r>
           </w:p>
         </w:tc>

</xml_diff>

<commit_message>
Regenerar outputs (HTML, Excel, Word) com artigos 8, 9, 10 corrigidos
- comparativo_reuniao_exemplo.html: Visualizador SPA atualizado
- comparativo_reuniao_exemplo.xlsx: Excel de reunião artigo a artigo
- comparativo_reuniao_exemplo.docx: Word formatado com cores por diploma

Todos os outputs refletem as referências exatas aos documentos legislativos.

https://claude.ai/code/session_01Lyx8H297UqfjCVAHdgya3T
</commit_message>
<xml_diff>
--- a/comparativo_reuniao_exemplo.docx
+++ b/comparativo_reuniao_exemplo.docx
@@ -535,7 +535,7 @@
                 <w:color w:val="222222"/>
                 <w:sz w:val="19"/>
               </w:rPr>
-              <w:t>All dogs and cats kept in establishments placed on the market or owned by pet owners or by any other natural or legal persons, shall be individually identified by means of a single injectable transponder containing a readable microchip compliant with Annex II.</w:t>
+              <w:t>1. All dogs and cats kept in establishments placed on the market or owned by pet owners or by any other natural or legal persons, shall be individually identified by means of a single injectable transponder containing a readable microchip compliant with Annex II.</w:t>
             </w:r>
           </w:p>
           <w:p>
@@ -584,6 +584,134 @@
                 <w:sz w:val="19"/>
               </w:rPr>
               <w:t>Pet owners and any other natural or legal persons, other than operators, who own dogs or cats, shall ensure that the dogs or cats are individually identified at the latest when the dog or cat reaches 3 months of age or, in case the dog or cat is placed on the market, before the date of their placing on the market.</w:t>
+            </w:r>
+          </w:p>
+          <w:p>
+            <w:pPr>
+              <w:spacing w:after="0" w:before="140"/>
+              <w:ind w:right="80" w:left="80" w:firstLine="0"/>
+            </w:pPr>
+            <w:r>
+              <w:rPr>
+                <w:rFonts w:ascii="Calibri" w:hAnsi="Calibri"/>
+                <w:b w:val="0"/>
+                <w:i w:val="0"/>
+                <w:color w:val="222222"/>
+                <w:sz w:val="19"/>
+              </w:rPr>
+              <w:t>2. The implantation of the transponder shall be performed by a veterinarian. Member States may allow the implantation of transponders in cats to be performed by a person other than a veterinarian, if it is done under the responsibility of a veterinarian.</w:t>
+            </w:r>
+          </w:p>
+          <w:p>
+            <w:pPr>
+              <w:spacing w:after="0" w:before="140"/>
+              <w:ind w:right="80" w:left="80" w:firstLine="0"/>
+            </w:pPr>
+            <w:r>
+              <w:rPr>
+                <w:rFonts w:ascii="Calibri" w:hAnsi="Calibri"/>
+                <w:b w:val="0"/>
+                <w:i w:val="0"/>
+                <w:color w:val="222222"/>
+                <w:sz w:val="19"/>
+              </w:rPr>
+              <w:t>3. Dogs and cats which have been individually identified by means of an injectable transponder containing a microchip, in accordance with national legislation prior to entry into force of this Regulation, shall be recognised as identified in accordance with the requirements of this Article.</w:t>
+            </w:r>
+          </w:p>
+          <w:p>
+            <w:pPr>
+              <w:spacing w:after="0" w:before="140"/>
+              <w:ind w:right="80" w:left="80" w:firstLine="0"/>
+            </w:pPr>
+            <w:r>
+              <w:rPr>
+                <w:rFonts w:ascii="Calibri" w:hAnsi="Calibri"/>
+                <w:b w:val="0"/>
+                <w:i w:val="0"/>
+                <w:color w:val="222222"/>
+                <w:sz w:val="19"/>
+              </w:rPr>
+              <w:t>4. Within two working days after their identification, the dogs and cats shall be registered by a veterinarian in a national database.</w:t>
+            </w:r>
+          </w:p>
+          <w:p>
+            <w:pPr>
+              <w:spacing w:after="0" w:before="140"/>
+              <w:ind w:right="80" w:left="80" w:firstLine="0"/>
+            </w:pPr>
+            <w:r>
+              <w:rPr>
+                <w:rFonts w:ascii="Calibri" w:hAnsi="Calibri"/>
+                <w:b w:val="0"/>
+                <w:i w:val="0"/>
+                <w:color w:val="222222"/>
+                <w:sz w:val="19"/>
+              </w:rPr>
+              <w:t>5. For dogs and cats kept in establishments, the registration shall be made in the name of the operator of the establishment. For dogs and cats placed in foster homes, the registration shall be made in the name of the person responsible for the foster home. For dogs and cats owned by pet owners or by any other natural or legal person, the registration shall be made in the name of the pet owner or the natural or legal person.</w:t>
+            </w:r>
+          </w:p>
+          <w:p>
+            <w:pPr>
+              <w:spacing w:after="0" w:before="140"/>
+              <w:ind w:right="80" w:left="80" w:firstLine="0"/>
+            </w:pPr>
+            <w:r>
+              <w:rPr>
+                <w:rFonts w:ascii="Calibri" w:hAnsi="Calibri"/>
+                <w:b w:val="0"/>
+                <w:i w:val="0"/>
+                <w:color w:val="222222"/>
+                <w:sz w:val="19"/>
+              </w:rPr>
+              <w:t>Member States may grant derogations from the first subparagraph to military, police and customs dogs.</w:t>
+            </w:r>
+          </w:p>
+          <w:p>
+            <w:pPr>
+              <w:spacing w:after="0" w:before="140"/>
+              <w:ind w:right="80" w:left="80" w:firstLine="0"/>
+            </w:pPr>
+            <w:r>
+              <w:rPr>
+                <w:rFonts w:ascii="Calibri" w:hAnsi="Calibri"/>
+                <w:b w:val="0"/>
+                <w:i w:val="0"/>
+                <w:color w:val="222222"/>
+                <w:sz w:val="19"/>
+              </w:rPr>
+              <w:t>6. In case of placing on the market or occasional and irregular donation by a natural person without online advertising, the requirements for registration shall not apply.</w:t>
+            </w:r>
+          </w:p>
+          <w:p>
+            <w:pPr>
+              <w:spacing w:after="0" w:before="140"/>
+              <w:ind w:right="80" w:left="80" w:firstLine="0"/>
+            </w:pPr>
+            <w:r>
+              <w:rPr>
+                <w:rFonts w:ascii="Calibri" w:hAnsi="Calibri"/>
+                <w:b w:val="0"/>
+                <w:i w:val="0"/>
+                <w:color w:val="222222"/>
+                <w:sz w:val="19"/>
+              </w:rPr>
+              <w:t>7. In the case of a death of a dog or a cat, the operator, pet owner or natural or legal person owning the dog or cat shall inform the national database.</w:t>
+            </w:r>
+          </w:p>
+          <w:p>
+            <w:pPr>
+              <w:spacing w:after="0" w:before="140"/>
+              <w:ind w:right="80" w:left="80" w:firstLine="0"/>
+            </w:pPr>
+            <w:r>
+              <w:rPr>
+                <w:rFonts w:ascii="Calibri" w:hAnsi="Calibri"/>
+                <w:b w:val="0"/>
+                <w:i w:val="0"/>
+                <w:color w:val="222222"/>
+                <w:sz w:val="19"/>
+              </w:rPr>
+              <w:t>8. In case of unreadable transponder, the operator or the natural or legal person responsible for the dog or cat shall ensure that the dog or cat is re-identified with a new transponder and re-registered in the national database.</w:t>
             </w:r>
           </w:p>
         </w:tc>
@@ -658,7 +786,7 @@
                 <w:color w:val="222222"/>
                 <w:sz w:val="19"/>
               </w:rPr>
-              <w:t>Todos os cães e gatos mantidos em estabelecimentos colocados no mercado ou detidos por donos de animais de companhia ou por qualquer outra pessoa singular ou coletiva devem ser identificados individualmente por meio de um único transponder injetável contendo um microchip legível em conformidade com o Anexo II.</w:t>
+              <w:t>1. Todos os cães e gatos mantidos em estabelecimentos colocados no mercado ou detidos por donos de animais de companhia ou por qualquer outra pessoa singular ou coletiva devem ser identificados individualmente por meio de um único transponder injetável contendo um microchip legível em conformidade com o Anexo II.</w:t>
             </w:r>
           </w:p>
           <w:p>
@@ -706,7 +834,135 @@
                 <w:color w:val="222222"/>
                 <w:sz w:val="19"/>
               </w:rPr>
-              <w:t>Os donos de animais de companhia e quaisquer outras pessoas singulares ou coletivas que detenham cães ou gatos devem assegurar que os animais sejam identificados individualmente o mais tardar quando o animal atingir os 3 meses de idade.</w:t>
+              <w:t>Os donos de animais de companhia e quaisquer outras pessoas singulares ou coletivas que detenham cães ou gatos devem assegurar que os animais sejam identificados individualmente o mais tardar quando o animal atingir os 3 meses de idade ou, no caso de o animal ser colocado no mercado, antes da data da sua colocação no mercado.</w:t>
+            </w:r>
+          </w:p>
+          <w:p>
+            <w:pPr>
+              <w:spacing w:after="0" w:before="140"/>
+              <w:ind w:right="80" w:left="80" w:firstLine="0"/>
+            </w:pPr>
+            <w:r>
+              <w:rPr>
+                <w:rFonts w:ascii="Calibri" w:hAnsi="Calibri"/>
+                <w:b w:val="0"/>
+                <w:i/>
+                <w:color w:val="222222"/>
+                <w:sz w:val="19"/>
+              </w:rPr>
+              <w:t>2. A implantação do transponder devem ser efetuada por um médico veterinário. Os Estados-Membros podem permitir que a implantação de transponders em gatos seja efetuada por pessoa que não seja médico veterinário, se for feita sob a responsabilidade de um médico veterinário.</w:t>
+            </w:r>
+          </w:p>
+          <w:p>
+            <w:pPr>
+              <w:spacing w:after="0" w:before="140"/>
+              <w:ind w:right="80" w:left="80" w:firstLine="0"/>
+            </w:pPr>
+            <w:r>
+              <w:rPr>
+                <w:rFonts w:ascii="Calibri" w:hAnsi="Calibri"/>
+                <w:b w:val="0"/>
+                <w:i/>
+                <w:color w:val="222222"/>
+                <w:sz w:val="19"/>
+              </w:rPr>
+              <w:t>3. Cães e gatos que tenham sido identificados individualmente por meio de um transponder injetável contendo um microchip, em conformidade com legislação nacional anterior à entrada em vigor do presente Regulamento, são reconhecidos como identificados de acordo com os requisitos do presente artigo.</w:t>
+            </w:r>
+          </w:p>
+          <w:p>
+            <w:pPr>
+              <w:spacing w:after="0" w:before="140"/>
+              <w:ind w:right="80" w:left="80" w:firstLine="0"/>
+            </w:pPr>
+            <w:r>
+              <w:rPr>
+                <w:rFonts w:ascii="Calibri" w:hAnsi="Calibri"/>
+                <w:b w:val="0"/>
+                <w:i/>
+                <w:color w:val="222222"/>
+                <w:sz w:val="19"/>
+              </w:rPr>
+              <w:t>4. No prazo de dois dias úteis após a sua identificação, os cães e gatos devem ser registados por um médico veterinário numa base de dados nacional.</w:t>
+            </w:r>
+          </w:p>
+          <w:p>
+            <w:pPr>
+              <w:spacing w:after="0" w:before="140"/>
+              <w:ind w:right="80" w:left="80" w:firstLine="0"/>
+            </w:pPr>
+            <w:r>
+              <w:rPr>
+                <w:rFonts w:ascii="Calibri" w:hAnsi="Calibri"/>
+                <w:b w:val="0"/>
+                <w:i/>
+                <w:color w:val="222222"/>
+                <w:sz w:val="19"/>
+              </w:rPr>
+              <w:t>5. Para cães e gatos mantidos em estabelecimentos, o registo deve ser efetuado em nome do operador do estabelecimento. Para cães e gatos colocados em famílias de acolhimento, o registo deve ser efetuado em nome da pessoa responsável pela família de acolhimento. Para cães e gatos detidos por donos de animais de companhia ou por qualquer outra pessoa singular ou coletiva, o registo deve ser efetuado em nome do dono ou da pessoa singular ou coletiva.</w:t>
+            </w:r>
+          </w:p>
+          <w:p>
+            <w:pPr>
+              <w:spacing w:after="0" w:before="140"/>
+              <w:ind w:right="80" w:left="80" w:firstLine="0"/>
+            </w:pPr>
+            <w:r>
+              <w:rPr>
+                <w:rFonts w:ascii="Calibri" w:hAnsi="Calibri"/>
+                <w:b w:val="0"/>
+                <w:i/>
+                <w:color w:val="222222"/>
+                <w:sz w:val="19"/>
+              </w:rPr>
+              <w:t>Os Estados-Membros podem conceder derrogações ao primeiro parágrafo a cães militares, policiais e aduaneiros.</w:t>
+            </w:r>
+          </w:p>
+          <w:p>
+            <w:pPr>
+              <w:spacing w:after="0" w:before="140"/>
+              <w:ind w:right="80" w:left="80" w:firstLine="0"/>
+            </w:pPr>
+            <w:r>
+              <w:rPr>
+                <w:rFonts w:ascii="Calibri" w:hAnsi="Calibri"/>
+                <w:b w:val="0"/>
+                <w:i/>
+                <w:color w:val="222222"/>
+                <w:sz w:val="19"/>
+              </w:rPr>
+              <w:t>6. Em caso de colocação no mercado ou cedência ocasional e irregular por pessoa singular sem publicidade em linha, os requisitos de registo não se aplicam.</w:t>
+            </w:r>
+          </w:p>
+          <w:p>
+            <w:pPr>
+              <w:spacing w:after="0" w:before="140"/>
+              <w:ind w:right="80" w:left="80" w:firstLine="0"/>
+            </w:pPr>
+            <w:r>
+              <w:rPr>
+                <w:rFonts w:ascii="Calibri" w:hAnsi="Calibri"/>
+                <w:b w:val="0"/>
+                <w:i/>
+                <w:color w:val="222222"/>
+                <w:sz w:val="19"/>
+              </w:rPr>
+              <w:t>7. Em caso de morte de um cão ou gato, o operador, dono do animal ou pessoa singular ou coletiva proprietária devem informar a base de dados nacional.</w:t>
+            </w:r>
+          </w:p>
+          <w:p>
+            <w:pPr>
+              <w:spacing w:after="0" w:before="140"/>
+              <w:ind w:right="80" w:left="80" w:firstLine="0"/>
+            </w:pPr>
+            <w:r>
+              <w:rPr>
+                <w:rFonts w:ascii="Calibri" w:hAnsi="Calibri"/>
+                <w:b w:val="0"/>
+                <w:i/>
+                <w:color w:val="222222"/>
+                <w:sz w:val="19"/>
+              </w:rPr>
+              <w:t>8. Em caso de transponder ilegível, o operador ou a pessoa singular ou coletiva responsável pelo cão ou gato devem assegurar que o animal é reidentificado com um novo transponder e re-registado na base de dados nacional.</w:t>
             </w:r>
           </w:p>
         </w:tc>
@@ -1604,7 +1860,7 @@
                 <w:color w:val="222222"/>
                 <w:sz w:val="19"/>
               </w:rPr>
-              <w:t>Operators shall be responsible for the welfare of dogs or cats kept in the establishments under their responsibility and under their control and to minimise any risks to their welfare.</w:t>
+              <w:t>1. Operators shall be responsible for the welfare of dogs or cats kept in the establishments under their responsibility and under their control and to minimise any risks to their welfare.</w:t>
             </w:r>
           </w:p>
           <w:p>
@@ -1620,7 +1876,103 @@
                 <w:color w:val="222222"/>
                 <w:sz w:val="19"/>
               </w:rPr>
-              <w:t>1a. In the case of foster homes, the responsibility shall lie with the operator on whose behalf dogs or cats are kept. Such operators shall not place more than a total of five dogs or cats or one litter with or without mother in a foster home at any given time and shall provide the foster family with adequate information on the animal welfare obligations as well as the individual needs of the dogs or cats, and shall ensure that the relevant obligations set out by this Regulation are complied with in foster homes.</w:t>
+              <w:t>1a. In the case of foster homes, the responsibility shall lie with the operator on whose behalf dogs or cats are kept. Such operators shall not place more than a total of five dogs or cats or one litter with or without mother in a foster home at any given time and shall provide the foster family with adequate information on the animal welfare obligations as well as the individual needs of the dogs or cats, and shall ensure that the relevant obligations set out by this Regulation are complied with in foster homes. Member States where the foster home is located may provide for a greater number of dogs, cats or litters to be placed in the foster home, provided that the premises of the foster home provide sufficient space, including outdoor space, and that the number of animal caretakers in the foster home is sufficient, to ensure the welfare of the dogs or cats.</w:t>
+            </w:r>
+          </w:p>
+          <w:p>
+            <w:pPr>
+              <w:spacing w:after="0" w:before="140"/>
+              <w:ind w:right="80" w:left="80" w:firstLine="0"/>
+            </w:pPr>
+            <w:r>
+              <w:rPr>
+                <w:rFonts w:ascii="Calibri" w:hAnsi="Calibri"/>
+                <w:b w:val="0"/>
+                <w:i w:val="0"/>
+                <w:color w:val="222222"/>
+                <w:sz w:val="19"/>
+              </w:rPr>
+              <w:t>1b. Operators shall not subject any dog or cat to cruelty, abuse or mistreatment, including through participation in activities likely to result in cruelty, abuse or mistreatment, to the dogs or cats bred or kept by the operator.</w:t>
+            </w:r>
+          </w:p>
+          <w:p>
+            <w:pPr>
+              <w:spacing w:after="0" w:before="140"/>
+              <w:ind w:right="80" w:left="80" w:firstLine="0"/>
+            </w:pPr>
+            <w:r>
+              <w:rPr>
+                <w:rFonts w:ascii="Calibri" w:hAnsi="Calibri"/>
+                <w:b w:val="0"/>
+                <w:i w:val="0"/>
+                <w:color w:val="222222"/>
+                <w:sz w:val="19"/>
+              </w:rPr>
+              <w:t>1c. Operators shall not abandon dogs or cats.</w:t>
+            </w:r>
+          </w:p>
+          <w:p>
+            <w:pPr>
+              <w:spacing w:after="0" w:before="140"/>
+              <w:ind w:right="80" w:left="80" w:firstLine="0"/>
+            </w:pPr>
+            <w:r>
+              <w:rPr>
+                <w:rFonts w:ascii="Calibri" w:hAnsi="Calibri"/>
+                <w:b w:val="0"/>
+                <w:i w:val="0"/>
+                <w:color w:val="222222"/>
+                <w:sz w:val="19"/>
+              </w:rPr>
+              <w:t>1d. Operators who are due to cease the activities of their establishment shall ensure the rehoming of the dogs or cats kept therein either by taking up the pet ownership or by transferring the responsibility or ownership of dogs and cats to other operators or acquirers.</w:t>
+            </w:r>
+          </w:p>
+          <w:p>
+            <w:pPr>
+              <w:spacing w:after="0" w:before="140"/>
+              <w:ind w:right="80" w:left="80" w:firstLine="0"/>
+            </w:pPr>
+            <w:r>
+              <w:rPr>
+                <w:rFonts w:ascii="Calibri" w:hAnsi="Calibri"/>
+                <w:b w:val="0"/>
+                <w:i w:val="0"/>
+                <w:color w:val="222222"/>
+                <w:sz w:val="19"/>
+              </w:rPr>
+              <w:t>2. Operators shall ensure that dogs or cats are handled by a suitable number of animal caretakers and in order to meet the welfare needs of dogs or cats kept in their establishments and who have the competences required under Article 9.</w:t>
+            </w:r>
+          </w:p>
+          <w:p>
+            <w:pPr>
+              <w:spacing w:after="0" w:before="140"/>
+              <w:ind w:right="80" w:left="80" w:firstLine="0"/>
+            </w:pPr>
+            <w:r>
+              <w:rPr>
+                <w:rFonts w:ascii="Calibri" w:hAnsi="Calibri"/>
+                <w:b w:val="0"/>
+                <w:i w:val="0"/>
+                <w:color w:val="222222"/>
+                <w:sz w:val="19"/>
+              </w:rPr>
+              <w:t>2a. Operators shall ensure the welfare of the dogs or cats under their responsibility by monitoring animal-based indicators concerning behaviour and physical appearance, and by taking actions based on the results of such monitoring.</w:t>
+            </w:r>
+          </w:p>
+          <w:p>
+            <w:pPr>
+              <w:spacing w:after="0" w:before="140"/>
+              <w:ind w:right="80" w:left="80" w:firstLine="0"/>
+            </w:pPr>
+            <w:r>
+              <w:rPr>
+                <w:rFonts w:ascii="Calibri" w:hAnsi="Calibri"/>
+                <w:b w:val="0"/>
+                <w:i w:val="0"/>
+                <w:color w:val="222222"/>
+                <w:sz w:val="19"/>
+              </w:rPr>
+              <w:t>2b. The Commission is empowered to adopt delegated acts in accordance with Article 23 supplementing this Regulation by laying down animal-based indicators concerning behaviour and physical appearance and the methods of their measurement.</w:t>
             </w:r>
           </w:p>
         </w:tc>
@@ -1695,7 +2047,7 @@
                 <w:color w:val="222222"/>
                 <w:sz w:val="19"/>
               </w:rPr>
-              <w:t>Os operadores são responsáveis pelo bem-estar dos cães ou gatos mantidos nos estabelecimentos sob a sua responsabilidade e controlo e devem minimizar quaisquer riscos para o seu bem-estar.</w:t>
+              <w:t>1. Os operadores são responsáveis pelo bem-estar dos cães ou gatos mantidos nos estabelecimentos sob a sua responsabilidade e controlo e devem minimizar quaisquer riscos para o seu bem-estar.</w:t>
             </w:r>
           </w:p>
           <w:p>
@@ -1711,7 +2063,103 @@
                 <w:color w:val="222222"/>
                 <w:sz w:val="19"/>
               </w:rPr>
-              <w:t>1a. No caso de famílias de acolhimento, a responsabilidade recai sobre o operador em nome de quem os cães ou gatos são mantidos. Esses operadores não devem colocar mais do que um total de cinco cães ou gatos ou uma ninhada com ou sem mãe numa família de acolhimento em qualquer momento e devem fornecer à família de acolhimento informação adequada sobre as obrigações de bem-estar animal, bem como as necessidades individuais dos animais.</w:t>
+              <w:t>1a. No caso de famílias de acolhimento, a responsabilidade recai sobre o operador em nome de quem os cães ou gatos são mantidos. Esses operadores não devem colocar mais do que um total de cinco cães ou gatos ou uma ninhada com ou sem mãe numa família de acolhimento em qualquer momento e devem fornecer à família de acolhimento informação adequada sobre as obrigações de bem-estar animal, bem como as necessidades individuais dos animais, e devem assegurar que as obrigações relevantes estabelecidas por este Regulamento são cumpridas em famílias de acolhimento. Os Estados-Membros onde a família de acolhimento está localizada podem prever um número maior de cães, gatos ou ninhadas a serem colocadas na família de acolhimento, desde que as instalações da família de acolhimento providenciem espaço suficiente, incluindo espaço ao ar livre, e que o número de cuidadores de animais na família de acolhimento seja suficiente, para assegurar o bem-estar dos cães ou gatos.</w:t>
+            </w:r>
+          </w:p>
+          <w:p>
+            <w:pPr>
+              <w:spacing w:after="0" w:before="140"/>
+              <w:ind w:right="80" w:left="80" w:firstLine="0"/>
+            </w:pPr>
+            <w:r>
+              <w:rPr>
+                <w:rFonts w:ascii="Calibri" w:hAnsi="Calibri"/>
+                <w:b w:val="0"/>
+                <w:i/>
+                <w:color w:val="222222"/>
+                <w:sz w:val="19"/>
+              </w:rPr>
+              <w:t>1b. Os operadores não devem sujeitar nenhum cão ou gato a crueldade, abuso ou maus-tratos, incluindo através de participação em atividades que possam resultar em crueldade, abuso ou maus-tratos, aos cães ou gatos criados ou mantidos pelo operador.</w:t>
+            </w:r>
+          </w:p>
+          <w:p>
+            <w:pPr>
+              <w:spacing w:after="0" w:before="140"/>
+              <w:ind w:right="80" w:left="80" w:firstLine="0"/>
+            </w:pPr>
+            <w:r>
+              <w:rPr>
+                <w:rFonts w:ascii="Calibri" w:hAnsi="Calibri"/>
+                <w:b w:val="0"/>
+                <w:i/>
+                <w:color w:val="222222"/>
+                <w:sz w:val="19"/>
+              </w:rPr>
+              <w:t>1c. Os operadores não devem abandonar cães ou gatos.</w:t>
+            </w:r>
+          </w:p>
+          <w:p>
+            <w:pPr>
+              <w:spacing w:after="0" w:before="140"/>
+              <w:ind w:right="80" w:left="80" w:firstLine="0"/>
+            </w:pPr>
+            <w:r>
+              <w:rPr>
+                <w:rFonts w:ascii="Calibri" w:hAnsi="Calibri"/>
+                <w:b w:val="0"/>
+                <w:i/>
+                <w:color w:val="222222"/>
+                <w:sz w:val="19"/>
+              </w:rPr>
+              <w:t>1d. Os operadores que estejam prestes a cessar as atividades do seu estabelecimento devem assegurar a reintegração dos cães ou gatos mantidos aí, quer através da assunção da posse do animal de companhia, quer através da transferência da responsabilidade ou propriedade dos cães e gatos para outros operadores ou adquirentes.</w:t>
+            </w:r>
+          </w:p>
+          <w:p>
+            <w:pPr>
+              <w:spacing w:after="0" w:before="140"/>
+              <w:ind w:right="80" w:left="80" w:firstLine="0"/>
+            </w:pPr>
+            <w:r>
+              <w:rPr>
+                <w:rFonts w:ascii="Calibri" w:hAnsi="Calibri"/>
+                <w:b w:val="0"/>
+                <w:i/>
+                <w:color w:val="222222"/>
+                <w:sz w:val="19"/>
+              </w:rPr>
+              <w:t>2. Os operadores devem assegurar que os cães ou gatos são tratados por um número adequado de cuidadores de animais e de modo a satisfazer as necessidades de bem-estar dos cães ou gatos mantidos nos seus estabelecimentos e que têm as competências exigidas no artigo 9.º.</w:t>
+            </w:r>
+          </w:p>
+          <w:p>
+            <w:pPr>
+              <w:spacing w:after="0" w:before="140"/>
+              <w:ind w:right="80" w:left="80" w:firstLine="0"/>
+            </w:pPr>
+            <w:r>
+              <w:rPr>
+                <w:rFonts w:ascii="Calibri" w:hAnsi="Calibri"/>
+                <w:b w:val="0"/>
+                <w:i/>
+                <w:color w:val="222222"/>
+                <w:sz w:val="19"/>
+              </w:rPr>
+              <w:t>2a. Os operadores devem assegurar o bem-estar dos cães ou gatos sob a sua responsabilidade através da monitorização de indicadores baseados no comportamento e aparência física, e através da adoção de ações com base nos resultados de tal monitorização.</w:t>
+            </w:r>
+          </w:p>
+          <w:p>
+            <w:pPr>
+              <w:spacing w:after="0" w:before="140"/>
+              <w:ind w:right="80" w:left="80" w:firstLine="0"/>
+            </w:pPr>
+            <w:r>
+              <w:rPr>
+                <w:rFonts w:ascii="Calibri" w:hAnsi="Calibri"/>
+                <w:b w:val="0"/>
+                <w:i/>
+                <w:color w:val="222222"/>
+                <w:sz w:val="19"/>
+              </w:rPr>
+              <w:t>2b. A Comissão tem competência para adotar atos delegados em conformidade com o artigo 23.º que complementem este Regulamento através do estabelecimento de indicadores baseados no bem-estar dos animais relativos ao comportamento e aparência física e dos métodos da sua medição.</w:t>
             </w:r>
           </w:p>
         </w:tc>
@@ -5052,7 +5500,7 @@
                 <w:color w:val="FFFFFF"/>
                 <w:sz w:val="18"/>
               </w:rPr>
-              <w:t>@regulamento — Breeding strategies obligations  ·  Art.º 6.a do Regulamento 2023/0447  |  EN</w:t>
+              <w:t>@regulamento — Breeding strategies obligations  ·  Art.º 6.º-A do Regulamento 2023/0447  |  EN</w:t>
             </w:r>
           </w:p>
         </w:tc>
@@ -5083,7 +5531,7 @@
                 <w:color w:val="222222"/>
                 <w:sz w:val="19"/>
               </w:rPr>
-              <w:t>Operators of breeding establishments shall ensure that their breeding strategies minimise the risk of producing dogs or cats with genotypes associated with detrimental effects on their health and welfare.</w:t>
+              <w:t>1. Operators of breeding establishments shall ensure that their breeding strategies minimise the risk of producing dogs or cats with genotypes associated with detrimental effects on their health and welfare.</w:t>
             </w:r>
           </w:p>
           <w:p>
@@ -5099,7 +5547,7 @@
                 <w:color w:val="222222"/>
                 <w:sz w:val="19"/>
               </w:rPr>
-              <w:t>Operators of breeding establishments shall not use for reproduction dogs or cats that have excessive conformational traits leading to a high risk of detrimental effects on the welfare of these dogs or cats, or of their offspring. Before selection for breeding of a dog or cat that may be concerned by an excessive conformational trait the operator shall consult a veterinarian or an independent qualified person under the responsibility of a veterinarian.</w:t>
+              <w:t>2. Operators of breeding establishments shall not use for reproduction dogs or cats that have excessive conformational traits leading to a high risk of detrimental effects on the welfare of these dogs or cats, or of their offspring. Before selection for breeding of a dog or cat that may be concerned by an excessive conformational trait the operator shall consult a veterinarian or an independent qualified person under the responsibility of a veterinarian. The veterinarian or independent qualified person shall assess whether the dog or cat has an excessive conformational trait.</w:t>
             </w:r>
           </w:p>
           <w:p>
@@ -5115,7 +5563,71 @@
                 <w:color w:val="222222"/>
                 <w:sz w:val="19"/>
               </w:rPr>
-              <w:t>The following shall be prohibited in the management of the reproduction of dogs and cats:</w:t>
+              <w:t>3. The Commission is empowered to adopt, taking into account scientific opinions of the European Food Safety Authority as well as the social and economic impacts, delegated acts in accordance with Article 23 supplementing this Regulation by:</w:t>
+            </w:r>
+          </w:p>
+          <w:p>
+            <w:pPr>
+              <w:spacing w:after="0" w:before="20"/>
+              <w:ind w:right="80" w:left="360" w:hanging="280"/>
+            </w:pPr>
+            <w:r>
+              <w:rPr>
+                <w:rFonts w:ascii="Calibri" w:hAnsi="Calibri"/>
+                <w:b w:val="0"/>
+                <w:i w:val="0"/>
+                <w:color w:val="222222"/>
+                <w:sz w:val="19"/>
+              </w:rPr>
+              <w:t>(a) defining characteristics of the genotypes referred to in paragraph 1, which shall be excluded from reproduction, and the methods for their assessment and the record keeping requirements;</w:t>
+            </w:r>
+          </w:p>
+          <w:p>
+            <w:pPr>
+              <w:spacing w:after="0" w:before="20"/>
+              <w:ind w:right="80" w:left="360" w:hanging="280"/>
+            </w:pPr>
+            <w:r>
+              <w:rPr>
+                <w:rFonts w:ascii="Calibri" w:hAnsi="Calibri"/>
+                <w:b w:val="0"/>
+                <w:i w:val="0"/>
+                <w:color w:val="222222"/>
+                <w:sz w:val="19"/>
+              </w:rPr>
+              <w:t>(b) defining excessive conformational traits referred to in paragraph 2 of this Article, which shall be excluded from reproduction, the methods for their assessment and the record keeping requirements.</w:t>
+            </w:r>
+          </w:p>
+          <w:p>
+            <w:pPr>
+              <w:spacing w:after="0" w:before="140"/>
+              <w:ind w:right="80" w:left="80" w:firstLine="0"/>
+            </w:pPr>
+            <w:r>
+              <w:rPr>
+                <w:rFonts w:ascii="Calibri" w:hAnsi="Calibri"/>
+                <w:b w:val="0"/>
+                <w:i w:val="0"/>
+                <w:color w:val="222222"/>
+                <w:sz w:val="19"/>
+              </w:rPr>
+              <w:t>4. The delegated acts concerning the excessive conformational traits shall be adopted by 1 July 2030. The delegated acts concerning the genotypes shall be adopted by 1 July 2036.</w:t>
+            </w:r>
+          </w:p>
+          <w:p>
+            <w:pPr>
+              <w:spacing w:after="0" w:before="140"/>
+              <w:ind w:right="80" w:left="80" w:firstLine="0"/>
+            </w:pPr>
+            <w:r>
+              <w:rPr>
+                <w:rFonts w:ascii="Calibri" w:hAnsi="Calibri"/>
+                <w:b w:val="0"/>
+                <w:i w:val="0"/>
+                <w:color w:val="222222"/>
+                <w:sz w:val="19"/>
+              </w:rPr>
+              <w:t>5. The following shall be prohibited in the management of the reproduction of dogs and cats:</w:t>
             </w:r>
           </w:p>
           <w:p>
@@ -5191,7 +5703,7 @@
                 <w:color w:val="FFFFFF"/>
                 <w:sz w:val="18"/>
               </w:rPr>
-              <w:t>@regulamento — Tradução PT-PT  ·  Art.º 6.a do Regulamento 2023/0447</w:t>
+              <w:t>@regulamento — Tradução PT-PT  ·  Art.º 6.º-A do Regulamento 2023/0447</w:t>
             </w:r>
           </w:p>
         </w:tc>
@@ -5222,7 +5734,7 @@
                 <w:color w:val="222222"/>
                 <w:sz w:val="19"/>
               </w:rPr>
-              <w:t>Os operadores de estabelecimentos de criação devem assegurar que as suas estratégias de criação minimizam o risco de produzir cães ou gatos com genótipos associados a efeitos prejudiciais para a sua saúde e bem-estar.</w:t>
+              <w:t>1. Os operadores de estabelecimentos de criação devem assegurar que as suas estratégias de criação minimizam o risco de produzir cães ou gatos com genótipos associados a efeitos prejudiciais para a sua saúde e bem-estar.</w:t>
             </w:r>
           </w:p>
           <w:p>
@@ -5238,7 +5750,7 @@
                 <w:color w:val="222222"/>
                 <w:sz w:val="19"/>
               </w:rPr>
-              <w:t>Os operadores de estabelecimentos de criação não devem utilizar para reprodução cães ou gatos que apresentem traços conformacionais excessivos que conduzam a um risco elevado de efeitos prejudiciais para o bem-estar desses animais ou das suas crias. Antes da seleção para reprodução de um animal potencialmente afetado por traço conformacional excessivo, o operador deve consultar um médico veterinário ou uma pessoa qualificada independente sob responsabilidade veterinária.</w:t>
+              <w:t>2. Os operadores de estabelecimentos de criação não devem utilizar para reprodução cães ou gatos que apresentem traços conformacionais excessivos que conduzam a um risco elevado de efeitos prejudiciais para o bem-estar desses animais ou das suas crias. Antes da seleção para reprodução de um animal potencialmente afetado por traço conformacional excessivo, o operador deve consultar um médico veterinário ou uma pessoa qualificada independente sob responsabilidade veterinária. O médico veterinário ou a pessoa qualificada independente devem avaliar se o animal tem um traço conformacional excessivo.</w:t>
             </w:r>
           </w:p>
           <w:p>
@@ -5254,7 +5766,71 @@
                 <w:color w:val="222222"/>
                 <w:sz w:val="19"/>
               </w:rPr>
-              <w:t>São proibidos na gestão da reprodução de cães e gatos:</w:t>
+              <w:t>3. A Comissão tem competência para adotar, tendo em conta os pareceres científicos da Autoridade Europeia para a Segurança dos Alimentos, bem como os impactos sociais e económicos, atos delegados em conformidade com o artigo 23.º que complementem este Regulamento:</w:t>
+            </w:r>
+          </w:p>
+          <w:p>
+            <w:pPr>
+              <w:spacing w:after="0" w:before="20"/>
+              <w:ind w:right="80" w:left="360" w:hanging="280"/>
+            </w:pPr>
+            <w:r>
+              <w:rPr>
+                <w:rFonts w:ascii="Calibri" w:hAnsi="Calibri"/>
+                <w:b w:val="0"/>
+                <w:i/>
+                <w:color w:val="222222"/>
+                <w:sz w:val="19"/>
+              </w:rPr>
+              <w:t>(a) definindo características dos genótipos a que se refere o parágrafo 1, que devem ser excluídos da reprodução, e os métodos para a sua avaliação e requisitos de manutenção de registos;</w:t>
+            </w:r>
+          </w:p>
+          <w:p>
+            <w:pPr>
+              <w:spacing w:after="0" w:before="20"/>
+              <w:ind w:right="80" w:left="360" w:hanging="280"/>
+            </w:pPr>
+            <w:r>
+              <w:rPr>
+                <w:rFonts w:ascii="Calibri" w:hAnsi="Calibri"/>
+                <w:b w:val="0"/>
+                <w:i/>
+                <w:color w:val="222222"/>
+                <w:sz w:val="19"/>
+              </w:rPr>
+              <w:t>(b) definindo traços conformacionais excessivos a que se refere o parágrafo 2 do presente artigo, que devem ser excluídos da reprodução, os métodos para a sua avaliação e requisitos de manutenção de registos.</w:t>
+            </w:r>
+          </w:p>
+          <w:p>
+            <w:pPr>
+              <w:spacing w:after="0" w:before="140"/>
+              <w:ind w:right="80" w:left="80" w:firstLine="0"/>
+            </w:pPr>
+            <w:r>
+              <w:rPr>
+                <w:rFonts w:ascii="Calibri" w:hAnsi="Calibri"/>
+                <w:b w:val="0"/>
+                <w:i/>
+                <w:color w:val="222222"/>
+                <w:sz w:val="19"/>
+              </w:rPr>
+              <w:t>4. Os atos delegados relativos aos traços conformacionais excessivos devem ser adotados até 1 de julho de 2030. Os atos delegados relativos aos genótipos devem ser adotados até 1 de julho de 2036.</w:t>
+            </w:r>
+          </w:p>
+          <w:p>
+            <w:pPr>
+              <w:spacing w:after="0" w:before="140"/>
+              <w:ind w:right="80" w:left="80" w:firstLine="0"/>
+            </w:pPr>
+            <w:r>
+              <w:rPr>
+                <w:rFonts w:ascii="Calibri" w:hAnsi="Calibri"/>
+                <w:b w:val="0"/>
+                <w:i/>
+                <w:color w:val="222222"/>
+                <w:sz w:val="19"/>
+              </w:rPr>
+              <w:t>5. São proibidos na gestão da reprodução de cães e gatos:</w:t>
             </w:r>
           </w:p>
           <w:p>
@@ -7507,6 +8083,3533 @@
                 <w:sz w:val="18"/>
               </w:rPr>
               <w:t>A @legislacao vigente (DL n.º 276/2001) tem o maior alinhamento, mas insuficiente. Necessidade de alteração dos três diplomas: (1) introduzir inspeção diária diferenciada para animais vulneráveis (al. (a) do n.º 1 do art.º 13.º do @regulamento); (2) criar obrigação de isolamento e tratamento imediato (al. (b)); (3) regular o processo de eutanásia com supervisão veterinária e anestesia/analgesia (al. (c)); (4) para criadores (n.º 2): fixar idade mínima e maturidade esquelética das fêmeas reprodutoras, frequência máxima de partos conforme Anexo I, proibição de cobrição de fêmeas a lactar, e regime de rehoming dos animais retirados da reprodução.</w:t>
+            </w:r>
+          </w:p>
+        </w:tc>
+      </w:tr>
+    </w:tbl>
+    <w:p>
+      <w:pPr>
+        <w:spacing w:after="80"/>
+      </w:pPr>
+    </w:p>
+    <w:tbl>
+      <w:tblPr>
+        <w:tblLook w:firstColumn="1" w:firstRow="1" w:lastColumn="0" w:lastRow="0" w:noHBand="0" w:noVBand="1" w:val="04A0"/>
+        <w:tblW w:w="5000" w:type="pct"/>
+      </w:tblPr>
+      <w:tblGrid>
+        <w:gridCol w:w="15138"/>
+      </w:tblGrid>
+      <w:tr>
+        <w:tc>
+          <w:tcPr>
+            <w:tcW w:type="dxa" w:w="15138"/>
+            <w:shd w:val="clear" w:color="auto" w:fill="4A4A4A"/>
+            <w:tcBorders>
+              <w:top w:val="single" w:sz="4" w:space="0" w:color="CCCCCC"/>
+              <w:left w:val="single" w:sz="4" w:space="0" w:color="CCCCCC"/>
+              <w:bottom w:val="single" w:sz="4" w:space="0" w:color="CCCCCC"/>
+              <w:right w:val="single" w:sz="4" w:space="0" w:color="CCCCCC"/>
+            </w:tcBorders>
+          </w:tcPr>
+          <w:p>
+            <w:pPr>
+              <w:spacing w:before="80" w:after="80"/>
+              <w:jc w:val="center"/>
+            </w:pPr>
+            <w:r>
+              <w:rPr>
+                <w:rFonts w:ascii="Calibri" w:hAnsi="Calibri"/>
+                <w:b/>
+                <w:i w:val="0"/>
+                <w:color w:val="FFFFFF"/>
+                <w:sz w:val="18"/>
+              </w:rPr>
+              <w:t>NOTAS DE REUNIÃO</w:t>
+            </w:r>
+          </w:p>
+        </w:tc>
+      </w:tr>
+      <w:tr>
+        <w:tc>
+          <w:tcPr>
+            <w:tcW w:type="dxa" w:w="15138"/>
+            <w:shd w:val="clear" w:color="auto" w:fill="F5F5F5"/>
+            <w:tcBorders>
+              <w:top w:val="single" w:sz="4" w:space="0" w:color="CCCCCC"/>
+              <w:left w:val="single" w:sz="4" w:space="0" w:color="CCCCCC"/>
+              <w:bottom w:val="single" w:sz="4" w:space="0" w:color="CCCCCC"/>
+              <w:right w:val="single" w:sz="4" w:space="0" w:color="CCCCCC"/>
+            </w:tcBorders>
+          </w:tcPr>
+          <w:p>
+            <w:pPr>
+              <w:spacing w:before="120" w:after="800"/>
+              <w:ind w:left="80"/>
+            </w:pPr>
+            <w:r>
+              <w:rPr>
+                <w:rFonts w:ascii="Calibri" w:hAnsi="Calibri"/>
+                <w:b w:val="0"/>
+                <w:i/>
+                <w:color w:val="888888"/>
+                <w:sz w:val="19"/>
+              </w:rPr>
+              <w:t>(espaço para anotações da reunião)</w:t>
+            </w:r>
+          </w:p>
+        </w:tc>
+      </w:tr>
+    </w:tbl>
+    <w:p/>
+    <w:p>
+      <w:pPr>
+        <w:spacing w:before="0" w:after="320"/>
+      </w:pPr>
+      <w:r>
+        <w:rPr>
+          <w:color w:val="CCCCCC"/>
+          <w:sz w:val="16"/>
+        </w:rPr>
+        <w:t>────────────────────────────────────────────────────────────────────────────────</w:t>
+      </w:r>
+    </w:p>
+    <w:p>
+      <w:r>
+        <w:br w:type="page"/>
+      </w:r>
+    </w:p>
+    <w:tbl>
+      <w:tblPr>
+        <w:tblLook w:firstColumn="1" w:firstRow="1" w:lastColumn="0" w:lastRow="0" w:noHBand="0" w:noVBand="1" w:val="04A0"/>
+        <w:tblW w:w="5000" w:type="pct"/>
+        <w:tblBorders>
+          <w:top w:val="none" w:sz="0" w:space="0" w:color="auto"/>
+          <w:left w:val="none" w:sz="0" w:space="0" w:color="auto"/>
+          <w:bottom w:val="none" w:sz="0" w:space="0" w:color="auto"/>
+          <w:right w:val="none" w:sz="0" w:space="0" w:color="auto"/>
+          <w:insideH w:val="none" w:sz="0" w:space="0" w:color="auto"/>
+          <w:insideV w:val="none" w:sz="0" w:space="0" w:color="auto"/>
+        </w:tblBorders>
+      </w:tblPr>
+      <w:tblGrid>
+        <w:gridCol w:w="7569"/>
+        <w:gridCol w:w="7569"/>
+      </w:tblGrid>
+      <w:tr>
+        <w:tc>
+          <w:tcPr>
+            <w:tcW w:type="dxa" w:w="7569"/>
+            <w:shd w:val="clear" w:color="auto" w:fill="1A1A2E"/>
+            <w:tcBorders>
+              <w:top w:val="single" w:sz="4" w:space="0" w:color="1A1A2E"/>
+              <w:left w:val="single" w:sz="4" w:space="0" w:color="1A1A2E"/>
+              <w:bottom w:val="single" w:sz="4" w:space="0" w:color="1A1A2E"/>
+              <w:right w:val="single" w:sz="4" w:space="0" w:color="1A1A2E"/>
+            </w:tcBorders>
+          </w:tcPr>
+          <w:p>
+            <w:pPr>
+              <w:spacing w:before="160" w:after="160"/>
+              <w:ind w:left="200"/>
+            </w:pPr>
+            <w:r>
+              <w:rPr>
+                <w:rFonts w:ascii="Calibri" w:hAnsi="Calibri"/>
+                <w:b/>
+                <w:i w:val="0"/>
+                <w:color w:val="FFFFFF"/>
+                <w:sz w:val="22"/>
+              </w:rPr>
+              <w:t>ART-08</w:t>
+            </w:r>
+          </w:p>
+        </w:tc>
+        <w:tc>
+          <w:tcPr>
+            <w:tcW w:type="dxa" w:w="7569"/>
+            <w:shd w:val="clear" w:color="auto" w:fill="2C3E6B"/>
+            <w:tcBorders>
+              <w:top w:val="single" w:sz="4" w:space="0" w:color="2C3E6B"/>
+              <w:left w:val="single" w:sz="4" w:space="0" w:color="2C3E6B"/>
+              <w:bottom w:val="single" w:sz="4" w:space="0" w:color="2C3E6B"/>
+              <w:right w:val="single" w:sz="4" w:space="0" w:color="2C3E6B"/>
+            </w:tcBorders>
+          </w:tcPr>
+          <w:p>
+            <w:pPr>
+              <w:spacing w:before="160" w:after="160"/>
+              <w:ind w:left="200"/>
+            </w:pPr>
+            <w:r>
+              <w:rPr>
+                <w:rFonts w:ascii="Calibri" w:hAnsi="Calibri"/>
+                <w:b/>
+                <w:i w:val="0"/>
+                <w:color w:val="7EC8E3"/>
+                <w:sz w:val="22"/>
+              </w:rPr>
+              <w:t>Detenção Responsável e Informação</w:t>
+            </w:r>
+          </w:p>
+        </w:tc>
+      </w:tr>
+    </w:tbl>
+    <w:p>
+      <w:pPr>
+        <w:spacing w:after="80"/>
+      </w:pPr>
+    </w:p>
+    <w:tbl>
+      <w:tblPr>
+        <w:tblLook w:firstColumn="1" w:firstRow="1" w:lastColumn="0" w:lastRow="0" w:noHBand="0" w:noVBand="1" w:val="04A0"/>
+        <w:tblW w:w="5000" w:type="pct"/>
+      </w:tblPr>
+      <w:tblGrid>
+        <w:gridCol w:w="15138"/>
+      </w:tblGrid>
+      <w:tr>
+        <w:tc>
+          <w:tcPr>
+            <w:tcW w:type="dxa" w:w="15138"/>
+            <w:shd w:val="clear" w:color="auto" w:fill="1A3A5C"/>
+            <w:tcBorders>
+              <w:top w:val="single" w:sz="4" w:space="0" w:color="CCCCCC"/>
+              <w:left w:val="single" w:sz="4" w:space="0" w:color="CCCCCC"/>
+              <w:bottom w:val="single" w:sz="4" w:space="0" w:color="CCCCCC"/>
+              <w:right w:val="single" w:sz="4" w:space="0" w:color="CCCCCC"/>
+            </w:tcBorders>
+          </w:tcPr>
+          <w:p>
+            <w:pPr>
+              <w:spacing w:before="80" w:after="80"/>
+              <w:jc w:val="center"/>
+            </w:pPr>
+            <w:r>
+              <w:rPr>
+                <w:rFonts w:ascii="Calibri" w:hAnsi="Calibri"/>
+                <w:b/>
+                <w:i w:val="0"/>
+                <w:color w:val="FFFFFF"/>
+                <w:sz w:val="18"/>
+              </w:rPr>
+              <w:t>@regulamento — Obligation of informing on responsible ownership  ·  Art.º 8.º do Regulamento 2023/0447  |  EN</w:t>
+            </w:r>
+          </w:p>
+        </w:tc>
+      </w:tr>
+      <w:tr>
+        <w:tc>
+          <w:tcPr>
+            <w:tcW w:type="dxa" w:w="15138"/>
+            <w:shd w:val="clear" w:color="auto" w:fill="D6E4F0"/>
+            <w:tcBorders>
+              <w:top w:val="single" w:sz="4" w:space="0" w:color="CCCCCC"/>
+              <w:left w:val="single" w:sz="4" w:space="0" w:color="CCCCCC"/>
+              <w:bottom w:val="single" w:sz="4" w:space="0" w:color="CCCCCC"/>
+              <w:right w:val="single" w:sz="4" w:space="0" w:color="CCCCCC"/>
+            </w:tcBorders>
+            <w:vAlign w:val="top"/>
+          </w:tcPr>
+          <w:p>
+            <w:pPr>
+              <w:spacing w:after="0" w:before="80"/>
+              <w:ind w:right="80" w:left="80" w:firstLine="0"/>
+            </w:pPr>
+            <w:r>
+              <w:rPr>
+                <w:rFonts w:ascii="Calibri" w:hAnsi="Calibri"/>
+                <w:b w:val="0"/>
+                <w:i w:val="0"/>
+                <w:color w:val="222222"/>
+                <w:sz w:val="19"/>
+              </w:rPr>
+              <w:t>Operators shall provide to the acquirer of a dog or cat written information necessary to enable him or her to ensure the welfare of the dog or cat including information on responsible ownership and on the specific needs of the dog or cat in terms of feeding, caring, health, housing and behavioural needs, as well as information on its health.</w:t>
+            </w:r>
+          </w:p>
+          <w:p>
+            <w:pPr>
+              <w:spacing w:after="0" w:before="140"/>
+              <w:ind w:right="80" w:left="80" w:firstLine="0"/>
+            </w:pPr>
+            <w:r>
+              <w:rPr>
+                <w:rFonts w:ascii="Calibri" w:hAnsi="Calibri"/>
+                <w:b w:val="0"/>
+                <w:i w:val="0"/>
+                <w:color w:val="222222"/>
+                <w:sz w:val="19"/>
+              </w:rPr>
+              <w:t>1a. The written information on the dog or cat's health referred to in the first paragraph shall include at least:</w:t>
+            </w:r>
+          </w:p>
+          <w:p>
+            <w:pPr>
+              <w:spacing w:after="0" w:before="20"/>
+              <w:ind w:right="80" w:left="360" w:hanging="280"/>
+            </w:pPr>
+            <w:r>
+              <w:rPr>
+                <w:rFonts w:ascii="Calibri" w:hAnsi="Calibri"/>
+                <w:b w:val="0"/>
+                <w:i w:val="0"/>
+                <w:color w:val="222222"/>
+                <w:sz w:val="19"/>
+              </w:rPr>
+              <w:t>(a) the dog or cat's vaccination status;</w:t>
+            </w:r>
+          </w:p>
+          <w:p>
+            <w:pPr>
+              <w:spacing w:after="0" w:before="20"/>
+              <w:ind w:right="80" w:left="360" w:hanging="280"/>
+            </w:pPr>
+            <w:r>
+              <w:rPr>
+                <w:rFonts w:ascii="Calibri" w:hAnsi="Calibri"/>
+                <w:b w:val="0"/>
+                <w:i w:val="0"/>
+                <w:color w:val="222222"/>
+                <w:sz w:val="19"/>
+              </w:rPr>
+              <w:t>(b) any medical conditions or predispositions to diseases, including allergies, that are known by the operator, and any diagnostic test results for the dog or cat that are available to the operator.</w:t>
+            </w:r>
+          </w:p>
+          <w:p>
+            <w:pPr>
+              <w:spacing w:after="0" w:before="140"/>
+              <w:ind w:right="80" w:left="80" w:firstLine="0"/>
+            </w:pPr>
+            <w:r>
+              <w:rPr>
+                <w:rFonts w:ascii="Calibri" w:hAnsi="Calibri"/>
+                <w:b w:val="0"/>
+                <w:i w:val="0"/>
+                <w:color w:val="222222"/>
+                <w:sz w:val="19"/>
+              </w:rPr>
+              <w:t>In case the information on the dog's or cat's health is documented in a document required under Regulation (EU) 2016/429, the operator shall transmit that document to the acquirer.</w:t>
+            </w:r>
+          </w:p>
+        </w:tc>
+      </w:tr>
+    </w:tbl>
+    <w:p>
+      <w:pPr>
+        <w:spacing w:after="80"/>
+      </w:pPr>
+    </w:p>
+    <w:tbl>
+      <w:tblPr>
+        <w:tblLook w:firstColumn="1" w:firstRow="1" w:lastColumn="0" w:lastRow="0" w:noHBand="0" w:noVBand="1" w:val="04A0"/>
+        <w:tblW w:w="5000" w:type="pct"/>
+      </w:tblPr>
+      <w:tblGrid>
+        <w:gridCol w:w="15138"/>
+      </w:tblGrid>
+      <w:tr>
+        <w:tc>
+          <w:tcPr>
+            <w:tcW w:type="dxa" w:w="15138"/>
+            <w:shd w:val="clear" w:color="auto" w:fill="2471A3"/>
+            <w:tcBorders>
+              <w:top w:val="single" w:sz="4" w:space="0" w:color="CCCCCC"/>
+              <w:left w:val="single" w:sz="4" w:space="0" w:color="CCCCCC"/>
+              <w:bottom w:val="single" w:sz="4" w:space="0" w:color="CCCCCC"/>
+              <w:right w:val="single" w:sz="4" w:space="0" w:color="CCCCCC"/>
+            </w:tcBorders>
+          </w:tcPr>
+          <w:p>
+            <w:pPr>
+              <w:spacing w:before="80" w:after="80"/>
+              <w:jc w:val="center"/>
+            </w:pPr>
+            <w:r>
+              <w:rPr>
+                <w:rFonts w:ascii="Calibri" w:hAnsi="Calibri"/>
+                <w:b/>
+                <w:i w:val="0"/>
+                <w:color w:val="FFFFFF"/>
+                <w:sz w:val="18"/>
+              </w:rPr>
+              <w:t>@regulamento — Tradução PT-PT  ·  Art.º 8.º do Regulamento 2023/0447</w:t>
+            </w:r>
+          </w:p>
+        </w:tc>
+      </w:tr>
+      <w:tr>
+        <w:tc>
+          <w:tcPr>
+            <w:tcW w:type="dxa" w:w="15138"/>
+            <w:shd w:val="clear" w:color="auto" w:fill="EBF5FB"/>
+            <w:tcBorders>
+              <w:top w:val="single" w:sz="4" w:space="0" w:color="CCCCCC"/>
+              <w:left w:val="single" w:sz="4" w:space="0" w:color="CCCCCC"/>
+              <w:bottom w:val="single" w:sz="4" w:space="0" w:color="CCCCCC"/>
+              <w:right w:val="single" w:sz="4" w:space="0" w:color="CCCCCC"/>
+            </w:tcBorders>
+            <w:vAlign w:val="top"/>
+          </w:tcPr>
+          <w:p>
+            <w:pPr>
+              <w:spacing w:after="0" w:before="80"/>
+              <w:ind w:right="80" w:left="80" w:firstLine="0"/>
+            </w:pPr>
+            <w:r>
+              <w:rPr>
+                <w:rFonts w:ascii="Calibri" w:hAnsi="Calibri"/>
+                <w:b w:val="0"/>
+                <w:i/>
+                <w:color w:val="222222"/>
+                <w:sz w:val="19"/>
+              </w:rPr>
+              <w:t>Os operadores devem fornecer ao adquirente de um cão ou gato informação escrita necessária para lhe permitir assegurar o bem-estar do cão ou gato, incluindo informação sobre detenção responsável e sobre as necessidades específicas do cão ou gato em termos de alimentação, cuidados, saúde, alojamento e necessidades comportamentais, bem como informação sobre a sua saúde.</w:t>
+            </w:r>
+          </w:p>
+          <w:p>
+            <w:pPr>
+              <w:spacing w:after="0" w:before="140"/>
+              <w:ind w:right="80" w:left="80" w:firstLine="0"/>
+            </w:pPr>
+            <w:r>
+              <w:rPr>
+                <w:rFonts w:ascii="Calibri" w:hAnsi="Calibri"/>
+                <w:b w:val="0"/>
+                <w:i/>
+                <w:color w:val="222222"/>
+                <w:sz w:val="19"/>
+              </w:rPr>
+              <w:t>1a. A informação escrita sobre a saúde do cão ou gato referida no parágrafo anterior deve incluir pelo menos:</w:t>
+            </w:r>
+          </w:p>
+          <w:p>
+            <w:pPr>
+              <w:spacing w:after="0" w:before="20"/>
+              <w:ind w:right="80" w:left="360" w:hanging="280"/>
+            </w:pPr>
+            <w:r>
+              <w:rPr>
+                <w:rFonts w:ascii="Calibri" w:hAnsi="Calibri"/>
+                <w:b w:val="0"/>
+                <w:i/>
+                <w:color w:val="222222"/>
+                <w:sz w:val="19"/>
+              </w:rPr>
+              <w:t>(a) o estado de vacinação do cão ou gato;</w:t>
+            </w:r>
+          </w:p>
+          <w:p>
+            <w:pPr>
+              <w:spacing w:after="0" w:before="20"/>
+              <w:ind w:right="80" w:left="360" w:hanging="280"/>
+            </w:pPr>
+            <w:r>
+              <w:rPr>
+                <w:rFonts w:ascii="Calibri" w:hAnsi="Calibri"/>
+                <w:b w:val="0"/>
+                <w:i/>
+                <w:color w:val="222222"/>
+                <w:sz w:val="19"/>
+              </w:rPr>
+              <w:t>(b) quaisquer condições médicas ou predisposições a doenças, incluindo alergias, conhecidas pelo operador, e quaisquer resultados de testes de diagnóstico para o cão ou gato que estejam disponíveis para o operador.</w:t>
+            </w:r>
+          </w:p>
+          <w:p>
+            <w:pPr>
+              <w:spacing w:after="0" w:before="140"/>
+              <w:ind w:right="80" w:left="80" w:firstLine="0"/>
+            </w:pPr>
+            <w:r>
+              <w:rPr>
+                <w:rFonts w:ascii="Calibri" w:hAnsi="Calibri"/>
+                <w:b w:val="0"/>
+                <w:i/>
+                <w:color w:val="222222"/>
+                <w:sz w:val="19"/>
+              </w:rPr>
+              <w:t>Caso a informação sobre a saúde do cão ou gato esteja documentada num documento exigido sob o Regulamento (UE) 2016/429, o operador deve transmitir esse documento ao adquirente.</w:t>
+            </w:r>
+          </w:p>
+        </w:tc>
+      </w:tr>
+    </w:tbl>
+    <w:p>
+      <w:pPr>
+        <w:spacing w:after="80"/>
+      </w:pPr>
+    </w:p>
+    <w:tbl>
+      <w:tblPr>
+        <w:tblLook w:firstColumn="1" w:firstRow="1" w:lastColumn="0" w:lastRow="0" w:noHBand="0" w:noVBand="1" w:val="04A0"/>
+        <w:tblW w:w="5000" w:type="pct"/>
+      </w:tblPr>
+      <w:tblGrid>
+        <w:gridCol w:w="5046"/>
+        <w:gridCol w:w="5046"/>
+        <w:gridCol w:w="5046"/>
+      </w:tblGrid>
+      <w:tr>
+        <w:tc>
+          <w:tcPr>
+            <w:tcW w:type="dxa" w:w="5046"/>
+            <w:shd w:val="clear" w:color="auto" w:fill="1E5631"/>
+            <w:tcBorders>
+              <w:top w:val="single" w:sz="4" w:space="0" w:color="CCCCCC"/>
+              <w:left w:val="single" w:sz="4" w:space="0" w:color="CCCCCC"/>
+              <w:bottom w:val="single" w:sz="4" w:space="0" w:color="CCCCCC"/>
+              <w:right w:val="single" w:sz="4" w:space="0" w:color="CCCCCC"/>
+            </w:tcBorders>
+          </w:tcPr>
+          <w:p>
+            <w:pPr>
+              <w:spacing w:before="80" w:after="80"/>
+              <w:jc w:val="center"/>
+            </w:pPr>
+            <w:r>
+              <w:rPr>
+                <w:rFonts w:ascii="Calibri" w:hAnsi="Calibri"/>
+                <w:b/>
+                <w:i w:val="0"/>
+                <w:color w:val="FFFFFF"/>
+                <w:sz w:val="18"/>
+              </w:rPr>
+              <w:t>@rgbeac (proposta jun. 2025)</w:t>
+            </w:r>
+          </w:p>
+        </w:tc>
+        <w:tc>
+          <w:tcPr>
+            <w:tcW w:type="dxa" w:w="5046"/>
+            <w:shd w:val="clear" w:color="auto" w:fill="7E4C00"/>
+            <w:tcBorders>
+              <w:top w:val="single" w:sz="4" w:space="0" w:color="CCCCCC"/>
+              <w:left w:val="single" w:sz="4" w:space="0" w:color="CCCCCC"/>
+              <w:bottom w:val="single" w:sz="4" w:space="0" w:color="CCCCCC"/>
+              <w:right w:val="single" w:sz="4" w:space="0" w:color="CCCCCC"/>
+            </w:tcBorders>
+          </w:tcPr>
+          <w:p>
+            <w:pPr>
+              <w:spacing w:before="80" w:after="80"/>
+              <w:jc w:val="center"/>
+            </w:pPr>
+            <w:r>
+              <w:rPr>
+                <w:rFonts w:ascii="Calibri" w:hAnsi="Calibri"/>
+                <w:b/>
+                <w:i w:val="0"/>
+                <w:color w:val="FFFFFF"/>
+                <w:sz w:val="18"/>
+              </w:rPr>
+              <w:t>@codigo (DL n.º 214/2013)</w:t>
+            </w:r>
+          </w:p>
+        </w:tc>
+        <w:tc>
+          <w:tcPr>
+            <w:tcW w:type="dxa" w:w="5046"/>
+            <w:shd w:val="clear" w:color="auto" w:fill="006064"/>
+            <w:tcBorders>
+              <w:top w:val="single" w:sz="4" w:space="0" w:color="CCCCCC"/>
+              <w:left w:val="single" w:sz="4" w:space="0" w:color="CCCCCC"/>
+              <w:bottom w:val="single" w:sz="4" w:space="0" w:color="CCCCCC"/>
+              <w:right w:val="single" w:sz="4" w:space="0" w:color="CCCCCC"/>
+            </w:tcBorders>
+          </w:tcPr>
+          <w:p>
+            <w:pPr>
+              <w:spacing w:before="80" w:after="80"/>
+              <w:jc w:val="center"/>
+            </w:pPr>
+            <w:r>
+              <w:rPr>
+                <w:rFonts w:ascii="Calibri" w:hAnsi="Calibri"/>
+                <w:b/>
+                <w:i w:val="0"/>
+                <w:color w:val="FFFFFF"/>
+                <w:sz w:val="18"/>
+              </w:rPr>
+              <w:t>@legislacao (legislação vigente)</w:t>
+            </w:r>
+          </w:p>
+        </w:tc>
+      </w:tr>
+      <w:tr>
+        <w:tc>
+          <w:tcPr>
+            <w:tcW w:type="dxa" w:w="5046"/>
+            <w:shd w:val="clear" w:color="auto" w:fill="D5E8D4"/>
+            <w:tcBorders>
+              <w:top w:val="single" w:sz="4" w:space="0" w:color="CCCCCC"/>
+              <w:left w:val="single" w:sz="4" w:space="0" w:color="CCCCCC"/>
+              <w:bottom w:val="single" w:sz="4" w:space="0" w:color="CCCCCC"/>
+              <w:right w:val="single" w:sz="4" w:space="0" w:color="CCCCCC"/>
+            </w:tcBorders>
+            <w:vAlign w:val="top"/>
+          </w:tcPr>
+          <w:p>
+            <w:pPr>
+              <w:spacing w:before="80" w:after="40"/>
+              <w:ind w:left="80" w:right="80"/>
+            </w:pPr>
+            <w:r>
+              <w:rPr>
+                <w:rFonts w:ascii="Calibri" w:hAnsi="Calibri"/>
+                <w:b/>
+                <w:i/>
+                <w:color w:val="555555"/>
+                <w:sz w:val="16"/>
+              </w:rPr>
+              <w:t>Art.º 8.º do RGBEAC (proposta, jun. 2025)</w:t>
+            </w:r>
+          </w:p>
+          <w:p>
+            <w:pPr>
+              <w:spacing w:after="0" w:before="140"/>
+              <w:ind w:right="80" w:left="80" w:firstLine="0"/>
+            </w:pPr>
+            <w:r>
+              <w:rPr>
+                <w:rFonts w:ascii="Calibri" w:hAnsi="Calibri"/>
+                <w:b w:val="0"/>
+                <w:i w:val="0"/>
+                <w:color w:val="222222"/>
+                <w:sz w:val="19"/>
+              </w:rPr>
+              <w:t>1 — O detentor do animal de companhia deve possuir informação sobre as obrigações inerentes à sua detenção, incluindo direitos e responsabilidades, normas de bem-estar, cuidados de saúde, comportamento, necessidades específicas da espécie/raça, duração de vida esperada, custos de manutenção, e proibição de abandono.</w:t>
+            </w:r>
+          </w:p>
+          <w:p>
+            <w:pPr>
+              <w:spacing w:after="0" w:before="140"/>
+              <w:ind w:right="80" w:left="80" w:firstLine="0"/>
+            </w:pPr>
+            <w:r>
+              <w:rPr>
+                <w:rFonts w:ascii="Calibri" w:hAnsi="Calibri"/>
+                <w:b w:val="0"/>
+                <w:i w:val="0"/>
+                <w:color w:val="222222"/>
+                <w:sz w:val="19"/>
+              </w:rPr>
+              <w:t>2 — Os comerciantes devem fornecer por escrito ao adquirente informação completa antes da transferência do animal, incluindo identidade e dados de contacto do comerciante, dados de identificação do animal, cuidados de saúde e estado de vacinação, e certificado de origem ou de compatibilidade quando aplicável.</w:t>
+            </w:r>
+          </w:p>
+        </w:tc>
+        <w:tc>
+          <w:tcPr>
+            <w:tcW w:type="dxa" w:w="5046"/>
+            <w:shd w:val="clear" w:color="auto" w:fill="FFE6CC"/>
+            <w:tcBorders>
+              <w:top w:val="single" w:sz="4" w:space="0" w:color="CCCCCC"/>
+              <w:left w:val="single" w:sz="4" w:space="0" w:color="CCCCCC"/>
+              <w:bottom w:val="single" w:sz="4" w:space="0" w:color="CCCCCC"/>
+              <w:right w:val="single" w:sz="4" w:space="0" w:color="CCCCCC"/>
+            </w:tcBorders>
+            <w:vAlign w:val="top"/>
+          </w:tcPr>
+          <w:p>
+            <w:pPr>
+              <w:spacing w:before="80" w:after="40"/>
+              <w:ind w:left="80" w:right="80"/>
+            </w:pPr>
+            <w:r>
+              <w:rPr>
+                <w:rFonts w:ascii="Calibri" w:hAnsi="Calibri"/>
+                <w:b/>
+                <w:i/>
+                <w:color w:val="555555"/>
+                <w:sz w:val="16"/>
+              </w:rPr>
+              <w:t>Art.º 57.º do Código do Animal (DL n.º 214/2013)</w:t>
+            </w:r>
+          </w:p>
+          <w:p>
+            <w:pPr>
+              <w:spacing w:after="0" w:before="140"/>
+              <w:ind w:right="80" w:left="80" w:firstLine="0"/>
+            </w:pPr>
+            <w:r>
+              <w:rPr>
+                <w:rFonts w:ascii="Calibri" w:hAnsi="Calibri"/>
+                <w:b w:val="0"/>
+                <w:i w:val="0"/>
+                <w:color w:val="222222"/>
+                <w:sz w:val="19"/>
+              </w:rPr>
+              <w:t>1 — O detentor do animal deve ter acesso a informação sobre:</w:t>
+            </w:r>
+          </w:p>
+          <w:p>
+            <w:pPr>
+              <w:spacing w:after="0" w:before="100"/>
+              <w:ind w:right="80" w:left="360" w:hanging="280"/>
+            </w:pPr>
+            <w:r>
+              <w:rPr>
+                <w:rFonts w:ascii="Calibri" w:hAnsi="Calibri"/>
+                <w:b w:val="0"/>
+                <w:i w:val="0"/>
+                <w:color w:val="222222"/>
+                <w:sz w:val="19"/>
+              </w:rPr>
+              <w:t>a) As obrigações inerentes à sua detenção, direitos e responsabilidades;</w:t>
+            </w:r>
+          </w:p>
+          <w:p>
+            <w:pPr>
+              <w:spacing w:after="0" w:before="20"/>
+              <w:ind w:right="80" w:left="360" w:hanging="280"/>
+            </w:pPr>
+            <w:r>
+              <w:rPr>
+                <w:rFonts w:ascii="Calibri" w:hAnsi="Calibri"/>
+                <w:b w:val="0"/>
+                <w:i w:val="0"/>
+                <w:color w:val="222222"/>
+                <w:sz w:val="19"/>
+              </w:rPr>
+              <w:t>b) As normas de bem-estar, cuidados de saúde e comportamento esperado;</w:t>
+            </w:r>
+          </w:p>
+          <w:p>
+            <w:pPr>
+              <w:spacing w:after="0" w:before="20"/>
+              <w:ind w:right="80" w:left="360" w:hanging="280"/>
+            </w:pPr>
+            <w:r>
+              <w:rPr>
+                <w:rFonts w:ascii="Calibri" w:hAnsi="Calibri"/>
+                <w:b w:val="0"/>
+                <w:i w:val="0"/>
+                <w:color w:val="222222"/>
+                <w:sz w:val="19"/>
+              </w:rPr>
+              <w:t>c) As necessidades específicas da espécie ou raça;</w:t>
+            </w:r>
+          </w:p>
+          <w:p>
+            <w:pPr>
+              <w:spacing w:after="0" w:before="20"/>
+              <w:ind w:right="80" w:left="360" w:hanging="280"/>
+            </w:pPr>
+            <w:r>
+              <w:rPr>
+                <w:rFonts w:ascii="Calibri" w:hAnsi="Calibri"/>
+                <w:b w:val="0"/>
+                <w:i w:val="0"/>
+                <w:color w:val="222222"/>
+                <w:sz w:val="19"/>
+              </w:rPr>
+              <w:t>d) A duração de vida esperada;</w:t>
+            </w:r>
+          </w:p>
+          <w:p>
+            <w:pPr>
+              <w:spacing w:after="0" w:before="20"/>
+              <w:ind w:right="80" w:left="360" w:hanging="280"/>
+            </w:pPr>
+            <w:r>
+              <w:rPr>
+                <w:rFonts w:ascii="Calibri" w:hAnsi="Calibri"/>
+                <w:b w:val="0"/>
+                <w:i w:val="0"/>
+                <w:color w:val="222222"/>
+                <w:sz w:val="19"/>
+              </w:rPr>
+              <w:t>e) Os custos de manutenção;</w:t>
+            </w:r>
+          </w:p>
+          <w:p>
+            <w:pPr>
+              <w:spacing w:after="0" w:before="20"/>
+              <w:ind w:right="80" w:left="360" w:hanging="280"/>
+            </w:pPr>
+            <w:r>
+              <w:rPr>
+                <w:rFonts w:ascii="Calibri" w:hAnsi="Calibri"/>
+                <w:b w:val="0"/>
+                <w:i w:val="0"/>
+                <w:color w:val="222222"/>
+                <w:sz w:val="19"/>
+              </w:rPr>
+              <w:t>f) A proibição de abandono.</w:t>
+            </w:r>
+          </w:p>
+          <w:p>
+            <w:pPr>
+              <w:spacing w:after="0" w:before="140"/>
+              <w:ind w:right="80" w:left="80" w:firstLine="0"/>
+            </w:pPr>
+            <w:r>
+              <w:rPr>
+                <w:rFonts w:ascii="Calibri" w:hAnsi="Calibri"/>
+                <w:b w:val="0"/>
+                <w:i w:val="0"/>
+                <w:color w:val="222222"/>
+                <w:sz w:val="19"/>
+              </w:rPr>
+              <w:t>2 — Os criadores e comerciantes devem fornecer informação escrita completa ao adquirente antes da transferência do animal, incluindo dados de identificação e cuidados de saúde.</w:t>
+            </w:r>
+          </w:p>
+        </w:tc>
+        <w:tc>
+          <w:tcPr>
+            <w:tcW w:type="dxa" w:w="5046"/>
+            <w:shd w:val="clear" w:color="auto" w:fill="E0F7FA"/>
+            <w:tcBorders>
+              <w:top w:val="single" w:sz="4" w:space="0" w:color="CCCCCC"/>
+              <w:left w:val="single" w:sz="4" w:space="0" w:color="CCCCCC"/>
+              <w:bottom w:val="single" w:sz="4" w:space="0" w:color="CCCCCC"/>
+              <w:right w:val="single" w:sz="4" w:space="0" w:color="CCCCCC"/>
+            </w:tcBorders>
+            <w:vAlign w:val="top"/>
+          </w:tcPr>
+          <w:p>
+            <w:pPr>
+              <w:spacing w:before="80" w:after="40"/>
+              <w:ind w:left="80" w:right="80"/>
+            </w:pPr>
+            <w:r>
+              <w:rPr>
+                <w:rFonts w:ascii="Calibri" w:hAnsi="Calibri"/>
+                <w:b/>
+                <w:i/>
+                <w:color w:val="555555"/>
+                <w:sz w:val="16"/>
+              </w:rPr>
+              <w:t>Art.º 20.º do DL n.º 276/2001, de 17 de outubro</w:t>
+            </w:r>
+          </w:p>
+          <w:p>
+            <w:pPr>
+              <w:spacing w:after="0" w:before="140"/>
+              <w:ind w:right="80" w:left="80" w:firstLine="0"/>
+            </w:pPr>
+            <w:r>
+              <w:rPr>
+                <w:rFonts w:ascii="Calibri" w:hAnsi="Calibri"/>
+                <w:b w:val="0"/>
+                <w:i w:val="0"/>
+                <w:color w:val="222222"/>
+                <w:sz w:val="19"/>
+              </w:rPr>
+              <w:t>1 — O proprietário ou detentor de animal de companhia deve ter acesso a informação adequada sobre as suas obrigações relativas ao bem-estar do animal.</w:t>
+            </w:r>
+          </w:p>
+          <w:p>
+            <w:pPr>
+              <w:spacing w:after="0" w:before="140"/>
+              <w:ind w:right="80" w:left="80" w:firstLine="0"/>
+            </w:pPr>
+            <w:r>
+              <w:rPr>
+                <w:rFonts w:ascii="Calibri" w:hAnsi="Calibri"/>
+                <w:b w:val="0"/>
+                <w:i w:val="0"/>
+                <w:color w:val="222222"/>
+                <w:sz w:val="19"/>
+              </w:rPr>
+              <w:t>2 — Os detentores de animais de companhia que os comercializem devem fornecer informação ao adquirente sobre o estado de saúde do animal e vacinas efetuadas.</w:t>
+            </w:r>
+          </w:p>
+        </w:tc>
+      </w:tr>
+    </w:tbl>
+    <w:p>
+      <w:pPr>
+        <w:spacing w:after="80"/>
+      </w:pPr>
+    </w:p>
+    <w:tbl>
+      <w:tblPr>
+        <w:tblLook w:firstColumn="1" w:firstRow="1" w:lastColumn="0" w:lastRow="0" w:noHBand="0" w:noVBand="1" w:val="04A0"/>
+        <w:tblW w:w="5000" w:type="pct"/>
+      </w:tblPr>
+      <w:tblGrid>
+        <w:gridCol w:w="15138"/>
+      </w:tblGrid>
+      <w:tr>
+        <w:tc>
+          <w:tcPr>
+            <w:tcW w:type="dxa" w:w="15138"/>
+            <w:shd w:val="clear" w:color="auto" w:fill="5D2A8A"/>
+            <w:tcBorders>
+              <w:top w:val="single" w:sz="4" w:space="0" w:color="CCCCCC"/>
+              <w:left w:val="single" w:sz="4" w:space="0" w:color="CCCCCC"/>
+              <w:bottom w:val="single" w:sz="4" w:space="0" w:color="CCCCCC"/>
+              <w:right w:val="single" w:sz="4" w:space="0" w:color="CCCCCC"/>
+            </w:tcBorders>
+          </w:tcPr>
+          <w:p>
+            <w:pPr>
+              <w:spacing w:before="80" w:after="80"/>
+              <w:jc w:val="center"/>
+            </w:pPr>
+            <w:r>
+              <w:rPr>
+                <w:rFonts w:ascii="Calibri" w:hAnsi="Calibri"/>
+                <w:b/>
+                <w:i w:val="0"/>
+                <w:color w:val="FFFFFF"/>
+                <w:sz w:val="18"/>
+              </w:rPr>
+              <w:t>DIVERGÊNCIA FACE AO REGULAMENTO  ·  Necessidade de alteração: Sim</w:t>
+            </w:r>
+          </w:p>
+        </w:tc>
+      </w:tr>
+      <w:tr>
+        <w:tc>
+          <w:tcPr>
+            <w:tcW w:type="dxa" w:w="15138"/>
+            <w:shd w:val="clear" w:color="auto" w:fill="006064"/>
+            <w:tcBorders>
+              <w:top w:val="single" w:sz="4" w:space="0" w:color="006064"/>
+              <w:left w:val="single" w:sz="4" w:space="0" w:color="006064"/>
+              <w:bottom w:val="single" w:sz="4" w:space="0" w:color="006064"/>
+              <w:right w:val="single" w:sz="4" w:space="0" w:color="006064"/>
+            </w:tcBorders>
+          </w:tcPr>
+          <w:p>
+            <w:pPr>
+              <w:spacing w:before="80" w:after="0"/>
+              <w:ind w:left="120"/>
+            </w:pPr>
+            <w:r>
+              <w:rPr>
+                <w:rFonts w:ascii="Calibri" w:hAnsi="Calibri"/>
+                <w:b/>
+                <w:i w:val="0"/>
+                <w:color w:val="FFFFFF"/>
+                <w:sz w:val="17"/>
+              </w:rPr>
+              <w:t>@legislacao</w:t>
+            </w:r>
+          </w:p>
+        </w:tc>
+      </w:tr>
+      <w:tr>
+        <w:tc>
+          <w:tcPr>
+            <w:tcW w:type="dxa" w:w="15138"/>
+            <w:shd w:val="clear" w:color="auto" w:fill="E0F7FA"/>
+            <w:tcBorders>
+              <w:top w:val="single" w:sz="4" w:space="0" w:color="CCCCCC"/>
+              <w:left w:val="single" w:sz="4" w:space="0" w:color="CCCCCC"/>
+              <w:bottom w:val="single" w:sz="4" w:space="0" w:color="CCCCCC"/>
+              <w:right w:val="single" w:sz="4" w:space="0" w:color="CCCCCC"/>
+            </w:tcBorders>
+            <w:vAlign w:val="top"/>
+          </w:tcPr>
+          <w:p>
+            <w:pPr>
+              <w:spacing w:before="80" w:after="80"/>
+              <w:ind w:left="120" w:right="120"/>
+            </w:pPr>
+            <w:r>
+              <w:rPr>
+                <w:rFonts w:ascii="Calibri" w:hAnsi="Calibri"/>
+                <w:b w:val="0"/>
+                <w:i w:val="0"/>
+                <w:color w:val="222222"/>
+                <w:sz w:val="18"/>
+              </w:rPr>
+              <w:t>O DL n.º 276/2001 (art.º 20.º) é genérico e não especifica a forma escrita nem detalhes de conteúdo. O @regulamento exige informação escrita sobre necessidades específicas de bem-estar (alimentação, cuidados, saúde, alojamento, comportamento) e condiciona a transferência à transmissão dessa informação.</w:t>
+            </w:r>
+          </w:p>
+        </w:tc>
+      </w:tr>
+      <w:tr>
+        <w:tc>
+          <w:tcPr>
+            <w:tcW w:type="dxa" w:w="15138"/>
+            <w:shd w:val="clear" w:color="auto" w:fill="7E4C00"/>
+            <w:tcBorders>
+              <w:top w:val="single" w:sz="4" w:space="0" w:color="7E4C00"/>
+              <w:left w:val="single" w:sz="4" w:space="0" w:color="7E4C00"/>
+              <w:bottom w:val="single" w:sz="4" w:space="0" w:color="7E4C00"/>
+              <w:right w:val="single" w:sz="4" w:space="0" w:color="7E4C00"/>
+            </w:tcBorders>
+          </w:tcPr>
+          <w:p>
+            <w:pPr>
+              <w:spacing w:before="80" w:after="0"/>
+              <w:ind w:left="120"/>
+            </w:pPr>
+            <w:r>
+              <w:rPr>
+                <w:rFonts w:ascii="Calibri" w:hAnsi="Calibri"/>
+                <w:b/>
+                <w:i w:val="0"/>
+                <w:color w:val="FFFFFF"/>
+                <w:sz w:val="17"/>
+              </w:rPr>
+              <w:t>@codigo</w:t>
+            </w:r>
+          </w:p>
+        </w:tc>
+      </w:tr>
+      <w:tr>
+        <w:tc>
+          <w:tcPr>
+            <w:tcW w:type="dxa" w:w="15138"/>
+            <w:shd w:val="clear" w:color="auto" w:fill="FFE6CC"/>
+            <w:tcBorders>
+              <w:top w:val="single" w:sz="4" w:space="0" w:color="CCCCCC"/>
+              <w:left w:val="single" w:sz="4" w:space="0" w:color="CCCCCC"/>
+              <w:bottom w:val="single" w:sz="4" w:space="0" w:color="CCCCCC"/>
+              <w:right w:val="single" w:sz="4" w:space="0" w:color="CCCCCC"/>
+            </w:tcBorders>
+            <w:vAlign w:val="top"/>
+          </w:tcPr>
+          <w:p>
+            <w:pPr>
+              <w:spacing w:before="80" w:after="80"/>
+              <w:ind w:left="120" w:right="120"/>
+            </w:pPr>
+            <w:r>
+              <w:rPr>
+                <w:rFonts w:ascii="Calibri" w:hAnsi="Calibri"/>
+                <w:b w:val="0"/>
+                <w:i w:val="0"/>
+                <w:color w:val="222222"/>
+                <w:sz w:val="18"/>
+              </w:rPr>
+              <w:t>O @codigo (art.º 57.º) exige informação escrita mas com âmbito mais amplo (duração de vida, custos) do que o @regulamento, que se foca especificamente em bem-estar e saúde.</w:t>
+            </w:r>
+          </w:p>
+        </w:tc>
+      </w:tr>
+      <w:tr>
+        <w:tc>
+          <w:tcPr>
+            <w:tcW w:type="dxa" w:w="15138"/>
+            <w:shd w:val="clear" w:color="auto" w:fill="1E5631"/>
+            <w:tcBorders>
+              <w:top w:val="single" w:sz="4" w:space="0" w:color="1E5631"/>
+              <w:left w:val="single" w:sz="4" w:space="0" w:color="1E5631"/>
+              <w:bottom w:val="single" w:sz="4" w:space="0" w:color="1E5631"/>
+              <w:right w:val="single" w:sz="4" w:space="0" w:color="1E5631"/>
+            </w:tcBorders>
+          </w:tcPr>
+          <w:p>
+            <w:pPr>
+              <w:spacing w:before="80" w:after="0"/>
+              <w:ind w:left="120"/>
+            </w:pPr>
+            <w:r>
+              <w:rPr>
+                <w:rFonts w:ascii="Calibri" w:hAnsi="Calibri"/>
+                <w:b/>
+                <w:i w:val="0"/>
+                <w:color w:val="FFFFFF"/>
+                <w:sz w:val="17"/>
+              </w:rPr>
+              <w:t>@rgbeac</w:t>
+            </w:r>
+          </w:p>
+        </w:tc>
+      </w:tr>
+      <w:tr>
+        <w:tc>
+          <w:tcPr>
+            <w:tcW w:type="dxa" w:w="15138"/>
+            <w:shd w:val="clear" w:color="auto" w:fill="D5E8D4"/>
+            <w:tcBorders>
+              <w:top w:val="single" w:sz="4" w:space="0" w:color="CCCCCC"/>
+              <w:left w:val="single" w:sz="4" w:space="0" w:color="CCCCCC"/>
+              <w:bottom w:val="single" w:sz="4" w:space="0" w:color="CCCCCC"/>
+              <w:right w:val="single" w:sz="4" w:space="0" w:color="CCCCCC"/>
+            </w:tcBorders>
+            <w:vAlign w:val="top"/>
+          </w:tcPr>
+          <w:p>
+            <w:pPr>
+              <w:spacing w:before="80" w:after="80"/>
+              <w:ind w:left="120" w:right="120"/>
+            </w:pPr>
+            <w:r>
+              <w:rPr>
+                <w:rFonts w:ascii="Calibri" w:hAnsi="Calibri"/>
+                <w:b w:val="0"/>
+                <w:i w:val="0"/>
+                <w:color w:val="222222"/>
+                <w:sz w:val="18"/>
+              </w:rPr>
+              <w:t>O @rgbeac (art.º 8.º) aproxima-se do conteúdo do @regulamento, exigindo informação escrita antes da transferência, incluindo dados de saúde e vacinação, mas ainda sem o enfoque específico em bem-estar comportamental.</w:t>
+            </w:r>
+          </w:p>
+        </w:tc>
+      </w:tr>
+      <w:tr>
+        <w:tc>
+          <w:tcPr>
+            <w:tcW w:type="dxa" w:w="15138"/>
+            <w:shd w:val="clear" w:color="auto" w:fill="5D2A8A"/>
+            <w:tcBorders>
+              <w:top w:val="single" w:sz="4" w:space="0" w:color="5D2A8A"/>
+              <w:left w:val="single" w:sz="4" w:space="0" w:color="5D2A8A"/>
+              <w:bottom w:val="single" w:sz="4" w:space="0" w:color="5D2A8A"/>
+              <w:right w:val="single" w:sz="4" w:space="0" w:color="5D2A8A"/>
+            </w:tcBorders>
+          </w:tcPr>
+          <w:p>
+            <w:pPr>
+              <w:spacing w:before="80" w:after="0"/>
+              <w:ind w:left="120"/>
+            </w:pPr>
+            <w:r>
+              <w:rPr>
+                <w:rFonts w:ascii="Calibri" w:hAnsi="Calibri"/>
+                <w:b/>
+                <w:i w:val="0"/>
+                <w:color w:val="FFFFFF"/>
+                <w:sz w:val="17"/>
+              </w:rPr>
+              <w:t>Sumário / Proposta</w:t>
+            </w:r>
+          </w:p>
+        </w:tc>
+      </w:tr>
+      <w:tr>
+        <w:tc>
+          <w:tcPr>
+            <w:tcW w:type="dxa" w:w="15138"/>
+            <w:shd w:val="clear" w:color="auto" w:fill="EAD7F7"/>
+            <w:tcBorders>
+              <w:top w:val="single" w:sz="4" w:space="0" w:color="CCCCCC"/>
+              <w:left w:val="single" w:sz="4" w:space="0" w:color="CCCCCC"/>
+              <w:bottom w:val="single" w:sz="4" w:space="0" w:color="CCCCCC"/>
+              <w:right w:val="single" w:sz="4" w:space="0" w:color="CCCCCC"/>
+            </w:tcBorders>
+            <w:vAlign w:val="top"/>
+          </w:tcPr>
+          <w:p>
+            <w:pPr>
+              <w:spacing w:before="80" w:after="80"/>
+              <w:ind w:left="120" w:right="120"/>
+            </w:pPr>
+            <w:r>
+              <w:rPr>
+                <w:rFonts w:ascii="Calibri" w:hAnsi="Calibri"/>
+                <w:b w:val="0"/>
+                <w:i w:val="0"/>
+                <w:color w:val="222222"/>
+                <w:sz w:val="18"/>
+              </w:rPr>
+              <w:t>Necessidade de alteração: (1) formalizar requisito de informação escrita como condição de transferência de animal; (2) especificar conteúdo obrigatório sobre bem-estar, saúde e necessidades comportamentais; (3) harmonizar entre @codigo e @rgbeac quanto a âmbito e forma.</w:t>
+            </w:r>
+          </w:p>
+        </w:tc>
+      </w:tr>
+    </w:tbl>
+    <w:p>
+      <w:pPr>
+        <w:spacing w:after="80"/>
+      </w:pPr>
+    </w:p>
+    <w:tbl>
+      <w:tblPr>
+        <w:tblLook w:firstColumn="1" w:firstRow="1" w:lastColumn="0" w:lastRow="0" w:noHBand="0" w:noVBand="1" w:val="04A0"/>
+        <w:tblW w:w="5000" w:type="pct"/>
+      </w:tblPr>
+      <w:tblGrid>
+        <w:gridCol w:w="15138"/>
+      </w:tblGrid>
+      <w:tr>
+        <w:tc>
+          <w:tcPr>
+            <w:tcW w:type="dxa" w:w="15138"/>
+            <w:shd w:val="clear" w:color="auto" w:fill="4A4A4A"/>
+            <w:tcBorders>
+              <w:top w:val="single" w:sz="4" w:space="0" w:color="CCCCCC"/>
+              <w:left w:val="single" w:sz="4" w:space="0" w:color="CCCCCC"/>
+              <w:bottom w:val="single" w:sz="4" w:space="0" w:color="CCCCCC"/>
+              <w:right w:val="single" w:sz="4" w:space="0" w:color="CCCCCC"/>
+            </w:tcBorders>
+          </w:tcPr>
+          <w:p>
+            <w:pPr>
+              <w:spacing w:before="80" w:after="80"/>
+              <w:jc w:val="center"/>
+            </w:pPr>
+            <w:r>
+              <w:rPr>
+                <w:rFonts w:ascii="Calibri" w:hAnsi="Calibri"/>
+                <w:b/>
+                <w:i w:val="0"/>
+                <w:color w:val="FFFFFF"/>
+                <w:sz w:val="18"/>
+              </w:rPr>
+              <w:t>NOTAS DE REUNIÃO</w:t>
+            </w:r>
+          </w:p>
+        </w:tc>
+      </w:tr>
+      <w:tr>
+        <w:tc>
+          <w:tcPr>
+            <w:tcW w:type="dxa" w:w="15138"/>
+            <w:shd w:val="clear" w:color="auto" w:fill="F5F5F5"/>
+            <w:tcBorders>
+              <w:top w:val="single" w:sz="4" w:space="0" w:color="CCCCCC"/>
+              <w:left w:val="single" w:sz="4" w:space="0" w:color="CCCCCC"/>
+              <w:bottom w:val="single" w:sz="4" w:space="0" w:color="CCCCCC"/>
+              <w:right w:val="single" w:sz="4" w:space="0" w:color="CCCCCC"/>
+            </w:tcBorders>
+          </w:tcPr>
+          <w:p>
+            <w:pPr>
+              <w:spacing w:before="120" w:after="800"/>
+              <w:ind w:left="80"/>
+            </w:pPr>
+            <w:r>
+              <w:rPr>
+                <w:rFonts w:ascii="Calibri" w:hAnsi="Calibri"/>
+                <w:b w:val="0"/>
+                <w:i/>
+                <w:color w:val="888888"/>
+                <w:sz w:val="19"/>
+              </w:rPr>
+              <w:t>(espaço para anotações da reunião)</w:t>
+            </w:r>
+          </w:p>
+        </w:tc>
+      </w:tr>
+    </w:tbl>
+    <w:p/>
+    <w:p>
+      <w:pPr>
+        <w:spacing w:before="0" w:after="320"/>
+      </w:pPr>
+      <w:r>
+        <w:rPr>
+          <w:color w:val="CCCCCC"/>
+          <w:sz w:val="16"/>
+        </w:rPr>
+        <w:t>────────────────────────────────────────────────────────────────────────────────</w:t>
+      </w:r>
+    </w:p>
+    <w:p>
+      <w:r>
+        <w:br w:type="page"/>
+      </w:r>
+    </w:p>
+    <w:tbl>
+      <w:tblPr>
+        <w:tblLook w:firstColumn="1" w:firstRow="1" w:lastColumn="0" w:lastRow="0" w:noHBand="0" w:noVBand="1" w:val="04A0"/>
+        <w:tblW w:w="5000" w:type="pct"/>
+        <w:tblBorders>
+          <w:top w:val="none" w:sz="0" w:space="0" w:color="auto"/>
+          <w:left w:val="none" w:sz="0" w:space="0" w:color="auto"/>
+          <w:bottom w:val="none" w:sz="0" w:space="0" w:color="auto"/>
+          <w:right w:val="none" w:sz="0" w:space="0" w:color="auto"/>
+          <w:insideH w:val="none" w:sz="0" w:space="0" w:color="auto"/>
+          <w:insideV w:val="none" w:sz="0" w:space="0" w:color="auto"/>
+        </w:tblBorders>
+      </w:tblPr>
+      <w:tblGrid>
+        <w:gridCol w:w="7569"/>
+        <w:gridCol w:w="7569"/>
+      </w:tblGrid>
+      <w:tr>
+        <w:tc>
+          <w:tcPr>
+            <w:tcW w:type="dxa" w:w="7569"/>
+            <w:shd w:val="clear" w:color="auto" w:fill="1A1A2E"/>
+            <w:tcBorders>
+              <w:top w:val="single" w:sz="4" w:space="0" w:color="1A1A2E"/>
+              <w:left w:val="single" w:sz="4" w:space="0" w:color="1A1A2E"/>
+              <w:bottom w:val="single" w:sz="4" w:space="0" w:color="1A1A2E"/>
+              <w:right w:val="single" w:sz="4" w:space="0" w:color="1A1A2E"/>
+            </w:tcBorders>
+          </w:tcPr>
+          <w:p>
+            <w:pPr>
+              <w:spacing w:before="160" w:after="160"/>
+              <w:ind w:left="200"/>
+            </w:pPr>
+            <w:r>
+              <w:rPr>
+                <w:rFonts w:ascii="Calibri" w:hAnsi="Calibri"/>
+                <w:b/>
+                <w:i w:val="0"/>
+                <w:color w:val="FFFFFF"/>
+                <w:sz w:val="22"/>
+              </w:rPr>
+              <w:t>ART-09</w:t>
+            </w:r>
+          </w:p>
+        </w:tc>
+        <w:tc>
+          <w:tcPr>
+            <w:tcW w:type="dxa" w:w="7569"/>
+            <w:shd w:val="clear" w:color="auto" w:fill="2C3E6B"/>
+            <w:tcBorders>
+              <w:top w:val="single" w:sz="4" w:space="0" w:color="2C3E6B"/>
+              <w:left w:val="single" w:sz="4" w:space="0" w:color="2C3E6B"/>
+              <w:bottom w:val="single" w:sz="4" w:space="0" w:color="2C3E6B"/>
+              <w:right w:val="single" w:sz="4" w:space="0" w:color="2C3E6B"/>
+            </w:tcBorders>
+          </w:tcPr>
+          <w:p>
+            <w:pPr>
+              <w:spacing w:before="160" w:after="160"/>
+              <w:ind w:left="200"/>
+            </w:pPr>
+            <w:r>
+              <w:rPr>
+                <w:rFonts w:ascii="Calibri" w:hAnsi="Calibri"/>
+                <w:b/>
+                <w:i w:val="0"/>
+                <w:color w:val="7EC8E3"/>
+                <w:sz w:val="22"/>
+              </w:rPr>
+              <w:t>Competências de Cuidadores e Bem-Estar Animal</w:t>
+            </w:r>
+          </w:p>
+        </w:tc>
+      </w:tr>
+    </w:tbl>
+    <w:p>
+      <w:pPr>
+        <w:spacing w:after="80"/>
+      </w:pPr>
+    </w:p>
+    <w:tbl>
+      <w:tblPr>
+        <w:tblLook w:firstColumn="1" w:firstRow="1" w:lastColumn="0" w:lastRow="0" w:noHBand="0" w:noVBand="1" w:val="04A0"/>
+        <w:tblW w:w="5000" w:type="pct"/>
+      </w:tblPr>
+      <w:tblGrid>
+        <w:gridCol w:w="15138"/>
+      </w:tblGrid>
+      <w:tr>
+        <w:tc>
+          <w:tcPr>
+            <w:tcW w:type="dxa" w:w="15138"/>
+            <w:shd w:val="clear" w:color="auto" w:fill="1A3A5C"/>
+            <w:tcBorders>
+              <w:top w:val="single" w:sz="4" w:space="0" w:color="CCCCCC"/>
+              <w:left w:val="single" w:sz="4" w:space="0" w:color="CCCCCC"/>
+              <w:bottom w:val="single" w:sz="4" w:space="0" w:color="CCCCCC"/>
+              <w:right w:val="single" w:sz="4" w:space="0" w:color="CCCCCC"/>
+            </w:tcBorders>
+          </w:tcPr>
+          <w:p>
+            <w:pPr>
+              <w:spacing w:before="80" w:after="80"/>
+              <w:jc w:val="center"/>
+            </w:pPr>
+            <w:r>
+              <w:rPr>
+                <w:rFonts w:ascii="Calibri" w:hAnsi="Calibri"/>
+                <w:b/>
+                <w:i w:val="0"/>
+                <w:color w:val="FFFFFF"/>
+                <w:sz w:val="18"/>
+              </w:rPr>
+              <w:t>@regulamento — Animal welfare competences of animal caretakers  ·  Art.º 9.º do Regulamento 2023/0447  |  EN</w:t>
+            </w:r>
+          </w:p>
+        </w:tc>
+      </w:tr>
+      <w:tr>
+        <w:tc>
+          <w:tcPr>
+            <w:tcW w:type="dxa" w:w="15138"/>
+            <w:shd w:val="clear" w:color="auto" w:fill="D6E4F0"/>
+            <w:tcBorders>
+              <w:top w:val="single" w:sz="4" w:space="0" w:color="CCCCCC"/>
+              <w:left w:val="single" w:sz="4" w:space="0" w:color="CCCCCC"/>
+              <w:bottom w:val="single" w:sz="4" w:space="0" w:color="CCCCCC"/>
+              <w:right w:val="single" w:sz="4" w:space="0" w:color="CCCCCC"/>
+            </w:tcBorders>
+            <w:vAlign w:val="top"/>
+          </w:tcPr>
+          <w:p>
+            <w:pPr>
+              <w:spacing w:after="0" w:before="80"/>
+              <w:ind w:right="80" w:left="80" w:firstLine="0"/>
+            </w:pPr>
+            <w:r>
+              <w:rPr>
+                <w:rFonts w:ascii="Calibri" w:hAnsi="Calibri"/>
+                <w:b w:val="0"/>
+                <w:i w:val="0"/>
+                <w:color w:val="222222"/>
+                <w:sz w:val="19"/>
+              </w:rPr>
+              <w:t>1. Animal caretakers, other than volunteers in shelters and interns who are under the responsibility of a competent animal caretaker, shall have the following competences as regards the dogs and cats they are handling:</w:t>
+            </w:r>
+          </w:p>
+          <w:p>
+            <w:pPr>
+              <w:spacing w:after="0" w:before="20"/>
+              <w:ind w:right="80" w:left="360" w:hanging="280"/>
+            </w:pPr>
+            <w:r>
+              <w:rPr>
+                <w:rFonts w:ascii="Calibri" w:hAnsi="Calibri"/>
+                <w:b w:val="0"/>
+                <w:i w:val="0"/>
+                <w:color w:val="222222"/>
+                <w:sz w:val="19"/>
+              </w:rPr>
+              <w:t>(a) understanding of their biological behaviour and their physiological and ethological needs;</w:t>
+            </w:r>
+          </w:p>
+          <w:p>
+            <w:pPr>
+              <w:spacing w:after="0" w:before="20"/>
+              <w:ind w:right="80" w:left="360" w:hanging="280"/>
+            </w:pPr>
+            <w:r>
+              <w:rPr>
+                <w:rFonts w:ascii="Calibri" w:hAnsi="Calibri"/>
+                <w:b w:val="0"/>
+                <w:i w:val="0"/>
+                <w:color w:val="222222"/>
+                <w:sz w:val="19"/>
+              </w:rPr>
+              <w:t>(b) ability to recognise their expressions including any sign of suffering and to identify and take the appropriate mitigating measures in such cases;</w:t>
+            </w:r>
+          </w:p>
+          <w:p>
+            <w:pPr>
+              <w:spacing w:after="0" w:before="20"/>
+              <w:ind w:right="80" w:left="360" w:hanging="280"/>
+            </w:pPr>
+            <w:r>
+              <w:rPr>
+                <w:rFonts w:ascii="Calibri" w:hAnsi="Calibri"/>
+                <w:b w:val="0"/>
+                <w:i w:val="0"/>
+                <w:color w:val="222222"/>
+                <w:sz w:val="19"/>
+              </w:rPr>
+              <w:t>(c) ability to apply good animal management practices, including operant conditioning and positive reinforcement, to use and maintain the equipment used for the dogs or cats under their care and to minimise any risks to the welfare of the dogs or cats, preventing suffering;</w:t>
+            </w:r>
+          </w:p>
+          <w:p>
+            <w:pPr>
+              <w:spacing w:after="0" w:before="20"/>
+              <w:ind w:right="80" w:left="360" w:hanging="280"/>
+            </w:pPr>
+            <w:r>
+              <w:rPr>
+                <w:rFonts w:ascii="Calibri" w:hAnsi="Calibri"/>
+                <w:b w:val="0"/>
+                <w:i w:val="0"/>
+                <w:color w:val="222222"/>
+                <w:sz w:val="19"/>
+              </w:rPr>
+              <w:t>(d) knowledge of their obligations under this Regulation.</w:t>
+            </w:r>
+          </w:p>
+          <w:p>
+            <w:pPr>
+              <w:spacing w:after="0" w:before="140"/>
+              <w:ind w:right="80" w:left="80" w:firstLine="0"/>
+            </w:pPr>
+            <w:r>
+              <w:rPr>
+                <w:rFonts w:ascii="Calibri" w:hAnsi="Calibri"/>
+                <w:b w:val="0"/>
+                <w:i w:val="0"/>
+                <w:color w:val="222222"/>
+                <w:sz w:val="19"/>
+              </w:rPr>
+              <w:t>2. The competences referred to in paragraph 1 may be acquired through education, training or professional experience. Education, training or professional experience shall be documented.</w:t>
+            </w:r>
+          </w:p>
+          <w:p>
+            <w:pPr>
+              <w:spacing w:after="0" w:before="140"/>
+              <w:ind w:right="80" w:left="80" w:firstLine="0"/>
+            </w:pPr>
+            <w:r>
+              <w:rPr>
+                <w:rFonts w:ascii="Calibri" w:hAnsi="Calibri"/>
+                <w:b w:val="0"/>
+                <w:i w:val="0"/>
+                <w:color w:val="222222"/>
+                <w:sz w:val="19"/>
+              </w:rPr>
+              <w:t>2a. Operators shall ensure that at least one animal caretaker, other than a volunteer or intern, at the establishment has completed the training courses referred to in Article 18 and that the caretaker transfers the knowledge to the other animal caretakers of the establishment.</w:t>
+            </w:r>
+          </w:p>
+          <w:p>
+            <w:pPr>
+              <w:spacing w:after="0" w:before="140"/>
+              <w:ind w:right="80" w:left="80" w:firstLine="0"/>
+            </w:pPr>
+            <w:r>
+              <w:rPr>
+                <w:rFonts w:ascii="Calibri" w:hAnsi="Calibri"/>
+                <w:b w:val="0"/>
+                <w:i w:val="0"/>
+                <w:color w:val="222222"/>
+                <w:sz w:val="19"/>
+              </w:rPr>
+              <w:t>3. The Commission shall, by means of implementing acts, lay down minimum requirements concerning the formal education, training or professional experience in order to acquire the competences referred to in paragraph 2 and for the training courses referred to in paragraph 2a. Those implementing acts shall be adopted in accordance with the examination procedure referred to in Article 24. The implementing act concerning the training courses referred to in paragraph 2a shall be adopted by [3 years from the date of entry into force of the Regulation].</w:t>
+            </w:r>
+          </w:p>
+        </w:tc>
+      </w:tr>
+    </w:tbl>
+    <w:p>
+      <w:pPr>
+        <w:spacing w:after="80"/>
+      </w:pPr>
+    </w:p>
+    <w:tbl>
+      <w:tblPr>
+        <w:tblLook w:firstColumn="1" w:firstRow="1" w:lastColumn="0" w:lastRow="0" w:noHBand="0" w:noVBand="1" w:val="04A0"/>
+        <w:tblW w:w="5000" w:type="pct"/>
+      </w:tblPr>
+      <w:tblGrid>
+        <w:gridCol w:w="15138"/>
+      </w:tblGrid>
+      <w:tr>
+        <w:tc>
+          <w:tcPr>
+            <w:tcW w:type="dxa" w:w="15138"/>
+            <w:shd w:val="clear" w:color="auto" w:fill="2471A3"/>
+            <w:tcBorders>
+              <w:top w:val="single" w:sz="4" w:space="0" w:color="CCCCCC"/>
+              <w:left w:val="single" w:sz="4" w:space="0" w:color="CCCCCC"/>
+              <w:bottom w:val="single" w:sz="4" w:space="0" w:color="CCCCCC"/>
+              <w:right w:val="single" w:sz="4" w:space="0" w:color="CCCCCC"/>
+            </w:tcBorders>
+          </w:tcPr>
+          <w:p>
+            <w:pPr>
+              <w:spacing w:before="80" w:after="80"/>
+              <w:jc w:val="center"/>
+            </w:pPr>
+            <w:r>
+              <w:rPr>
+                <w:rFonts w:ascii="Calibri" w:hAnsi="Calibri"/>
+                <w:b/>
+                <w:i w:val="0"/>
+                <w:color w:val="FFFFFF"/>
+                <w:sz w:val="18"/>
+              </w:rPr>
+              <w:t>@regulamento — Tradução PT-PT  ·  Art.º 9.º do Regulamento 2023/0447</w:t>
+            </w:r>
+          </w:p>
+        </w:tc>
+      </w:tr>
+      <w:tr>
+        <w:tc>
+          <w:tcPr>
+            <w:tcW w:type="dxa" w:w="15138"/>
+            <w:shd w:val="clear" w:color="auto" w:fill="EBF5FB"/>
+            <w:tcBorders>
+              <w:top w:val="single" w:sz="4" w:space="0" w:color="CCCCCC"/>
+              <w:left w:val="single" w:sz="4" w:space="0" w:color="CCCCCC"/>
+              <w:bottom w:val="single" w:sz="4" w:space="0" w:color="CCCCCC"/>
+              <w:right w:val="single" w:sz="4" w:space="0" w:color="CCCCCC"/>
+            </w:tcBorders>
+            <w:vAlign w:val="top"/>
+          </w:tcPr>
+          <w:p>
+            <w:pPr>
+              <w:spacing w:after="0" w:before="80"/>
+              <w:ind w:right="80" w:left="80" w:firstLine="0"/>
+            </w:pPr>
+            <w:r>
+              <w:rPr>
+                <w:rFonts w:ascii="Calibri" w:hAnsi="Calibri"/>
+                <w:b w:val="0"/>
+                <w:i/>
+                <w:color w:val="222222"/>
+                <w:sz w:val="19"/>
+              </w:rPr>
+              <w:t>1. Os cuidadores de animais, com exceção de voluntários em abrigos e estagiários sob a responsabilidade de um cuidador competente, devem ter as seguintes competências no que diz respeito aos cães e gatos que manuseiam:</w:t>
+            </w:r>
+          </w:p>
+          <w:p>
+            <w:pPr>
+              <w:spacing w:after="0" w:before="20"/>
+              <w:ind w:right="80" w:left="360" w:hanging="280"/>
+            </w:pPr>
+            <w:r>
+              <w:rPr>
+                <w:rFonts w:ascii="Calibri" w:hAnsi="Calibri"/>
+                <w:b w:val="0"/>
+                <w:i/>
+                <w:color w:val="222222"/>
+                <w:sz w:val="19"/>
+              </w:rPr>
+              <w:t>(a) compreensão do seu comportamento biológico e das suas necessidades fisiológicas e etológicas;</w:t>
+            </w:r>
+          </w:p>
+          <w:p>
+            <w:pPr>
+              <w:spacing w:after="0" w:before="20"/>
+              <w:ind w:right="80" w:left="360" w:hanging="280"/>
+            </w:pPr>
+            <w:r>
+              <w:rPr>
+                <w:rFonts w:ascii="Calibri" w:hAnsi="Calibri"/>
+                <w:b w:val="0"/>
+                <w:i/>
+                <w:color w:val="222222"/>
+                <w:sz w:val="19"/>
+              </w:rPr>
+              <w:t>(b) capacidade de reconhecer as suas expressões, incluindo qualquer sinal de sofrimento, e de identificar e adotar as medidas mitigantes apropriadas nesses casos;</w:t>
+            </w:r>
+          </w:p>
+          <w:p>
+            <w:pPr>
+              <w:spacing w:after="0" w:before="20"/>
+              <w:ind w:right="80" w:left="360" w:hanging="280"/>
+            </w:pPr>
+            <w:r>
+              <w:rPr>
+                <w:rFonts w:ascii="Calibri" w:hAnsi="Calibri"/>
+                <w:b w:val="0"/>
+                <w:i/>
+                <w:color w:val="222222"/>
+                <w:sz w:val="19"/>
+              </w:rPr>
+              <w:t>(c) capacidade de aplicar boas práticas de maneio de animais, incluindo condicionamento operante e reforço positivo, utilizar e manter o equipamento utilizado para os cães ou gatos sob os seus cuidados e minimizar quaisquer riscos para o bem-estar dos cães ou gatos, prevenindo sofrimento;</w:t>
+            </w:r>
+          </w:p>
+          <w:p>
+            <w:pPr>
+              <w:spacing w:after="0" w:before="20"/>
+              <w:ind w:right="80" w:left="360" w:hanging="280"/>
+            </w:pPr>
+            <w:r>
+              <w:rPr>
+                <w:rFonts w:ascii="Calibri" w:hAnsi="Calibri"/>
+                <w:b w:val="0"/>
+                <w:i/>
+                <w:color w:val="222222"/>
+                <w:sz w:val="19"/>
+              </w:rPr>
+              <w:t>(d) conhecimento das suas obrigações sob este Regulamento.</w:t>
+            </w:r>
+          </w:p>
+          <w:p>
+            <w:pPr>
+              <w:spacing w:after="0" w:before="140"/>
+              <w:ind w:right="80" w:left="80" w:firstLine="0"/>
+            </w:pPr>
+            <w:r>
+              <w:rPr>
+                <w:rFonts w:ascii="Calibri" w:hAnsi="Calibri"/>
+                <w:b w:val="0"/>
+                <w:i/>
+                <w:color w:val="222222"/>
+                <w:sz w:val="19"/>
+              </w:rPr>
+              <w:t>2. As competências referidas no parágrafo 1 podem ser adquiridas através de educação, formação ou experiência profissional. A educação, formação ou experiência profissional devem ser documentadas.</w:t>
+            </w:r>
+          </w:p>
+          <w:p>
+            <w:pPr>
+              <w:spacing w:after="0" w:before="140"/>
+              <w:ind w:right="80" w:left="80" w:firstLine="0"/>
+            </w:pPr>
+            <w:r>
+              <w:rPr>
+                <w:rFonts w:ascii="Calibri" w:hAnsi="Calibri"/>
+                <w:b w:val="0"/>
+                <w:i/>
+                <w:color w:val="222222"/>
+                <w:sz w:val="19"/>
+              </w:rPr>
+              <w:t>2a. Os operadores devem assegurar que pelo menos um cuidador de animais, que não seja um voluntário ou estagiário, no estabelecimento tenha completado os cursos de formação referidos no artigo 18.º e que o cuidador transfira os conhecimentos aos outros cuidadores de animais do estabelecimento.</w:t>
+            </w:r>
+          </w:p>
+          <w:p>
+            <w:pPr>
+              <w:spacing w:after="0" w:before="140"/>
+              <w:ind w:right="80" w:left="80" w:firstLine="0"/>
+            </w:pPr>
+            <w:r>
+              <w:rPr>
+                <w:rFonts w:ascii="Calibri" w:hAnsi="Calibri"/>
+                <w:b w:val="0"/>
+                <w:i/>
+                <w:color w:val="222222"/>
+                <w:sz w:val="19"/>
+              </w:rPr>
+              <w:t>3. A Comissão estabelecerá, por meio de atos de execução, os requisitos mínimos relativos à educação formal, formação ou experiência profissional para adquirir as competências referidas no parágrafo 2 e para os cursos de formação referidos no parágrafo 2a. Esses atos de execução serão adotados de acordo com o procedimento de exame referido no artigo 24.º. O ato de execução relativo aos cursos de formação referidos no parágrafo 2a deve ser adotado por [3 anos da data de entrada em vigor do Regulamento].</w:t>
+            </w:r>
+          </w:p>
+        </w:tc>
+      </w:tr>
+    </w:tbl>
+    <w:p>
+      <w:pPr>
+        <w:spacing w:after="80"/>
+      </w:pPr>
+    </w:p>
+    <w:tbl>
+      <w:tblPr>
+        <w:tblLook w:firstColumn="1" w:firstRow="1" w:lastColumn="0" w:lastRow="0" w:noHBand="0" w:noVBand="1" w:val="04A0"/>
+        <w:tblW w:w="5000" w:type="pct"/>
+      </w:tblPr>
+      <w:tblGrid>
+        <w:gridCol w:w="5046"/>
+        <w:gridCol w:w="5046"/>
+        <w:gridCol w:w="5046"/>
+      </w:tblGrid>
+      <w:tr>
+        <w:tc>
+          <w:tcPr>
+            <w:tcW w:type="dxa" w:w="5046"/>
+            <w:shd w:val="clear" w:color="auto" w:fill="1E5631"/>
+            <w:tcBorders>
+              <w:top w:val="single" w:sz="4" w:space="0" w:color="CCCCCC"/>
+              <w:left w:val="single" w:sz="4" w:space="0" w:color="CCCCCC"/>
+              <w:bottom w:val="single" w:sz="4" w:space="0" w:color="CCCCCC"/>
+              <w:right w:val="single" w:sz="4" w:space="0" w:color="CCCCCC"/>
+            </w:tcBorders>
+          </w:tcPr>
+          <w:p>
+            <w:pPr>
+              <w:spacing w:before="80" w:after="80"/>
+              <w:jc w:val="center"/>
+            </w:pPr>
+            <w:r>
+              <w:rPr>
+                <w:rFonts w:ascii="Calibri" w:hAnsi="Calibri"/>
+                <w:b/>
+                <w:i w:val="0"/>
+                <w:color w:val="FFFFFF"/>
+                <w:sz w:val="18"/>
+              </w:rPr>
+              <w:t>@rgbeac (proposta jun. 2025)</w:t>
+            </w:r>
+          </w:p>
+        </w:tc>
+        <w:tc>
+          <w:tcPr>
+            <w:tcW w:type="dxa" w:w="5046"/>
+            <w:shd w:val="clear" w:color="auto" w:fill="7E4C00"/>
+            <w:tcBorders>
+              <w:top w:val="single" w:sz="4" w:space="0" w:color="CCCCCC"/>
+              <w:left w:val="single" w:sz="4" w:space="0" w:color="CCCCCC"/>
+              <w:bottom w:val="single" w:sz="4" w:space="0" w:color="CCCCCC"/>
+              <w:right w:val="single" w:sz="4" w:space="0" w:color="CCCCCC"/>
+            </w:tcBorders>
+          </w:tcPr>
+          <w:p>
+            <w:pPr>
+              <w:spacing w:before="80" w:after="80"/>
+              <w:jc w:val="center"/>
+            </w:pPr>
+            <w:r>
+              <w:rPr>
+                <w:rFonts w:ascii="Calibri" w:hAnsi="Calibri"/>
+                <w:b/>
+                <w:i w:val="0"/>
+                <w:color w:val="FFFFFF"/>
+                <w:sz w:val="18"/>
+              </w:rPr>
+              <w:t>@codigo (DL n.º 214/2013)</w:t>
+            </w:r>
+          </w:p>
+        </w:tc>
+        <w:tc>
+          <w:tcPr>
+            <w:tcW w:type="dxa" w:w="5046"/>
+            <w:shd w:val="clear" w:color="auto" w:fill="006064"/>
+            <w:tcBorders>
+              <w:top w:val="single" w:sz="4" w:space="0" w:color="CCCCCC"/>
+              <w:left w:val="single" w:sz="4" w:space="0" w:color="CCCCCC"/>
+              <w:bottom w:val="single" w:sz="4" w:space="0" w:color="CCCCCC"/>
+              <w:right w:val="single" w:sz="4" w:space="0" w:color="CCCCCC"/>
+            </w:tcBorders>
+          </w:tcPr>
+          <w:p>
+            <w:pPr>
+              <w:spacing w:before="80" w:after="80"/>
+              <w:jc w:val="center"/>
+            </w:pPr>
+            <w:r>
+              <w:rPr>
+                <w:rFonts w:ascii="Calibri" w:hAnsi="Calibri"/>
+                <w:b/>
+                <w:i w:val="0"/>
+                <w:color w:val="FFFFFF"/>
+                <w:sz w:val="18"/>
+              </w:rPr>
+              <w:t>@legislacao (legislação vigente)</w:t>
+            </w:r>
+          </w:p>
+        </w:tc>
+      </w:tr>
+      <w:tr>
+        <w:tc>
+          <w:tcPr>
+            <w:tcW w:type="dxa" w:w="5046"/>
+            <w:shd w:val="clear" w:color="auto" w:fill="D5E8D4"/>
+            <w:tcBorders>
+              <w:top w:val="single" w:sz="4" w:space="0" w:color="CCCCCC"/>
+              <w:left w:val="single" w:sz="4" w:space="0" w:color="CCCCCC"/>
+              <w:bottom w:val="single" w:sz="4" w:space="0" w:color="CCCCCC"/>
+              <w:right w:val="single" w:sz="4" w:space="0" w:color="CCCCCC"/>
+            </w:tcBorders>
+            <w:vAlign w:val="top"/>
+          </w:tcPr>
+          <w:p>
+            <w:pPr>
+              <w:spacing w:before="80" w:after="40"/>
+              <w:ind w:left="80" w:right="80"/>
+            </w:pPr>
+            <w:r>
+              <w:rPr>
+                <w:rFonts w:ascii="Calibri" w:hAnsi="Calibri"/>
+                <w:b/>
+                <w:i/>
+                <w:color w:val="555555"/>
+                <w:sz w:val="16"/>
+              </w:rPr>
+              <w:t>Art.ºs 69.º, 84.º e 90.º do RGBEAC (proposta, jun. 2025)</w:t>
+            </w:r>
+          </w:p>
+          <w:p>
+            <w:pPr>
+              <w:spacing w:after="0" w:before="140"/>
+              <w:ind w:right="80" w:left="80" w:firstLine="0"/>
+            </w:pPr>
+            <w:r>
+              <w:rPr>
+                <w:rFonts w:ascii="Calibri" w:hAnsi="Calibri"/>
+                <w:b/>
+                <w:i w:val="0"/>
+                <w:color w:val="333333"/>
+                <w:sz w:val="18"/>
+              </w:rPr>
+              <w:t>Artigo 69.º — Formação</w:t>
+            </w:r>
+          </w:p>
+          <w:p>
+            <w:pPr>
+              <w:spacing w:after="0" w:before="140"/>
+              <w:ind w:right="80" w:left="80" w:firstLine="0"/>
+            </w:pPr>
+            <w:r>
+              <w:rPr>
+                <w:rFonts w:ascii="Calibri" w:hAnsi="Calibri"/>
+                <w:b w:val="0"/>
+                <w:i w:val="0"/>
+                <w:color w:val="222222"/>
+                <w:sz w:val="19"/>
+              </w:rPr>
+              <w:t>A reprodução, criação, manutenção, venda ou treino de animais de companhia depende de aprovação em formação sobre detenção responsável de animais de companhia, bem como sobre as necessidades fisiológicas e etológicas específicas da espécie animal em causa, ministrada pelo ICNF, I.P. ou entidades por este certificadas.</w:t>
+            </w:r>
+          </w:p>
+          <w:p>
+            <w:pPr>
+              <w:spacing w:after="0" w:before="200"/>
+              <w:ind w:right="80" w:left="80" w:firstLine="0"/>
+            </w:pPr>
+            <w:r>
+              <w:rPr>
+                <w:rFonts w:ascii="Calibri" w:hAnsi="Calibri"/>
+                <w:b/>
+                <w:i w:val="0"/>
+                <w:color w:val="333333"/>
+                <w:sz w:val="18"/>
+              </w:rPr>
+              <w:t>Artigo 84.º — Pessoal</w:t>
+            </w:r>
+          </w:p>
+          <w:p>
+            <w:pPr>
+              <w:spacing w:after="0" w:before="140"/>
+              <w:ind w:right="80" w:left="80" w:firstLine="0"/>
+            </w:pPr>
+            <w:r>
+              <w:rPr>
+                <w:rFonts w:ascii="Calibri" w:hAnsi="Calibri"/>
+                <w:b w:val="0"/>
+                <w:i w:val="0"/>
+                <w:color w:val="222222"/>
+                <w:sz w:val="19"/>
+              </w:rPr>
+              <w:t>O pessoal responsável pelas tarefas referidas no artigo 82.º deve possuir os conhecimentos e a experiência adequados para as executar.</w:t>
+            </w:r>
+          </w:p>
+          <w:p>
+            <w:pPr>
+              <w:spacing w:after="0" w:before="200"/>
+              <w:ind w:right="80" w:left="80" w:firstLine="0"/>
+            </w:pPr>
+            <w:r>
+              <w:rPr>
+                <w:rFonts w:ascii="Calibri" w:hAnsi="Calibri"/>
+                <w:b/>
+                <w:i w:val="0"/>
+                <w:color w:val="333333"/>
+                <w:sz w:val="18"/>
+              </w:rPr>
+              <w:t>Artigo 90.º — Pessoal</w:t>
+            </w:r>
+          </w:p>
+          <w:p>
+            <w:pPr>
+              <w:spacing w:after="0" w:before="140"/>
+              <w:ind w:right="80" w:left="80" w:firstLine="0"/>
+            </w:pPr>
+            <w:r>
+              <w:rPr>
+                <w:rFonts w:ascii="Calibri" w:hAnsi="Calibri"/>
+                <w:b w:val="0"/>
+                <w:i w:val="0"/>
+                <w:color w:val="222222"/>
+                <w:sz w:val="19"/>
+              </w:rPr>
+              <w:t>O pessoal auxiliar deve possuir os conhecimentos e a experiência adequada, o qual fica, contudo, sob a orientação do médico veterinário responsável.</w:t>
+            </w:r>
+          </w:p>
+        </w:tc>
+        <w:tc>
+          <w:tcPr>
+            <w:tcW w:type="dxa" w:w="5046"/>
+            <w:shd w:val="clear" w:color="auto" w:fill="FFE6CC"/>
+            <w:tcBorders>
+              <w:top w:val="single" w:sz="4" w:space="0" w:color="CCCCCC"/>
+              <w:left w:val="single" w:sz="4" w:space="0" w:color="CCCCCC"/>
+              <w:bottom w:val="single" w:sz="4" w:space="0" w:color="CCCCCC"/>
+              <w:right w:val="single" w:sz="4" w:space="0" w:color="CCCCCC"/>
+            </w:tcBorders>
+            <w:vAlign w:val="top"/>
+          </w:tcPr>
+          <w:p>
+            <w:pPr>
+              <w:spacing w:before="80" w:after="40"/>
+              <w:ind w:left="80" w:right="80"/>
+            </w:pPr>
+            <w:r>
+              <w:rPr>
+                <w:rFonts w:ascii="Calibri" w:hAnsi="Calibri"/>
+                <w:b/>
+                <w:i/>
+                <w:color w:val="555555"/>
+                <w:sz w:val="16"/>
+              </w:rPr>
+              <w:t>Art.º 19.º do Código do Animal (DL n.º 214/2013)</w:t>
+            </w:r>
+          </w:p>
+          <w:p>
+            <w:pPr>
+              <w:spacing w:after="0" w:before="140"/>
+              <w:ind w:right="80" w:left="80" w:firstLine="0"/>
+            </w:pPr>
+            <w:r>
+              <w:rPr>
+                <w:rFonts w:ascii="Calibri" w:hAnsi="Calibri"/>
+                <w:b/>
+                <w:i w:val="0"/>
+                <w:color w:val="333333"/>
+                <w:sz w:val="18"/>
+              </w:rPr>
+              <w:t>Artigo 19.º — Pessoal auxiliar</w:t>
+            </w:r>
+          </w:p>
+          <w:p>
+            <w:pPr>
+              <w:spacing w:after="0" w:before="140"/>
+              <w:ind w:right="80" w:left="80" w:firstLine="0"/>
+            </w:pPr>
+            <w:r>
+              <w:rPr>
+                <w:rFonts w:ascii="Calibri" w:hAnsi="Calibri"/>
+                <w:b w:val="0"/>
+                <w:i w:val="0"/>
+                <w:color w:val="222222"/>
+                <w:sz w:val="19"/>
+              </w:rPr>
+              <w:t>Os alojamentos devem dispor de pessoal auxiliar que possua os conhecimentos e a aptidão necessária para assegurar os cuidados adequados aos animais, o qual fica sob a orientação do médico veterinário responsável.</w:t>
+            </w:r>
+          </w:p>
+        </w:tc>
+        <w:tc>
+          <w:tcPr>
+            <w:tcW w:type="dxa" w:w="5046"/>
+            <w:shd w:val="clear" w:color="auto" w:fill="E0F7FA"/>
+            <w:tcBorders>
+              <w:top w:val="single" w:sz="4" w:space="0" w:color="CCCCCC"/>
+              <w:left w:val="single" w:sz="4" w:space="0" w:color="CCCCCC"/>
+              <w:bottom w:val="single" w:sz="4" w:space="0" w:color="CCCCCC"/>
+              <w:right w:val="single" w:sz="4" w:space="0" w:color="CCCCCC"/>
+            </w:tcBorders>
+            <w:vAlign w:val="top"/>
+          </w:tcPr>
+          <w:p>
+            <w:pPr>
+              <w:spacing w:before="80" w:after="40"/>
+              <w:ind w:left="80" w:right="80"/>
+            </w:pPr>
+            <w:r>
+              <w:rPr>
+                <w:rFonts w:ascii="Calibri" w:hAnsi="Calibri"/>
+                <w:b/>
+                <w:i/>
+                <w:color w:val="555555"/>
+                <w:sz w:val="16"/>
+              </w:rPr>
+              <w:t>Art.º 13.º do DL n.º 276/2001, de 17 de outubro</w:t>
+            </w:r>
+          </w:p>
+          <w:p>
+            <w:pPr>
+              <w:spacing w:after="0" w:before="140"/>
+              <w:ind w:right="80" w:left="80" w:firstLine="0"/>
+            </w:pPr>
+            <w:r>
+              <w:rPr>
+                <w:rFonts w:ascii="Calibri" w:hAnsi="Calibri"/>
+                <w:b/>
+                <w:i w:val="0"/>
+                <w:color w:val="333333"/>
+                <w:sz w:val="18"/>
+              </w:rPr>
+              <w:t>Artigo 13.º — Maneio</w:t>
+            </w:r>
+          </w:p>
+          <w:p>
+            <w:pPr>
+              <w:spacing w:after="0" w:before="140"/>
+              <w:ind w:right="80" w:left="80" w:firstLine="0"/>
+            </w:pPr>
+            <w:r>
+              <w:rPr>
+                <w:rFonts w:ascii="Calibri" w:hAnsi="Calibri"/>
+                <w:b w:val="0"/>
+                <w:i w:val="0"/>
+                <w:color w:val="222222"/>
+                <w:sz w:val="19"/>
+              </w:rPr>
+              <w:t>1 — A observação diária dos animais e o seu maneio, a organização da dieta e o tratamento médico-veterinário devem ser assegurados por pessoal técnico competente e em número adequado à quantidade e espécies animais que alojam.</w:t>
+            </w:r>
+          </w:p>
+          <w:p>
+            <w:pPr>
+              <w:spacing w:after="0" w:before="140"/>
+              <w:ind w:right="80" w:left="80" w:firstLine="0"/>
+            </w:pPr>
+            <w:r>
+              <w:rPr>
+                <w:rFonts w:ascii="Calibri" w:hAnsi="Calibri"/>
+                <w:b w:val="0"/>
+                <w:i w:val="0"/>
+                <w:color w:val="222222"/>
+                <w:sz w:val="19"/>
+              </w:rPr>
+              <w:t>2 — O maneio deve ser feito por pessoal que possua formação teórica e prática específica ou sob a supervisão de uma pessoa competente para o efeito.</w:t>
+            </w:r>
+          </w:p>
+          <w:p>
+            <w:pPr>
+              <w:spacing w:after="0" w:before="140"/>
+              <w:ind w:right="80" w:left="80" w:firstLine="0"/>
+            </w:pPr>
+            <w:r>
+              <w:rPr>
+                <w:rFonts w:ascii="Calibri" w:hAnsi="Calibri"/>
+                <w:b w:val="0"/>
+                <w:i w:val="0"/>
+                <w:color w:val="222222"/>
+                <w:sz w:val="19"/>
+              </w:rPr>
+              <w:t>3 — Todos os animais devem ser alvo de inspeção diária, sendo de imediato prestados os primeiros cuidados.</w:t>
+            </w:r>
+          </w:p>
+        </w:tc>
+      </w:tr>
+    </w:tbl>
+    <w:p>
+      <w:pPr>
+        <w:spacing w:after="80"/>
+      </w:pPr>
+    </w:p>
+    <w:tbl>
+      <w:tblPr>
+        <w:tblLook w:firstColumn="1" w:firstRow="1" w:lastColumn="0" w:lastRow="0" w:noHBand="0" w:noVBand="1" w:val="04A0"/>
+        <w:tblW w:w="5000" w:type="pct"/>
+      </w:tblPr>
+      <w:tblGrid>
+        <w:gridCol w:w="15138"/>
+      </w:tblGrid>
+      <w:tr>
+        <w:tc>
+          <w:tcPr>
+            <w:tcW w:type="dxa" w:w="15138"/>
+            <w:shd w:val="clear" w:color="auto" w:fill="5D2A8A"/>
+            <w:tcBorders>
+              <w:top w:val="single" w:sz="4" w:space="0" w:color="CCCCCC"/>
+              <w:left w:val="single" w:sz="4" w:space="0" w:color="CCCCCC"/>
+              <w:bottom w:val="single" w:sz="4" w:space="0" w:color="CCCCCC"/>
+              <w:right w:val="single" w:sz="4" w:space="0" w:color="CCCCCC"/>
+            </w:tcBorders>
+          </w:tcPr>
+          <w:p>
+            <w:pPr>
+              <w:spacing w:before="80" w:after="80"/>
+              <w:jc w:val="center"/>
+            </w:pPr>
+            <w:r>
+              <w:rPr>
+                <w:rFonts w:ascii="Calibri" w:hAnsi="Calibri"/>
+                <w:b/>
+                <w:i w:val="0"/>
+                <w:color w:val="FFFFFF"/>
+                <w:sz w:val="18"/>
+              </w:rPr>
+              <w:t>DIVERGÊNCIA FACE AO REGULAMENTO  ·  Necessidade de alteração: Sim</w:t>
+            </w:r>
+          </w:p>
+        </w:tc>
+      </w:tr>
+      <w:tr>
+        <w:tc>
+          <w:tcPr>
+            <w:tcW w:type="dxa" w:w="15138"/>
+            <w:shd w:val="clear" w:color="auto" w:fill="006064"/>
+            <w:tcBorders>
+              <w:top w:val="single" w:sz="4" w:space="0" w:color="006064"/>
+              <w:left w:val="single" w:sz="4" w:space="0" w:color="006064"/>
+              <w:bottom w:val="single" w:sz="4" w:space="0" w:color="006064"/>
+              <w:right w:val="single" w:sz="4" w:space="0" w:color="006064"/>
+            </w:tcBorders>
+          </w:tcPr>
+          <w:p>
+            <w:pPr>
+              <w:spacing w:before="80" w:after="0"/>
+              <w:ind w:left="120"/>
+            </w:pPr>
+            <w:r>
+              <w:rPr>
+                <w:rFonts w:ascii="Calibri" w:hAnsi="Calibri"/>
+                <w:b/>
+                <w:i w:val="0"/>
+                <w:color w:val="FFFFFF"/>
+                <w:sz w:val="17"/>
+              </w:rPr>
+              <w:t>@legislacao</w:t>
+            </w:r>
+          </w:p>
+        </w:tc>
+      </w:tr>
+      <w:tr>
+        <w:tc>
+          <w:tcPr>
+            <w:tcW w:type="dxa" w:w="15138"/>
+            <w:shd w:val="clear" w:color="auto" w:fill="E0F7FA"/>
+            <w:tcBorders>
+              <w:top w:val="single" w:sz="4" w:space="0" w:color="CCCCCC"/>
+              <w:left w:val="single" w:sz="4" w:space="0" w:color="CCCCCC"/>
+              <w:bottom w:val="single" w:sz="4" w:space="0" w:color="CCCCCC"/>
+              <w:right w:val="single" w:sz="4" w:space="0" w:color="CCCCCC"/>
+            </w:tcBorders>
+            <w:vAlign w:val="top"/>
+          </w:tcPr>
+          <w:p>
+            <w:pPr>
+              <w:spacing w:before="80" w:after="80"/>
+              <w:ind w:left="120" w:right="120"/>
+            </w:pPr>
+            <w:r>
+              <w:rPr>
+                <w:rFonts w:ascii="Calibri" w:hAnsi="Calibri"/>
+                <w:b w:val="0"/>
+                <w:i w:val="0"/>
+                <w:color w:val="222222"/>
+                <w:sz w:val="18"/>
+              </w:rPr>
+              <w:t>O DL n.º 276/2001 (art.º 13.º) exige pessoal 'técnico competente' com 'formação teórica e prática específica' e 'inspeção diária', mas não detalha competências concretas. O @regulamento especifica 4 competências estruturadas (comportamento biológico, reconhecimento de sofrimento, maneio e bem-estar, conhecimento de obrigações) e exige documentação de educação/formação/experiência.</w:t>
+            </w:r>
+          </w:p>
+        </w:tc>
+      </w:tr>
+      <w:tr>
+        <w:tc>
+          <w:tcPr>
+            <w:tcW w:type="dxa" w:w="15138"/>
+            <w:shd w:val="clear" w:color="auto" w:fill="7E4C00"/>
+            <w:tcBorders>
+              <w:top w:val="single" w:sz="4" w:space="0" w:color="7E4C00"/>
+              <w:left w:val="single" w:sz="4" w:space="0" w:color="7E4C00"/>
+              <w:bottom w:val="single" w:sz="4" w:space="0" w:color="7E4C00"/>
+              <w:right w:val="single" w:sz="4" w:space="0" w:color="7E4C00"/>
+            </w:tcBorders>
+          </w:tcPr>
+          <w:p>
+            <w:pPr>
+              <w:spacing w:before="80" w:after="0"/>
+              <w:ind w:left="120"/>
+            </w:pPr>
+            <w:r>
+              <w:rPr>
+                <w:rFonts w:ascii="Calibri" w:hAnsi="Calibri"/>
+                <w:b/>
+                <w:i w:val="0"/>
+                <w:color w:val="FFFFFF"/>
+                <w:sz w:val="17"/>
+              </w:rPr>
+              <w:t>@codigo</w:t>
+            </w:r>
+          </w:p>
+        </w:tc>
+      </w:tr>
+      <w:tr>
+        <w:tc>
+          <w:tcPr>
+            <w:tcW w:type="dxa" w:w="15138"/>
+            <w:shd w:val="clear" w:color="auto" w:fill="FFE6CC"/>
+            <w:tcBorders>
+              <w:top w:val="single" w:sz="4" w:space="0" w:color="CCCCCC"/>
+              <w:left w:val="single" w:sz="4" w:space="0" w:color="CCCCCC"/>
+              <w:bottom w:val="single" w:sz="4" w:space="0" w:color="CCCCCC"/>
+              <w:right w:val="single" w:sz="4" w:space="0" w:color="CCCCCC"/>
+            </w:tcBorders>
+            <w:vAlign w:val="top"/>
+          </w:tcPr>
+          <w:p>
+            <w:pPr>
+              <w:spacing w:before="80" w:after="80"/>
+              <w:ind w:left="120" w:right="120"/>
+            </w:pPr>
+            <w:r>
+              <w:rPr>
+                <w:rFonts w:ascii="Calibri" w:hAnsi="Calibri"/>
+                <w:b w:val="0"/>
+                <w:i w:val="0"/>
+                <w:color w:val="222222"/>
+                <w:sz w:val="18"/>
+              </w:rPr>
+              <w:t>O @codigo (art.º 19.º) é genérico: exige apenas 'conhecimentos e aptidão necessária' sob orientação do médico veterinário responsável. Não detalha competências concretas nem exigências de formação formal.</w:t>
+            </w:r>
+          </w:p>
+        </w:tc>
+      </w:tr>
+      <w:tr>
+        <w:tc>
+          <w:tcPr>
+            <w:tcW w:type="dxa" w:w="15138"/>
+            <w:shd w:val="clear" w:color="auto" w:fill="1E5631"/>
+            <w:tcBorders>
+              <w:top w:val="single" w:sz="4" w:space="0" w:color="1E5631"/>
+              <w:left w:val="single" w:sz="4" w:space="0" w:color="1E5631"/>
+              <w:bottom w:val="single" w:sz="4" w:space="0" w:color="1E5631"/>
+              <w:right w:val="single" w:sz="4" w:space="0" w:color="1E5631"/>
+            </w:tcBorders>
+          </w:tcPr>
+          <w:p>
+            <w:pPr>
+              <w:spacing w:before="80" w:after="0"/>
+              <w:ind w:left="120"/>
+            </w:pPr>
+            <w:r>
+              <w:rPr>
+                <w:rFonts w:ascii="Calibri" w:hAnsi="Calibri"/>
+                <w:b/>
+                <w:i w:val="0"/>
+                <w:color w:val="FFFFFF"/>
+                <w:sz w:val="17"/>
+              </w:rPr>
+              <w:t>@rgbeac</w:t>
+            </w:r>
+          </w:p>
+        </w:tc>
+      </w:tr>
+      <w:tr>
+        <w:tc>
+          <w:tcPr>
+            <w:tcW w:type="dxa" w:w="15138"/>
+            <w:shd w:val="clear" w:color="auto" w:fill="D5E8D4"/>
+            <w:tcBorders>
+              <w:top w:val="single" w:sz="4" w:space="0" w:color="CCCCCC"/>
+              <w:left w:val="single" w:sz="4" w:space="0" w:color="CCCCCC"/>
+              <w:bottom w:val="single" w:sz="4" w:space="0" w:color="CCCCCC"/>
+              <w:right w:val="single" w:sz="4" w:space="0" w:color="CCCCCC"/>
+            </w:tcBorders>
+            <w:vAlign w:val="top"/>
+          </w:tcPr>
+          <w:p>
+            <w:pPr>
+              <w:spacing w:before="80" w:after="80"/>
+              <w:ind w:left="120" w:right="120"/>
+            </w:pPr>
+            <w:r>
+              <w:rPr>
+                <w:rFonts w:ascii="Calibri" w:hAnsi="Calibri"/>
+                <w:b w:val="0"/>
+                <w:i w:val="0"/>
+                <w:color w:val="222222"/>
+                <w:sz w:val="18"/>
+              </w:rPr>
+              <w:t>O @rgbeac (art.ºs 69.º, 84.º, 90.º) aproxima-se mais do @regulamento: exige 'conhecimentos e experiência adequados', menciona 'necessidades fisiológicas e etológicas', exige formação certificada pelo ICNF. Lacuna: não detalha as 4 competências específicas do @regulamento (reconhecimento de sofrimento, condicionamento operante, etc.).</w:t>
+            </w:r>
+          </w:p>
+        </w:tc>
+      </w:tr>
+      <w:tr>
+        <w:tc>
+          <w:tcPr>
+            <w:tcW w:type="dxa" w:w="15138"/>
+            <w:shd w:val="clear" w:color="auto" w:fill="5D2A8A"/>
+            <w:tcBorders>
+              <w:top w:val="single" w:sz="4" w:space="0" w:color="5D2A8A"/>
+              <w:left w:val="single" w:sz="4" w:space="0" w:color="5D2A8A"/>
+              <w:bottom w:val="single" w:sz="4" w:space="0" w:color="5D2A8A"/>
+              <w:right w:val="single" w:sz="4" w:space="0" w:color="5D2A8A"/>
+            </w:tcBorders>
+          </w:tcPr>
+          <w:p>
+            <w:pPr>
+              <w:spacing w:before="80" w:after="0"/>
+              <w:ind w:left="120"/>
+            </w:pPr>
+            <w:r>
+              <w:rPr>
+                <w:rFonts w:ascii="Calibri" w:hAnsi="Calibri"/>
+                <w:b/>
+                <w:i w:val="0"/>
+                <w:color w:val="FFFFFF"/>
+                <w:sz w:val="17"/>
+              </w:rPr>
+              <w:t>Sumário / Proposta</w:t>
+            </w:r>
+          </w:p>
+        </w:tc>
+      </w:tr>
+      <w:tr>
+        <w:tc>
+          <w:tcPr>
+            <w:tcW w:type="dxa" w:w="15138"/>
+            <w:shd w:val="clear" w:color="auto" w:fill="EAD7F7"/>
+            <w:tcBorders>
+              <w:top w:val="single" w:sz="4" w:space="0" w:color="CCCCCC"/>
+              <w:left w:val="single" w:sz="4" w:space="0" w:color="CCCCCC"/>
+              <w:bottom w:val="single" w:sz="4" w:space="0" w:color="CCCCCC"/>
+              <w:right w:val="single" w:sz="4" w:space="0" w:color="CCCCCC"/>
+            </w:tcBorders>
+            <w:vAlign w:val="top"/>
+          </w:tcPr>
+          <w:p>
+            <w:pPr>
+              <w:spacing w:before="80" w:after="80"/>
+              <w:ind w:left="120" w:right="120"/>
+            </w:pPr>
+            <w:r>
+              <w:rPr>
+                <w:rFonts w:ascii="Calibri" w:hAnsi="Calibri"/>
+                <w:b w:val="0"/>
+                <w:i w:val="0"/>
+                <w:color w:val="222222"/>
+                <w:sz w:val="18"/>
+              </w:rPr>
+              <w:t>Alinhamento parcial do @rgbeac com @regulamento. Para @codigo e @legislacao, necessidade de: (1) detalhar as 4 competências específicas (comportamento, reconhecimento de sofrimento, maneio positivo, conhecimento de obrigações); (2) exigir documentação formal de educação/formação/experiência; (3) requerer que operador designe formador responsável que transfira conhecimento; (4) implementar requisitos mínimos de formação via regulamento delegado.</w:t>
+            </w:r>
+          </w:p>
+        </w:tc>
+      </w:tr>
+    </w:tbl>
+    <w:p>
+      <w:pPr>
+        <w:spacing w:after="80"/>
+      </w:pPr>
+    </w:p>
+    <w:tbl>
+      <w:tblPr>
+        <w:tblLook w:firstColumn="1" w:firstRow="1" w:lastColumn="0" w:lastRow="0" w:noHBand="0" w:noVBand="1" w:val="04A0"/>
+        <w:tblW w:w="5000" w:type="pct"/>
+      </w:tblPr>
+      <w:tblGrid>
+        <w:gridCol w:w="15138"/>
+      </w:tblGrid>
+      <w:tr>
+        <w:tc>
+          <w:tcPr>
+            <w:tcW w:type="dxa" w:w="15138"/>
+            <w:shd w:val="clear" w:color="auto" w:fill="4A4A4A"/>
+            <w:tcBorders>
+              <w:top w:val="single" w:sz="4" w:space="0" w:color="CCCCCC"/>
+              <w:left w:val="single" w:sz="4" w:space="0" w:color="CCCCCC"/>
+              <w:bottom w:val="single" w:sz="4" w:space="0" w:color="CCCCCC"/>
+              <w:right w:val="single" w:sz="4" w:space="0" w:color="CCCCCC"/>
+            </w:tcBorders>
+          </w:tcPr>
+          <w:p>
+            <w:pPr>
+              <w:spacing w:before="80" w:after="80"/>
+              <w:jc w:val="center"/>
+            </w:pPr>
+            <w:r>
+              <w:rPr>
+                <w:rFonts w:ascii="Calibri" w:hAnsi="Calibri"/>
+                <w:b/>
+                <w:i w:val="0"/>
+                <w:color w:val="FFFFFF"/>
+                <w:sz w:val="18"/>
+              </w:rPr>
+              <w:t>NOTAS DE REUNIÃO</w:t>
+            </w:r>
+          </w:p>
+        </w:tc>
+      </w:tr>
+      <w:tr>
+        <w:tc>
+          <w:tcPr>
+            <w:tcW w:type="dxa" w:w="15138"/>
+            <w:shd w:val="clear" w:color="auto" w:fill="F5F5F5"/>
+            <w:tcBorders>
+              <w:top w:val="single" w:sz="4" w:space="0" w:color="CCCCCC"/>
+              <w:left w:val="single" w:sz="4" w:space="0" w:color="CCCCCC"/>
+              <w:bottom w:val="single" w:sz="4" w:space="0" w:color="CCCCCC"/>
+              <w:right w:val="single" w:sz="4" w:space="0" w:color="CCCCCC"/>
+            </w:tcBorders>
+          </w:tcPr>
+          <w:p>
+            <w:pPr>
+              <w:spacing w:before="120" w:after="800"/>
+              <w:ind w:left="80"/>
+            </w:pPr>
+            <w:r>
+              <w:rPr>
+                <w:rFonts w:ascii="Calibri" w:hAnsi="Calibri"/>
+                <w:b w:val="0"/>
+                <w:i/>
+                <w:color w:val="888888"/>
+                <w:sz w:val="19"/>
+              </w:rPr>
+              <w:t>(espaço para anotações da reunião)</w:t>
+            </w:r>
+          </w:p>
+        </w:tc>
+      </w:tr>
+    </w:tbl>
+    <w:p/>
+    <w:p>
+      <w:pPr>
+        <w:spacing w:before="0" w:after="320"/>
+      </w:pPr>
+      <w:r>
+        <w:rPr>
+          <w:color w:val="CCCCCC"/>
+          <w:sz w:val="16"/>
+        </w:rPr>
+        <w:t>────────────────────────────────────────────────────────────────────────────────</w:t>
+      </w:r>
+    </w:p>
+    <w:p>
+      <w:r>
+        <w:br w:type="page"/>
+      </w:r>
+    </w:p>
+    <w:tbl>
+      <w:tblPr>
+        <w:tblLook w:firstColumn="1" w:firstRow="1" w:lastColumn="0" w:lastRow="0" w:noHBand="0" w:noVBand="1" w:val="04A0"/>
+        <w:tblW w:w="5000" w:type="pct"/>
+        <w:tblBorders>
+          <w:top w:val="none" w:sz="0" w:space="0" w:color="auto"/>
+          <w:left w:val="none" w:sz="0" w:space="0" w:color="auto"/>
+          <w:bottom w:val="none" w:sz="0" w:space="0" w:color="auto"/>
+          <w:right w:val="none" w:sz="0" w:space="0" w:color="auto"/>
+          <w:insideH w:val="none" w:sz="0" w:space="0" w:color="auto"/>
+          <w:insideV w:val="none" w:sz="0" w:space="0" w:color="auto"/>
+        </w:tblBorders>
+      </w:tblPr>
+      <w:tblGrid>
+        <w:gridCol w:w="7569"/>
+        <w:gridCol w:w="7569"/>
+      </w:tblGrid>
+      <w:tr>
+        <w:tc>
+          <w:tcPr>
+            <w:tcW w:type="dxa" w:w="7569"/>
+            <w:shd w:val="clear" w:color="auto" w:fill="1A1A2E"/>
+            <w:tcBorders>
+              <w:top w:val="single" w:sz="4" w:space="0" w:color="1A1A2E"/>
+              <w:left w:val="single" w:sz="4" w:space="0" w:color="1A1A2E"/>
+              <w:bottom w:val="single" w:sz="4" w:space="0" w:color="1A1A2E"/>
+              <w:right w:val="single" w:sz="4" w:space="0" w:color="1A1A2E"/>
+            </w:tcBorders>
+          </w:tcPr>
+          <w:p>
+            <w:pPr>
+              <w:spacing w:before="160" w:after="160"/>
+              <w:ind w:left="200"/>
+            </w:pPr>
+            <w:r>
+              <w:rPr>
+                <w:rFonts w:ascii="Calibri" w:hAnsi="Calibri"/>
+                <w:b/>
+                <w:i w:val="0"/>
+                <w:color w:val="FFFFFF"/>
+                <w:sz w:val="22"/>
+              </w:rPr>
+              <w:t>ART-10</w:t>
+            </w:r>
+          </w:p>
+        </w:tc>
+        <w:tc>
+          <w:tcPr>
+            <w:tcW w:type="dxa" w:w="7569"/>
+            <w:shd w:val="clear" w:color="auto" w:fill="2C3E6B"/>
+            <w:tcBorders>
+              <w:top w:val="single" w:sz="4" w:space="0" w:color="2C3E6B"/>
+              <w:left w:val="single" w:sz="4" w:space="0" w:color="2C3E6B"/>
+              <w:bottom w:val="single" w:sz="4" w:space="0" w:color="2C3E6B"/>
+              <w:right w:val="single" w:sz="4" w:space="0" w:color="2C3E6B"/>
+            </w:tcBorders>
+          </w:tcPr>
+          <w:p>
+            <w:pPr>
+              <w:spacing w:before="160" w:after="160"/>
+              <w:ind w:left="200"/>
+            </w:pPr>
+            <w:r>
+              <w:rPr>
+                <w:rFonts w:ascii="Calibri" w:hAnsi="Calibri"/>
+                <w:b/>
+                <w:i w:val="0"/>
+                <w:color w:val="7EC8E3"/>
+                <w:sz w:val="22"/>
+              </w:rPr>
+              <w:t>Avaliação e Supervisão de Bem-Estar</w:t>
+            </w:r>
+          </w:p>
+        </w:tc>
+      </w:tr>
+    </w:tbl>
+    <w:p>
+      <w:pPr>
+        <w:spacing w:after="80"/>
+      </w:pPr>
+    </w:p>
+    <w:tbl>
+      <w:tblPr>
+        <w:tblLook w:firstColumn="1" w:firstRow="1" w:lastColumn="0" w:lastRow="0" w:noHBand="0" w:noVBand="1" w:val="04A0"/>
+        <w:tblW w:w="5000" w:type="pct"/>
+      </w:tblPr>
+      <w:tblGrid>
+        <w:gridCol w:w="15138"/>
+      </w:tblGrid>
+      <w:tr>
+        <w:tc>
+          <w:tcPr>
+            <w:tcW w:type="dxa" w:w="15138"/>
+            <w:shd w:val="clear" w:color="auto" w:fill="1A3A5C"/>
+            <w:tcBorders>
+              <w:top w:val="single" w:sz="4" w:space="0" w:color="CCCCCC"/>
+              <w:left w:val="single" w:sz="4" w:space="0" w:color="CCCCCC"/>
+              <w:bottom w:val="single" w:sz="4" w:space="0" w:color="CCCCCC"/>
+              <w:right w:val="single" w:sz="4" w:space="0" w:color="CCCCCC"/>
+            </w:tcBorders>
+          </w:tcPr>
+          <w:p>
+            <w:pPr>
+              <w:spacing w:before="80" w:after="80"/>
+              <w:jc w:val="center"/>
+            </w:pPr>
+            <w:r>
+              <w:rPr>
+                <w:rFonts w:ascii="Calibri" w:hAnsi="Calibri"/>
+                <w:b/>
+                <w:i w:val="0"/>
+                <w:color w:val="FFFFFF"/>
+                <w:sz w:val="18"/>
+              </w:rPr>
+              <w:t>@regulamento — Advisory welfare visits  ·  Art.º 10.º do Regulamento 2023/0447  |  EN</w:t>
+            </w:r>
+          </w:p>
+        </w:tc>
+      </w:tr>
+      <w:tr>
+        <w:tc>
+          <w:tcPr>
+            <w:tcW w:type="dxa" w:w="15138"/>
+            <w:shd w:val="clear" w:color="auto" w:fill="D6E4F0"/>
+            <w:tcBorders>
+              <w:top w:val="single" w:sz="4" w:space="0" w:color="CCCCCC"/>
+              <w:left w:val="single" w:sz="4" w:space="0" w:color="CCCCCC"/>
+              <w:bottom w:val="single" w:sz="4" w:space="0" w:color="CCCCCC"/>
+              <w:right w:val="single" w:sz="4" w:space="0" w:color="CCCCCC"/>
+            </w:tcBorders>
+            <w:vAlign w:val="top"/>
+          </w:tcPr>
+          <w:p>
+            <w:pPr>
+              <w:spacing w:after="0" w:before="80"/>
+              <w:ind w:right="80" w:left="80" w:firstLine="0"/>
+            </w:pPr>
+            <w:r>
+              <w:rPr>
+                <w:rFonts w:ascii="Calibri" w:hAnsi="Calibri"/>
+                <w:b w:val="0"/>
+                <w:i w:val="0"/>
+                <w:color w:val="222222"/>
+                <w:sz w:val="19"/>
+              </w:rPr>
+              <w:t>Operators shall:</w:t>
+            </w:r>
+          </w:p>
+          <w:p>
+            <w:pPr>
+              <w:spacing w:after="0" w:before="100"/>
+              <w:ind w:right="80" w:left="360" w:hanging="280"/>
+            </w:pPr>
+            <w:r>
+              <w:rPr>
+                <w:rFonts w:ascii="Calibri" w:hAnsi="Calibri"/>
+                <w:b w:val="0"/>
+                <w:i w:val="0"/>
+                <w:color w:val="222222"/>
+                <w:sz w:val="19"/>
+              </w:rPr>
+              <w:t>(a) ensure that the establishments under their responsibility receive a visit by a veterinarian within the first year after the date of application of this Regulation or within the first year after having notified a new establishment, for the purpose of identifying and assessing any risk factor for the welfare of the dogs or cats and advising the operator on measures to address those risks; thereafter the visits from a veterinarian shall take place when appropriate, based on a risk analysis by the competent authorities; Member States may provide for that the advisory welfare visits are annual;</w:t>
+            </w:r>
+          </w:p>
+          <w:p>
+            <w:pPr>
+              <w:spacing w:after="0" w:before="100"/>
+              <w:ind w:right="80" w:left="360" w:hanging="280"/>
+            </w:pPr>
+            <w:r>
+              <w:rPr>
+                <w:rFonts w:ascii="Calibri" w:hAnsi="Calibri"/>
+                <w:b w:val="0"/>
+                <w:i w:val="0"/>
+                <w:color w:val="222222"/>
+                <w:sz w:val="19"/>
+              </w:rPr>
+              <w:t>(b) keep the records of the findings of the visit of the veterinarian referred to in point (a) and of their follow up actions for at least 4 years, from the day of the visit, and shall make them available to the competent authorities upon request and to the veterinarian that performs subsequent advisory visits.</w:t>
+            </w:r>
+          </w:p>
+          <w:p>
+            <w:pPr>
+              <w:spacing w:after="0" w:before="140"/>
+              <w:ind w:right="80" w:left="80" w:firstLine="0"/>
+            </w:pPr>
+            <w:r>
+              <w:rPr>
+                <w:rFonts w:ascii="Calibri" w:hAnsi="Calibri"/>
+                <w:b w:val="0"/>
+                <w:i w:val="0"/>
+                <w:color w:val="222222"/>
+                <w:sz w:val="19"/>
+              </w:rPr>
+              <w:t>By 24 months from the date of entry into force of this Regulation, the Commission shall adopt delegated acts in accordance with Article 23 supplementing this Article in order to lay down minimum criteria to be assessed during the advisory welfare visit.</w:t>
+            </w:r>
+          </w:p>
+        </w:tc>
+      </w:tr>
+    </w:tbl>
+    <w:p>
+      <w:pPr>
+        <w:spacing w:after="80"/>
+      </w:pPr>
+    </w:p>
+    <w:tbl>
+      <w:tblPr>
+        <w:tblLook w:firstColumn="1" w:firstRow="1" w:lastColumn="0" w:lastRow="0" w:noHBand="0" w:noVBand="1" w:val="04A0"/>
+        <w:tblW w:w="5000" w:type="pct"/>
+      </w:tblPr>
+      <w:tblGrid>
+        <w:gridCol w:w="15138"/>
+      </w:tblGrid>
+      <w:tr>
+        <w:tc>
+          <w:tcPr>
+            <w:tcW w:type="dxa" w:w="15138"/>
+            <w:shd w:val="clear" w:color="auto" w:fill="2471A3"/>
+            <w:tcBorders>
+              <w:top w:val="single" w:sz="4" w:space="0" w:color="CCCCCC"/>
+              <w:left w:val="single" w:sz="4" w:space="0" w:color="CCCCCC"/>
+              <w:bottom w:val="single" w:sz="4" w:space="0" w:color="CCCCCC"/>
+              <w:right w:val="single" w:sz="4" w:space="0" w:color="CCCCCC"/>
+            </w:tcBorders>
+          </w:tcPr>
+          <w:p>
+            <w:pPr>
+              <w:spacing w:before="80" w:after="80"/>
+              <w:jc w:val="center"/>
+            </w:pPr>
+            <w:r>
+              <w:rPr>
+                <w:rFonts w:ascii="Calibri" w:hAnsi="Calibri"/>
+                <w:b/>
+                <w:i w:val="0"/>
+                <w:color w:val="FFFFFF"/>
+                <w:sz w:val="18"/>
+              </w:rPr>
+              <w:t>@regulamento — Tradução PT-PT  ·  Art.º 10.º do Regulamento 2023/0447</w:t>
+            </w:r>
+          </w:p>
+        </w:tc>
+      </w:tr>
+      <w:tr>
+        <w:tc>
+          <w:tcPr>
+            <w:tcW w:type="dxa" w:w="15138"/>
+            <w:shd w:val="clear" w:color="auto" w:fill="EBF5FB"/>
+            <w:tcBorders>
+              <w:top w:val="single" w:sz="4" w:space="0" w:color="CCCCCC"/>
+              <w:left w:val="single" w:sz="4" w:space="0" w:color="CCCCCC"/>
+              <w:bottom w:val="single" w:sz="4" w:space="0" w:color="CCCCCC"/>
+              <w:right w:val="single" w:sz="4" w:space="0" w:color="CCCCCC"/>
+            </w:tcBorders>
+            <w:vAlign w:val="top"/>
+          </w:tcPr>
+          <w:p>
+            <w:pPr>
+              <w:spacing w:after="0" w:before="80"/>
+              <w:ind w:right="80" w:left="80" w:firstLine="0"/>
+            </w:pPr>
+            <w:r>
+              <w:rPr>
+                <w:rFonts w:ascii="Calibri" w:hAnsi="Calibri"/>
+                <w:b w:val="0"/>
+                <w:i/>
+                <w:color w:val="222222"/>
+                <w:sz w:val="19"/>
+              </w:rPr>
+              <w:t>Os operadores devem:</w:t>
+            </w:r>
+          </w:p>
+          <w:p>
+            <w:pPr>
+              <w:spacing w:after="0" w:before="100"/>
+              <w:ind w:right="80" w:left="360" w:hanging="280"/>
+            </w:pPr>
+            <w:r>
+              <w:rPr>
+                <w:rFonts w:ascii="Calibri" w:hAnsi="Calibri"/>
+                <w:b w:val="0"/>
+                <w:i/>
+                <w:color w:val="222222"/>
+                <w:sz w:val="19"/>
+              </w:rPr>
+              <w:t>(a) assegurar que os estabelecimentos sob a sua responsabilidade recebem uma visita de um médico veterinário no prazo de um ano a partir da data de aplicação do presente Regulamento ou no prazo de um ano após notificação de novo estabelecimento, com o objetivo de identificar e avaliar quaisquer fatores de risco para o bem-estar dos cães ou gatos e aconselhar o operador sobre medidas para resolver esses riscos; depois, as visitas do médico veterinário devem ocorrer quando apropriado, com base numa análise de risco pelas autoridades competentes; os Estados-Membros podem estabelecer que as visitas de aconselhamento de bem-estar sejam anuais;</w:t>
+            </w:r>
+          </w:p>
+          <w:p>
+            <w:pPr>
+              <w:spacing w:after="0" w:before="100"/>
+              <w:ind w:right="80" w:left="360" w:hanging="280"/>
+            </w:pPr>
+            <w:r>
+              <w:rPr>
+                <w:rFonts w:ascii="Calibri" w:hAnsi="Calibri"/>
+                <w:b w:val="0"/>
+                <w:i/>
+                <w:color w:val="222222"/>
+                <w:sz w:val="19"/>
+              </w:rPr>
+              <w:t>(b) manter registos dos resultados da visita do médico veterinário referida na alínea (a) e das ações de acompanhamento por um período mínimo de 4 anos, a partir da data da visita, e disponibilizá-los às autoridades competentes a pedido e ao médico veterinário que realiza visitas de aconselhamento subsequentes.</w:t>
+            </w:r>
+          </w:p>
+          <w:p>
+            <w:pPr>
+              <w:spacing w:after="0" w:before="140"/>
+              <w:ind w:right="80" w:left="80" w:firstLine="0"/>
+            </w:pPr>
+            <w:r>
+              <w:rPr>
+                <w:rFonts w:ascii="Calibri" w:hAnsi="Calibri"/>
+                <w:b w:val="0"/>
+                <w:i/>
+                <w:color w:val="222222"/>
+                <w:sz w:val="19"/>
+              </w:rPr>
+              <w:t>Dentro de 24 meses a partir da data de entrada em vigor do presente Regulamento, a Comissão deve adotar atos delegados em conformidade com o artigo 23.º que complementem o presente artigo de forma a estabelecer critérios mínimos a serem avaliados durante a visita de aconselhamento de bem-estar.</w:t>
+            </w:r>
+          </w:p>
+        </w:tc>
+      </w:tr>
+    </w:tbl>
+    <w:p>
+      <w:pPr>
+        <w:spacing w:after="80"/>
+      </w:pPr>
+    </w:p>
+    <w:tbl>
+      <w:tblPr>
+        <w:tblLook w:firstColumn="1" w:firstRow="1" w:lastColumn="0" w:lastRow="0" w:noHBand="0" w:noVBand="1" w:val="04A0"/>
+        <w:tblW w:w="5000" w:type="pct"/>
+      </w:tblPr>
+      <w:tblGrid>
+        <w:gridCol w:w="5046"/>
+        <w:gridCol w:w="5046"/>
+        <w:gridCol w:w="5046"/>
+      </w:tblGrid>
+      <w:tr>
+        <w:tc>
+          <w:tcPr>
+            <w:tcW w:type="dxa" w:w="5046"/>
+            <w:shd w:val="clear" w:color="auto" w:fill="1E5631"/>
+            <w:tcBorders>
+              <w:top w:val="single" w:sz="4" w:space="0" w:color="CCCCCC"/>
+              <w:left w:val="single" w:sz="4" w:space="0" w:color="CCCCCC"/>
+              <w:bottom w:val="single" w:sz="4" w:space="0" w:color="CCCCCC"/>
+              <w:right w:val="single" w:sz="4" w:space="0" w:color="CCCCCC"/>
+            </w:tcBorders>
+          </w:tcPr>
+          <w:p>
+            <w:pPr>
+              <w:spacing w:before="80" w:after="80"/>
+              <w:jc w:val="center"/>
+            </w:pPr>
+            <w:r>
+              <w:rPr>
+                <w:rFonts w:ascii="Calibri" w:hAnsi="Calibri"/>
+                <w:b/>
+                <w:i w:val="0"/>
+                <w:color w:val="FFFFFF"/>
+                <w:sz w:val="18"/>
+              </w:rPr>
+              <w:t>@rgbeac (proposta jun. 2025)</w:t>
+            </w:r>
+          </w:p>
+        </w:tc>
+        <w:tc>
+          <w:tcPr>
+            <w:tcW w:type="dxa" w:w="5046"/>
+            <w:shd w:val="clear" w:color="auto" w:fill="7E4C00"/>
+            <w:tcBorders>
+              <w:top w:val="single" w:sz="4" w:space="0" w:color="CCCCCC"/>
+              <w:left w:val="single" w:sz="4" w:space="0" w:color="CCCCCC"/>
+              <w:bottom w:val="single" w:sz="4" w:space="0" w:color="CCCCCC"/>
+              <w:right w:val="single" w:sz="4" w:space="0" w:color="CCCCCC"/>
+            </w:tcBorders>
+          </w:tcPr>
+          <w:p>
+            <w:pPr>
+              <w:spacing w:before="80" w:after="80"/>
+              <w:jc w:val="center"/>
+            </w:pPr>
+            <w:r>
+              <w:rPr>
+                <w:rFonts w:ascii="Calibri" w:hAnsi="Calibri"/>
+                <w:b/>
+                <w:i w:val="0"/>
+                <w:color w:val="FFFFFF"/>
+                <w:sz w:val="18"/>
+              </w:rPr>
+              <w:t>@codigo (DL n.º 214/2013)</w:t>
+            </w:r>
+          </w:p>
+        </w:tc>
+        <w:tc>
+          <w:tcPr>
+            <w:tcW w:type="dxa" w:w="5046"/>
+            <w:shd w:val="clear" w:color="auto" w:fill="006064"/>
+            <w:tcBorders>
+              <w:top w:val="single" w:sz="4" w:space="0" w:color="CCCCCC"/>
+              <w:left w:val="single" w:sz="4" w:space="0" w:color="CCCCCC"/>
+              <w:bottom w:val="single" w:sz="4" w:space="0" w:color="CCCCCC"/>
+              <w:right w:val="single" w:sz="4" w:space="0" w:color="CCCCCC"/>
+            </w:tcBorders>
+          </w:tcPr>
+          <w:p>
+            <w:pPr>
+              <w:spacing w:before="80" w:after="80"/>
+              <w:jc w:val="center"/>
+            </w:pPr>
+            <w:r>
+              <w:rPr>
+                <w:rFonts w:ascii="Calibri" w:hAnsi="Calibri"/>
+                <w:b/>
+                <w:i w:val="0"/>
+                <w:color w:val="FFFFFF"/>
+                <w:sz w:val="18"/>
+              </w:rPr>
+              <w:t>@legislacao (legislação vigente)</w:t>
+            </w:r>
+          </w:p>
+        </w:tc>
+      </w:tr>
+      <w:tr>
+        <w:tc>
+          <w:tcPr>
+            <w:tcW w:type="dxa" w:w="5046"/>
+            <w:shd w:val="clear" w:color="auto" w:fill="D5E8D4"/>
+            <w:tcBorders>
+              <w:top w:val="single" w:sz="4" w:space="0" w:color="CCCCCC"/>
+              <w:left w:val="single" w:sz="4" w:space="0" w:color="CCCCCC"/>
+              <w:bottom w:val="single" w:sz="4" w:space="0" w:color="CCCCCC"/>
+              <w:right w:val="single" w:sz="4" w:space="0" w:color="CCCCCC"/>
+            </w:tcBorders>
+            <w:vAlign w:val="top"/>
+          </w:tcPr>
+          <w:p>
+            <w:pPr>
+              <w:spacing w:before="80" w:after="40"/>
+              <w:ind w:left="80" w:right="80"/>
+            </w:pPr>
+            <w:r>
+              <w:rPr>
+                <w:rFonts w:ascii="Calibri" w:hAnsi="Calibri"/>
+                <w:b/>
+                <w:i/>
+                <w:color w:val="555555"/>
+                <w:sz w:val="16"/>
+              </w:rPr>
+              <w:t>Art.º 56.º do RGBEAC (proposta, jun. 2025)</w:t>
+            </w:r>
+          </w:p>
+          <w:p>
+            <w:pPr>
+              <w:spacing w:after="0" w:before="140"/>
+              <w:ind w:right="80" w:left="80" w:firstLine="0"/>
+            </w:pPr>
+            <w:r>
+              <w:rPr>
+                <w:rFonts w:ascii="Calibri" w:hAnsi="Calibri"/>
+                <w:b/>
+                <w:i w:val="0"/>
+                <w:color w:val="333333"/>
+                <w:sz w:val="18"/>
+              </w:rPr>
+              <w:t>Artigo 56.º — Médico veterinário responsável pelo alojamento</w:t>
+            </w:r>
+          </w:p>
+          <w:p>
+            <w:pPr>
+              <w:spacing w:after="0" w:before="140"/>
+              <w:ind w:right="80" w:left="80" w:firstLine="0"/>
+            </w:pPr>
+            <w:r>
+              <w:rPr>
+                <w:rFonts w:ascii="Calibri" w:hAnsi="Calibri"/>
+                <w:b w:val="0"/>
+                <w:i w:val="0"/>
+                <w:color w:val="222222"/>
+                <w:sz w:val="19"/>
+              </w:rPr>
+              <w:t>1 — Os titulares da exploração de alojamentos para hospedagem, com exceção dos alojamentos para hospedagem com fins higiénicos, devem ter ao seu serviço um médico veterinário responsável pelo alojamento.</w:t>
+            </w:r>
+          </w:p>
+          <w:p>
+            <w:pPr>
+              <w:spacing w:after="0" w:before="140"/>
+              <w:ind w:right="80" w:left="80" w:firstLine="0"/>
+            </w:pPr>
+            <w:r>
+              <w:rPr>
+                <w:rFonts w:ascii="Calibri" w:hAnsi="Calibri"/>
+                <w:b w:val="0"/>
+                <w:i w:val="0"/>
+                <w:color w:val="222222"/>
+                <w:sz w:val="19"/>
+              </w:rPr>
+              <w:t>2 — Ao médico veterinário responsável pelo alojamento compete:</w:t>
+            </w:r>
+          </w:p>
+          <w:p>
+            <w:pPr>
+              <w:spacing w:after="0" w:before="20"/>
+              <w:ind w:right="80" w:left="360" w:hanging="280"/>
+            </w:pPr>
+            <w:r>
+              <w:rPr>
+                <w:rFonts w:ascii="Calibri" w:hAnsi="Calibri"/>
+                <w:b w:val="0"/>
+                <w:i w:val="0"/>
+                <w:color w:val="222222"/>
+                <w:sz w:val="19"/>
+              </w:rPr>
+              <w:t>a) A elaboração de parecer relativo à verificação das condições higiossanitárias e de bem-estar animal exigidas no presente decreto-lei;</w:t>
+            </w:r>
+          </w:p>
+          <w:p>
+            <w:pPr>
+              <w:spacing w:after="0" w:before="20"/>
+              <w:ind w:right="80" w:left="360" w:hanging="280"/>
+            </w:pPr>
+            <w:r>
+              <w:rPr>
+                <w:rFonts w:ascii="Calibri" w:hAnsi="Calibri"/>
+                <w:b w:val="0"/>
+                <w:i w:val="0"/>
+                <w:color w:val="222222"/>
+                <w:sz w:val="19"/>
+              </w:rPr>
+              <w:t>b) A elaboração e a execução de programas e ações que visem a saúde e o bem-estar dos animais e o seu acompanhamento, bem como a emissão de pareceres relativos à saúde e ao bem-estar dos animais;</w:t>
+            </w:r>
+          </w:p>
+          <w:p>
+            <w:pPr>
+              <w:spacing w:after="0" w:before="20"/>
+              <w:ind w:right="80" w:left="360" w:hanging="280"/>
+            </w:pPr>
+            <w:r>
+              <w:rPr>
+                <w:rFonts w:ascii="Calibri" w:hAnsi="Calibri"/>
+                <w:b w:val="0"/>
+                <w:i w:val="0"/>
+                <w:color w:val="222222"/>
+                <w:sz w:val="19"/>
+              </w:rPr>
+              <w:t>c) A orientação técnica do pessoal responsável pela observação, maneio e prestação de cuidados aos animais;</w:t>
+            </w:r>
+          </w:p>
+          <w:p>
+            <w:pPr>
+              <w:spacing w:after="0" w:before="20"/>
+              <w:ind w:right="80" w:left="360" w:hanging="280"/>
+            </w:pPr>
+            <w:r>
+              <w:rPr>
+                <w:rFonts w:ascii="Calibri" w:hAnsi="Calibri"/>
+                <w:b w:val="0"/>
+                <w:i w:val="0"/>
+                <w:color w:val="222222"/>
+                <w:sz w:val="19"/>
+              </w:rPr>
+              <w:t>d) A colaboração com as autoridades competentes em todas as ações que estas determinem.</w:t>
+            </w:r>
+          </w:p>
+        </w:tc>
+        <w:tc>
+          <w:tcPr>
+            <w:tcW w:type="dxa" w:w="5046"/>
+            <w:shd w:val="clear" w:color="auto" w:fill="FFE6CC"/>
+            <w:tcBorders>
+              <w:top w:val="single" w:sz="4" w:space="0" w:color="CCCCCC"/>
+              <w:left w:val="single" w:sz="4" w:space="0" w:color="CCCCCC"/>
+              <w:bottom w:val="single" w:sz="4" w:space="0" w:color="CCCCCC"/>
+              <w:right w:val="single" w:sz="4" w:space="0" w:color="CCCCCC"/>
+            </w:tcBorders>
+            <w:vAlign w:val="top"/>
+          </w:tcPr>
+          <w:p>
+            <w:pPr>
+              <w:spacing w:before="80" w:after="40"/>
+              <w:ind w:left="80" w:right="80"/>
+            </w:pPr>
+            <w:r>
+              <w:rPr>
+                <w:rFonts w:ascii="Calibri" w:hAnsi="Calibri"/>
+                <w:b/>
+                <w:i/>
+                <w:color w:val="555555"/>
+                <w:sz w:val="16"/>
+              </w:rPr>
+              <w:t>Art.º 32.º do Código do Animal (DL n.º 214/2013)</w:t>
+            </w:r>
+          </w:p>
+          <w:p>
+            <w:pPr>
+              <w:spacing w:after="0" w:before="140"/>
+              <w:ind w:right="80" w:left="80" w:firstLine="0"/>
+            </w:pPr>
+            <w:r>
+              <w:rPr>
+                <w:rFonts w:ascii="Calibri" w:hAnsi="Calibri"/>
+                <w:b/>
+                <w:i w:val="0"/>
+                <w:color w:val="333333"/>
+                <w:sz w:val="18"/>
+              </w:rPr>
+              <w:t>Artigo 32.º — Médico veterinário responsável pelo alojamento</w:t>
+            </w:r>
+          </w:p>
+          <w:p>
+            <w:pPr>
+              <w:spacing w:after="0" w:before="140"/>
+              <w:ind w:right="80" w:left="80" w:firstLine="0"/>
+            </w:pPr>
+            <w:r>
+              <w:rPr>
+                <w:rFonts w:ascii="Calibri" w:hAnsi="Calibri"/>
+                <w:b w:val="0"/>
+                <w:i w:val="0"/>
+                <w:color w:val="222222"/>
+                <w:sz w:val="19"/>
+              </w:rPr>
+              <w:t>1 — Os titulares da exploração de alojamentos para hospedagem sem fins lucrativos e com fins lucrativos de animais, com exceção dos com fins higiénicos, necessitam de ter ao seu serviço um médico veterinário que seja responsável pelo alojamento.</w:t>
+            </w:r>
+          </w:p>
+          <w:p>
+            <w:pPr>
+              <w:spacing w:after="0" w:before="140"/>
+              <w:ind w:right="80" w:left="80" w:firstLine="0"/>
+            </w:pPr>
+            <w:r>
+              <w:rPr>
+                <w:rFonts w:ascii="Calibri" w:hAnsi="Calibri"/>
+                <w:b w:val="0"/>
+                <w:i w:val="0"/>
+                <w:color w:val="222222"/>
+                <w:sz w:val="19"/>
+              </w:rPr>
+              <w:t>2 — Ao médico veterinário responsável pelo alojamento compete:</w:t>
+            </w:r>
+          </w:p>
+          <w:p>
+            <w:pPr>
+              <w:spacing w:after="0" w:before="20"/>
+              <w:ind w:right="80" w:left="360" w:hanging="280"/>
+            </w:pPr>
+            <w:r>
+              <w:rPr>
+                <w:rFonts w:ascii="Calibri" w:hAnsi="Calibri"/>
+                <w:b w:val="0"/>
+                <w:i w:val="0"/>
+                <w:color w:val="222222"/>
+                <w:sz w:val="19"/>
+              </w:rPr>
+              <w:t>a) A elaboração e execução de programas que visem a saúde e o bem-estar dos animais e o seu acompanhamento, bem como a emissão de pareceres relativos à saúde e ao bem-estar dos animais;</w:t>
+            </w:r>
+          </w:p>
+          <w:p>
+            <w:pPr>
+              <w:spacing w:after="0" w:before="20"/>
+              <w:ind w:right="80" w:left="360" w:hanging="280"/>
+            </w:pPr>
+            <w:r>
+              <w:rPr>
+                <w:rFonts w:ascii="Calibri" w:hAnsi="Calibri"/>
+                <w:b w:val="0"/>
+                <w:i w:val="0"/>
+                <w:color w:val="222222"/>
+                <w:sz w:val="19"/>
+              </w:rPr>
+              <w:t>b) A orientação técnica do pessoal que cuida dos animais;</w:t>
+            </w:r>
+          </w:p>
+          <w:p>
+            <w:pPr>
+              <w:spacing w:after="0" w:before="20"/>
+              <w:ind w:right="80" w:left="360" w:hanging="280"/>
+            </w:pPr>
+            <w:r>
+              <w:rPr>
+                <w:rFonts w:ascii="Calibri" w:hAnsi="Calibri"/>
+                <w:b w:val="0"/>
+                <w:i w:val="0"/>
+                <w:color w:val="222222"/>
+                <w:sz w:val="19"/>
+              </w:rPr>
+              <w:t>c) A colaboração com as autoridades competentes em todas as ações que estas determinarem.</w:t>
+            </w:r>
+          </w:p>
+        </w:tc>
+        <w:tc>
+          <w:tcPr>
+            <w:tcW w:type="dxa" w:w="5046"/>
+            <w:shd w:val="clear" w:color="auto" w:fill="E0F7FA"/>
+            <w:tcBorders>
+              <w:top w:val="single" w:sz="4" w:space="0" w:color="CCCCCC"/>
+              <w:left w:val="single" w:sz="4" w:space="0" w:color="CCCCCC"/>
+              <w:bottom w:val="single" w:sz="4" w:space="0" w:color="CCCCCC"/>
+              <w:right w:val="single" w:sz="4" w:space="0" w:color="CCCCCC"/>
+            </w:tcBorders>
+            <w:vAlign w:val="top"/>
+          </w:tcPr>
+          <w:p>
+            <w:pPr>
+              <w:spacing w:before="80" w:after="40"/>
+              <w:ind w:left="80" w:right="80"/>
+            </w:pPr>
+            <w:r>
+              <w:rPr>
+                <w:rFonts w:ascii="Calibri" w:hAnsi="Calibri"/>
+                <w:b/>
+                <w:i/>
+                <w:color w:val="555555"/>
+                <w:sz w:val="16"/>
+              </w:rPr>
+              <w:t>Art.º 4.º do DL n.º 276/2001, de 17 de outubro</w:t>
+            </w:r>
+          </w:p>
+          <w:p>
+            <w:pPr>
+              <w:spacing w:after="0" w:before="140"/>
+              <w:ind w:right="80" w:left="80" w:firstLine="0"/>
+            </w:pPr>
+            <w:r>
+              <w:rPr>
+                <w:rFonts w:ascii="Calibri" w:hAnsi="Calibri"/>
+                <w:b/>
+                <w:i w:val="0"/>
+                <w:color w:val="333333"/>
+                <w:sz w:val="18"/>
+              </w:rPr>
+              <w:t>Artigo 4.º — Médico veterinário responsável pelo alojamento</w:t>
+            </w:r>
+          </w:p>
+          <w:p>
+            <w:pPr>
+              <w:spacing w:after="0" w:before="140"/>
+              <w:ind w:right="80" w:left="80" w:firstLine="0"/>
+            </w:pPr>
+            <w:r>
+              <w:rPr>
+                <w:rFonts w:ascii="Calibri" w:hAnsi="Calibri"/>
+                <w:b w:val="0"/>
+                <w:i w:val="0"/>
+                <w:color w:val="222222"/>
+                <w:sz w:val="19"/>
+              </w:rPr>
+              <w:t>1 — Os titulares da exploração de alojamentos para hospedagem sem fins lucrativos e com fins lucrativos de animais, com exceção dos alojamentos para hospedagem com fins higiénicos, devem ter ao seu serviço um médico veterinário que seja responsável pelo alojamento.</w:t>
+            </w:r>
+          </w:p>
+          <w:p>
+            <w:pPr>
+              <w:spacing w:after="0" w:before="140"/>
+              <w:ind w:right="80" w:left="80" w:firstLine="0"/>
+            </w:pPr>
+            <w:r>
+              <w:rPr>
+                <w:rFonts w:ascii="Calibri" w:hAnsi="Calibri"/>
+                <w:b w:val="0"/>
+                <w:i w:val="0"/>
+                <w:color w:val="222222"/>
+                <w:sz w:val="19"/>
+              </w:rPr>
+              <w:t>2 — Ao médico veterinário responsável pelo alojamento compete:</w:t>
+            </w:r>
+          </w:p>
+          <w:p>
+            <w:pPr>
+              <w:spacing w:after="0" w:before="20"/>
+              <w:ind w:right="80" w:left="360" w:hanging="280"/>
+            </w:pPr>
+            <w:r>
+              <w:rPr>
+                <w:rFonts w:ascii="Calibri" w:hAnsi="Calibri"/>
+                <w:b w:val="0"/>
+                <w:i w:val="0"/>
+                <w:color w:val="222222"/>
+                <w:sz w:val="19"/>
+              </w:rPr>
+              <w:t>a) A elaboração e a execução de programas e ações que visem a saúde e o bem-estar dos animais e o seu acompanhamento, bem como a emissão de pareceres relativos à saúde e ao bem-estar dos animais;</w:t>
+            </w:r>
+          </w:p>
+          <w:p>
+            <w:pPr>
+              <w:spacing w:after="0" w:before="20"/>
+              <w:ind w:right="80" w:left="360" w:hanging="280"/>
+            </w:pPr>
+            <w:r>
+              <w:rPr>
+                <w:rFonts w:ascii="Calibri" w:hAnsi="Calibri"/>
+                <w:b w:val="0"/>
+                <w:i w:val="0"/>
+                <w:color w:val="222222"/>
+                <w:sz w:val="19"/>
+              </w:rPr>
+              <w:t>b) A orientação técnica do pessoal que cuida dos animais;</w:t>
+            </w:r>
+          </w:p>
+          <w:p>
+            <w:pPr>
+              <w:spacing w:after="0" w:before="20"/>
+              <w:ind w:right="80" w:left="360" w:hanging="280"/>
+            </w:pPr>
+            <w:r>
+              <w:rPr>
+                <w:rFonts w:ascii="Calibri" w:hAnsi="Calibri"/>
+                <w:b w:val="0"/>
+                <w:i w:val="0"/>
+                <w:color w:val="222222"/>
+                <w:sz w:val="19"/>
+              </w:rPr>
+              <w:t>c) A colaboração com as autoridades competentes em todas as ações que estas determinarem.</w:t>
+            </w:r>
+          </w:p>
+        </w:tc>
+      </w:tr>
+    </w:tbl>
+    <w:p>
+      <w:pPr>
+        <w:spacing w:after="80"/>
+      </w:pPr>
+    </w:p>
+    <w:tbl>
+      <w:tblPr>
+        <w:tblLook w:firstColumn="1" w:firstRow="1" w:lastColumn="0" w:lastRow="0" w:noHBand="0" w:noVBand="1" w:val="04A0"/>
+        <w:tblW w:w="5000" w:type="pct"/>
+      </w:tblPr>
+      <w:tblGrid>
+        <w:gridCol w:w="15138"/>
+      </w:tblGrid>
+      <w:tr>
+        <w:tc>
+          <w:tcPr>
+            <w:tcW w:type="dxa" w:w="15138"/>
+            <w:shd w:val="clear" w:color="auto" w:fill="5D2A8A"/>
+            <w:tcBorders>
+              <w:top w:val="single" w:sz="4" w:space="0" w:color="CCCCCC"/>
+              <w:left w:val="single" w:sz="4" w:space="0" w:color="CCCCCC"/>
+              <w:bottom w:val="single" w:sz="4" w:space="0" w:color="CCCCCC"/>
+              <w:right w:val="single" w:sz="4" w:space="0" w:color="CCCCCC"/>
+            </w:tcBorders>
+          </w:tcPr>
+          <w:p>
+            <w:pPr>
+              <w:spacing w:before="80" w:after="80"/>
+              <w:jc w:val="center"/>
+            </w:pPr>
+            <w:r>
+              <w:rPr>
+                <w:rFonts w:ascii="Calibri" w:hAnsi="Calibri"/>
+                <w:b/>
+                <w:i w:val="0"/>
+                <w:color w:val="FFFFFF"/>
+                <w:sz w:val="18"/>
+              </w:rPr>
+              <w:t>DIVERGÊNCIA FACE AO REGULAMENTO  ·  Necessidade de alteração: Sim</w:t>
+            </w:r>
+          </w:p>
+        </w:tc>
+      </w:tr>
+      <w:tr>
+        <w:tc>
+          <w:tcPr>
+            <w:tcW w:type="dxa" w:w="15138"/>
+            <w:shd w:val="clear" w:color="auto" w:fill="006064"/>
+            <w:tcBorders>
+              <w:top w:val="single" w:sz="4" w:space="0" w:color="006064"/>
+              <w:left w:val="single" w:sz="4" w:space="0" w:color="006064"/>
+              <w:bottom w:val="single" w:sz="4" w:space="0" w:color="006064"/>
+              <w:right w:val="single" w:sz="4" w:space="0" w:color="006064"/>
+            </w:tcBorders>
+          </w:tcPr>
+          <w:p>
+            <w:pPr>
+              <w:spacing w:before="80" w:after="0"/>
+              <w:ind w:left="120"/>
+            </w:pPr>
+            <w:r>
+              <w:rPr>
+                <w:rFonts w:ascii="Calibri" w:hAnsi="Calibri"/>
+                <w:b/>
+                <w:i w:val="0"/>
+                <w:color w:val="FFFFFF"/>
+                <w:sz w:val="17"/>
+              </w:rPr>
+              <w:t>@legislacao</w:t>
+            </w:r>
+          </w:p>
+        </w:tc>
+      </w:tr>
+      <w:tr>
+        <w:tc>
+          <w:tcPr>
+            <w:tcW w:type="dxa" w:w="15138"/>
+            <w:shd w:val="clear" w:color="auto" w:fill="E0F7FA"/>
+            <w:tcBorders>
+              <w:top w:val="single" w:sz="4" w:space="0" w:color="CCCCCC"/>
+              <w:left w:val="single" w:sz="4" w:space="0" w:color="CCCCCC"/>
+              <w:bottom w:val="single" w:sz="4" w:space="0" w:color="CCCCCC"/>
+              <w:right w:val="single" w:sz="4" w:space="0" w:color="CCCCCC"/>
+            </w:tcBorders>
+            <w:vAlign w:val="top"/>
+          </w:tcPr>
+          <w:p>
+            <w:pPr>
+              <w:spacing w:before="80" w:after="80"/>
+              <w:ind w:left="120" w:right="120"/>
+            </w:pPr>
+            <w:r>
+              <w:rPr>
+                <w:rFonts w:ascii="Calibri" w:hAnsi="Calibri"/>
+                <w:b w:val="0"/>
+                <w:i w:val="0"/>
+                <w:color w:val="222222"/>
+                <w:sz w:val="18"/>
+              </w:rPr>
+              <w:t>O DL n.º 276/2001 (art.º 4.º) estabelece a obrigação de ter médico veterinário responsável que execute 'programas e ações' para saúde e bem-estar, mas não especifica que essa avaliação deve ocorrer em prazo determinado (ex.: 1 ano) ou que os registos devem ser mantidos por período específico (4 anos). O @regulamento é mais prescritivo neste aspecto.</w:t>
+            </w:r>
+          </w:p>
+        </w:tc>
+      </w:tr>
+      <w:tr>
+        <w:tc>
+          <w:tcPr>
+            <w:tcW w:type="dxa" w:w="15138"/>
+            <w:shd w:val="clear" w:color="auto" w:fill="7E4C00"/>
+            <w:tcBorders>
+              <w:top w:val="single" w:sz="4" w:space="0" w:color="7E4C00"/>
+              <w:left w:val="single" w:sz="4" w:space="0" w:color="7E4C00"/>
+              <w:bottom w:val="single" w:sz="4" w:space="0" w:color="7E4C00"/>
+              <w:right w:val="single" w:sz="4" w:space="0" w:color="7E4C00"/>
+            </w:tcBorders>
+          </w:tcPr>
+          <w:p>
+            <w:pPr>
+              <w:spacing w:before="80" w:after="0"/>
+              <w:ind w:left="120"/>
+            </w:pPr>
+            <w:r>
+              <w:rPr>
+                <w:rFonts w:ascii="Calibri" w:hAnsi="Calibri"/>
+                <w:b/>
+                <w:i w:val="0"/>
+                <w:color w:val="FFFFFF"/>
+                <w:sz w:val="17"/>
+              </w:rPr>
+              <w:t>@codigo</w:t>
+            </w:r>
+          </w:p>
+        </w:tc>
+      </w:tr>
+      <w:tr>
+        <w:tc>
+          <w:tcPr>
+            <w:tcW w:type="dxa" w:w="15138"/>
+            <w:shd w:val="clear" w:color="auto" w:fill="FFE6CC"/>
+            <w:tcBorders>
+              <w:top w:val="single" w:sz="4" w:space="0" w:color="CCCCCC"/>
+              <w:left w:val="single" w:sz="4" w:space="0" w:color="CCCCCC"/>
+              <w:bottom w:val="single" w:sz="4" w:space="0" w:color="CCCCCC"/>
+              <w:right w:val="single" w:sz="4" w:space="0" w:color="CCCCCC"/>
+            </w:tcBorders>
+            <w:vAlign w:val="top"/>
+          </w:tcPr>
+          <w:p>
+            <w:pPr>
+              <w:spacing w:before="80" w:after="80"/>
+              <w:ind w:left="120" w:right="120"/>
+            </w:pPr>
+            <w:r>
+              <w:rPr>
+                <w:rFonts w:ascii="Calibri" w:hAnsi="Calibri"/>
+                <w:b w:val="0"/>
+                <w:i w:val="0"/>
+                <w:color w:val="222222"/>
+                <w:sz w:val="18"/>
+              </w:rPr>
+              <w:t>O @codigo (art.º 32.º) replica quase verbatim o art.º 4.º do DL n.º 276/2001, mantendo as mesmas lacunas: não fixa prazos para avaliações de bem-estar nem obrigações de manutenção de registos estruturados.</w:t>
+            </w:r>
+          </w:p>
+        </w:tc>
+      </w:tr>
+      <w:tr>
+        <w:tc>
+          <w:tcPr>
+            <w:tcW w:type="dxa" w:w="15138"/>
+            <w:shd w:val="clear" w:color="auto" w:fill="1E5631"/>
+            <w:tcBorders>
+              <w:top w:val="single" w:sz="4" w:space="0" w:color="1E5631"/>
+              <w:left w:val="single" w:sz="4" w:space="0" w:color="1E5631"/>
+              <w:bottom w:val="single" w:sz="4" w:space="0" w:color="1E5631"/>
+              <w:right w:val="single" w:sz="4" w:space="0" w:color="1E5631"/>
+            </w:tcBorders>
+          </w:tcPr>
+          <w:p>
+            <w:pPr>
+              <w:spacing w:before="80" w:after="0"/>
+              <w:ind w:left="120"/>
+            </w:pPr>
+            <w:r>
+              <w:rPr>
+                <w:rFonts w:ascii="Calibri" w:hAnsi="Calibri"/>
+                <w:b/>
+                <w:i w:val="0"/>
+                <w:color w:val="FFFFFF"/>
+                <w:sz w:val="17"/>
+              </w:rPr>
+              <w:t>@rgbeac</w:t>
+            </w:r>
+          </w:p>
+        </w:tc>
+      </w:tr>
+      <w:tr>
+        <w:tc>
+          <w:tcPr>
+            <w:tcW w:type="dxa" w:w="15138"/>
+            <w:shd w:val="clear" w:color="auto" w:fill="D5E8D4"/>
+            <w:tcBorders>
+              <w:top w:val="single" w:sz="4" w:space="0" w:color="CCCCCC"/>
+              <w:left w:val="single" w:sz="4" w:space="0" w:color="CCCCCC"/>
+              <w:bottom w:val="single" w:sz="4" w:space="0" w:color="CCCCCC"/>
+              <w:right w:val="single" w:sz="4" w:space="0" w:color="CCCCCC"/>
+            </w:tcBorders>
+            <w:vAlign w:val="top"/>
+          </w:tcPr>
+          <w:p>
+            <w:pPr>
+              <w:spacing w:before="80" w:after="80"/>
+              <w:ind w:left="120" w:right="120"/>
+            </w:pPr>
+            <w:r>
+              <w:rPr>
+                <w:rFonts w:ascii="Calibri" w:hAnsi="Calibri"/>
+                <w:b w:val="0"/>
+                <w:i w:val="0"/>
+                <w:color w:val="222222"/>
+                <w:sz w:val="18"/>
+              </w:rPr>
+              <w:t>O @rgbeac (art.º 56.º) reforça a obrigação com 'parecer relativo à verificação das condições higiossanitárias e de bem-estar', mas igualmente sem prazos específicos para avaliações ou duração de retenção de registos. Ambos focam-se em 'programas' interno, não em 'visitas periódicas externas'.</w:t>
+            </w:r>
+          </w:p>
+        </w:tc>
+      </w:tr>
+      <w:tr>
+        <w:tc>
+          <w:tcPr>
+            <w:tcW w:type="dxa" w:w="15138"/>
+            <w:shd w:val="clear" w:color="auto" w:fill="5D2A8A"/>
+            <w:tcBorders>
+              <w:top w:val="single" w:sz="4" w:space="0" w:color="5D2A8A"/>
+              <w:left w:val="single" w:sz="4" w:space="0" w:color="5D2A8A"/>
+              <w:bottom w:val="single" w:sz="4" w:space="0" w:color="5D2A8A"/>
+              <w:right w:val="single" w:sz="4" w:space="0" w:color="5D2A8A"/>
+            </w:tcBorders>
+          </w:tcPr>
+          <w:p>
+            <w:pPr>
+              <w:spacing w:before="80" w:after="0"/>
+              <w:ind w:left="120"/>
+            </w:pPr>
+            <w:r>
+              <w:rPr>
+                <w:rFonts w:ascii="Calibri" w:hAnsi="Calibri"/>
+                <w:b/>
+                <w:i w:val="0"/>
+                <w:color w:val="FFFFFF"/>
+                <w:sz w:val="17"/>
+              </w:rPr>
+              <w:t>Sumário / Proposta</w:t>
+            </w:r>
+          </w:p>
+        </w:tc>
+      </w:tr>
+      <w:tr>
+        <w:tc>
+          <w:tcPr>
+            <w:tcW w:type="dxa" w:w="15138"/>
+            <w:shd w:val="clear" w:color="auto" w:fill="EAD7F7"/>
+            <w:tcBorders>
+              <w:top w:val="single" w:sz="4" w:space="0" w:color="CCCCCC"/>
+              <w:left w:val="single" w:sz="4" w:space="0" w:color="CCCCCC"/>
+              <w:bottom w:val="single" w:sz="4" w:space="0" w:color="CCCCCC"/>
+              <w:right w:val="single" w:sz="4" w:space="0" w:color="CCCCCC"/>
+            </w:tcBorders>
+            <w:vAlign w:val="top"/>
+          </w:tcPr>
+          <w:p>
+            <w:pPr>
+              <w:spacing w:before="80" w:after="80"/>
+              <w:ind w:left="120" w:right="120"/>
+            </w:pPr>
+            <w:r>
+              <w:rPr>
+                <w:rFonts w:ascii="Calibri" w:hAnsi="Calibri"/>
+                <w:b w:val="0"/>
+                <w:i w:val="0"/>
+                <w:color w:val="222222"/>
+                <w:sz w:val="18"/>
+              </w:rPr>
+              <w:t>Lacuna estrutural em toda a legislação nacional: enquanto o @regulamento exige 'visita de um veterinário' num prazo específico (1 ano) com manutenção de registos por 4 anos e transmissão entre veterinários, a legislação nacional concentra-se em ter um 'médico veterinário responsável' no estabelecimento. Necessidade de alteração: (1) formalizar obrigação de 'visita de avaliação' por veterinário dentro de 1 ano após notificação; (2) exigir avaliações periódicas conforme risco; (3) obrigatória manutenção de registos por 4 anos; (4) garantir transmissão de informações ao próximo veterinário avaliador; (5) estabelecer critérios mínimos de avaliação (bem-estar comportamental, alojamento, saúde, etc.).</w:t>
             </w:r>
           </w:p>
         </w:tc>

</xml_diff>

<commit_message>
Regenerar outputs com traduções PT-PT completas para artigos 17a, 18, 19, 21, 22
Outputs atualizados (sequência 5-22):
- comparativo_reuniao_exemplo.xlsx (21 artigos com correspondências e traduções)
- comparativo_reuniao_exemplo.html (SPA interativo com busca)
- comparativo_reuniao_exemplo.docx (documento imprimível formatado)

Todas as traduções PT-PT agora completas e sem referências a ficheiros de
tradução externos. Traduções realizadas diretamente conforme metodologia
CLAUDE.md - verbatim do texto original em inglês com terminologia legal PT-PT
consolidada.

https://claude.ai/code/session_01Lyx8H297UqfjCVAHdgya3T
</commit_message>
<xml_diff>
--- a/comparativo_reuniao_exemplo.docx
+++ b/comparativo_reuniao_exemplo.docx
@@ -18008,7 +18008,151 @@
                 <w:color w:val="222222"/>
                 <w:sz w:val="19"/>
               </w:rPr>
-              <w:t>Disponível no documento Regulamento - Primeira Versão portuguesa.docx</w:t>
+              <w:t>1. Quando operadores anunciem online um cão ou gato com vista ao seu colocamento no mercado da União, devem assegurar a apresentação do seguinte aviso no anúncio em caracteres claramente visíveis e em negrito:</w:t>
+            </w:r>
+          </w:p>
+          <w:p>
+            <w:pPr>
+              <w:spacing w:after="0" w:before="140"/>
+              <w:ind w:right="80" w:left="80" w:firstLine="0"/>
+            </w:pPr>
+            <w:r>
+              <w:rPr>
+                <w:rFonts w:ascii="Calibri" w:hAnsi="Calibri"/>
+                <w:b w:val="0"/>
+                <w:i/>
+                <w:color w:val="222222"/>
+                <w:sz w:val="19"/>
+              </w:rPr>
+              <w:t>"Um animal não é um brinquedo. Ter um é uma decisão que muda a vida. É seu dever assegurar a sua saúde e bem-estar e não o abandonar."</w:t>
+            </w:r>
+          </w:p>
+          <w:p>
+            <w:pPr>
+              <w:spacing w:after="0" w:before="140"/>
+              <w:ind w:right="80" w:left="80" w:firstLine="0"/>
+            </w:pPr>
+            <w:r>
+              <w:rPr>
+                <w:rFonts w:ascii="Calibri" w:hAnsi="Calibri"/>
+                <w:b w:val="0"/>
+                <w:i/>
+                <w:color w:val="222222"/>
+                <w:sz w:val="19"/>
+              </w:rPr>
+              <w:t>2. Quando pessoas singulares ou coletivas que não sejam operadores anunciem online um cão ou gato com vista ao seu colocamento no mercado da União, devem assegurar a apresentação de um aviso sobre detenção responsável utilizando a redação referida no primeiro parágrafo ou uma redação diferente com significado equivalente.</w:t>
+            </w:r>
+          </w:p>
+          <w:p>
+            <w:pPr>
+              <w:spacing w:after="0" w:before="140"/>
+              <w:ind w:right="80" w:left="80" w:firstLine="0"/>
+            </w:pPr>
+            <w:r>
+              <w:rPr>
+                <w:rFonts w:ascii="Calibri" w:hAnsi="Calibri"/>
+                <w:b w:val="0"/>
+                <w:i/>
+                <w:color w:val="222222"/>
+                <w:sz w:val="19"/>
+              </w:rPr>
+              <w:t>3. Ao colocar um cão ou gato no mercado na União, a pessoa singular ou coletiva que coloca o cão ou gato no mercado deve:</w:t>
+            </w:r>
+          </w:p>
+          <w:p>
+            <w:pPr>
+              <w:spacing w:after="0" w:before="100"/>
+              <w:ind w:right="80" w:left="360" w:hanging="280"/>
+            </w:pPr>
+            <w:r>
+              <w:rPr>
+                <w:rFonts w:ascii="Calibri" w:hAnsi="Calibri"/>
+                <w:b w:val="0"/>
+                <w:i/>
+                <w:color w:val="222222"/>
+                <w:sz w:val="19"/>
+              </w:rPr>
+              <w:t>a) Fornecer ao adquirente prova de identificação e registo do cão ou gato em conformidade com o artigo 17.º;</w:t>
+            </w:r>
+          </w:p>
+          <w:p>
+            <w:pPr>
+              <w:spacing w:after="0" w:before="100"/>
+              <w:ind w:right="80" w:left="360" w:hanging="280"/>
+            </w:pPr>
+            <w:r>
+              <w:rPr>
+                <w:rFonts w:ascii="Calibri" w:hAnsi="Calibri"/>
+                <w:b w:val="0"/>
+                <w:i/>
+                <w:color w:val="222222"/>
+                <w:sz w:val="19"/>
+              </w:rPr>
+              <w:t>b) Fornecer ao adquirente as seguintes informações sobre o cão ou gato: espécie, sexo, data e país de nascimento, e, quando relevante, raça;</w:t>
+            </w:r>
+          </w:p>
+          <w:p>
+            <w:pPr>
+              <w:spacing w:after="0" w:before="100"/>
+              <w:ind w:right="80" w:left="360" w:hanging="280"/>
+            </w:pPr>
+            <w:r>
+              <w:rPr>
+                <w:rFonts w:ascii="Calibri" w:hAnsi="Calibri"/>
+                <w:b w:val="0"/>
+                <w:i/>
+                <w:color w:val="222222"/>
+                <w:sz w:val="19"/>
+              </w:rPr>
+              <w:t>c) No caso de anúncio online, utilizar o sistema referido no parágrafo 6 para gerar um token único de verificação e disponibilizar o token e a ligação web para o sistema referido no parágrafo 6 no anúncio.</w:t>
+            </w:r>
+          </w:p>
+          <w:p>
+            <w:pPr>
+              <w:spacing w:after="0" w:before="140"/>
+              <w:ind w:right="80" w:left="80" w:firstLine="0"/>
+            </w:pPr>
+            <w:r>
+              <w:rPr>
+                <w:rFonts w:ascii="Calibri" w:hAnsi="Calibri"/>
+                <w:b w:val="0"/>
+                <w:i/>
+                <w:color w:val="222222"/>
+                <w:sz w:val="19"/>
+              </w:rPr>
+              <w:t>4. Os adquirentes podem verificar a autenticidade da identificação, registo e propriedade de cães ou gatos anunciados online através do sistema referido no parágrafo 6.</w:t>
+            </w:r>
+          </w:p>
+          <w:p>
+            <w:pPr>
+              <w:spacing w:after="0" w:before="140"/>
+              <w:ind w:right="80" w:left="80" w:firstLine="0"/>
+            </w:pPr>
+            <w:r>
+              <w:rPr>
+                <w:rFonts w:ascii="Calibri" w:hAnsi="Calibri"/>
+                <w:b w:val="0"/>
+                <w:i/>
+                <w:color w:val="222222"/>
+                <w:sz w:val="19"/>
+              </w:rPr>
+              <w:t>5. Os fornecedores de plataformas online devem assegurar que a sua interface online é concebida e organizada de forma a facilitar aos operadores ou outras pessoas singulares ou coletivas que colocam cães ou gatos no mercado o cumprimento das suas obrigações, e devem informar os adquirentes, de forma visível, da possibilidade de verificar a identificação e o registo do cão ou gato através de uma ligação web para o sistema referido no parágrafo 6.</w:t>
+            </w:r>
+          </w:p>
+          <w:p>
+            <w:pPr>
+              <w:spacing w:after="0" w:before="140"/>
+              <w:ind w:right="80" w:left="80" w:firstLine="0"/>
+            </w:pPr>
+            <w:r>
+              <w:rPr>
+                <w:rFonts w:ascii="Calibri" w:hAnsi="Calibri"/>
+                <w:b w:val="0"/>
+                <w:i/>
+                <w:color w:val="222222"/>
+                <w:sz w:val="19"/>
+              </w:rPr>
+              <w:t>6. A Comissão garante que um sistema de verificação online que realiza controlos automatizados da autenticidade da identificação, registo e propriedade de cães ou gatos anunciados online, utilizando a base de dados referida no artigo 19.º, está disponível publicamente gratuitamente e gera o token único de verificação referido no parágrafo 3, alínea c).</w:t>
             </w:r>
           </w:p>
         </w:tc>
@@ -18981,7 +19125,87 @@
                 <w:color w:val="222222"/>
                 <w:sz w:val="19"/>
               </w:rPr>
-              <w:t>Disponível no documento Regulamento - Primeira Versão portuguesa.docx</w:t>
+              <w:t>1. Para efeitos do artigo 9.º, as autoridades competentes são responsáveis por:</w:t>
+            </w:r>
+          </w:p>
+          <w:p>
+            <w:pPr>
+              <w:spacing w:after="0" w:before="100"/>
+              <w:ind w:right="80" w:left="360" w:hanging="280"/>
+            </w:pPr>
+            <w:r>
+              <w:rPr>
+                <w:rFonts w:ascii="Calibri" w:hAnsi="Calibri"/>
+                <w:b w:val="0"/>
+                <w:i/>
+                <w:color w:val="222222"/>
+                <w:sz w:val="19"/>
+              </w:rPr>
+              <w:t>a) Assegurar que existem cursos de formação disponíveis para cuidadores de animais;</w:t>
+            </w:r>
+          </w:p>
+          <w:p>
+            <w:pPr>
+              <w:spacing w:after="0" w:before="100"/>
+              <w:ind w:right="80" w:left="360" w:hanging="280"/>
+            </w:pPr>
+            <w:r>
+              <w:rPr>
+                <w:rFonts w:ascii="Calibri" w:hAnsi="Calibri"/>
+                <w:b w:val="0"/>
+                <w:i/>
+                <w:color w:val="222222"/>
+                <w:sz w:val="19"/>
+              </w:rPr>
+              <w:t>b) Aprovar o conteúdo dos cursos de formação referidos na alínea a), tendo em conta os requisitos mínimos estabelecidos pelos atos de execução referidos no artigo 9.º, parágrafo 3;</w:t>
+            </w:r>
+          </w:p>
+          <w:p>
+            <w:pPr>
+              <w:spacing w:after="0" w:before="140"/>
+              <w:ind w:right="80" w:left="80" w:firstLine="0"/>
+            </w:pPr>
+            <w:r>
+              <w:rPr>
+                <w:rFonts w:ascii="Calibri" w:hAnsi="Calibri"/>
+                <w:b w:val="0"/>
+                <w:i/>
+                <w:color w:val="222222"/>
+                <w:sz w:val="19"/>
+              </w:rPr>
+              <w:t>ba) Certificar os cuidadores de animais que completaram com sucesso os cursos de formação referidos na alínea a).</w:t>
+            </w:r>
+          </w:p>
+          <w:p>
+            <w:pPr>
+              <w:spacing w:after="0" w:before="140"/>
+              <w:ind w:right="80" w:left="80" w:firstLine="0"/>
+            </w:pPr>
+            <w:r>
+              <w:rPr>
+                <w:rFonts w:ascii="Calibri" w:hAnsi="Calibri"/>
+                <w:b w:val="0"/>
+                <w:i/>
+                <w:color w:val="222222"/>
+                <w:sz w:val="19"/>
+              </w:rPr>
+              <w:t>2. As autoridades competentes podem delegar a tarefa referida na alínea ba).</w:t>
+            </w:r>
+          </w:p>
+          <w:p>
+            <w:pPr>
+              <w:spacing w:after="0" w:before="140"/>
+              <w:ind w:right="80" w:left="80" w:firstLine="0"/>
+            </w:pPr>
+            <w:r>
+              <w:rPr>
+                <w:rFonts w:ascii="Calibri" w:hAnsi="Calibri"/>
+                <w:b w:val="0"/>
+                <w:i/>
+                <w:color w:val="222222"/>
+                <w:sz w:val="19"/>
+              </w:rPr>
+              <w:t>3. O Centro de Referência da União Europeia para o Bem-Estar Animal designado em conformidade com o artigo 95.º do Regulamento (UE) 2017/625 pode desenvolver modelos de materiais de formação e recomendações para os fornecedores dos cursos de formação referidos no parágrafo 1.</w:t>
             </w:r>
           </w:p>
         </w:tc>
@@ -20034,7 +20258,55 @@
                 <w:color w:val="222222"/>
                 <w:sz w:val="19"/>
               </w:rPr>
-              <w:t>Disponível no documento Regulamento - Primeira Versão portuguesa.docx</w:t>
+              <w:t>1. Os Estados-Membros são responsáveis pela criação e manutenção de bases de dados para o registo de cães e gatos identificados, em conformidade com os artigos 17.º (parágrafos 1 e 2) e 21.º (parágrafo 4 e segundo parágrafo do parágrafo 4a).</w:t>
+            </w:r>
+          </w:p>
+          <w:p>
+            <w:pPr>
+              <w:spacing w:after="0" w:before="140"/>
+              <w:ind w:right="80" w:left="80" w:firstLine="0"/>
+            </w:pPr>
+            <w:r>
+              <w:rPr>
+                <w:rFonts w:ascii="Calibri" w:hAnsi="Calibri"/>
+                <w:b w:val="0"/>
+                <w:i/>
+                <w:color w:val="222222"/>
+                <w:sz w:val="19"/>
+              </w:rPr>
+              <w:t>1a. Para este efeito, os Estados-Membros podem utilizar bases de dados mantidas por outro Estado-Membro, com base em acordos apropriados entre esses Estados-Membros.</w:t>
+            </w:r>
+          </w:p>
+          <w:p>
+            <w:pPr>
+              <w:spacing w:after="0" w:before="140"/>
+              <w:ind w:right="80" w:left="80" w:firstLine="0"/>
+            </w:pPr>
+            <w:r>
+              <w:rPr>
+                <w:rFonts w:ascii="Calibri" w:hAnsi="Calibri"/>
+                <w:b w:val="0"/>
+                <w:i/>
+                <w:color w:val="222222"/>
+                <w:sz w:val="19"/>
+              </w:rPr>
+              <w:t>2. Os Estados-Membros asseguram que as suas bases de dados referidas no parágrafo 1 estão em conformidade com os requisitos estabelecidos pelo ato de execução referido no parágrafo 3, alínea b), de modo a assegurar a sua interoperabilidade, permitindo que a identificação de um cão ou gato possa ser autenticada e rastreada em toda a União.</w:t>
+            </w:r>
+          </w:p>
+          <w:p>
+            <w:pPr>
+              <w:spacing w:after="0" w:before="140"/>
+              <w:ind w:right="80" w:left="80" w:firstLine="0"/>
+            </w:pPr>
+            <w:r>
+              <w:rPr>
+                <w:rFonts w:ascii="Calibri" w:hAnsi="Calibri"/>
+                <w:b w:val="0"/>
+                <w:i/>
+                <w:color w:val="222222"/>
+                <w:sz w:val="19"/>
+              </w:rPr>
+              <w:t>2a. A Comissão estabelece e mantém uma base de dados de índice contendo o conjunto mínimo de campos definido no parágrafo 3, alínea b). A Comissão pode confiar o desenvolvimento, manutenção e funcionamento dessa base de dados de índice a uma entidade independente, após um processo de seleção pública.</w:t>
             </w:r>
           </w:p>
         </w:tc>
@@ -23337,7 +23609,87 @@
                 <w:color w:val="222222"/>
                 <w:sz w:val="19"/>
               </w:rPr>
-              <w:t>1. A partir de [data de implementação], os cães e os gatos só podem ser introduzidos na União para colocação no mercado da União se tiverem estado detidos em conformidade com o indicado numa das alíneas seguintes...</w:t>
+              <w:t>1. Os cães e os gatos podem ser introduzidos na União apenas para colocação no mercado da União se estiverem satisfeitas as seguintes condições:</w:t>
+            </w:r>
+          </w:p>
+          <w:p>
+            <w:pPr>
+              <w:spacing w:after="0" w:before="100"/>
+              <w:ind w:right="80" w:left="360" w:hanging="280"/>
+            </w:pPr>
+            <w:r>
+              <w:rPr>
+                <w:rFonts w:ascii="Calibri" w:hAnsi="Calibri"/>
+                <w:b w:val="0"/>
+                <w:i/>
+                <w:color w:val="222222"/>
+                <w:sz w:val="19"/>
+              </w:rPr>
+              <w:t>a) Tenham sido criados e mantidos em conformidade com qualquer das seguintes situações:</w:t>
+            </w:r>
+          </w:p>
+          <w:p>
+            <w:pPr>
+              <w:spacing w:after="0" w:before="20"/>
+              <w:ind w:right="80" w:left="360" w:hanging="280"/>
+            </w:pPr>
+            <w:r>
+              <w:rPr>
+                <w:rFonts w:ascii="Calibri" w:hAnsi="Calibri"/>
+                <w:b w:val="0"/>
+                <w:i/>
+                <w:color w:val="222222"/>
+                <w:sz w:val="19"/>
+              </w:rPr>
+              <w:t>i) Capítulo II do presente Regulamento;</w:t>
+            </w:r>
+          </w:p>
+          <w:p>
+            <w:pPr>
+              <w:spacing w:after="0" w:before="20"/>
+              <w:ind w:right="80" w:left="80" w:firstLine="0"/>
+            </w:pPr>
+            <w:r>
+              <w:rPr>
+                <w:rFonts w:ascii="Calibri" w:hAnsi="Calibri"/>
+                <w:b w:val="0"/>
+                <w:i/>
+                <w:color w:val="222222"/>
+                <w:sz w:val="19"/>
+              </w:rPr>
+              <w:t>ii) Condições reconhecidas pela União em conformidade com o artigo 129.º do Regulamento (UE) 2017/625 como equivalentes às estabelecidas no Capítulo II do presente Regulamento; ou</w:t>
+            </w:r>
+          </w:p>
+          <w:p>
+            <w:pPr>
+              <w:spacing w:after="0" w:before="20"/>
+              <w:ind w:right="80" w:left="80" w:firstLine="0"/>
+            </w:pPr>
+            <w:r>
+              <w:rPr>
+                <w:rFonts w:ascii="Calibri" w:hAnsi="Calibri"/>
+                <w:b w:val="0"/>
+                <w:i/>
+                <w:color w:val="222222"/>
+                <w:sz w:val="19"/>
+              </w:rPr>
+              <w:t>iii) Quando aplicável, requisitos contidos num acordo específico entre a União e o país exportador.</w:t>
+            </w:r>
+          </w:p>
+          <w:p>
+            <w:pPr>
+              <w:spacing w:after="0" w:before="100"/>
+              <w:ind w:right="80" w:left="360" w:hanging="280"/>
+            </w:pPr>
+            <w:r>
+              <w:rPr>
+                <w:rFonts w:ascii="Calibri" w:hAnsi="Calibri"/>
+                <w:b w:val="0"/>
+                <w:i/>
+                <w:color w:val="222222"/>
+                <w:sz w:val="19"/>
+              </w:rPr>
+              <w:t>b) Provenham de um país terceiro ou território e de um estabelecimento listado em conformidade com os artigos 126.º e 127.º do Regulamento (UE) 2017/625.</w:t>
             </w:r>
           </w:p>
           <w:p>
@@ -23353,7 +23705,103 @@
                 <w:color w:val="222222"/>
                 <w:sz w:val="19"/>
               </w:rPr>
-              <w:t>[Tradução disponível no documento 'Regulamento - Primeira Versão portuguesa.docx']</w:t>
+              <w:t>2. O certificado oficial referido no artigo 126.º, parágrafo 2, alínea c), do Regulamento (UE) 2017/625 que acompanha os cães e gatos que entram na União desde países terceiros e territórios para colocação no mercado da União deve conter uma atestação certificando a conformidade com o parágrafo 1 do presente artigo.</w:t>
+            </w:r>
+          </w:p>
+          <w:p>
+            <w:pPr>
+              <w:spacing w:after="0" w:before="140"/>
+              <w:ind w:right="80" w:left="80" w:firstLine="0"/>
+            </w:pPr>
+            <w:r>
+              <w:rPr>
+                <w:rFonts w:ascii="Calibri" w:hAnsi="Calibri"/>
+                <w:b w:val="0"/>
+                <w:i/>
+                <w:color w:val="222222"/>
+                <w:sz w:val="19"/>
+              </w:rPr>
+              <w:t>3. Os cães e gatos que entram na União para colocação no mercado da União devem ser identificados antes da sua entrada por um médico veterinário através de um transponder injetável contendo um microchip legível em conformidade com o Anexo II.</w:t>
+            </w:r>
+          </w:p>
+          <w:p>
+            <w:pPr>
+              <w:spacing w:after="0" w:before="140"/>
+              <w:ind w:right="80" w:left="80" w:firstLine="0"/>
+            </w:pPr>
+            <w:r>
+              <w:rPr>
+                <w:rFonts w:ascii="Calibri" w:hAnsi="Calibri"/>
+                <w:b w:val="0"/>
+                <w:i/>
+                <w:color w:val="222222"/>
+                <w:sz w:val="19"/>
+              </w:rPr>
+              <w:t>4. O operador responsável pela importação de cães ou gatos que entram na União deve assegurar o registo dos cães ou gatos por um médico veterinário numa base de dados nacional referida no artigo 19.º, parágrafo 1, no prazo de 5 dias úteis após a sua entrada na União.</w:t>
+            </w:r>
+          </w:p>
+          <w:p>
+            <w:pPr>
+              <w:spacing w:after="0" w:before="140"/>
+              <w:ind w:right="80" w:left="80" w:firstLine="0"/>
+            </w:pPr>
+            <w:r>
+              <w:rPr>
+                <w:rFonts w:ascii="Calibri" w:hAnsi="Calibri"/>
+                <w:b w:val="0"/>
+                <w:i/>
+                <w:color w:val="222222"/>
+                <w:sz w:val="19"/>
+              </w:rPr>
+              <w:t>4a. O movimento não-comercial de um cão ou gato desde um país terceiro ou território para a União deve ser pré-notificado pelo seu proprietário numa base de dados online de viajantes da União com animais de estimação, pelo menos 5 dias úteis antes da passagem da fronteira da União, exceto nos seguintes casos:</w:t>
+            </w:r>
+          </w:p>
+          <w:p>
+            <w:pPr>
+              <w:spacing w:after="0" w:before="20"/>
+              <w:ind w:right="80" w:left="680" w:hanging="280"/>
+            </w:pPr>
+            <w:r>
+              <w:rPr>
+                <w:rFonts w:ascii="Calibri" w:hAnsi="Calibri"/>
+                <w:b w:val="0"/>
+                <w:i/>
+                <w:color w:val="222222"/>
+                <w:sz w:val="19"/>
+              </w:rPr>
+              <w:t>— cães ou gatos que entram na União diretamente desde países terceiros ou territórios que satisfazem as condições estabelecidas no artigo 17.º, parágrafo 1, alínea a), do Regulamento Delegado (C(2026) 20); e</w:t>
+            </w:r>
+          </w:p>
+          <w:p>
+            <w:pPr>
+              <w:spacing w:after="0" w:before="20"/>
+              <w:ind w:right="80" w:left="680" w:hanging="280"/>
+            </w:pPr>
+            <w:r>
+              <w:rPr>
+                <w:rFonts w:ascii="Calibri" w:hAnsi="Calibri"/>
+                <w:b w:val="0"/>
+                <w:i/>
+                <w:color w:val="222222"/>
+                <w:sz w:val="19"/>
+              </w:rPr>
+              <w:t>— cães ou gatos registados numa base de dados de um Estado-Membro referida no artigo 19.º, parágrafo 1.</w:t>
+            </w:r>
+          </w:p>
+          <w:p>
+            <w:pPr>
+              <w:spacing w:after="0" w:before="140"/>
+              <w:ind w:right="80" w:left="80" w:firstLine="0"/>
+            </w:pPr>
+            <w:r>
+              <w:rPr>
+                <w:rFonts w:ascii="Calibri" w:hAnsi="Calibri"/>
+                <w:b w:val="0"/>
+                <w:i/>
+                <w:color w:val="222222"/>
+                <w:sz w:val="19"/>
+              </w:rPr>
+              <w:t>Se o cão ou gato permanecer mais de seis meses na União, o proprietário deve assegurar o seu registo por um médico veterinário na base de dados do Estado-Membro de residência referida no artigo 19.º, parágrafo 1, no prazo de 5 dias úteis após o termo do sexto mês. Os Estados-Membros podem permitir o registo por outras pessoas que não médicos veterinários, desde que tenham medidas em vigor para assegurar a exatidão das informações inseridas na base de dados.</w:t>
             </w:r>
           </w:p>
         </w:tc>
@@ -24566,7 +25014,215 @@
                 <w:color w:val="222222"/>
                 <w:sz w:val="19"/>
               </w:rPr>
-              <w:t>1. A Comissão fica habilitada a adotar atos delegados, nos termos do artigo 23.º, que alterem os anexos do presente regulamento para ter em conta o progresso científico e técnico, incluindo, se for caso disso, os pareceres científicos da EFSA...</w:t>
+              <w:t>1. A Comissão fica habilitada a adotar atos delegados em conformidade com o artigo 23.º que alterem os anexos do presente Regulamento para ter em conta o progresso científico e técnico, incluindo, quando relevante, pareceres científicos da Autoridade Europeia para a Segurança dos Alimentos, nos seguintes aspetos:</w:t>
+            </w:r>
+          </w:p>
+          <w:p>
+            <w:pPr>
+              <w:spacing w:after="0" w:before="100"/>
+              <w:ind w:right="80" w:left="360" w:hanging="280"/>
+            </w:pPr>
+            <w:r>
+              <w:rPr>
+                <w:rFonts w:ascii="Calibri" w:hAnsi="Calibri"/>
+                <w:b w:val="0"/>
+                <w:i/>
+                <w:color w:val="222222"/>
+                <w:sz w:val="19"/>
+              </w:rPr>
+              <w:t>a) Um número adequado de cuidadores de animais em estabelecimentos de criação e venda;</w:t>
+            </w:r>
+          </w:p>
+          <w:p>
+            <w:pPr>
+              <w:spacing w:after="0" w:before="100"/>
+              <w:ind w:right="80" w:left="360" w:hanging="280"/>
+            </w:pPr>
+            <w:r>
+              <w:rPr>
+                <w:rFonts w:ascii="Calibri" w:hAnsi="Calibri"/>
+                <w:b w:val="0"/>
+                <w:i/>
+                <w:color w:val="222222"/>
+                <w:sz w:val="19"/>
+              </w:rPr>
+              <w:t>b) Requisitos de abastecimento de água e alimentação e processo de desmame;</w:t>
+            </w:r>
+          </w:p>
+          <w:p>
+            <w:pPr>
+              <w:spacing w:after="0" w:before="100"/>
+              <w:ind w:right="80" w:left="360" w:hanging="280"/>
+            </w:pPr>
+            <w:r>
+              <w:rPr>
+                <w:rFonts w:ascii="Calibri" w:hAnsi="Calibri"/>
+                <w:b w:val="0"/>
+                <w:i/>
+                <w:color w:val="222222"/>
+                <w:sz w:val="19"/>
+              </w:rPr>
+              <w:t>c) Gamas de temperatura;</w:t>
+            </w:r>
+          </w:p>
+          <w:p>
+            <w:pPr>
+              <w:spacing w:after="0" w:before="100"/>
+              <w:ind w:right="80" w:left="360" w:hanging="280"/>
+            </w:pPr>
+            <w:r>
+              <w:rPr>
+                <w:rFonts w:ascii="Calibri" w:hAnsi="Calibri"/>
+                <w:b w:val="0"/>
+                <w:i/>
+                <w:color w:val="222222"/>
+                <w:sz w:val="19"/>
+              </w:rPr>
+              <w:t>d) Requisitos de iluminação;</w:t>
+            </w:r>
+          </w:p>
+          <w:p>
+            <w:pPr>
+              <w:spacing w:after="0" w:before="100"/>
+              <w:ind w:right="80" w:left="360" w:hanging="280"/>
+            </w:pPr>
+            <w:r>
+              <w:rPr>
+                <w:rFonts w:ascii="Calibri" w:hAnsi="Calibri"/>
+                <w:b w:val="0"/>
+                <w:i/>
+                <w:color w:val="222222"/>
+                <w:sz w:val="19"/>
+              </w:rPr>
+              <w:t>e) Níveis de amoníaco e monóxido de carbono;</w:t>
+            </w:r>
+          </w:p>
+          <w:p>
+            <w:pPr>
+              <w:spacing w:after="0" w:before="100"/>
+              <w:ind w:right="80" w:left="360" w:hanging="280"/>
+            </w:pPr>
+            <w:r>
+              <w:rPr>
+                <w:rFonts w:ascii="Calibri" w:hAnsi="Calibri"/>
+                <w:b w:val="0"/>
+                <w:i/>
+                <w:color w:val="222222"/>
+                <w:sz w:val="19"/>
+              </w:rPr>
+              <w:t>f) Conceção de canis e gateis;</w:t>
+            </w:r>
+          </w:p>
+          <w:p>
+            <w:pPr>
+              <w:spacing w:after="0" w:before="100"/>
+              <w:ind w:right="80" w:left="360" w:hanging="280"/>
+            </w:pPr>
+            <w:r>
+              <w:rPr>
+                <w:rFonts w:ascii="Calibri" w:hAnsi="Calibri"/>
+                <w:b w:val="0"/>
+                <w:i/>
+                <w:color w:val="222222"/>
+                <w:sz w:val="19"/>
+              </w:rPr>
+              <w:t>g) Alojamento em grupo;</w:t>
+            </w:r>
+          </w:p>
+          <w:p>
+            <w:pPr>
+              <w:spacing w:after="0" w:before="100"/>
+              <w:ind w:right="80" w:left="360" w:hanging="280"/>
+            </w:pPr>
+            <w:r>
+              <w:rPr>
+                <w:rFonts w:ascii="Calibri" w:hAnsi="Calibri"/>
+                <w:b w:val="0"/>
+                <w:i/>
+                <w:color w:val="222222"/>
+                <w:sz w:val="19"/>
+              </w:rPr>
+              <w:t>h) Espaços permitidos para diferentes categorias de cães e gatos;</w:t>
+            </w:r>
+          </w:p>
+          <w:p>
+            <w:pPr>
+              <w:spacing w:after="0" w:before="100"/>
+              <w:ind w:right="80" w:left="360" w:hanging="280"/>
+            </w:pPr>
+            <w:r>
+              <w:rPr>
+                <w:rFonts w:ascii="Calibri" w:hAnsi="Calibri"/>
+                <w:b w:val="0"/>
+                <w:i/>
+                <w:color w:val="222222"/>
+                <w:sz w:val="19"/>
+              </w:rPr>
+              <w:t>i) Frequência de gestações;</w:t>
+            </w:r>
+          </w:p>
+          <w:p>
+            <w:pPr>
+              <w:spacing w:after="0" w:before="100"/>
+              <w:ind w:right="80" w:left="360" w:hanging="280"/>
+            </w:pPr>
+            <w:r>
+              <w:rPr>
+                <w:rFonts w:ascii="Calibri" w:hAnsi="Calibri"/>
+                <w:b w:val="0"/>
+                <w:i/>
+                <w:color w:val="222222"/>
+                <w:sz w:val="19"/>
+              </w:rPr>
+              <w:t>j) Idade mínima e máxima de cadelas e gatas para reprodução;</w:t>
+            </w:r>
+          </w:p>
+          <w:p>
+            <w:pPr>
+              <w:spacing w:after="0" w:before="100"/>
+              <w:ind w:right="80" w:left="360" w:hanging="280"/>
+            </w:pPr>
+            <w:r>
+              <w:rPr>
+                <w:rFonts w:ascii="Calibri" w:hAnsi="Calibri"/>
+                <w:b w:val="0"/>
+                <w:i/>
+                <w:color w:val="222222"/>
+                <w:sz w:val="19"/>
+              </w:rPr>
+              <w:t>k) Socialização, enriquecimento e outras medidas para satisfazer as necessidades comportamentais de cães e gatos;</w:t>
+            </w:r>
+          </w:p>
+          <w:p>
+            <w:pPr>
+              <w:spacing w:after="0" w:before="100"/>
+              <w:ind w:right="80" w:left="360" w:hanging="280"/>
+            </w:pPr>
+            <w:r>
+              <w:rPr>
+                <w:rFonts w:ascii="Calibri" w:hAnsi="Calibri"/>
+                <w:b w:val="0"/>
+                <w:i/>
+                <w:color w:val="222222"/>
+                <w:sz w:val="19"/>
+              </w:rPr>
+              <w:t>l) Requisitos para transponders utilizados na identificação individual de cães e gatos;</w:t>
+            </w:r>
+          </w:p>
+          <w:p>
+            <w:pPr>
+              <w:spacing w:after="0" w:before="100"/>
+              <w:ind w:right="80" w:left="360" w:hanging="280"/>
+            </w:pPr>
+            <w:r>
+              <w:rPr>
+                <w:rFonts w:ascii="Calibri" w:hAnsi="Calibri"/>
+                <w:b w:val="0"/>
+                <w:i/>
+                <w:color w:val="222222"/>
+                <w:sz w:val="19"/>
+              </w:rPr>
+              <w:t>m) Dados a recolher para avaliação e monitorização de políticas.</w:t>
             </w:r>
           </w:p>
           <w:p>
@@ -24582,7 +25238,7 @@
                 <w:color w:val="222222"/>
                 <w:sz w:val="19"/>
               </w:rPr>
-              <w:t>[Tradução disponível no documento 'Regulamento - Primeira Versão portuguesa.docx']</w:t>
+              <w:t>2. Qualquer complemento de requisitos nos Anexos deve ser baseado em evidência científica ou técnica atualizada, em particular no que diz respeito às condições específicas necessárias para assegurar o bem-estar dos cães e gatos abrangidos pelo âmbito do presente Regulamento. Quando relevante, esses atos delegados devem levar em conta impactos sociais, económicos e ambientais e prever períodos de transição suficientes para permitir aos operadores envolvidos a adaptação aos novos requisitos.</w:t>
             </w:r>
           </w:p>
         </w:tc>

</xml_diff>